<commit_message>
docs: regenerate final report after adversarial repair
</commit_message>
<xml_diff>
--- a/report/BaoCao_TieuLuan_PLDC_UIT_FINAL.docx
+++ b/report/BaoCao_TieuLuan_PLDC_UIT_FINAL.docx
@@ -807,7 +807,7 @@
       <w:r>
         <w:fldChar w:fldCharType="separate"/>
       </w:r>
-      <w:hyperlink w:anchor="_Toc237710253" w:history="1">
+      <w:hyperlink w:anchor="_Toc237711300" w:history="1">
         <w:r>
           <w:rPr>
             <w:rStyle w:val="Siuktni"/>
@@ -834,7 +834,7 @@
             <w:noProof/>
             <w:webHidden/>
           </w:rPr>
-          <w:instrText xml:space="preserve"> PAGEREF _Toc237710253 \h </w:instrText>
+          <w:instrText xml:space="preserve"> PAGEREF _Toc237711300 \h </w:instrText>
         </w:r>
         <w:r>
           <w:rPr>
@@ -875,7 +875,7 @@
           <w:noProof/>
         </w:rPr>
       </w:pPr>
-      <w:hyperlink w:anchor="_Toc237710254" w:history="1">
+      <w:hyperlink w:anchor="_Toc237711301" w:history="1">
         <w:r>
           <w:rPr>
             <w:rStyle w:val="Siuktni"/>
@@ -902,7 +902,7 @@
             <w:noProof/>
             <w:webHidden/>
           </w:rPr>
-          <w:instrText xml:space="preserve"> PAGEREF _Toc237710254 \h </w:instrText>
+          <w:instrText xml:space="preserve"> PAGEREF _Toc237711301 \h </w:instrText>
         </w:r>
         <w:r>
           <w:rPr>
@@ -943,7 +943,7 @@
           <w:noProof/>
         </w:rPr>
       </w:pPr>
-      <w:hyperlink w:anchor="_Toc237710255" w:history="1">
+      <w:hyperlink w:anchor="_Toc237711302" w:history="1">
         <w:r>
           <w:rPr>
             <w:rStyle w:val="Siuktni"/>
@@ -970,7 +970,7 @@
             <w:noProof/>
             <w:webHidden/>
           </w:rPr>
-          <w:instrText xml:space="preserve"> PAGEREF _Toc237710255 \h </w:instrText>
+          <w:instrText xml:space="preserve"> PAGEREF _Toc237711302 \h </w:instrText>
         </w:r>
         <w:r>
           <w:rPr>
@@ -1011,7 +1011,7 @@
           <w:noProof/>
         </w:rPr>
       </w:pPr>
-      <w:hyperlink w:anchor="_Toc237710256" w:history="1">
+      <w:hyperlink w:anchor="_Toc237711303" w:history="1">
         <w:r>
           <w:rPr>
             <w:rStyle w:val="Siuktni"/>
@@ -1038,7 +1038,7 @@
             <w:noProof/>
             <w:webHidden/>
           </w:rPr>
-          <w:instrText xml:space="preserve"> PAGEREF _Toc237710256 \h </w:instrText>
+          <w:instrText xml:space="preserve"> PAGEREF _Toc237711303 \h </w:instrText>
         </w:r>
         <w:r>
           <w:rPr>
@@ -1079,7 +1079,7 @@
           <w:noProof/>
         </w:rPr>
       </w:pPr>
-      <w:hyperlink w:anchor="_Toc237710257" w:history="1">
+      <w:hyperlink w:anchor="_Toc237711304" w:history="1">
         <w:r>
           <w:rPr>
             <w:rStyle w:val="Siuktni"/>
@@ -1106,7 +1106,7 @@
             <w:noProof/>
             <w:webHidden/>
           </w:rPr>
-          <w:instrText xml:space="preserve"> PAGEREF _Toc237710257 \h </w:instrText>
+          <w:instrText xml:space="preserve"> PAGEREF _Toc237711304 \h </w:instrText>
         </w:r>
         <w:r>
           <w:rPr>
@@ -1147,7 +1147,7 @@
           <w:noProof/>
         </w:rPr>
       </w:pPr>
-      <w:hyperlink w:anchor="_Toc237710258" w:history="1">
+      <w:hyperlink w:anchor="_Toc237711305" w:history="1">
         <w:r>
           <w:rPr>
             <w:rStyle w:val="Siuktni"/>
@@ -1174,7 +1174,7 @@
             <w:noProof/>
             <w:webHidden/>
           </w:rPr>
-          <w:instrText xml:space="preserve"> PAGEREF _Toc237710258 \h </w:instrText>
+          <w:instrText xml:space="preserve"> PAGEREF _Toc237711305 \h </w:instrText>
         </w:r>
         <w:r>
           <w:rPr>
@@ -1215,7 +1215,7 @@
           <w:noProof/>
         </w:rPr>
       </w:pPr>
-      <w:hyperlink w:anchor="_Toc237710259" w:history="1">
+      <w:hyperlink w:anchor="_Toc237711306" w:history="1">
         <w:r>
           <w:rPr>
             <w:rStyle w:val="Siuktni"/>
@@ -1242,7 +1242,7 @@
             <w:noProof/>
             <w:webHidden/>
           </w:rPr>
-          <w:instrText xml:space="preserve"> PAGEREF _Toc237710259 \h </w:instrText>
+          <w:instrText xml:space="preserve"> PAGEREF _Toc237711306 \h </w:instrText>
         </w:r>
         <w:r>
           <w:rPr>
@@ -1283,7 +1283,7 @@
           <w:noProof/>
         </w:rPr>
       </w:pPr>
-      <w:hyperlink w:anchor="_Toc237710260" w:history="1">
+      <w:hyperlink w:anchor="_Toc237711307" w:history="1">
         <w:r>
           <w:rPr>
             <w:rStyle w:val="Siuktni"/>
@@ -1310,7 +1310,7 @@
             <w:noProof/>
             <w:webHidden/>
           </w:rPr>
-          <w:instrText xml:space="preserve"> PAGEREF _Toc237710260 \h </w:instrText>
+          <w:instrText xml:space="preserve"> PAGEREF _Toc237711307 \h </w:instrText>
         </w:r>
         <w:r>
           <w:rPr>
@@ -1351,7 +1351,7 @@
           <w:noProof/>
         </w:rPr>
       </w:pPr>
-      <w:hyperlink w:anchor="_Toc237710261" w:history="1">
+      <w:hyperlink w:anchor="_Toc237711308" w:history="1">
         <w:r>
           <w:rPr>
             <w:rStyle w:val="Siuktni"/>
@@ -1378,7 +1378,7 @@
             <w:noProof/>
             <w:webHidden/>
           </w:rPr>
-          <w:instrText xml:space="preserve"> PAGEREF _Toc237710261 \h </w:instrText>
+          <w:instrText xml:space="preserve"> PAGEREF _Toc237711308 \h </w:instrText>
         </w:r>
         <w:r>
           <w:rPr>
@@ -1419,7 +1419,7 @@
           <w:noProof/>
         </w:rPr>
       </w:pPr>
-      <w:hyperlink w:anchor="_Toc237710262" w:history="1">
+      <w:hyperlink w:anchor="_Toc237711309" w:history="1">
         <w:r>
           <w:rPr>
             <w:rStyle w:val="Siuktni"/>
@@ -1446,7 +1446,7 @@
             <w:noProof/>
             <w:webHidden/>
           </w:rPr>
-          <w:instrText xml:space="preserve"> PAGEREF _Toc237710262 \h </w:instrText>
+          <w:instrText xml:space="preserve"> PAGEREF _Toc237711309 \h </w:instrText>
         </w:r>
         <w:r>
           <w:rPr>
@@ -1487,7 +1487,7 @@
           <w:noProof/>
         </w:rPr>
       </w:pPr>
-      <w:hyperlink w:anchor="_Toc237710263" w:history="1">
+      <w:hyperlink w:anchor="_Toc237711310" w:history="1">
         <w:r>
           <w:rPr>
             <w:rStyle w:val="Siuktni"/>
@@ -1514,7 +1514,7 @@
             <w:noProof/>
             <w:webHidden/>
           </w:rPr>
-          <w:instrText xml:space="preserve"> PAGEREF _Toc237710263 \h </w:instrText>
+          <w:instrText xml:space="preserve"> PAGEREF _Toc237711310 \h </w:instrText>
         </w:r>
         <w:r>
           <w:rPr>
@@ -1555,7 +1555,7 @@
           <w:noProof/>
         </w:rPr>
       </w:pPr>
-      <w:hyperlink w:anchor="_Toc237710264" w:history="1">
+      <w:hyperlink w:anchor="_Toc237711311" w:history="1">
         <w:r>
           <w:rPr>
             <w:rStyle w:val="Siuktni"/>
@@ -1582,7 +1582,7 @@
             <w:noProof/>
             <w:webHidden/>
           </w:rPr>
-          <w:instrText xml:space="preserve"> PAGEREF _Toc237710264 \h </w:instrText>
+          <w:instrText xml:space="preserve"> PAGEREF _Toc237711311 \h </w:instrText>
         </w:r>
         <w:r>
           <w:rPr>
@@ -1623,7 +1623,7 @@
           <w:noProof/>
         </w:rPr>
       </w:pPr>
-      <w:hyperlink w:anchor="_Toc237710265" w:history="1">
+      <w:hyperlink w:anchor="_Toc237711312" w:history="1">
         <w:r>
           <w:rPr>
             <w:rStyle w:val="Siuktni"/>
@@ -1650,7 +1650,7 @@
             <w:noProof/>
             <w:webHidden/>
           </w:rPr>
-          <w:instrText xml:space="preserve"> PAGEREF _Toc237710265 \h </w:instrText>
+          <w:instrText xml:space="preserve"> PAGEREF _Toc237711312 \h </w:instrText>
         </w:r>
         <w:r>
           <w:rPr>
@@ -1691,7 +1691,7 @@
           <w:noProof/>
         </w:rPr>
       </w:pPr>
-      <w:hyperlink w:anchor="_Toc237710266" w:history="1">
+      <w:hyperlink w:anchor="_Toc237711313" w:history="1">
         <w:r>
           <w:rPr>
             <w:rStyle w:val="Siuktni"/>
@@ -1718,7 +1718,7 @@
             <w:noProof/>
             <w:webHidden/>
           </w:rPr>
-          <w:instrText xml:space="preserve"> PAGEREF _Toc237710266 \h </w:instrText>
+          <w:instrText xml:space="preserve"> PAGEREF _Toc237711313 \h </w:instrText>
         </w:r>
         <w:r>
           <w:rPr>
@@ -1759,7 +1759,7 @@
           <w:noProof/>
         </w:rPr>
       </w:pPr>
-      <w:hyperlink w:anchor="_Toc237710267" w:history="1">
+      <w:hyperlink w:anchor="_Toc237711314" w:history="1">
         <w:r>
           <w:rPr>
             <w:rStyle w:val="Siuktni"/>
@@ -1786,7 +1786,7 @@
             <w:noProof/>
             <w:webHidden/>
           </w:rPr>
-          <w:instrText xml:space="preserve"> PAGEREF _Toc237710267 \h </w:instrText>
+          <w:instrText xml:space="preserve"> PAGEREF _Toc237711314 \h </w:instrText>
         </w:r>
         <w:r>
           <w:rPr>
@@ -1827,7 +1827,7 @@
           <w:noProof/>
         </w:rPr>
       </w:pPr>
-      <w:hyperlink w:anchor="_Toc237710268" w:history="1">
+      <w:hyperlink w:anchor="_Toc237711315" w:history="1">
         <w:r>
           <w:rPr>
             <w:rStyle w:val="Siuktni"/>
@@ -1854,7 +1854,7 @@
             <w:noProof/>
             <w:webHidden/>
           </w:rPr>
-          <w:instrText xml:space="preserve"> PAGEREF _Toc237710268 \h </w:instrText>
+          <w:instrText xml:space="preserve"> PAGEREF _Toc237711315 \h </w:instrText>
         </w:r>
         <w:r>
           <w:rPr>
@@ -1895,7 +1895,7 @@
           <w:noProof/>
         </w:rPr>
       </w:pPr>
-      <w:hyperlink w:anchor="_Toc237710269" w:history="1">
+      <w:hyperlink w:anchor="_Toc237711316" w:history="1">
         <w:r>
           <w:rPr>
             <w:rStyle w:val="Siuktni"/>
@@ -1922,7 +1922,7 @@
             <w:noProof/>
             <w:webHidden/>
           </w:rPr>
-          <w:instrText xml:space="preserve"> PAGEREF _Toc237710269 \h </w:instrText>
+          <w:instrText xml:space="preserve"> PAGEREF _Toc237711316 \h </w:instrText>
         </w:r>
         <w:r>
           <w:rPr>
@@ -1963,7 +1963,7 @@
           <w:noProof/>
         </w:rPr>
       </w:pPr>
-      <w:hyperlink w:anchor="_Toc237710270" w:history="1">
+      <w:hyperlink w:anchor="_Toc237711317" w:history="1">
         <w:r>
           <w:rPr>
             <w:rStyle w:val="Siuktni"/>
@@ -1990,7 +1990,7 @@
             <w:noProof/>
             <w:webHidden/>
           </w:rPr>
-          <w:instrText xml:space="preserve"> PAGEREF _Toc237710270 \h </w:instrText>
+          <w:instrText xml:space="preserve"> PAGEREF _Toc237711317 \h </w:instrText>
         </w:r>
         <w:r>
           <w:rPr>
@@ -2031,7 +2031,7 @@
           <w:noProof/>
         </w:rPr>
       </w:pPr>
-      <w:hyperlink w:anchor="_Toc237710271" w:history="1">
+      <w:hyperlink w:anchor="_Toc237711318" w:history="1">
         <w:r>
           <w:rPr>
             <w:rStyle w:val="Siuktni"/>
@@ -2058,7 +2058,7 @@
             <w:noProof/>
             <w:webHidden/>
           </w:rPr>
-          <w:instrText xml:space="preserve"> PAGEREF _Toc237710271 \h </w:instrText>
+          <w:instrText xml:space="preserve"> PAGEREF _Toc237711318 \h </w:instrText>
         </w:r>
         <w:r>
           <w:rPr>
@@ -2099,7 +2099,7 @@
           <w:noProof/>
         </w:rPr>
       </w:pPr>
-      <w:hyperlink w:anchor="_Toc237710272" w:history="1">
+      <w:hyperlink w:anchor="_Toc237711319" w:history="1">
         <w:r>
           <w:rPr>
             <w:rStyle w:val="Siuktni"/>
@@ -2126,7 +2126,7 @@
             <w:noProof/>
             <w:webHidden/>
           </w:rPr>
-          <w:instrText xml:space="preserve"> PAGEREF _Toc237710272 \h </w:instrText>
+          <w:instrText xml:space="preserve"> PAGEREF _Toc237711319 \h </w:instrText>
         </w:r>
         <w:r>
           <w:rPr>
@@ -2167,7 +2167,7 @@
           <w:noProof/>
         </w:rPr>
       </w:pPr>
-      <w:hyperlink w:anchor="_Toc237710273" w:history="1">
+      <w:hyperlink w:anchor="_Toc237711320" w:history="1">
         <w:r>
           <w:rPr>
             <w:rStyle w:val="Siuktni"/>
@@ -2194,7 +2194,7 @@
             <w:noProof/>
             <w:webHidden/>
           </w:rPr>
-          <w:instrText xml:space="preserve"> PAGEREF _Toc237710273 \h </w:instrText>
+          <w:instrText xml:space="preserve"> PAGEREF _Toc237711320 \h </w:instrText>
         </w:r>
         <w:r>
           <w:rPr>
@@ -2235,7 +2235,7 @@
           <w:noProof/>
         </w:rPr>
       </w:pPr>
-      <w:hyperlink w:anchor="_Toc237710274" w:history="1">
+      <w:hyperlink w:anchor="_Toc237711321" w:history="1">
         <w:r>
           <w:rPr>
             <w:rStyle w:val="Siuktni"/>
@@ -2262,7 +2262,7 @@
             <w:noProof/>
             <w:webHidden/>
           </w:rPr>
-          <w:instrText xml:space="preserve"> PAGEREF _Toc237710274 \h </w:instrText>
+          <w:instrText xml:space="preserve"> PAGEREF _Toc237711321 \h </w:instrText>
         </w:r>
         <w:r>
           <w:rPr>
@@ -2303,7 +2303,7 @@
           <w:noProof/>
         </w:rPr>
       </w:pPr>
-      <w:hyperlink w:anchor="_Toc237710275" w:history="1">
+      <w:hyperlink w:anchor="_Toc237711322" w:history="1">
         <w:r>
           <w:rPr>
             <w:rStyle w:val="Siuktni"/>
@@ -2330,7 +2330,7 @@
             <w:noProof/>
             <w:webHidden/>
           </w:rPr>
-          <w:instrText xml:space="preserve"> PAGEREF _Toc237710275 \h </w:instrText>
+          <w:instrText xml:space="preserve"> PAGEREF _Toc237711322 \h </w:instrText>
         </w:r>
         <w:r>
           <w:rPr>
@@ -2371,7 +2371,7 @@
           <w:noProof/>
         </w:rPr>
       </w:pPr>
-      <w:hyperlink w:anchor="_Toc237710276" w:history="1">
+      <w:hyperlink w:anchor="_Toc237711323" w:history="1">
         <w:r>
           <w:rPr>
             <w:rStyle w:val="Siuktni"/>
@@ -2398,7 +2398,7 @@
             <w:noProof/>
             <w:webHidden/>
           </w:rPr>
-          <w:instrText xml:space="preserve"> PAGEREF _Toc237710276 \h </w:instrText>
+          <w:instrText xml:space="preserve"> PAGEREF _Toc237711323 \h </w:instrText>
         </w:r>
         <w:r>
           <w:rPr>
@@ -2418,7 +2418,7 @@
             <w:noProof/>
             <w:webHidden/>
           </w:rPr>
-          <w:t>17</w:t>
+          <w:t>18</w:t>
         </w:r>
         <w:r>
           <w:rPr>
@@ -2439,7 +2439,7 @@
           <w:noProof/>
         </w:rPr>
       </w:pPr>
-      <w:hyperlink w:anchor="_Toc237710277" w:history="1">
+      <w:hyperlink w:anchor="_Toc237711324" w:history="1">
         <w:r>
           <w:rPr>
             <w:rStyle w:val="Siuktni"/>
@@ -2466,7 +2466,7 @@
             <w:noProof/>
             <w:webHidden/>
           </w:rPr>
-          <w:instrText xml:space="preserve"> PAGEREF _Toc237710277 \h </w:instrText>
+          <w:instrText xml:space="preserve"> PAGEREF _Toc237711324 \h </w:instrText>
         </w:r>
         <w:r>
           <w:rPr>
@@ -2507,7 +2507,7 @@
           <w:noProof/>
         </w:rPr>
       </w:pPr>
-      <w:hyperlink w:anchor="_Toc237710278" w:history="1">
+      <w:hyperlink w:anchor="_Toc237711325" w:history="1">
         <w:r>
           <w:rPr>
             <w:rStyle w:val="Siuktni"/>
@@ -2534,7 +2534,7 @@
             <w:noProof/>
             <w:webHidden/>
           </w:rPr>
-          <w:instrText xml:space="preserve"> PAGEREF _Toc237710278 \h </w:instrText>
+          <w:instrText xml:space="preserve"> PAGEREF _Toc237711325 \h </w:instrText>
         </w:r>
         <w:r>
           <w:rPr>
@@ -2554,7 +2554,7 @@
             <w:noProof/>
             <w:webHidden/>
           </w:rPr>
-          <w:t>20</w:t>
+          <w:t>21</w:t>
         </w:r>
         <w:r>
           <w:rPr>
@@ -2575,7 +2575,7 @@
           <w:noProof/>
         </w:rPr>
       </w:pPr>
-      <w:hyperlink w:anchor="_Toc237710279" w:history="1">
+      <w:hyperlink w:anchor="_Toc237711326" w:history="1">
         <w:r>
           <w:rPr>
             <w:rStyle w:val="Siuktni"/>
@@ -2602,7 +2602,7 @@
             <w:noProof/>
             <w:webHidden/>
           </w:rPr>
-          <w:instrText xml:space="preserve"> PAGEREF _Toc237710279 \h </w:instrText>
+          <w:instrText xml:space="preserve"> PAGEREF _Toc237711326 \h </w:instrText>
         </w:r>
         <w:r>
           <w:rPr>
@@ -2643,7 +2643,7 @@
           <w:noProof/>
         </w:rPr>
       </w:pPr>
-      <w:hyperlink w:anchor="_Toc237710280" w:history="1">
+      <w:hyperlink w:anchor="_Toc237711327" w:history="1">
         <w:r>
           <w:rPr>
             <w:rStyle w:val="Siuktni"/>
@@ -2670,7 +2670,7 @@
             <w:noProof/>
             <w:webHidden/>
           </w:rPr>
-          <w:instrText xml:space="preserve"> PAGEREF _Toc237710280 \h </w:instrText>
+          <w:instrText xml:space="preserve"> PAGEREF _Toc237711327 \h </w:instrText>
         </w:r>
         <w:r>
           <w:rPr>
@@ -2711,7 +2711,7 @@
           <w:noProof/>
         </w:rPr>
       </w:pPr>
-      <w:hyperlink w:anchor="_Toc237710281" w:history="1">
+      <w:hyperlink w:anchor="_Toc237711328" w:history="1">
         <w:r>
           <w:rPr>
             <w:rStyle w:val="Siuktni"/>
@@ -2738,7 +2738,7 @@
             <w:noProof/>
             <w:webHidden/>
           </w:rPr>
-          <w:instrText xml:space="preserve"> PAGEREF _Toc237710281 \h </w:instrText>
+          <w:instrText xml:space="preserve"> PAGEREF _Toc237711328 \h </w:instrText>
         </w:r>
         <w:r>
           <w:rPr>
@@ -2779,7 +2779,7 @@
           <w:noProof/>
         </w:rPr>
       </w:pPr>
-      <w:hyperlink w:anchor="_Toc237710282" w:history="1">
+      <w:hyperlink w:anchor="_Toc237711329" w:history="1">
         <w:r>
           <w:rPr>
             <w:rStyle w:val="Siuktni"/>
@@ -2806,7 +2806,7 @@
             <w:noProof/>
             <w:webHidden/>
           </w:rPr>
-          <w:instrText xml:space="preserve"> PAGEREF _Toc237710282 \h </w:instrText>
+          <w:instrText xml:space="preserve"> PAGEREF _Toc237711329 \h </w:instrText>
         </w:r>
         <w:r>
           <w:rPr>
@@ -2847,7 +2847,7 @@
           <w:noProof/>
         </w:rPr>
       </w:pPr>
-      <w:hyperlink w:anchor="_Toc237710283" w:history="1">
+      <w:hyperlink w:anchor="_Toc237711330" w:history="1">
         <w:r>
           <w:rPr>
             <w:rStyle w:val="Siuktni"/>
@@ -2874,7 +2874,7 @@
             <w:noProof/>
             <w:webHidden/>
           </w:rPr>
-          <w:instrText xml:space="preserve"> PAGEREF _Toc237710283 \h </w:instrText>
+          <w:instrText xml:space="preserve"> PAGEREF _Toc237711330 \h </w:instrText>
         </w:r>
         <w:r>
           <w:rPr>
@@ -2915,7 +2915,7 @@
           <w:noProof/>
         </w:rPr>
       </w:pPr>
-      <w:hyperlink w:anchor="_Toc237710284" w:history="1">
+      <w:hyperlink w:anchor="_Toc237711331" w:history="1">
         <w:r>
           <w:rPr>
             <w:rStyle w:val="Siuktni"/>
@@ -2942,7 +2942,7 @@
             <w:noProof/>
             <w:webHidden/>
           </w:rPr>
-          <w:instrText xml:space="preserve"> PAGEREF _Toc237710284 \h </w:instrText>
+          <w:instrText xml:space="preserve"> PAGEREF _Toc237711331 \h </w:instrText>
         </w:r>
         <w:r>
           <w:rPr>
@@ -2983,7 +2983,7 @@
           <w:noProof/>
         </w:rPr>
       </w:pPr>
-      <w:hyperlink w:anchor="_Toc237710285" w:history="1">
+      <w:hyperlink w:anchor="_Toc237711332" w:history="1">
         <w:r>
           <w:rPr>
             <w:rStyle w:val="Siuktni"/>
@@ -3010,7 +3010,7 @@
             <w:noProof/>
             <w:webHidden/>
           </w:rPr>
-          <w:instrText xml:space="preserve"> PAGEREF _Toc237710285 \h </w:instrText>
+          <w:instrText xml:space="preserve"> PAGEREF _Toc237711332 \h </w:instrText>
         </w:r>
         <w:r>
           <w:rPr>
@@ -3051,7 +3051,7 @@
           <w:noProof/>
         </w:rPr>
       </w:pPr>
-      <w:hyperlink w:anchor="_Toc237710286" w:history="1">
+      <w:hyperlink w:anchor="_Toc237711333" w:history="1">
         <w:r>
           <w:rPr>
             <w:rStyle w:val="Siuktni"/>
@@ -3078,7 +3078,7 @@
             <w:noProof/>
             <w:webHidden/>
           </w:rPr>
-          <w:instrText xml:space="preserve"> PAGEREF _Toc237710286 \h </w:instrText>
+          <w:instrText xml:space="preserve"> PAGEREF _Toc237711333 \h </w:instrText>
         </w:r>
         <w:r>
           <w:rPr>
@@ -3119,7 +3119,7 @@
           <w:noProof/>
         </w:rPr>
       </w:pPr>
-      <w:hyperlink w:anchor="_Toc237710287" w:history="1">
+      <w:hyperlink w:anchor="_Toc237711334" w:history="1">
         <w:r>
           <w:rPr>
             <w:rStyle w:val="Siuktni"/>
@@ -3146,7 +3146,7 @@
             <w:noProof/>
             <w:webHidden/>
           </w:rPr>
-          <w:instrText xml:space="preserve"> PAGEREF _Toc237710287 \h </w:instrText>
+          <w:instrText xml:space="preserve"> PAGEREF _Toc237711334 \h </w:instrText>
         </w:r>
         <w:r>
           <w:rPr>
@@ -3187,7 +3187,7 @@
           <w:noProof/>
         </w:rPr>
       </w:pPr>
-      <w:hyperlink w:anchor="_Toc237710288" w:history="1">
+      <w:hyperlink w:anchor="_Toc237711335" w:history="1">
         <w:r>
           <w:rPr>
             <w:rStyle w:val="Siuktni"/>
@@ -3214,7 +3214,7 @@
             <w:noProof/>
             <w:webHidden/>
           </w:rPr>
-          <w:instrText xml:space="preserve"> PAGEREF _Toc237710288 \h </w:instrText>
+          <w:instrText xml:space="preserve"> PAGEREF _Toc237711335 \h </w:instrText>
         </w:r>
         <w:r>
           <w:rPr>
@@ -3263,7 +3263,7 @@
       <w:pPr>
         <w:pStyle w:val="u1"/>
       </w:pPr>
-      <w:bookmarkStart w:id="0" w:name="_Toc237710253"/>
+      <w:bookmarkStart w:id="0" w:name="_Toc237711300"/>
       <w:r>
         <w:rPr>
           <w:rFonts w:ascii="Times New Roman" w:eastAsia="Times New Roman" w:hAnsi="Times New Roman"/>
@@ -3278,7 +3278,7 @@
       <w:pPr>
         <w:pStyle w:val="u2"/>
       </w:pPr>
-      <w:bookmarkStart w:id="1" w:name="_Toc237710254"/>
+      <w:bookmarkStart w:id="1" w:name="_Toc237711301"/>
       <w:r>
         <w:rPr>
           <w:rFonts w:ascii="Times New Roman" w:eastAsia="Times New Roman" w:hAnsi="Times New Roman"/>
@@ -3298,19 +3298,19 @@
     </w:p>
     <w:p>
       <w:r>
-        <w:t>Vụ việc Cơ quan Cảnh sát điều tra Công an tỉnh Phú Thọ khởi tố vụ án, khởi tố Nguyễn Tiến Đạt cùng 20 bị can liên quan đến hoạt động quảng cáo sản phẩm Đông y “Xương khớp bà Sáu” trên mạng xã hội vào tháng 8/2026 là một tình huống thực tiễn điển hình để vận dụng lý luận môn học. Dưới góc độ môn Pháp luật đại cương, vụ việc thể hiện đầy đủ các khía cạnh pháp lý của một vi phạm pháp luật có tổ chức trong môi trường số, đòi hỏi sự xem xét có hệ thống dựa trên bốn yếu tố cấu thành.</w:t>
-      </w:r>
-    </w:p>
-    <w:p>
-      <w:r>
-        <w:t>Việc nghiên cứu đề tài này giúp sinh viên củng cố vững chắc phương pháp luận phân tích vi phạm pháp luật, rèn luyện kỹ năng đánh giá chứng cứ khách quan, đồng thời nâng cao ý thức tuân thủ pháp luật và đạo đức nghề nghiệp số (Digital Ethics) cho sinh viên Trường Đại học Công nghệ Thông tin – ĐHQG-HCM.</w:t>
+        <w:t>Vụ việc Cơ quan Cảnh sát điều tra Công an tỉnh Phú Thọ khởi tố vụ án, khởi tố Nguyễn Tiến Đạt cùng 20 bị can liên quan đến hoạt động quảng cáo sản phẩm Đông y “Xương khớp bà Sáu” trên mạng xã hội vào tháng 8/2026 là một tình huống thực tiễn điển hình để vận dụng lý luận môn học. Dưới góc độ môn Pháp luật đại cương, vụ việc thể hiện đầy đủ các khía cạnh pháp lý của một vi phạm pháp luật diễn ra qua nhiều khâu trong môi trường số, đòi hỏi sự xem xét có hệ thống dựa trên bốn yếu tố cấu thành.</w:t>
+      </w:r>
+    </w:p>
+    <w:p>
+      <w:r>
+        <w:t>Việc nghiên cứu đề tài này giúp sinh viên củng cố vững chắc phương pháp luận phân tích vi phạm pháp luật, rèn luyện kỹ năng đánh giá chứng cứ khách quan, đồng thời nâng cao ý thức tuân thủ pháp luật và đạo đức nghề nghiệp trong môi trường số cho sinh viên Trường Đại học Công nghệ Thông tin – ĐHQG-HCM.</w:t>
       </w:r>
     </w:p>
     <w:p>
       <w:pPr>
         <w:pStyle w:val="u2"/>
       </w:pPr>
-      <w:bookmarkStart w:id="2" w:name="_Toc237710255"/>
+      <w:bookmarkStart w:id="2" w:name="_Toc237711302"/>
       <w:r>
         <w:rPr>
           <w:rFonts w:ascii="Times New Roman" w:eastAsia="Times New Roman" w:hAnsi="Times New Roman"/>
@@ -3365,7 +3365,7 @@
       <w:pPr>
         <w:pStyle w:val="u2"/>
       </w:pPr>
-      <w:bookmarkStart w:id="3" w:name="_Toc237710256"/>
+      <w:bookmarkStart w:id="3" w:name="_Toc237711303"/>
       <w:r>
         <w:rPr>
           <w:rFonts w:ascii="Times New Roman" w:eastAsia="Times New Roman" w:hAnsi="Times New Roman"/>
@@ -3384,7 +3384,7 @@
       <w:pPr>
         <w:pStyle w:val="u2"/>
       </w:pPr>
-      <w:bookmarkStart w:id="4" w:name="_Toc237710257"/>
+      <w:bookmarkStart w:id="4" w:name="_Toc237711304"/>
       <w:r>
         <w:rPr>
           <w:rFonts w:ascii="Times New Roman" w:eastAsia="Times New Roman" w:hAnsi="Times New Roman"/>
@@ -3430,7 +3430,7 @@
       <w:pPr>
         <w:pStyle w:val="u2"/>
       </w:pPr>
-      <w:bookmarkStart w:id="5" w:name="_Toc237710258"/>
+      <w:bookmarkStart w:id="5" w:name="_Toc237711305"/>
       <w:r>
         <w:rPr>
           <w:rFonts w:ascii="Times New Roman" w:eastAsia="Times New Roman" w:hAnsi="Times New Roman"/>
@@ -3449,7 +3449,7 @@
       <w:pPr>
         <w:pStyle w:val="u2"/>
       </w:pPr>
-      <w:bookmarkStart w:id="6" w:name="_Toc237710259"/>
+      <w:bookmarkStart w:id="6" w:name="_Toc237711306"/>
       <w:r>
         <w:rPr>
           <w:rFonts w:ascii="Times New Roman" w:eastAsia="Times New Roman" w:hAnsi="Times New Roman"/>
@@ -3533,7 +3533,7 @@
       <w:pPr>
         <w:pStyle w:val="u1"/>
       </w:pPr>
-      <w:bookmarkStart w:id="7" w:name="_Toc237710260"/>
+      <w:bookmarkStart w:id="7" w:name="_Toc237711307"/>
       <w:r>
         <w:rPr>
           <w:rFonts w:ascii="Times New Roman" w:eastAsia="Times New Roman" w:hAnsi="Times New Roman"/>
@@ -3548,7 +3548,7 @@
       <w:pPr>
         <w:pStyle w:val="u2"/>
       </w:pPr>
-      <w:bookmarkStart w:id="8" w:name="_Toc237710261"/>
+      <w:bookmarkStart w:id="8" w:name="_Toc237711308"/>
       <w:r>
         <w:rPr>
           <w:rFonts w:ascii="Times New Roman" w:eastAsia="Times New Roman" w:hAnsi="Times New Roman"/>
@@ -3586,7 +3586,7 @@
       <w:pPr>
         <w:pStyle w:val="u2"/>
       </w:pPr>
-      <w:bookmarkStart w:id="9" w:name="_Toc237710262"/>
+      <w:bookmarkStart w:id="9" w:name="_Toc237711309"/>
       <w:r>
         <w:rPr>
           <w:rFonts w:ascii="Times New Roman" w:eastAsia="Times New Roman" w:hAnsi="Times New Roman"/>
@@ -3704,7 +3704,7 @@
       <w:pPr>
         <w:pStyle w:val="u2"/>
       </w:pPr>
-      <w:bookmarkStart w:id="10" w:name="_Toc237710263"/>
+      <w:bookmarkStart w:id="10" w:name="_Toc237711310"/>
       <w:r>
         <w:rPr>
           <w:rFonts w:ascii="Times New Roman" w:eastAsia="Times New Roman" w:hAnsi="Times New Roman"/>
@@ -3752,18 +3752,20 @@
         <w:tblLook w:val="04A0" w:firstRow="1" w:lastRow="0" w:firstColumn="1" w:lastColumn="0" w:noHBand="0" w:noVBand="1"/>
       </w:tblPr>
       <w:tblGrid>
-        <w:gridCol w:w="1984"/>
-        <w:gridCol w:w="2551"/>
-        <w:gridCol w:w="2154"/>
+        <w:gridCol w:w="1814"/>
+        <w:gridCol w:w="2608"/>
+        <w:gridCol w:w="2268"/>
         <w:gridCol w:w="2268"/>
       </w:tblGrid>
       <w:tr>
         <w:trPr>
+          <w:cantSplit/>
+          <w:tblHeader/>
           <w:jc w:val="center"/>
         </w:trPr>
         <w:tc>
           <w:tcPr>
-            <w:tcW w:w="1984" w:type="dxa"/>
+            <w:tcW w:w="1814" w:type="dxa"/>
             <w:vAlign w:val="center"/>
           </w:tcPr>
           <w:p>
@@ -3783,7 +3785,7 @@
         </w:tc>
         <w:tc>
           <w:tcPr>
-            <w:tcW w:w="2551" w:type="dxa"/>
+            <w:tcW w:w="2608" w:type="dxa"/>
             <w:vAlign w:val="center"/>
           </w:tcPr>
           <w:p>
@@ -3803,7 +3805,7 @@
         </w:tc>
         <w:tc>
           <w:tcPr>
-            <w:tcW w:w="2154" w:type="dxa"/>
+            <w:tcW w:w="2268" w:type="dxa"/>
             <w:vAlign w:val="center"/>
           </w:tcPr>
           <w:p>
@@ -3844,11 +3846,12 @@
       </w:tr>
       <w:tr>
         <w:trPr>
+          <w:cantSplit/>
           <w:jc w:val="center"/>
         </w:trPr>
         <w:tc>
           <w:tcPr>
-            <w:tcW w:w="1984" w:type="dxa"/>
+            <w:tcW w:w="1814" w:type="dxa"/>
             <w:vAlign w:val="center"/>
           </w:tcPr>
           <w:p>
@@ -3867,7 +3870,7 @@
         </w:tc>
         <w:tc>
           <w:tcPr>
-            <w:tcW w:w="2551" w:type="dxa"/>
+            <w:tcW w:w="2608" w:type="dxa"/>
             <w:vAlign w:val="center"/>
           </w:tcPr>
           <w:p>
@@ -3886,7 +3889,7 @@
         </w:tc>
         <w:tc>
           <w:tcPr>
-            <w:tcW w:w="2154" w:type="dxa"/>
+            <w:tcW w:w="2268" w:type="dxa"/>
             <w:vAlign w:val="center"/>
           </w:tcPr>
           <w:p>
@@ -3963,7 +3966,7 @@
       <w:pPr>
         <w:pStyle w:val="u2"/>
       </w:pPr>
-      <w:bookmarkStart w:id="11" w:name="_Toc237710264"/>
+      <w:bookmarkStart w:id="11" w:name="_Toc237711311"/>
       <w:r>
         <w:rPr>
           <w:rFonts w:ascii="Times New Roman" w:eastAsia="Times New Roman" w:hAnsi="Times New Roman"/>
@@ -4036,7 +4039,7 @@
       <w:pPr>
         <w:pStyle w:val="u2"/>
       </w:pPr>
-      <w:bookmarkStart w:id="12" w:name="_Toc237710265"/>
+      <w:bookmarkStart w:id="12" w:name="_Toc237711312"/>
       <w:r>
         <w:rPr>
           <w:rFonts w:ascii="Times New Roman" w:eastAsia="Times New Roman" w:hAnsi="Times New Roman"/>
@@ -4106,7 +4109,7 @@
       </w:r>
       <w:r>
         <w:lastRenderedPageBreak/>
-        <w:t>quả về mặt thời gian và giữ vai trò là nguyên nhân trực tiếp dẫn tới hậu quả nguy hại đó.</w:t>
+        <w:t>quả về mặt thời gian và giữ vai trò là nguyên nhân có mối liên hệ nội tại tất yếu dẫn tới hậu quả nguy hại đó.</w:t>
       </w:r>
     </w:p>
     <w:p>
@@ -4131,7 +4134,7 @@
       <w:pPr>
         <w:pStyle w:val="u2"/>
       </w:pPr>
-      <w:bookmarkStart w:id="13" w:name="_Toc237710266"/>
+      <w:bookmarkStart w:id="13" w:name="_Toc237711313"/>
       <w:r>
         <w:rPr>
           <w:rFonts w:ascii="Times New Roman" w:eastAsia="Times New Roman" w:hAnsi="Times New Roman"/>
@@ -4187,7 +4190,7 @@
       <w:pPr>
         <w:pStyle w:val="u2"/>
       </w:pPr>
-      <w:bookmarkStart w:id="14" w:name="_Toc237710267"/>
+      <w:bookmarkStart w:id="14" w:name="_Toc237711314"/>
       <w:r>
         <w:rPr>
           <w:rFonts w:ascii="Times New Roman" w:eastAsia="Times New Roman" w:hAnsi="Times New Roman"/>
@@ -4293,7 +4296,7 @@
       <w:pPr>
         <w:pStyle w:val="u1"/>
       </w:pPr>
-      <w:bookmarkStart w:id="15" w:name="_Toc237710268"/>
+      <w:bookmarkStart w:id="15" w:name="_Toc237711315"/>
       <w:r>
         <w:rPr>
           <w:rFonts w:ascii="Times New Roman" w:eastAsia="Times New Roman" w:hAnsi="Times New Roman"/>
@@ -4308,7 +4311,7 @@
       <w:pPr>
         <w:pStyle w:val="u2"/>
       </w:pPr>
-      <w:bookmarkStart w:id="16" w:name="_Toc237710269"/>
+      <w:bookmarkStart w:id="16" w:name="_Toc237711316"/>
       <w:r>
         <w:rPr>
           <w:rFonts w:ascii="Times New Roman" w:eastAsia="Times New Roman" w:hAnsi="Times New Roman"/>
@@ -4350,7 +4353,7 @@
       <w:pPr>
         <w:pStyle w:val="u2"/>
       </w:pPr>
-      <w:bookmarkStart w:id="17" w:name="_Toc237710270"/>
+      <w:bookmarkStart w:id="17" w:name="_Toc237711317"/>
       <w:r>
         <w:rPr>
           <w:rFonts w:ascii="Times New Roman" w:eastAsia="Times New Roman" w:hAnsi="Times New Roman"/>
@@ -4490,6 +4493,8 @@
       </w:tblGrid>
       <w:tr>
         <w:trPr>
+          <w:cantSplit/>
+          <w:tblHeader/>
           <w:jc w:val="center"/>
         </w:trPr>
         <w:tc>
@@ -4555,6 +4560,7 @@
       </w:tr>
       <w:tr>
         <w:trPr>
+          <w:cantSplit/>
           <w:jc w:val="center"/>
         </w:trPr>
         <w:tc>
@@ -4618,6 +4624,7 @@
       </w:tr>
       <w:tr>
         <w:trPr>
+          <w:cantSplit/>
           <w:jc w:val="center"/>
         </w:trPr>
         <w:tc>
@@ -4681,6 +4688,7 @@
       </w:tr>
       <w:tr>
         <w:trPr>
+          <w:cantSplit/>
           <w:jc w:val="center"/>
         </w:trPr>
         <w:tc>
@@ -4744,6 +4752,7 @@
       </w:tr>
       <w:tr>
         <w:trPr>
+          <w:cantSplit/>
           <w:jc w:val="center"/>
         </w:trPr>
         <w:tc>
@@ -4810,7 +4819,7 @@
       <w:pPr>
         <w:pStyle w:val="u2"/>
       </w:pPr>
-      <w:bookmarkStart w:id="18" w:name="_Toc237710271"/>
+      <w:bookmarkStart w:id="18" w:name="_Toc237711318"/>
       <w:r>
         <w:rPr>
           <w:rFonts w:ascii="Times New Roman" w:eastAsia="Times New Roman" w:hAnsi="Times New Roman"/>
@@ -4877,7 +4886,7 @@
       <w:pPr>
         <w:pStyle w:val="u2"/>
       </w:pPr>
-      <w:bookmarkStart w:id="19" w:name="_Toc237710272"/>
+      <w:bookmarkStart w:id="19" w:name="_Toc237711319"/>
       <w:r>
         <w:rPr>
           <w:rFonts w:ascii="Times New Roman" w:eastAsia="Times New Roman" w:hAnsi="Times New Roman"/>
@@ -4967,7 +4976,7 @@
       <w:pPr>
         <w:pStyle w:val="u2"/>
       </w:pPr>
-      <w:bookmarkStart w:id="20" w:name="_Toc237710273"/>
+      <w:bookmarkStart w:id="20" w:name="_Toc237711320"/>
       <w:r>
         <w:rPr>
           <w:rFonts w:ascii="Times New Roman" w:eastAsia="Times New Roman" w:hAnsi="Times New Roman"/>
@@ -5005,6 +5014,8 @@
       </w:tblGrid>
       <w:tr>
         <w:trPr>
+          <w:cantSplit/>
+          <w:tblHeader/>
           <w:jc w:val="center"/>
         </w:trPr>
         <w:tc>
@@ -5070,6 +5081,7 @@
       </w:tr>
       <w:tr>
         <w:trPr>
+          <w:cantSplit/>
           <w:jc w:val="center"/>
         </w:trPr>
         <w:tc>
@@ -5133,6 +5145,7 @@
       </w:tr>
       <w:tr>
         <w:trPr>
+          <w:cantSplit/>
           <w:jc w:val="center"/>
         </w:trPr>
         <w:tc>
@@ -5196,6 +5209,7 @@
       </w:tr>
       <w:tr>
         <w:trPr>
+          <w:cantSplit/>
           <w:jc w:val="center"/>
         </w:trPr>
         <w:tc>
@@ -5259,6 +5273,7 @@
       </w:tr>
       <w:tr>
         <w:trPr>
+          <w:cantSplit/>
           <w:jc w:val="center"/>
         </w:trPr>
         <w:tc>
@@ -5322,6 +5337,7 @@
       </w:tr>
       <w:tr>
         <w:trPr>
+          <w:cantSplit/>
           <w:jc w:val="center"/>
         </w:trPr>
         <w:tc>
@@ -5385,6 +5401,7 @@
       </w:tr>
       <w:tr>
         <w:trPr>
+          <w:cantSplit/>
           <w:jc w:val="center"/>
         </w:trPr>
         <w:tc>
@@ -5448,6 +5465,7 @@
       </w:tr>
       <w:tr>
         <w:trPr>
+          <w:cantSplit/>
           <w:jc w:val="center"/>
         </w:trPr>
         <w:tc>
@@ -5511,6 +5529,7 @@
       </w:tr>
       <w:tr>
         <w:trPr>
+          <w:cantSplit/>
           <w:jc w:val="center"/>
         </w:trPr>
         <w:tc>
@@ -5574,6 +5593,7 @@
       </w:tr>
       <w:tr>
         <w:trPr>
+          <w:cantSplit/>
           <w:jc w:val="center"/>
         </w:trPr>
         <w:tc>
@@ -5637,6 +5657,7 @@
       </w:tr>
       <w:tr>
         <w:trPr>
+          <w:cantSplit/>
           <w:jc w:val="center"/>
         </w:trPr>
         <w:tc>
@@ -5727,6 +5748,8 @@
       </w:tblGrid>
       <w:tr>
         <w:trPr>
+          <w:cantSplit/>
+          <w:tblHeader/>
           <w:jc w:val="center"/>
         </w:trPr>
         <w:tc>
@@ -5792,6 +5815,7 @@
       </w:tr>
       <w:tr>
         <w:trPr>
+          <w:cantSplit/>
           <w:jc w:val="center"/>
         </w:trPr>
         <w:tc>
@@ -5855,6 +5879,7 @@
       </w:tr>
       <w:tr>
         <w:trPr>
+          <w:cantSplit/>
           <w:jc w:val="center"/>
         </w:trPr>
         <w:tc>
@@ -5918,6 +5943,7 @@
       </w:tr>
       <w:tr>
         <w:trPr>
+          <w:cantSplit/>
           <w:jc w:val="center"/>
         </w:trPr>
         <w:tc>
@@ -5981,6 +6007,7 @@
       </w:tr>
       <w:tr>
         <w:trPr>
+          <w:cantSplit/>
           <w:jc w:val="center"/>
         </w:trPr>
         <w:tc>
@@ -6044,6 +6071,7 @@
       </w:tr>
       <w:tr>
         <w:trPr>
+          <w:cantSplit/>
           <w:jc w:val="center"/>
         </w:trPr>
         <w:tc>
@@ -6110,7 +6138,7 @@
       <w:pPr>
         <w:pStyle w:val="u1"/>
       </w:pPr>
-      <w:bookmarkStart w:id="21" w:name="_Toc237710274"/>
+      <w:bookmarkStart w:id="21" w:name="_Toc237711321"/>
       <w:r>
         <w:rPr>
           <w:rFonts w:ascii="Times New Roman" w:eastAsia="Times New Roman" w:hAnsi="Times New Roman"/>
@@ -6130,7 +6158,7 @@
       <w:pPr>
         <w:pStyle w:val="u2"/>
       </w:pPr>
-      <w:bookmarkStart w:id="22" w:name="_Toc237710275"/>
+      <w:bookmarkStart w:id="22" w:name="_Toc237711322"/>
       <w:r>
         <w:rPr>
           <w:rFonts w:ascii="Times New Roman" w:eastAsia="Times New Roman" w:hAnsi="Times New Roman"/>
@@ -6295,7 +6323,10 @@
         <w:t>Điều 32 Bộ luật Dân sự năm 2015</w:t>
       </w:r>
       <w:r>
-        <w:t>, việc sử dụng hình ảnh của cá nhân phải được người đó đồng ý [2]. Hành vi tự ý chỉnh sửa, cắt ghép video, hình ảnh của người nổi tiếng để phục vụ mục đích bán hàng đã xâm phạm quyền về hình ảnh và có nguy cơ ảnh hưởng xấu đến uy tín cá nhân của họ.</w:t>
+        <w:t xml:space="preserve"> [2] và pháp luật về quảng cáo [3], việc sử dụng hình ảnh cá nhân trong tiếp thị phải tuân thủ sự đồng ý hợp pháp hoặc các trường hợp luật định. Dữ kiện công khai ghi nhận việc sử dụng video, hình ảnh người nổi tiếng đã qua chỉnh sửa, cắt ghép để tiếp thị [6]. Dưới góc độ lý luận, nếu việc khai thác hình ảnh này diễn ra ngoài phạm vi đồng ý hoặc không thuộc ngoại lệ luật định thì đặt ra vấn đề xâm hại quyền nhân thân về hình ảnh. Cần lưu ý rằng nguồn tin công khai hiện chưa cung cấp đầy đủ thông tin về tình</w:t>
+      </w:r>
+      <w:r>
+        <w:t xml:space="preserve"> trạng thỏa thuận hoặc sự đồng ý của từng cá nhân xuất hiện trong hình ảnh.</w:t>
       </w:r>
     </w:p>
     <w:p>
@@ -6326,6 +6357,8 @@
       </w:tblGrid>
       <w:tr>
         <w:trPr>
+          <w:cantSplit/>
+          <w:tblHeader/>
           <w:jc w:val="center"/>
         </w:trPr>
         <w:tc>
@@ -6391,6 +6424,7 @@
       </w:tr>
       <w:tr>
         <w:trPr>
+          <w:cantSplit/>
           <w:jc w:val="center"/>
         </w:trPr>
         <w:tc>
@@ -6454,6 +6488,7 @@
       </w:tr>
       <w:tr>
         <w:trPr>
+          <w:cantSplit/>
           <w:jc w:val="center"/>
         </w:trPr>
         <w:tc>
@@ -6517,6 +6552,7 @@
       </w:tr>
       <w:tr>
         <w:trPr>
+          <w:cantSplit/>
           <w:jc w:val="center"/>
         </w:trPr>
         <w:tc>
@@ -6554,7 +6590,7 @@
               <w:rPr>
                 <w:sz w:val="19"/>
               </w:rPr>
-              <w:t>Khách hàng đặt mua qua 5.429 đơn hàng; người nổi tiếng bị sử dụng hình ảnh</w:t>
+              <w:t>Khách hàng đặt mua qua 5.429 đơn hàng; người nổi tiếng xuất hiện trong tư liệu quảng cáo cắt ghép</w:t>
             </w:r>
           </w:p>
         </w:tc>
@@ -6573,7 +6609,7 @@
               <w:rPr>
                 <w:sz w:val="19"/>
               </w:rPr>
-              <w:t>Không suy đoán số lượng khách hàng riêng biệt hay ý chí từng người</w:t>
+              <w:t>Không suy đoán số lượng khách hàng riêng biệt, ý chí từng người hay tình trạng thỏa thuận hình ảnh</w:t>
             </w:r>
           </w:p>
         </w:tc>
@@ -6593,19 +6629,20 @@
     </w:p>
     <w:p>
       <w:r>
-        <w:t>Việc xác định khách thể cho thấy hành vi bị cáo buộc đã xâm hại đa chiều đến các quan hệ xã hội được pháp luật bảo vệ, bao gồm cả trật tự quản lý công cộng và quyền lợi hợp pháp của các chủ thể tham gia giao dịch trên không gian mạng.</w:t>
+        <w:t>Việc xác định khách thể cho thấy hành vi bị cáo buộc có thể tác động đa chiều đến các quan hệ xã hội được pháp luật bảo vệ, bao gồm cả trật tự quản lý công cộng và quyền lợi hợp pháp của các chủ thể tham gia giao dịch trên không gian mạng.</w:t>
       </w:r>
     </w:p>
     <w:p>
       <w:pPr>
         <w:pStyle w:val="u2"/>
       </w:pPr>
-      <w:bookmarkStart w:id="23" w:name="_Toc237710276"/>
+      <w:bookmarkStart w:id="23" w:name="_Toc237711323"/>
       <w:r>
         <w:rPr>
           <w:rFonts w:ascii="Times New Roman" w:eastAsia="Times New Roman" w:hAnsi="Times New Roman"/>
           <w:b w:val="0"/>
         </w:rPr>
+        <w:lastRenderedPageBreak/>
         <w:t>3.2. Phân tích yếu tố Mặt khách quan của vi phạm pháp luật</w:t>
       </w:r>
       <w:bookmarkEnd w:id="23"/>
@@ -6636,7 +6673,6 @@
           <w:rFonts w:ascii="Times New Roman" w:eastAsia="Times New Roman" w:hAnsi="Times New Roman"/>
           <w:b w:val="0"/>
         </w:rPr>
-        <w:lastRenderedPageBreak/>
         <w:t>3.2.2. Dữ kiện thực tế ghi nhận</w:t>
       </w:r>
     </w:p>
@@ -6734,28 +6770,28 @@
         <w:rPr>
           <w:b/>
         </w:rPr>
-        <w:t>Hành vi sử dụng trái phép hình ảnh người nổi tiếng:</w:t>
-      </w:r>
-      <w:r>
-        <w:t xml:space="preserve"> Cắt ghép video, hình ảnh người nổi tiếng lồng ghép vào nội dung tiếp thị mà không có sự đồng ý hợp pháp, trái với </w:t>
+        <w:t>Hành vi khai thác hình ảnh cắt ghép người nổi tiếng trong quảng cáo:</w:t>
+      </w:r>
+      <w:r>
+        <w:t xml:space="preserve"> Nguồn tin ghi nhận việc sử dụng hình ảnh, video cắt ghép người nổi tiếng lồng ghép vào nội dung tiếp thị [6]. Hoạt động này được đối chiếu với quy định tại </w:t>
       </w:r>
       <w:r>
         <w:rPr>
           <w:b/>
         </w:rPr>
+        <w:t>khoản 8 Điều 8 Luật Quảng cáo</w:t>
+      </w:r>
+      <w:r>
+        <w:t xml:space="preserve"> [3] và </w:t>
+      </w:r>
+      <w:r>
+        <w:rPr>
+          <w:b/>
+        </w:rPr>
         <w:t>Điều 32 Bộ luật Dân sự 2015</w:t>
       </w:r>
       <w:r>
-        <w:t xml:space="preserve"> [2] và </w:t>
-      </w:r>
-      <w:r>
-        <w:rPr>
-          <w:b/>
-        </w:rPr>
-        <w:t>khoản 8 Điều 8 Luật Quảng cáo</w:t>
-      </w:r>
-      <w:r>
-        <w:t xml:space="preserve"> [3].</w:t>
+        <w:t xml:space="preserve"> [2] về điều kiện sử dụng hình ảnh cá nhân; nếu việc sử dụng không có sự đồng ý hợp lệ thì đây là một dạng hành vi trái quy định pháp luật.</w:t>
       </w:r>
     </w:p>
     <w:p>
@@ -6795,6 +6831,7 @@
           <w:b w:val="0"/>
           <w:i w:val="0"/>
         </w:rPr>
+        <w:lastRenderedPageBreak/>
         <w:t>B. Quy mô và kết quả giao dịch ghi nhận</w:t>
       </w:r>
     </w:p>
@@ -6827,11 +6864,10 @@
     </w:p>
     <w:p>
       <w:r>
-        <w:t xml:space="preserve">Thông tin quảng cáo sai sự thật và hình ảnh cắt ghép đóng vai trò là yếu tố nguyên nhân trực tiếp dẫn dắt, tạo niềm tin sai lệch cho khách hàng tiếp cận trên </w:t>
-      </w:r>
-      <w:r>
-        <w:lastRenderedPageBreak/>
-        <w:t>mạng xã hội, từ đó thúc đẩy việc đặt mua 5.429 đơn hàng. Có mối liên hệ nhân quả khách quan giữa hành vi cung cấp thông tin sai lệch và hậu quả người mua chi trả tiền cho các đơn hàng.</w:t>
+        <w:t>Nội dung quảng cáo sai sự thật và hình ảnh cắt ghép có khả năng tác động trực tiếp đến nhận thức, định hướng niềm tin của người tiếp cận thông tin trên mạng xã hội. Mối liên hệ giữa quy trình quảng cáo sai lệch và kết quả 5.429 đơn hàng được xác lập tạo cơ sở lý luận để phân tích mối quan hệ nhân quả trong học phần Pháp luật đại cương. Dưới góc độ nghiên cứu học thuật, báo cáo không khái quát rằng toàn bộ 5.429 đơn hàng đều xuất phát duy nhất từ yếu tố quảng cáo gian dối do dữ liệu công khai chưa cung cấp đ</w:t>
+      </w:r>
+      <w:r>
+        <w:t>ộng cơ mua hàng cụ thể của từng người mua.</w:t>
       </w:r>
     </w:p>
     <w:p>
@@ -6848,14 +6884,14 @@
     </w:p>
     <w:p>
       <w:r>
-        <w:t>Mặt khách quan thể hiện rõ chuỗi hành vi hành động có tổ chức, sử dụng công nghệ số để phát tán thông tin sai lệch diện rộng, tạo ra quy mô giao dịch đáng kể trên thị trường trực tuyến.</w:t>
+        <w:t>Mặt khách quan thể hiện rõ chuỗi hành vi hành động được triển khai theo nhiều khâu, sử dụng công nghệ số để phát tán thông tin sai lệch diện rộng, tạo ra quy mô giao dịch đáng kể trên thị trường trực tuyến.</w:t>
       </w:r>
     </w:p>
     <w:p>
       <w:pPr>
         <w:pStyle w:val="u2"/>
       </w:pPr>
-      <w:bookmarkStart w:id="24" w:name="_Toc237710277"/>
+      <w:bookmarkStart w:id="24" w:name="_Toc237711324"/>
       <w:r>
         <w:rPr>
           <w:rFonts w:ascii="Times New Roman" w:eastAsia="Times New Roman" w:hAnsi="Times New Roman"/>
@@ -6905,7 +6941,7 @@
         <w:t>21 bị can</w:t>
       </w:r>
       <w:r>
-        <w:t>, trong đó Nguyễn Tiến Đạt sinh năm 1997 (29 tuổi tính đến năm 2026) được xác định là người tổ chức [6]. Phùng Thị Nguyệt Ánh là người liên quan đang tiếp tục được làm rõ hành vi; các nhân sự khác được phân công theo nhóm marketing, bán hàng, vận đơn [6].</w:t>
+        <w:t>, trong đó Nguyễn Tiến Đạt sinh năm 1997 được xác định là người tổ chức [6]. Phùng Thị Nguyệt Ánh là người liên quan đang tiếp tục được làm rõ hành vi; các nhân sự khác được phân công theo nhóm marketing, bán hàng, vận đơn [6].</w:t>
       </w:r>
     </w:p>
     <w:p>
@@ -6917,6 +6953,7 @@
           <w:rFonts w:ascii="Times New Roman" w:eastAsia="Times New Roman" w:hAnsi="Times New Roman"/>
           <w:b w:val="0"/>
         </w:rPr>
+        <w:lastRenderedPageBreak/>
         <w:t>3.3.3. Phân tích pháp lý chi tiết</w:t>
       </w:r>
     </w:p>
@@ -6946,7 +6983,7 @@
         <w:t>Về độ tuổi:</w:t>
       </w:r>
       <w:r>
-        <w:t xml:space="preserve"> Bị can Nguyễn Tiến Đạt sinh năm 1997, đã đủ tuổi thành niên chịu trách nhiệm pháp lý đầy đủ. Đối với 20 bị can còn lại, nguồn tin công khai không công bố năm sinh của từng người; việc họ tham gia làm việc và bị khởi tố cho thấy cơ quan điều tra đã bước đầu thẩm tra điều kiện chủ thể theo quy trình tố tụng.</w:t>
+        <w:t xml:space="preserve"> Bị can Nguyễn Tiến Đạt sinh năm 1997, đã đủ tuổi thành niên tại thời điểm diễn ra vụ việc (năm 2026). Đối với 20 bị can còn lại, tài liệu công khai chưa công bố năm sinh cụ thể; quyết định khởi tố của cơ quan điều tra là bối cảnh tố tụng phản ánh việc thẩm tra ban đầu, nhưng dữ liệu này chưa đủ để đánh giá độc lập về độ tuổi chính xác của từng cá nhân.</w:t>
       </w:r>
     </w:p>
     <w:p>
@@ -6962,11 +6999,7 @@
         <w:t>Về khả năng nhận thức và điều khiển hành vi:</w:t>
       </w:r>
       <w:r>
-        <w:t xml:space="preserve"> Dưới góc độ lý luận, các bị can tham gia hoạt động phân công công việc bình thường, không có thông tin về việc mất khả năng nhận thức. Việc kết luận tuyệt đối tình trạng </w:t>
-      </w:r>
-      <w:r>
-        <w:lastRenderedPageBreak/>
-        <w:t>tâm thần của từng cá nhân thuộc thẩm quyền của cơ quan tiến hành tố tụng dựa trên hồ sơ giám định chuyên môn.</w:t>
+        <w:t xml:space="preserve"> Nguồn tin công khai ghi nhận các cá nhân tham gia vào các khâu công việc cụ thể. Tuy nhiên, các tài liệu công khai được tiếp cận chưa cung cấp đủ dữ liệu để đánh giá độc lập tình trạng nhận thức và điều khiển hành vi của từng bị can; việc xác định chính xác năng lực trách nhiệm pháp lý thuộc thẩm quyền chuyên môn của cơ quan tiến hành tố tụng.</w:t>
       </w:r>
     </w:p>
     <w:p>
@@ -7055,19 +7088,20 @@
     </w:p>
     <w:p>
       <w:r>
-        <w:t>Các chủ thể trong vụ việc đáp ứng các điều kiện lý luận chung về năng lực trách nhiệm pháp lý. Sự phân hóa vai trò cho thấy tính chất có tổ chức trong việc triển khai chuỗi hành vi.</w:t>
+        <w:t>Về mặt lý luận, dữ kiện công khai cho phép xác định độ tuổi thành niên của người tổ chức (Nguyễn Tiến Đạt), trong khi các chủ thể khác cần thêm dữ liệu chứng cứ để đánh giá đầy đủ. Hoạt động thực tế thể hiện sự phân công công việc rõ nét giữa các khâu.</w:t>
       </w:r>
     </w:p>
     <w:p>
       <w:pPr>
         <w:pStyle w:val="u2"/>
       </w:pPr>
-      <w:bookmarkStart w:id="25" w:name="_Toc237710278"/>
+      <w:bookmarkStart w:id="25" w:name="_Toc237711325"/>
       <w:r>
         <w:rPr>
           <w:rFonts w:ascii="Times New Roman" w:eastAsia="Times New Roman" w:hAnsi="Times New Roman"/>
           <w:b w:val="0"/>
         </w:rPr>
+        <w:lastRenderedPageBreak/>
         <w:t>3.4. Phân tích yếu tố Mặt chủ quan của vi phạm pháp luật</w:t>
       </w:r>
       <w:bookmarkEnd w:id="25"/>
@@ -7127,7 +7161,7 @@
         <w:t>Về yếu tố Lỗi:</w:t>
       </w:r>
       <w:r>
-        <w:t xml:space="preserve"> Dữ kiện Đạt chỉ đạo dùng bài viết, video chỉnh sửa/cắt ghép và nội dung phóng đại, sai lệch để tạo niềm tin cho khách hàng là cơ sở xác định dấu hiệu </w:t>
+        <w:t xml:space="preserve"> Dữ kiện Đạt chỉ đạo dùng bài viết, video chỉnh sửa/cắt ghép và nội dung phóng đại, sai lệch để tạo niềm tin cho khách hàng cho thấy dấu hiệu và tạo cơ sở để phân tích theo hướng </w:t>
       </w:r>
       <w:r>
         <w:rPr>
@@ -7149,7 +7183,6 @@
         <w:rPr>
           <w:i/>
         </w:rPr>
-        <w:lastRenderedPageBreak/>
         <w:t>Về lý trí:</w:t>
       </w:r>
       <w:r>
@@ -7250,7 +7283,11 @@
     </w:p>
     <w:p>
       <w:r>
-        <w:t>Đối với các nhân viên ở khâu marketing, bán hàng, vận đơn và đóng gói, tài liệu ban đầu chưa thể hiện chi tiết ý thức chủ quan của từng người. Cơ quan tiến hành tố tụng sẽ làm rõ nhận thức của từng cá nhân để cá thể hóa trách nhiệm và xác định vai trò đồng phạm tương ứng.</w:t>
+        <w:t xml:space="preserve">Đối với các nhân viên ở khâu marketing, bán hàng, vận đơn và đóng gói, tài liệu ban đầu chưa thể hiện chi tiết ý thức chủ quan của từng người. Cơ quan tiến hành </w:t>
+      </w:r>
+      <w:r>
+        <w:lastRenderedPageBreak/>
+        <w:t>tố tụng sẽ làm rõ nhận thức của từng cá nhân để cá thể hóa trách nhiệm và xác định vai trò đồng phạm tương ứng.</w:t>
       </w:r>
     </w:p>
     <w:p>
@@ -7281,6 +7318,8 @@
       </w:tblGrid>
       <w:tr>
         <w:trPr>
+          <w:cantSplit/>
+          <w:tblHeader/>
           <w:jc w:val="center"/>
         </w:trPr>
         <w:tc>
@@ -7346,6 +7385,7 @@
       </w:tr>
       <w:tr>
         <w:trPr>
+          <w:cantSplit/>
           <w:jc w:val="center"/>
         </w:trPr>
         <w:tc>
@@ -7409,6 +7449,7 @@
       </w:tr>
       <w:tr>
         <w:trPr>
+          <w:cantSplit/>
           <w:jc w:val="center"/>
         </w:trPr>
         <w:tc>
@@ -7472,6 +7513,7 @@
       </w:tr>
       <w:tr>
         <w:trPr>
+          <w:cantSplit/>
           <w:jc w:val="center"/>
         </w:trPr>
         <w:tc>
@@ -7509,7 +7551,7 @@
               <w:rPr>
                 <w:sz w:val="19"/>
               </w:rPr>
-              <w:t>Nhận thức rõ tính chất sai lệch và chủ động mong muốn bán hàng $\rightarrow$ Dấu hiệu lỗi cố ý trực tiếp.</w:t>
+              <w:t>Nhận thức rõ tính chất sai lệch và mong muốn bán hàng tạo cơ sở phân tích hướng lỗi cố ý trực tiếp.</w:t>
             </w:r>
           </w:p>
         </w:tc>
@@ -7528,13 +7570,14 @@
               <w:rPr>
                 <w:sz w:val="19"/>
               </w:rPr>
-              <w:t>Vận dụng chuẩn khung lý luận môn học</w:t>
+              <w:t>Suy luận học thuật có căn cứ lý luận</w:t>
             </w:r>
           </w:p>
         </w:tc>
       </w:tr>
       <w:tr>
         <w:trPr>
+          <w:cantSplit/>
           <w:jc w:val="center"/>
         </w:trPr>
         <w:tc>
@@ -7606,20 +7649,19 @@
           <w:rFonts w:ascii="Times New Roman" w:eastAsia="Times New Roman" w:hAnsi="Times New Roman"/>
           <w:b w:val="0"/>
         </w:rPr>
-        <w:lastRenderedPageBreak/>
         <w:t>3.4.3. Nhận xét tiểu mục 3.4</w:t>
       </w:r>
     </w:p>
     <w:p>
       <w:r>
-        <w:t>Mặt chủ quan thể hiện rõ lỗi cố ý trực tiếp và động cơ vụ lợi của người tổ chức. Việc phân hóa trạng thái tâm lý theo từng nhóm đối tượng bảo đảm tính chặt chẽ và khách quan của phương pháp luận nghiên cứu pháp lý.</w:t>
+        <w:t>Dưới góc độ lý luận, các dữ kiện công khai tạo cơ sở phân tích hướng lỗi cố ý trực tiếp và động cơ vụ lợi của người tổ chức điều hành. Việc không áp đặt đồng loạt trạng thái tâm lý cho các nhân sự hỗ trợ thể hiện sự chuẩn mực và thận trọng trong phương pháp luận nghiên cứu pháp lý.</w:t>
       </w:r>
     </w:p>
     <w:p>
       <w:pPr>
         <w:pStyle w:val="u2"/>
       </w:pPr>
-      <w:bookmarkStart w:id="26" w:name="_Toc237710279"/>
+      <w:bookmarkStart w:id="26" w:name="_Toc237711326"/>
       <w:r>
         <w:rPr>
           <w:rFonts w:ascii="Times New Roman" w:eastAsia="Times New Roman" w:hAnsi="Times New Roman"/>
@@ -7651,18 +7693,20 @@
         <w:tblLook w:val="04A0" w:firstRow="1" w:lastRow="0" w:firstColumn="1" w:lastColumn="0" w:noHBand="0" w:noVBand="1"/>
       </w:tblPr>
       <w:tblGrid>
-        <w:gridCol w:w="1984"/>
-        <w:gridCol w:w="2551"/>
-        <w:gridCol w:w="2154"/>
+        <w:gridCol w:w="1814"/>
+        <w:gridCol w:w="2608"/>
+        <w:gridCol w:w="2268"/>
         <w:gridCol w:w="2268"/>
       </w:tblGrid>
       <w:tr>
         <w:trPr>
+          <w:cantSplit/>
+          <w:tblHeader/>
           <w:jc w:val="center"/>
         </w:trPr>
         <w:tc>
           <w:tcPr>
-            <w:tcW w:w="1984" w:type="dxa"/>
+            <w:tcW w:w="1814" w:type="dxa"/>
             <w:vAlign w:val="center"/>
           </w:tcPr>
           <w:p>
@@ -7682,7 +7726,7 @@
         </w:tc>
         <w:tc>
           <w:tcPr>
-            <w:tcW w:w="2551" w:type="dxa"/>
+            <w:tcW w:w="2608" w:type="dxa"/>
             <w:vAlign w:val="center"/>
           </w:tcPr>
           <w:p>
@@ -7702,7 +7746,7 @@
         </w:tc>
         <w:tc>
           <w:tcPr>
-            <w:tcW w:w="2154" w:type="dxa"/>
+            <w:tcW w:w="2268" w:type="dxa"/>
             <w:vAlign w:val="center"/>
           </w:tcPr>
           <w:p>
@@ -7743,11 +7787,12 @@
       </w:tr>
       <w:tr>
         <w:trPr>
+          <w:cantSplit/>
           <w:jc w:val="center"/>
         </w:trPr>
         <w:tc>
           <w:tcPr>
-            <w:tcW w:w="1984" w:type="dxa"/>
+            <w:tcW w:w="1814" w:type="dxa"/>
             <w:vAlign w:val="center"/>
           </w:tcPr>
           <w:p>
@@ -7767,7 +7812,7 @@
         </w:tc>
         <w:tc>
           <w:tcPr>
-            <w:tcW w:w="2551" w:type="dxa"/>
+            <w:tcW w:w="2608" w:type="dxa"/>
             <w:vAlign w:val="center"/>
           </w:tcPr>
           <w:p>
@@ -7786,7 +7831,7 @@
         </w:tc>
         <w:tc>
           <w:tcPr>
-            <w:tcW w:w="2154" w:type="dxa"/>
+            <w:tcW w:w="2268" w:type="dxa"/>
             <w:vAlign w:val="center"/>
           </w:tcPr>
           <w:p>
@@ -7819,7 +7864,7 @@
                 <w:b/>
                 <w:sz w:val="19"/>
               </w:rPr>
-              <w:t>Khách thể bị xâm hại đa chiều</w:t>
+              <w:t>Khách thể chịu tác động đa chiều</w:t>
             </w:r>
             <w:r>
               <w:rPr>
@@ -7832,11 +7877,12 @@
       </w:tr>
       <w:tr>
         <w:trPr>
+          <w:cantSplit/>
           <w:jc w:val="center"/>
         </w:trPr>
         <w:tc>
           <w:tcPr>
-            <w:tcW w:w="1984" w:type="dxa"/>
+            <w:tcW w:w="1814" w:type="dxa"/>
             <w:vAlign w:val="center"/>
           </w:tcPr>
           <w:p>
@@ -7856,7 +7902,7 @@
         </w:tc>
         <w:tc>
           <w:tcPr>
-            <w:tcW w:w="2551" w:type="dxa"/>
+            <w:tcW w:w="2608" w:type="dxa"/>
             <w:vAlign w:val="center"/>
           </w:tcPr>
           <w:p>
@@ -7869,13 +7915,13 @@
               <w:rPr>
                 <w:sz w:val="19"/>
               </w:rPr>
-              <w:t>Hành vi quảng cáo sai sự thật, cắt ghép video không phép; phát sinh 5.429 đơn hàng với tổng giá trị hơn 2,67 tỷ đồng.</w:t>
+              <w:t>Hành vi quảng cáo sai sự thật, sử dụng video cắt ghép; phát sinh 5.429 đơn hàng với tổng giá trị tiền hàng hơn 2,67 tỷ đồng theo nguồn công khai.</w:t>
             </w:r>
           </w:p>
         </w:tc>
         <w:tc>
           <w:tcPr>
-            <w:tcW w:w="2154" w:type="dxa"/>
+            <w:tcW w:w="2268" w:type="dxa"/>
             <w:vAlign w:val="center"/>
           </w:tcPr>
           <w:p>
@@ -7888,7 +7934,7 @@
               <w:rPr>
                 <w:sz w:val="19"/>
               </w:rPr>
-              <w:t>Chuỗi hành vi hành động trái pháp luật; có mối liên hệ nhân quả trực tiếp giữa thông tin sai lệch và quyết định đặt mua của khách hàng.</w:t>
+              <w:t>Chuỗi hành vi hành động trái pháp luật; thông tin sai lệch có khả năng tác động đến nhận thức người mua trong chuỗi giao dịch.</w:t>
             </w:r>
           </w:p>
         </w:tc>
@@ -7908,7 +7954,7 @@
                 <w:b/>
                 <w:sz w:val="19"/>
               </w:rPr>
-              <w:t>Hành vi trái pháp luật có tổ chức</w:t>
+              <w:t>Hành vi trái pháp luật qua nhiều khâu</w:t>
             </w:r>
             <w:r>
               <w:rPr>
@@ -7921,11 +7967,12 @@
       </w:tr>
       <w:tr>
         <w:trPr>
+          <w:cantSplit/>
           <w:jc w:val="center"/>
         </w:trPr>
         <w:tc>
           <w:tcPr>
-            <w:tcW w:w="1984" w:type="dxa"/>
+            <w:tcW w:w="1814" w:type="dxa"/>
             <w:vAlign w:val="center"/>
           </w:tcPr>
           <w:p>
@@ -7945,7 +7992,7 @@
         </w:tc>
         <w:tc>
           <w:tcPr>
-            <w:tcW w:w="2551" w:type="dxa"/>
+            <w:tcW w:w="2608" w:type="dxa"/>
             <w:vAlign w:val="center"/>
           </w:tcPr>
           <w:p>
@@ -7964,7 +8011,7 @@
         </w:tc>
         <w:tc>
           <w:tcPr>
-            <w:tcW w:w="2154" w:type="dxa"/>
+            <w:tcW w:w="2268" w:type="dxa"/>
             <w:vAlign w:val="center"/>
           </w:tcPr>
           <w:p>
@@ -7977,7 +8024,7 @@
               <w:rPr>
                 <w:sz w:val="19"/>
               </w:rPr>
-              <w:t>Đạt đủ tuổi thành niên; các cá nhân có năng lực nhận thức theo thẩm tra tố tụng ban đầu; có sự phân công vai trò rõ nét.</w:t>
+              <w:t>Đạt đã thành niên; các chủ thể khác chưa đủ dữ liệu công khai để đánh giá chi tiết; có sự phân công công việc rõ rệt.</w:t>
             </w:r>
           </w:p>
         </w:tc>
@@ -7997,7 +8044,7 @@
                 <w:b/>
                 <w:sz w:val="19"/>
               </w:rPr>
-              <w:t>Chủ thể có năng lực trách nhiệm pháp lý</w:t>
+              <w:t>Xác định được độ tuổi của người tổ chức</w:t>
             </w:r>
             <w:r>
               <w:rPr>
@@ -8010,11 +8057,12 @@
       </w:tr>
       <w:tr>
         <w:trPr>
+          <w:cantSplit/>
           <w:jc w:val="center"/>
         </w:trPr>
         <w:tc>
           <w:tcPr>
-            <w:tcW w:w="1984" w:type="dxa"/>
+            <w:tcW w:w="1814" w:type="dxa"/>
             <w:vAlign w:val="center"/>
           </w:tcPr>
           <w:p>
@@ -8034,7 +8082,7 @@
         </w:tc>
         <w:tc>
           <w:tcPr>
-            <w:tcW w:w="2551" w:type="dxa"/>
+            <w:tcW w:w="2608" w:type="dxa"/>
             <w:vAlign w:val="center"/>
           </w:tcPr>
           <w:p>
@@ -8047,13 +8095,13 @@
               <w:rPr>
                 <w:sz w:val="19"/>
               </w:rPr>
-              <w:t>Cố ý đưa nội dung phóng đại, cắt ghép clip người có uy tín để tạo niềm tin, thúc đẩy bán hàng giá 199k.</w:t>
+              <w:t>Dữ kiện chỉ đạo nội dung phóng đại, cắt ghép tư liệu người có uy tín để tạo niềm tin và bán hàng giá 199k.</w:t>
             </w:r>
           </w:p>
         </w:tc>
         <w:tc>
           <w:tcPr>
-            <w:tcW w:w="2154" w:type="dxa"/>
+            <w:tcW w:w="2268" w:type="dxa"/>
             <w:vAlign w:val="center"/>
           </w:tcPr>
           <w:p>
@@ -8066,7 +8114,7 @@
               <w:rPr>
                 <w:sz w:val="19"/>
               </w:rPr>
-              <w:t>Đạt có lỗi cố ý trực tiếp, động cơ vụ lợi kinh tế; nhân sự hỗ trợ cần chờ cơ quan điều tra làm rõ mức độ nhận thức cụ thể.</w:t>
+              <w:t>Có cơ sở phân tích hướng lỗi cố ý trực tiếp và động cơ vụ lợi ở Đạt; nhân sự hỗ trợ cần thêm chứng cứ cụ thể.</w:t>
             </w:r>
           </w:p>
         </w:tc>
@@ -8086,13 +8134,13 @@
                 <w:b/>
                 <w:sz w:val="19"/>
               </w:rPr>
-              <w:t>Lỗi cố ý trực tiếp ở người tổ chức</w:t>
+              <w:t>Cơ sở phân tích hướng lỗi cố ý trực tiếp ở người tổ chức</w:t>
             </w:r>
             <w:r>
               <w:rPr>
                 <w:sz w:val="19"/>
               </w:rPr>
-              <w:t>, mục đích kinh tế gắn với chuỗi giao dịch.</w:t>
+              <w:t>, động cơ vụ lợi gắn với hoạt động tiếp thị.</w:t>
             </w:r>
           </w:p>
         </w:tc>
@@ -8102,7 +8150,7 @@
       <w:pPr>
         <w:pStyle w:val="u1"/>
       </w:pPr>
-      <w:bookmarkStart w:id="27" w:name="_Toc237710280"/>
+      <w:bookmarkStart w:id="27" w:name="_Toc237711327"/>
       <w:r>
         <w:rPr>
           <w:rFonts w:ascii="Times New Roman" w:eastAsia="Times New Roman" w:hAnsi="Times New Roman"/>
@@ -8117,7 +8165,7 @@
       <w:pPr>
         <w:pStyle w:val="u2"/>
       </w:pPr>
-      <w:bookmarkStart w:id="28" w:name="_Toc237710281"/>
+      <w:bookmarkStart w:id="28" w:name="_Toc237711328"/>
       <w:r>
         <w:rPr>
           <w:rFonts w:ascii="Times New Roman" w:eastAsia="Times New Roman" w:hAnsi="Times New Roman"/>
@@ -8168,7 +8216,7 @@
       <w:pPr>
         <w:pStyle w:val="u2"/>
       </w:pPr>
-      <w:bookmarkStart w:id="29" w:name="_Toc237710282"/>
+      <w:bookmarkStart w:id="29" w:name="_Toc237711329"/>
       <w:r>
         <w:rPr>
           <w:rFonts w:ascii="Times New Roman" w:eastAsia="Times New Roman" w:hAnsi="Times New Roman"/>
@@ -8248,7 +8296,7 @@
       <w:pPr>
         <w:pStyle w:val="u2"/>
       </w:pPr>
-      <w:bookmarkStart w:id="30" w:name="_Toc237710283"/>
+      <w:bookmarkStart w:id="30" w:name="_Toc237711330"/>
       <w:r>
         <w:rPr>
           <w:rFonts w:ascii="Times New Roman" w:eastAsia="Times New Roman" w:hAnsi="Times New Roman"/>
@@ -8306,7 +8354,7 @@
         <w:rPr>
           <w:b/>
         </w:rPr>
-        <w:t>Giữ vững đạo đức nghề nghiệp số (Digital Ethics):</w:t>
+        <w:t>Giữ vững đạo đức nghề nghiệp trong môi trường số:</w:t>
       </w:r>
       <w:r>
         <w:t xml:space="preserve"> Năng lực công nghệ phải được sử dụng để xây dựng các giải pháp hữu ích, phục vụ cộng đồng, không tiếp tay cho các hành vi gian dối, trục lợi bất chính.</w:t>
@@ -8316,7 +8364,7 @@
       <w:pPr>
         <w:pStyle w:val="u1"/>
       </w:pPr>
-      <w:bookmarkStart w:id="31" w:name="_Toc237710284"/>
+      <w:bookmarkStart w:id="31" w:name="_Toc237711331"/>
       <w:r>
         <w:rPr>
           <w:rFonts w:ascii="Times New Roman" w:eastAsia="Times New Roman" w:hAnsi="Times New Roman"/>
@@ -8329,7 +8377,7 @@
     </w:p>
     <w:p>
       <w:r>
-        <w:t>Vận dụng lý luận cấu thành vi phạm pháp luật là phương pháp luận nền tảng của môn học Pháp luật đại cương, giúp phân tích và làm sáng tỏ bản chất pháp lý của các hành vi thực tế trong đời sống xã hội. Qua việc xem xét vụ việc Cơ quan Cảnh sát điều tra Công an tỉnh Phú Thọ khởi tố 21 bị can liên quan đến sản phẩm "Xương khớp bà Sáu", bài tiểu luận đã làm sáng tỏ bốn yếu tố cấu thành:</w:t>
+        <w:t>Vận dụng lý luận cấu thành vi phạm pháp luật là phương pháp luận nền tảng của môn học Pháp luật đại cương, giúp phân tích và làm sáng tỏ bản chất pháp lý của các hành vi thực tế trong đời sống xã hội. Qua việc xem xét vụ việc Cơ quan Cảnh sát điều tra Công an tỉnh Phú Thọ khởi tố 21 bị can liên quan đến sản phẩm "Xương khớp bà Sáu", bài tiểu luận đã tổng hợp bốn yếu tố cấu thành dưới góc độ học thuật:</w:t>
       </w:r>
     </w:p>
     <w:p>
@@ -8347,7 +8395,7 @@
         <w:t>Khách thể:</w:t>
       </w:r>
       <w:r>
-        <w:t xml:space="preserve"> Xâm hại trật tự quản lý nhà nước về hoạt động quảng cáo, thương mại và quyền được bảo đảm thông tin trung thực của người tiêu dùng trong 5.429 đơn hàng được xác lập.</w:t>
+        <w:t xml:space="preserve"> Hành vi bị xem xét tác động tiêu cực đến trật tự quản lý nhà nước về quảng cáo, thương mại, quyền được cung cấp thông tin trung thực của người tiêu dùng và quyền nhân thân về hình ảnh của cá nhân theo quy định pháp luật.</w:t>
       </w:r>
     </w:p>
     <w:p>
@@ -8365,7 +8413,7 @@
         <w:t>Mặt khách quan:</w:t>
       </w:r>
       <w:r>
-        <w:t xml:space="preserve"> Thể hiện qua chuỗi hành vi hành động: sản xuất nội dung quảng cáo sai sự thật, sử dụng trái phép hình ảnh người nổi tiếng và thực hiện giao dịch thu về hơn 2,67 tỷ đồng tiền hàng.</w:t>
+        <w:t xml:space="preserve"> Thể hiện qua chuỗi hành động sản xuất nội dung quảng cáo sai sự thật, khai thác hình ảnh cắt ghép và phát sinh 5.429 đơn hàng thành công với tổng giá trị tiền hàng hơn 2,67 tỷ đồng theo nguồn công khai; tạo cơ sở phân tích mối liên hệ nhân quả giữa hoạt động tiếp thị và kết quả giao dịch.</w:t>
       </w:r>
     </w:p>
     <w:p>
@@ -8383,7 +8431,7 @@
         <w:t>Chủ thể:</w:t>
       </w:r>
       <w:r>
-        <w:t xml:space="preserve"> Gồm 21 bị can đủ điều kiện về năng lực trách nhiệm pháp lý theo ghi nhận tố tụng ban đầu, trong đó có sự phân hóa vai trò giữa người tổ chức điều hành (Nguyễn Tiến Đạt) và các nhóm nhân sự hỗ trợ.</w:t>
+        <w:t xml:space="preserve"> Lý luận môn học yêu cầu chủ thể phải thỏa mãn điều kiện độ tuổi và khả năng nhận thức; dữ liệu công khai cho phép xác định Nguyễn Tiến Đạt đã thành niên, trong khi việc đánh giá toàn diện năng lực trách nhiệm pháp lý của các cá nhân khác cần căn cứ vào kết luận chính thức của cơ quan tố tụng.</w:t>
       </w:r>
     </w:p>
     <w:p>
@@ -8401,7 +8449,7 @@
         <w:t>Mặt chủ quan:</w:t>
       </w:r>
       <w:r>
-        <w:t xml:space="preserve"> Thể hiện lỗi cố ý trực tiếp ở người tổ chức, xuất phát từ động cơ vụ lợi kinh tế và mục đích thúc đẩy bán hàng dựa trên thông tin gian dối.</w:t>
+        <w:t xml:space="preserve"> Dữ kiện thực tế tạo cơ sở phân tích theo hướng lỗi cố ý trực tiếp và động cơ vụ lợi kinh tế đối với người tổ chức điều hành; đối với các nhân sự hỗ trợ, trạng thái tâm lý cần được phân hóa dựa trên mức độ nhận thức cụ thể trong quá trình giải quyết vụ án.</w:t>
       </w:r>
     </w:p>
     <w:p>
@@ -8421,7 +8469,7 @@
       <w:pPr>
         <w:pStyle w:val="u1"/>
       </w:pPr>
-      <w:bookmarkStart w:id="32" w:name="_Toc237710285"/>
+      <w:bookmarkStart w:id="32" w:name="_Toc237711332"/>
       <w:r>
         <w:rPr>
           <w:rFonts w:ascii="Times New Roman" w:eastAsia="Times New Roman" w:hAnsi="Times New Roman"/>
@@ -8436,7 +8484,7 @@
       <w:pPr>
         <w:pStyle w:val="u2"/>
       </w:pPr>
-      <w:bookmarkStart w:id="33" w:name="_Toc237710286"/>
+      <w:bookmarkStart w:id="33" w:name="_Toc237711333"/>
       <w:r>
         <w:rPr>
           <w:rFonts w:ascii="Times New Roman" w:eastAsia="Times New Roman" w:hAnsi="Times New Roman"/>
@@ -8558,7 +8606,7 @@
       <w:pPr>
         <w:pStyle w:val="u2"/>
       </w:pPr>
-      <w:bookmarkStart w:id="34" w:name="_Toc237710287"/>
+      <w:bookmarkStart w:id="34" w:name="_Toc237711334"/>
       <w:r>
         <w:rPr>
           <w:rFonts w:ascii="Times New Roman" w:eastAsia="Times New Roman" w:hAnsi="Times New Roman"/>
@@ -8599,7 +8647,7 @@
       <w:pPr>
         <w:pStyle w:val="u2"/>
       </w:pPr>
-      <w:bookmarkStart w:id="35" w:name="_Toc237710288"/>
+      <w:bookmarkStart w:id="35" w:name="_Toc237711335"/>
       <w:r>
         <w:rPr>
           <w:rFonts w:ascii="Times New Roman" w:eastAsia="Times New Roman" w:hAnsi="Times New Roman"/>
@@ -8907,31 +8955,31 @@
       </w:rPr>
     </w:lvl>
   </w:abstractNum>
-  <w:num w:numId="1" w16cid:durableId="1024983574">
+  <w:num w:numId="1" w16cid:durableId="525217246">
     <w:abstractNumId w:val="8"/>
   </w:num>
-  <w:num w:numId="2" w16cid:durableId="417753484">
+  <w:num w:numId="2" w16cid:durableId="1341546569">
     <w:abstractNumId w:val="6"/>
   </w:num>
-  <w:num w:numId="3" w16cid:durableId="1430196226">
+  <w:num w:numId="3" w16cid:durableId="753623047">
     <w:abstractNumId w:val="5"/>
   </w:num>
-  <w:num w:numId="4" w16cid:durableId="1668286110">
+  <w:num w:numId="4" w16cid:durableId="1686177497">
     <w:abstractNumId w:val="4"/>
   </w:num>
-  <w:num w:numId="5" w16cid:durableId="534729612">
+  <w:num w:numId="5" w16cid:durableId="264581367">
     <w:abstractNumId w:val="7"/>
   </w:num>
-  <w:num w:numId="6" w16cid:durableId="982008354">
+  <w:num w:numId="6" w16cid:durableId="1086659114">
     <w:abstractNumId w:val="3"/>
   </w:num>
-  <w:num w:numId="7" w16cid:durableId="142089984">
+  <w:num w:numId="7" w16cid:durableId="1946116538">
     <w:abstractNumId w:val="2"/>
   </w:num>
-  <w:num w:numId="8" w16cid:durableId="1123111631">
+  <w:num w:numId="8" w16cid:durableId="440607791">
     <w:abstractNumId w:val="1"/>
   </w:num>
-  <w:num w:numId="9" w16cid:durableId="1273781602">
+  <w:num w:numId="9" w16cid:durableId="1818643130">
     <w:abstractNumId w:val="0"/>
   </w:num>
 </w:numbering>
@@ -20334,7 +20382,7 @@
     <w:autoRedefine/>
     <w:uiPriority w:val="39"/>
     <w:unhideWhenUsed/>
-    <w:rsid w:val="00391C19"/>
+    <w:rsid w:val="008A4C59"/>
     <w:pPr>
       <w:spacing w:after="100"/>
     </w:pPr>
@@ -20346,7 +20394,7 @@
     <w:autoRedefine/>
     <w:uiPriority w:val="39"/>
     <w:unhideWhenUsed/>
-    <w:rsid w:val="00391C19"/>
+    <w:rsid w:val="008A4C59"/>
     <w:pPr>
       <w:spacing w:after="100"/>
       <w:ind w:left="260"/>
@@ -20357,7 +20405,7 @@
     <w:basedOn w:val="Phngmcinhcuaoanvn"/>
     <w:uiPriority w:val="99"/>
     <w:unhideWhenUsed/>
-    <w:rsid w:val="00391C19"/>
+    <w:rsid w:val="008A4C59"/>
     <w:rPr>
       <w:color w:val="0000FF" w:themeColor="hyperlink"/>
       <w:u w:val="single"/>

</xml_diff>

<commit_message>
docs: regenerate submission package after precision pass
</commit_message>
<xml_diff>
--- a/report/BaoCao_TieuLuan_PLDC_UIT_FINAL.docx
+++ b/report/BaoCao_TieuLuan_PLDC_UIT_FINAL.docx
@@ -807,7 +807,7 @@
       <w:r>
         <w:fldChar w:fldCharType="separate"/>
       </w:r>
-      <w:hyperlink w:anchor="_Toc237711300" w:history="1">
+      <w:hyperlink w:anchor="_Toc237714968" w:history="1">
         <w:r>
           <w:rPr>
             <w:rStyle w:val="Siuktni"/>
@@ -834,7 +834,7 @@
             <w:noProof/>
             <w:webHidden/>
           </w:rPr>
-          <w:instrText xml:space="preserve"> PAGEREF _Toc237711300 \h </w:instrText>
+          <w:instrText xml:space="preserve"> PAGEREF _Toc237714968 \h </w:instrText>
         </w:r>
         <w:r>
           <w:rPr>
@@ -875,7 +875,7 @@
           <w:noProof/>
         </w:rPr>
       </w:pPr>
-      <w:hyperlink w:anchor="_Toc237711301" w:history="1">
+      <w:hyperlink w:anchor="_Toc237714969" w:history="1">
         <w:r>
           <w:rPr>
             <w:rStyle w:val="Siuktni"/>
@@ -902,7 +902,7 @@
             <w:noProof/>
             <w:webHidden/>
           </w:rPr>
-          <w:instrText xml:space="preserve"> PAGEREF _Toc237711301 \h </w:instrText>
+          <w:instrText xml:space="preserve"> PAGEREF _Toc237714969 \h </w:instrText>
         </w:r>
         <w:r>
           <w:rPr>
@@ -943,7 +943,7 @@
           <w:noProof/>
         </w:rPr>
       </w:pPr>
-      <w:hyperlink w:anchor="_Toc237711302" w:history="1">
+      <w:hyperlink w:anchor="_Toc237714970" w:history="1">
         <w:r>
           <w:rPr>
             <w:rStyle w:val="Siuktni"/>
@@ -970,7 +970,7 @@
             <w:noProof/>
             <w:webHidden/>
           </w:rPr>
-          <w:instrText xml:space="preserve"> PAGEREF _Toc237711302 \h </w:instrText>
+          <w:instrText xml:space="preserve"> PAGEREF _Toc237714970 \h </w:instrText>
         </w:r>
         <w:r>
           <w:rPr>
@@ -1011,7 +1011,7 @@
           <w:noProof/>
         </w:rPr>
       </w:pPr>
-      <w:hyperlink w:anchor="_Toc237711303" w:history="1">
+      <w:hyperlink w:anchor="_Toc237714971" w:history="1">
         <w:r>
           <w:rPr>
             <w:rStyle w:val="Siuktni"/>
@@ -1038,7 +1038,7 @@
             <w:noProof/>
             <w:webHidden/>
           </w:rPr>
-          <w:instrText xml:space="preserve"> PAGEREF _Toc237711303 \h </w:instrText>
+          <w:instrText xml:space="preserve"> PAGEREF _Toc237714971 \h </w:instrText>
         </w:r>
         <w:r>
           <w:rPr>
@@ -1079,7 +1079,7 @@
           <w:noProof/>
         </w:rPr>
       </w:pPr>
-      <w:hyperlink w:anchor="_Toc237711304" w:history="1">
+      <w:hyperlink w:anchor="_Toc237714972" w:history="1">
         <w:r>
           <w:rPr>
             <w:rStyle w:val="Siuktni"/>
@@ -1106,7 +1106,7 @@
             <w:noProof/>
             <w:webHidden/>
           </w:rPr>
-          <w:instrText xml:space="preserve"> PAGEREF _Toc237711304 \h </w:instrText>
+          <w:instrText xml:space="preserve"> PAGEREF _Toc237714972 \h </w:instrText>
         </w:r>
         <w:r>
           <w:rPr>
@@ -1147,7 +1147,7 @@
           <w:noProof/>
         </w:rPr>
       </w:pPr>
-      <w:hyperlink w:anchor="_Toc237711305" w:history="1">
+      <w:hyperlink w:anchor="_Toc237714973" w:history="1">
         <w:r>
           <w:rPr>
             <w:rStyle w:val="Siuktni"/>
@@ -1174,7 +1174,7 @@
             <w:noProof/>
             <w:webHidden/>
           </w:rPr>
-          <w:instrText xml:space="preserve"> PAGEREF _Toc237711305 \h </w:instrText>
+          <w:instrText xml:space="preserve"> PAGEREF _Toc237714973 \h </w:instrText>
         </w:r>
         <w:r>
           <w:rPr>
@@ -1215,7 +1215,7 @@
           <w:noProof/>
         </w:rPr>
       </w:pPr>
-      <w:hyperlink w:anchor="_Toc237711306" w:history="1">
+      <w:hyperlink w:anchor="_Toc237714974" w:history="1">
         <w:r>
           <w:rPr>
             <w:rStyle w:val="Siuktni"/>
@@ -1242,7 +1242,7 @@
             <w:noProof/>
             <w:webHidden/>
           </w:rPr>
-          <w:instrText xml:space="preserve"> PAGEREF _Toc237711306 \h </w:instrText>
+          <w:instrText xml:space="preserve"> PAGEREF _Toc237714974 \h </w:instrText>
         </w:r>
         <w:r>
           <w:rPr>
@@ -1283,7 +1283,7 @@
           <w:noProof/>
         </w:rPr>
       </w:pPr>
-      <w:hyperlink w:anchor="_Toc237711307" w:history="1">
+      <w:hyperlink w:anchor="_Toc237714975" w:history="1">
         <w:r>
           <w:rPr>
             <w:rStyle w:val="Siuktni"/>
@@ -1310,7 +1310,7 @@
             <w:noProof/>
             <w:webHidden/>
           </w:rPr>
-          <w:instrText xml:space="preserve"> PAGEREF _Toc237711307 \h </w:instrText>
+          <w:instrText xml:space="preserve"> PAGEREF _Toc237714975 \h </w:instrText>
         </w:r>
         <w:r>
           <w:rPr>
@@ -1351,7 +1351,7 @@
           <w:noProof/>
         </w:rPr>
       </w:pPr>
-      <w:hyperlink w:anchor="_Toc237711308" w:history="1">
+      <w:hyperlink w:anchor="_Toc237714976" w:history="1">
         <w:r>
           <w:rPr>
             <w:rStyle w:val="Siuktni"/>
@@ -1378,7 +1378,7 @@
             <w:noProof/>
             <w:webHidden/>
           </w:rPr>
-          <w:instrText xml:space="preserve"> PAGEREF _Toc237711308 \h </w:instrText>
+          <w:instrText xml:space="preserve"> PAGEREF _Toc237714976 \h </w:instrText>
         </w:r>
         <w:r>
           <w:rPr>
@@ -1419,7 +1419,7 @@
           <w:noProof/>
         </w:rPr>
       </w:pPr>
-      <w:hyperlink w:anchor="_Toc237711309" w:history="1">
+      <w:hyperlink w:anchor="_Toc237714977" w:history="1">
         <w:r>
           <w:rPr>
             <w:rStyle w:val="Siuktni"/>
@@ -1446,7 +1446,7 @@
             <w:noProof/>
             <w:webHidden/>
           </w:rPr>
-          <w:instrText xml:space="preserve"> PAGEREF _Toc237711309 \h </w:instrText>
+          <w:instrText xml:space="preserve"> PAGEREF _Toc237714977 \h </w:instrText>
         </w:r>
         <w:r>
           <w:rPr>
@@ -1487,7 +1487,7 @@
           <w:noProof/>
         </w:rPr>
       </w:pPr>
-      <w:hyperlink w:anchor="_Toc237711310" w:history="1">
+      <w:hyperlink w:anchor="_Toc237714978" w:history="1">
         <w:r>
           <w:rPr>
             <w:rStyle w:val="Siuktni"/>
@@ -1514,7 +1514,7 @@
             <w:noProof/>
             <w:webHidden/>
           </w:rPr>
-          <w:instrText xml:space="preserve"> PAGEREF _Toc237711310 \h </w:instrText>
+          <w:instrText xml:space="preserve"> PAGEREF _Toc237714978 \h </w:instrText>
         </w:r>
         <w:r>
           <w:rPr>
@@ -1555,7 +1555,7 @@
           <w:noProof/>
         </w:rPr>
       </w:pPr>
-      <w:hyperlink w:anchor="_Toc237711311" w:history="1">
+      <w:hyperlink w:anchor="_Toc237714979" w:history="1">
         <w:r>
           <w:rPr>
             <w:rStyle w:val="Siuktni"/>
@@ -1582,7 +1582,7 @@
             <w:noProof/>
             <w:webHidden/>
           </w:rPr>
-          <w:instrText xml:space="preserve"> PAGEREF _Toc237711311 \h </w:instrText>
+          <w:instrText xml:space="preserve"> PAGEREF _Toc237714979 \h </w:instrText>
         </w:r>
         <w:r>
           <w:rPr>
@@ -1623,7 +1623,7 @@
           <w:noProof/>
         </w:rPr>
       </w:pPr>
-      <w:hyperlink w:anchor="_Toc237711312" w:history="1">
+      <w:hyperlink w:anchor="_Toc237714980" w:history="1">
         <w:r>
           <w:rPr>
             <w:rStyle w:val="Siuktni"/>
@@ -1650,7 +1650,7 @@
             <w:noProof/>
             <w:webHidden/>
           </w:rPr>
-          <w:instrText xml:space="preserve"> PAGEREF _Toc237711312 \h </w:instrText>
+          <w:instrText xml:space="preserve"> PAGEREF _Toc237714980 \h </w:instrText>
         </w:r>
         <w:r>
           <w:rPr>
@@ -1691,7 +1691,7 @@
           <w:noProof/>
         </w:rPr>
       </w:pPr>
-      <w:hyperlink w:anchor="_Toc237711313" w:history="1">
+      <w:hyperlink w:anchor="_Toc237714981" w:history="1">
         <w:r>
           <w:rPr>
             <w:rStyle w:val="Siuktni"/>
@@ -1718,7 +1718,7 @@
             <w:noProof/>
             <w:webHidden/>
           </w:rPr>
-          <w:instrText xml:space="preserve"> PAGEREF _Toc237711313 \h </w:instrText>
+          <w:instrText xml:space="preserve"> PAGEREF _Toc237714981 \h </w:instrText>
         </w:r>
         <w:r>
           <w:rPr>
@@ -1759,7 +1759,7 @@
           <w:noProof/>
         </w:rPr>
       </w:pPr>
-      <w:hyperlink w:anchor="_Toc237711314" w:history="1">
+      <w:hyperlink w:anchor="_Toc237714982" w:history="1">
         <w:r>
           <w:rPr>
             <w:rStyle w:val="Siuktni"/>
@@ -1786,7 +1786,7 @@
             <w:noProof/>
             <w:webHidden/>
           </w:rPr>
-          <w:instrText xml:space="preserve"> PAGEREF _Toc237711314 \h </w:instrText>
+          <w:instrText xml:space="preserve"> PAGEREF _Toc237714982 \h </w:instrText>
         </w:r>
         <w:r>
           <w:rPr>
@@ -1827,7 +1827,7 @@
           <w:noProof/>
         </w:rPr>
       </w:pPr>
-      <w:hyperlink w:anchor="_Toc237711315" w:history="1">
+      <w:hyperlink w:anchor="_Toc237714983" w:history="1">
         <w:r>
           <w:rPr>
             <w:rStyle w:val="Siuktni"/>
@@ -1854,7 +1854,7 @@
             <w:noProof/>
             <w:webHidden/>
           </w:rPr>
-          <w:instrText xml:space="preserve"> PAGEREF _Toc237711315 \h </w:instrText>
+          <w:instrText xml:space="preserve"> PAGEREF _Toc237714983 \h </w:instrText>
         </w:r>
         <w:r>
           <w:rPr>
@@ -1895,7 +1895,7 @@
           <w:noProof/>
         </w:rPr>
       </w:pPr>
-      <w:hyperlink w:anchor="_Toc237711316" w:history="1">
+      <w:hyperlink w:anchor="_Toc237714984" w:history="1">
         <w:r>
           <w:rPr>
             <w:rStyle w:val="Siuktni"/>
@@ -1922,7 +1922,7 @@
             <w:noProof/>
             <w:webHidden/>
           </w:rPr>
-          <w:instrText xml:space="preserve"> PAGEREF _Toc237711316 \h </w:instrText>
+          <w:instrText xml:space="preserve"> PAGEREF _Toc237714984 \h </w:instrText>
         </w:r>
         <w:r>
           <w:rPr>
@@ -1963,7 +1963,7 @@
           <w:noProof/>
         </w:rPr>
       </w:pPr>
-      <w:hyperlink w:anchor="_Toc237711317" w:history="1">
+      <w:hyperlink w:anchor="_Toc237714985" w:history="1">
         <w:r>
           <w:rPr>
             <w:rStyle w:val="Siuktni"/>
@@ -1990,7 +1990,7 @@
             <w:noProof/>
             <w:webHidden/>
           </w:rPr>
-          <w:instrText xml:space="preserve"> PAGEREF _Toc237711317 \h </w:instrText>
+          <w:instrText xml:space="preserve"> PAGEREF _Toc237714985 \h </w:instrText>
         </w:r>
         <w:r>
           <w:rPr>
@@ -2031,7 +2031,7 @@
           <w:noProof/>
         </w:rPr>
       </w:pPr>
-      <w:hyperlink w:anchor="_Toc237711318" w:history="1">
+      <w:hyperlink w:anchor="_Toc237714986" w:history="1">
         <w:r>
           <w:rPr>
             <w:rStyle w:val="Siuktni"/>
@@ -2058,7 +2058,7 @@
             <w:noProof/>
             <w:webHidden/>
           </w:rPr>
-          <w:instrText xml:space="preserve"> PAGEREF _Toc237711318 \h </w:instrText>
+          <w:instrText xml:space="preserve"> PAGEREF _Toc237714986 \h </w:instrText>
         </w:r>
         <w:r>
           <w:rPr>
@@ -2099,7 +2099,7 @@
           <w:noProof/>
         </w:rPr>
       </w:pPr>
-      <w:hyperlink w:anchor="_Toc237711319" w:history="1">
+      <w:hyperlink w:anchor="_Toc237714987" w:history="1">
         <w:r>
           <w:rPr>
             <w:rStyle w:val="Siuktni"/>
@@ -2126,7 +2126,7 @@
             <w:noProof/>
             <w:webHidden/>
           </w:rPr>
-          <w:instrText xml:space="preserve"> PAGEREF _Toc237711319 \h </w:instrText>
+          <w:instrText xml:space="preserve"> PAGEREF _Toc237714987 \h </w:instrText>
         </w:r>
         <w:r>
           <w:rPr>
@@ -2167,7 +2167,7 @@
           <w:noProof/>
         </w:rPr>
       </w:pPr>
-      <w:hyperlink w:anchor="_Toc237711320" w:history="1">
+      <w:hyperlink w:anchor="_Toc237714988" w:history="1">
         <w:r>
           <w:rPr>
             <w:rStyle w:val="Siuktni"/>
@@ -2194,7 +2194,7 @@
             <w:noProof/>
             <w:webHidden/>
           </w:rPr>
-          <w:instrText xml:space="preserve"> PAGEREF _Toc237711320 \h </w:instrText>
+          <w:instrText xml:space="preserve"> PAGEREF _Toc237714988 \h </w:instrText>
         </w:r>
         <w:r>
           <w:rPr>
@@ -2235,7 +2235,7 @@
           <w:noProof/>
         </w:rPr>
       </w:pPr>
-      <w:hyperlink w:anchor="_Toc237711321" w:history="1">
+      <w:hyperlink w:anchor="_Toc237714989" w:history="1">
         <w:r>
           <w:rPr>
             <w:rStyle w:val="Siuktni"/>
@@ -2262,7 +2262,7 @@
             <w:noProof/>
             <w:webHidden/>
           </w:rPr>
-          <w:instrText xml:space="preserve"> PAGEREF _Toc237711321 \h </w:instrText>
+          <w:instrText xml:space="preserve"> PAGEREF _Toc237714989 \h </w:instrText>
         </w:r>
         <w:r>
           <w:rPr>
@@ -2303,7 +2303,7 @@
           <w:noProof/>
         </w:rPr>
       </w:pPr>
-      <w:hyperlink w:anchor="_Toc237711322" w:history="1">
+      <w:hyperlink w:anchor="_Toc237714990" w:history="1">
         <w:r>
           <w:rPr>
             <w:rStyle w:val="Siuktni"/>
@@ -2330,7 +2330,7 @@
             <w:noProof/>
             <w:webHidden/>
           </w:rPr>
-          <w:instrText xml:space="preserve"> PAGEREF _Toc237711322 \h </w:instrText>
+          <w:instrText xml:space="preserve"> PAGEREF _Toc237714990 \h </w:instrText>
         </w:r>
         <w:r>
           <w:rPr>
@@ -2371,7 +2371,7 @@
           <w:noProof/>
         </w:rPr>
       </w:pPr>
-      <w:hyperlink w:anchor="_Toc237711323" w:history="1">
+      <w:hyperlink w:anchor="_Toc237714991" w:history="1">
         <w:r>
           <w:rPr>
             <w:rStyle w:val="Siuktni"/>
@@ -2398,7 +2398,7 @@
             <w:noProof/>
             <w:webHidden/>
           </w:rPr>
-          <w:instrText xml:space="preserve"> PAGEREF _Toc237711323 \h </w:instrText>
+          <w:instrText xml:space="preserve"> PAGEREF _Toc237714991 \h </w:instrText>
         </w:r>
         <w:r>
           <w:rPr>
@@ -2439,7 +2439,7 @@
           <w:noProof/>
         </w:rPr>
       </w:pPr>
-      <w:hyperlink w:anchor="_Toc237711324" w:history="1">
+      <w:hyperlink w:anchor="_Toc237714992" w:history="1">
         <w:r>
           <w:rPr>
             <w:rStyle w:val="Siuktni"/>
@@ -2466,7 +2466,7 @@
             <w:noProof/>
             <w:webHidden/>
           </w:rPr>
-          <w:instrText xml:space="preserve"> PAGEREF _Toc237711324 \h </w:instrText>
+          <w:instrText xml:space="preserve"> PAGEREF _Toc237714992 \h </w:instrText>
         </w:r>
         <w:r>
           <w:rPr>
@@ -2507,7 +2507,7 @@
           <w:noProof/>
         </w:rPr>
       </w:pPr>
-      <w:hyperlink w:anchor="_Toc237711325" w:history="1">
+      <w:hyperlink w:anchor="_Toc237714993" w:history="1">
         <w:r>
           <w:rPr>
             <w:rStyle w:val="Siuktni"/>
@@ -2534,7 +2534,7 @@
             <w:noProof/>
             <w:webHidden/>
           </w:rPr>
-          <w:instrText xml:space="preserve"> PAGEREF _Toc237711325 \h </w:instrText>
+          <w:instrText xml:space="preserve"> PAGEREF _Toc237714993 \h </w:instrText>
         </w:r>
         <w:r>
           <w:rPr>
@@ -2575,7 +2575,7 @@
           <w:noProof/>
         </w:rPr>
       </w:pPr>
-      <w:hyperlink w:anchor="_Toc237711326" w:history="1">
+      <w:hyperlink w:anchor="_Toc237714994" w:history="1">
         <w:r>
           <w:rPr>
             <w:rStyle w:val="Siuktni"/>
@@ -2602,7 +2602,7 @@
             <w:noProof/>
             <w:webHidden/>
           </w:rPr>
-          <w:instrText xml:space="preserve"> PAGEREF _Toc237711326 \h </w:instrText>
+          <w:instrText xml:space="preserve"> PAGEREF _Toc237714994 \h </w:instrText>
         </w:r>
         <w:r>
           <w:rPr>
@@ -2643,7 +2643,7 @@
           <w:noProof/>
         </w:rPr>
       </w:pPr>
-      <w:hyperlink w:anchor="_Toc237711327" w:history="1">
+      <w:hyperlink w:anchor="_Toc237714995" w:history="1">
         <w:r>
           <w:rPr>
             <w:rStyle w:val="Siuktni"/>
@@ -2670,7 +2670,7 @@
             <w:noProof/>
             <w:webHidden/>
           </w:rPr>
-          <w:instrText xml:space="preserve"> PAGEREF _Toc237711327 \h </w:instrText>
+          <w:instrText xml:space="preserve"> PAGEREF _Toc237714995 \h </w:instrText>
         </w:r>
         <w:r>
           <w:rPr>
@@ -2711,7 +2711,7 @@
           <w:noProof/>
         </w:rPr>
       </w:pPr>
-      <w:hyperlink w:anchor="_Toc237711328" w:history="1">
+      <w:hyperlink w:anchor="_Toc237714996" w:history="1">
         <w:r>
           <w:rPr>
             <w:rStyle w:val="Siuktni"/>
@@ -2738,7 +2738,7 @@
             <w:noProof/>
             <w:webHidden/>
           </w:rPr>
-          <w:instrText xml:space="preserve"> PAGEREF _Toc237711328 \h </w:instrText>
+          <w:instrText xml:space="preserve"> PAGEREF _Toc237714996 \h </w:instrText>
         </w:r>
         <w:r>
           <w:rPr>
@@ -2779,7 +2779,7 @@
           <w:noProof/>
         </w:rPr>
       </w:pPr>
-      <w:hyperlink w:anchor="_Toc237711329" w:history="1">
+      <w:hyperlink w:anchor="_Toc237714997" w:history="1">
         <w:r>
           <w:rPr>
             <w:rStyle w:val="Siuktni"/>
@@ -2806,7 +2806,7 @@
             <w:noProof/>
             <w:webHidden/>
           </w:rPr>
-          <w:instrText xml:space="preserve"> PAGEREF _Toc237711329 \h </w:instrText>
+          <w:instrText xml:space="preserve"> PAGEREF _Toc237714997 \h </w:instrText>
         </w:r>
         <w:r>
           <w:rPr>
@@ -2847,7 +2847,7 @@
           <w:noProof/>
         </w:rPr>
       </w:pPr>
-      <w:hyperlink w:anchor="_Toc237711330" w:history="1">
+      <w:hyperlink w:anchor="_Toc237714998" w:history="1">
         <w:r>
           <w:rPr>
             <w:rStyle w:val="Siuktni"/>
@@ -2874,7 +2874,7 @@
             <w:noProof/>
             <w:webHidden/>
           </w:rPr>
-          <w:instrText xml:space="preserve"> PAGEREF _Toc237711330 \h </w:instrText>
+          <w:instrText xml:space="preserve"> PAGEREF _Toc237714998 \h </w:instrText>
         </w:r>
         <w:r>
           <w:rPr>
@@ -2915,7 +2915,7 @@
           <w:noProof/>
         </w:rPr>
       </w:pPr>
-      <w:hyperlink w:anchor="_Toc237711331" w:history="1">
+      <w:hyperlink w:anchor="_Toc237714999" w:history="1">
         <w:r>
           <w:rPr>
             <w:rStyle w:val="Siuktni"/>
@@ -2942,7 +2942,7 @@
             <w:noProof/>
             <w:webHidden/>
           </w:rPr>
-          <w:instrText xml:space="preserve"> PAGEREF _Toc237711331 \h </w:instrText>
+          <w:instrText xml:space="preserve"> PAGEREF _Toc237714999 \h </w:instrText>
         </w:r>
         <w:r>
           <w:rPr>
@@ -2983,7 +2983,7 @@
           <w:noProof/>
         </w:rPr>
       </w:pPr>
-      <w:hyperlink w:anchor="_Toc237711332" w:history="1">
+      <w:hyperlink w:anchor="_Toc237715000" w:history="1">
         <w:r>
           <w:rPr>
             <w:rStyle w:val="Siuktni"/>
@@ -3010,7 +3010,7 @@
             <w:noProof/>
             <w:webHidden/>
           </w:rPr>
-          <w:instrText xml:space="preserve"> PAGEREF _Toc237711332 \h </w:instrText>
+          <w:instrText xml:space="preserve"> PAGEREF _Toc237715000 \h </w:instrText>
         </w:r>
         <w:r>
           <w:rPr>
@@ -3051,7 +3051,7 @@
           <w:noProof/>
         </w:rPr>
       </w:pPr>
-      <w:hyperlink w:anchor="_Toc237711333" w:history="1">
+      <w:hyperlink w:anchor="_Toc237715001" w:history="1">
         <w:r>
           <w:rPr>
             <w:rStyle w:val="Siuktni"/>
@@ -3078,7 +3078,7 @@
             <w:noProof/>
             <w:webHidden/>
           </w:rPr>
-          <w:instrText xml:space="preserve"> PAGEREF _Toc237711333 \h </w:instrText>
+          <w:instrText xml:space="preserve"> PAGEREF _Toc237715001 \h </w:instrText>
         </w:r>
         <w:r>
           <w:rPr>
@@ -3119,7 +3119,7 @@
           <w:noProof/>
         </w:rPr>
       </w:pPr>
-      <w:hyperlink w:anchor="_Toc237711334" w:history="1">
+      <w:hyperlink w:anchor="_Toc237715002" w:history="1">
         <w:r>
           <w:rPr>
             <w:rStyle w:val="Siuktni"/>
@@ -3146,7 +3146,7 @@
             <w:noProof/>
             <w:webHidden/>
           </w:rPr>
-          <w:instrText xml:space="preserve"> PAGEREF _Toc237711334 \h </w:instrText>
+          <w:instrText xml:space="preserve"> PAGEREF _Toc237715002 \h </w:instrText>
         </w:r>
         <w:r>
           <w:rPr>
@@ -3187,7 +3187,7 @@
           <w:noProof/>
         </w:rPr>
       </w:pPr>
-      <w:hyperlink w:anchor="_Toc237711335" w:history="1">
+      <w:hyperlink w:anchor="_Toc237715003" w:history="1">
         <w:r>
           <w:rPr>
             <w:rStyle w:val="Siuktni"/>
@@ -3214,7 +3214,7 @@
             <w:noProof/>
             <w:webHidden/>
           </w:rPr>
-          <w:instrText xml:space="preserve"> PAGEREF _Toc237711335 \h </w:instrText>
+          <w:instrText xml:space="preserve"> PAGEREF _Toc237715003 \h </w:instrText>
         </w:r>
         <w:r>
           <w:rPr>
@@ -3263,7 +3263,7 @@
       <w:pPr>
         <w:pStyle w:val="u1"/>
       </w:pPr>
-      <w:bookmarkStart w:id="0" w:name="_Toc237711300"/>
+      <w:bookmarkStart w:id="0" w:name="_Toc237714968"/>
       <w:r>
         <w:rPr>
           <w:rFonts w:ascii="Times New Roman" w:eastAsia="Times New Roman" w:hAnsi="Times New Roman"/>
@@ -3278,7 +3278,7 @@
       <w:pPr>
         <w:pStyle w:val="u2"/>
       </w:pPr>
-      <w:bookmarkStart w:id="1" w:name="_Toc237711301"/>
+      <w:bookmarkStart w:id="1" w:name="_Toc237714969"/>
       <w:r>
         <w:rPr>
           <w:rFonts w:ascii="Times New Roman" w:eastAsia="Times New Roman" w:hAnsi="Times New Roman"/>
@@ -3310,7 +3310,7 @@
       <w:pPr>
         <w:pStyle w:val="u2"/>
       </w:pPr>
-      <w:bookmarkStart w:id="2" w:name="_Toc237711302"/>
+      <w:bookmarkStart w:id="2" w:name="_Toc237714970"/>
       <w:r>
         <w:rPr>
           <w:rFonts w:ascii="Times New Roman" w:eastAsia="Times New Roman" w:hAnsi="Times New Roman"/>
@@ -3365,7 +3365,7 @@
       <w:pPr>
         <w:pStyle w:val="u2"/>
       </w:pPr>
-      <w:bookmarkStart w:id="3" w:name="_Toc237711303"/>
+      <w:bookmarkStart w:id="3" w:name="_Toc237714971"/>
       <w:r>
         <w:rPr>
           <w:rFonts w:ascii="Times New Roman" w:eastAsia="Times New Roman" w:hAnsi="Times New Roman"/>
@@ -3384,7 +3384,7 @@
       <w:pPr>
         <w:pStyle w:val="u2"/>
       </w:pPr>
-      <w:bookmarkStart w:id="4" w:name="_Toc237711304"/>
+      <w:bookmarkStart w:id="4" w:name="_Toc237714972"/>
       <w:r>
         <w:rPr>
           <w:rFonts w:ascii="Times New Roman" w:eastAsia="Times New Roman" w:hAnsi="Times New Roman"/>
@@ -3430,7 +3430,7 @@
       <w:pPr>
         <w:pStyle w:val="u2"/>
       </w:pPr>
-      <w:bookmarkStart w:id="5" w:name="_Toc237711305"/>
+      <w:bookmarkStart w:id="5" w:name="_Toc237714973"/>
       <w:r>
         <w:rPr>
           <w:rFonts w:ascii="Times New Roman" w:eastAsia="Times New Roman" w:hAnsi="Times New Roman"/>
@@ -3449,7 +3449,7 @@
       <w:pPr>
         <w:pStyle w:val="u2"/>
       </w:pPr>
-      <w:bookmarkStart w:id="6" w:name="_Toc237711306"/>
+      <w:bookmarkStart w:id="6" w:name="_Toc237714974"/>
       <w:r>
         <w:rPr>
           <w:rFonts w:ascii="Times New Roman" w:eastAsia="Times New Roman" w:hAnsi="Times New Roman"/>
@@ -3533,7 +3533,7 @@
       <w:pPr>
         <w:pStyle w:val="u1"/>
       </w:pPr>
-      <w:bookmarkStart w:id="7" w:name="_Toc237711307"/>
+      <w:bookmarkStart w:id="7" w:name="_Toc237714975"/>
       <w:r>
         <w:rPr>
           <w:rFonts w:ascii="Times New Roman" w:eastAsia="Times New Roman" w:hAnsi="Times New Roman"/>
@@ -3548,7 +3548,7 @@
       <w:pPr>
         <w:pStyle w:val="u2"/>
       </w:pPr>
-      <w:bookmarkStart w:id="8" w:name="_Toc237711308"/>
+      <w:bookmarkStart w:id="8" w:name="_Toc237714976"/>
       <w:r>
         <w:rPr>
           <w:rFonts w:ascii="Times New Roman" w:eastAsia="Times New Roman" w:hAnsi="Times New Roman"/>
@@ -3586,7 +3586,7 @@
       <w:pPr>
         <w:pStyle w:val="u2"/>
       </w:pPr>
-      <w:bookmarkStart w:id="9" w:name="_Toc237711309"/>
+      <w:bookmarkStart w:id="9" w:name="_Toc237714977"/>
       <w:r>
         <w:rPr>
           <w:rFonts w:ascii="Times New Roman" w:eastAsia="Times New Roman" w:hAnsi="Times New Roman"/>
@@ -3704,7 +3704,7 @@
       <w:pPr>
         <w:pStyle w:val="u2"/>
       </w:pPr>
-      <w:bookmarkStart w:id="10" w:name="_Toc237711310"/>
+      <w:bookmarkStart w:id="10" w:name="_Toc237714978"/>
       <w:r>
         <w:rPr>
           <w:rFonts w:ascii="Times New Roman" w:eastAsia="Times New Roman" w:hAnsi="Times New Roman"/>
@@ -3966,7 +3966,7 @@
       <w:pPr>
         <w:pStyle w:val="u2"/>
       </w:pPr>
-      <w:bookmarkStart w:id="11" w:name="_Toc237711311"/>
+      <w:bookmarkStart w:id="11" w:name="_Toc237714979"/>
       <w:r>
         <w:rPr>
           <w:rFonts w:ascii="Times New Roman" w:eastAsia="Times New Roman" w:hAnsi="Times New Roman"/>
@@ -4039,7 +4039,7 @@
       <w:pPr>
         <w:pStyle w:val="u2"/>
       </w:pPr>
-      <w:bookmarkStart w:id="12" w:name="_Toc237711312"/>
+      <w:bookmarkStart w:id="12" w:name="_Toc237714980"/>
       <w:r>
         <w:rPr>
           <w:rFonts w:ascii="Times New Roman" w:eastAsia="Times New Roman" w:hAnsi="Times New Roman"/>
@@ -4134,7 +4134,7 @@
       <w:pPr>
         <w:pStyle w:val="u2"/>
       </w:pPr>
-      <w:bookmarkStart w:id="13" w:name="_Toc237711313"/>
+      <w:bookmarkStart w:id="13" w:name="_Toc237714981"/>
       <w:r>
         <w:rPr>
           <w:rFonts w:ascii="Times New Roman" w:eastAsia="Times New Roman" w:hAnsi="Times New Roman"/>
@@ -4190,7 +4190,7 @@
       <w:pPr>
         <w:pStyle w:val="u2"/>
       </w:pPr>
-      <w:bookmarkStart w:id="14" w:name="_Toc237711314"/>
+      <w:bookmarkStart w:id="14" w:name="_Toc237714982"/>
       <w:r>
         <w:rPr>
           <w:rFonts w:ascii="Times New Roman" w:eastAsia="Times New Roman" w:hAnsi="Times New Roman"/>
@@ -4296,7 +4296,7 @@
       <w:pPr>
         <w:pStyle w:val="u1"/>
       </w:pPr>
-      <w:bookmarkStart w:id="15" w:name="_Toc237711315"/>
+      <w:bookmarkStart w:id="15" w:name="_Toc237714983"/>
       <w:r>
         <w:rPr>
           <w:rFonts w:ascii="Times New Roman" w:eastAsia="Times New Roman" w:hAnsi="Times New Roman"/>
@@ -4311,7 +4311,7 @@
       <w:pPr>
         <w:pStyle w:val="u2"/>
       </w:pPr>
-      <w:bookmarkStart w:id="16" w:name="_Toc237711316"/>
+      <w:bookmarkStart w:id="16" w:name="_Toc237714984"/>
       <w:r>
         <w:rPr>
           <w:rFonts w:ascii="Times New Roman" w:eastAsia="Times New Roman" w:hAnsi="Times New Roman"/>
@@ -4353,7 +4353,7 @@
       <w:pPr>
         <w:pStyle w:val="u2"/>
       </w:pPr>
-      <w:bookmarkStart w:id="17" w:name="_Toc237711317"/>
+      <w:bookmarkStart w:id="17" w:name="_Toc237714985"/>
       <w:r>
         <w:rPr>
           <w:rFonts w:ascii="Times New Roman" w:eastAsia="Times New Roman" w:hAnsi="Times New Roman"/>
@@ -4819,7 +4819,7 @@
       <w:pPr>
         <w:pStyle w:val="u2"/>
       </w:pPr>
-      <w:bookmarkStart w:id="18" w:name="_Toc237711318"/>
+      <w:bookmarkStart w:id="18" w:name="_Toc237714986"/>
       <w:r>
         <w:rPr>
           <w:rFonts w:ascii="Times New Roman" w:eastAsia="Times New Roman" w:hAnsi="Times New Roman"/>
@@ -4886,7 +4886,7 @@
       <w:pPr>
         <w:pStyle w:val="u2"/>
       </w:pPr>
-      <w:bookmarkStart w:id="19" w:name="_Toc237711319"/>
+      <w:bookmarkStart w:id="19" w:name="_Toc237714987"/>
       <w:r>
         <w:rPr>
           <w:rFonts w:ascii="Times New Roman" w:eastAsia="Times New Roman" w:hAnsi="Times New Roman"/>
@@ -4976,7 +4976,7 @@
       <w:pPr>
         <w:pStyle w:val="u2"/>
       </w:pPr>
-      <w:bookmarkStart w:id="20" w:name="_Toc237711320"/>
+      <w:bookmarkStart w:id="20" w:name="_Toc237714988"/>
       <w:r>
         <w:rPr>
           <w:rFonts w:ascii="Times New Roman" w:eastAsia="Times New Roman" w:hAnsi="Times New Roman"/>
@@ -6138,7 +6138,7 @@
       <w:pPr>
         <w:pStyle w:val="u1"/>
       </w:pPr>
-      <w:bookmarkStart w:id="21" w:name="_Toc237711321"/>
+      <w:bookmarkStart w:id="21" w:name="_Toc237714989"/>
       <w:r>
         <w:rPr>
           <w:rFonts w:ascii="Times New Roman" w:eastAsia="Times New Roman" w:hAnsi="Times New Roman"/>
@@ -6158,7 +6158,7 @@
       <w:pPr>
         <w:pStyle w:val="u2"/>
       </w:pPr>
-      <w:bookmarkStart w:id="22" w:name="_Toc237711322"/>
+      <w:bookmarkStart w:id="22" w:name="_Toc237714990"/>
       <w:r>
         <w:rPr>
           <w:rFonts w:ascii="Times New Roman" w:eastAsia="Times New Roman" w:hAnsi="Times New Roman"/>
@@ -6636,7 +6636,7 @@
       <w:pPr>
         <w:pStyle w:val="u2"/>
       </w:pPr>
-      <w:bookmarkStart w:id="23" w:name="_Toc237711323"/>
+      <w:bookmarkStart w:id="23" w:name="_Toc237714991"/>
       <w:r>
         <w:rPr>
           <w:rFonts w:ascii="Times New Roman" w:eastAsia="Times New Roman" w:hAnsi="Times New Roman"/>
@@ -6891,7 +6891,7 @@
       <w:pPr>
         <w:pStyle w:val="u2"/>
       </w:pPr>
-      <w:bookmarkStart w:id="24" w:name="_Toc237711324"/>
+      <w:bookmarkStart w:id="24" w:name="_Toc237714992"/>
       <w:r>
         <w:rPr>
           <w:rFonts w:ascii="Times New Roman" w:eastAsia="Times New Roman" w:hAnsi="Times New Roman"/>
@@ -7095,7 +7095,7 @@
       <w:pPr>
         <w:pStyle w:val="u2"/>
       </w:pPr>
-      <w:bookmarkStart w:id="25" w:name="_Toc237711325"/>
+      <w:bookmarkStart w:id="25" w:name="_Toc237714993"/>
       <w:r>
         <w:rPr>
           <w:rFonts w:ascii="Times New Roman" w:eastAsia="Times New Roman" w:hAnsi="Times New Roman"/>
@@ -7231,7 +7231,7 @@
         <w:t>Động cơ:</w:t>
       </w:r>
       <w:r>
-        <w:t xml:space="preserve"> Động cơ vụ lợi kinh tế, tìm kiếm lợi nhuận từ việc bán hàng chênh lệch giá.</w:t>
+        <w:t xml:space="preserve"> Các dữ kiện về chênh lệch giá, tổ chức quảng cáo và hoạt động bán hàng tạo cơ sở để phân tích theo hướng có động cơ vụ lợi kinh tế.</w:t>
       </w:r>
     </w:p>
     <w:p>
@@ -7247,7 +7247,7 @@
         <w:t>Mục đích:</w:t>
       </w:r>
       <w:r>
-        <w:t xml:space="preserve"> Tạo niềm tin để người tiếp cận đặt mua sản phẩm và thu tiền từ các đơn hàng giao dịch thành công [6].</w:t>
+        <w:t xml:space="preserve"> Tạo niềm tin để người tiếp cận đặt mua sản phẩm và phát sinh giao dịch từ các đơn hàng [6].</w:t>
       </w:r>
     </w:p>
     <w:p>
@@ -7265,7 +7265,7 @@
     </w:p>
     <w:p>
       <w:r>
-        <w:t>Chênh lệch giá mua 23.000 đồng và giá bán 199.000 đồng cùng việc đầu tư chi phí quảng cáo cho thấy hoạt động được định hướng nhằm tối ưu hóa doanh thu từ sự thiếu thông tin của khách hàng. Báo cáo không tự ý tính toán con số thu lợi bất chính khi cơ quan điều tra chưa công bố kết luận tài chính.</w:t>
+        <w:t>Chênh lệch giữa giá mua 23.000 đồng và giá bán 199.000 đồng cùng chi phí tiếp thị qua mạng xã hội phản ánh định hướng thúc đẩy giao dịch bán hàng trên thực tế. Dưới góc độ nghiên cứu học thuật, báo cáo không tự ý tính toán con số lợi nhuận thuần túy hay khoản thu lợi bất chính khi cơ quan tiến hành tố tụng chưa công bố kết luận tài chính chính thức.</w:t>
       </w:r>
     </w:p>
     <w:p>
@@ -7287,7 +7287,7 @@
       </w:r>
       <w:r>
         <w:lastRenderedPageBreak/>
-        <w:t>tố tụng sẽ làm rõ nhận thức của từng cá nhân để cá thể hóa trách nhiệm và xác định vai trò đồng phạm tương ứng.</w:t>
+        <w:t>tố tụng sẽ làm rõ nhận thức của từng cá nhân để cá thể hóa trách nhiệm, xác định vai trò, mức độ tham gia và trách nhiệm pháp lý của từng cá nhân.</w:t>
       </w:r>
     </w:p>
     <w:p>
@@ -7661,7 +7661,7 @@
       <w:pPr>
         <w:pStyle w:val="u2"/>
       </w:pPr>
-      <w:bookmarkStart w:id="26" w:name="_Toc237711326"/>
+      <w:bookmarkStart w:id="26" w:name="_Toc237714994"/>
       <w:r>
         <w:rPr>
           <w:rFonts w:ascii="Times New Roman" w:eastAsia="Times New Roman" w:hAnsi="Times New Roman"/>
@@ -7844,7 +7844,7 @@
               <w:rPr>
                 <w:sz w:val="19"/>
               </w:rPr>
-              <w:t>Xâm hại trật tự quản lý nhà nước về quảng cáo, thương mại; quyền được thông tin trung thực của NTD; quyền nhân thân về hình ảnh.</w:t>
+              <w:t>Các quan hệ xã hội được xem xét gồm trật tự quản lý nhà nước về quảng cáo, thương mại; quyền được thông tin trung thực của NTD; quyền nhân thân về hình ảnh.</w:t>
             </w:r>
           </w:p>
         </w:tc>
@@ -8150,7 +8150,7 @@
       <w:pPr>
         <w:pStyle w:val="u1"/>
       </w:pPr>
-      <w:bookmarkStart w:id="27" w:name="_Toc237711327"/>
+      <w:bookmarkStart w:id="27" w:name="_Toc237714995"/>
       <w:r>
         <w:rPr>
           <w:rFonts w:ascii="Times New Roman" w:eastAsia="Times New Roman" w:hAnsi="Times New Roman"/>
@@ -8165,7 +8165,7 @@
       <w:pPr>
         <w:pStyle w:val="u2"/>
       </w:pPr>
-      <w:bookmarkStart w:id="28" w:name="_Toc237711328"/>
+      <w:bookmarkStart w:id="28" w:name="_Toc237714996"/>
       <w:r>
         <w:rPr>
           <w:rFonts w:ascii="Times New Roman" w:eastAsia="Times New Roman" w:hAnsi="Times New Roman"/>
@@ -8193,7 +8193,7 @@
         <w:t>Nhận diện rủi ro của tiếp thị số:</w:t>
       </w:r>
       <w:r>
-        <w:t xml:space="preserve"> Cảnh báo về các phương thức gian dối tinh vi như cắt ghép hình ảnh người có uy tín và ứng dụng thuật toán mạng xã hội để phát tán thông tin sai lệch.</w:t>
+        <w:t xml:space="preserve"> Cảnh báo về các phương thức gian dối tinh vi như cắt ghép hình ảnh người có uy tín và tận dụng khả năng lan truyền nhanh của mạng xã hội để phát tán thông tin sai lệch.</w:t>
       </w:r>
     </w:p>
     <w:p>
@@ -8216,7 +8216,7 @@
       <w:pPr>
         <w:pStyle w:val="u2"/>
       </w:pPr>
-      <w:bookmarkStart w:id="29" w:name="_Toc237711329"/>
+      <w:bookmarkStart w:id="29" w:name="_Toc237714997"/>
       <w:r>
         <w:rPr>
           <w:rFonts w:ascii="Times New Roman" w:eastAsia="Times New Roman" w:hAnsi="Times New Roman"/>
@@ -8256,7 +8256,7 @@
         <w:ind w:left="709" w:firstLine="0"/>
       </w:pPr>
       <w:r>
-        <w:t>Việc sử dụng hình ảnh của bất kỳ cá nhân nào trong nội dung tiếp thị bắt buộc phải có sự đồng ý hợp pháp theo quy định của Bộ luật Dân sự.</w:t>
+        <w:t>Việc sử dụng hình ảnh cá nhân trong hoạt động quảng cáo phải tuân thủ các điều kiện về sự đồng ý và các trường hợp ngoại lệ theo quy định pháp luật.</w:t>
       </w:r>
     </w:p>
     <w:p>
@@ -8289,14 +8289,14 @@
         <w:ind w:left="709" w:firstLine="0"/>
       </w:pPr>
       <w:r>
-        <w:t>Chủ động tìm kiếm tư vấn y khoa chính quy từ các cơ sở y tế có thẩm quyền khi gặp vấn đề về sức khỏe, không tự ý dùng thuốc dựa trên thông tin quảng cáo chưa được kiểm chứng.</w:t>
+        <w:t>Chủ động tìm kiếm tư vấn y khoa chính quy từ các cơ sở y tế có thẩm quyền khi gặp vấn đề về sức khỏe, không tự ý sử dụng sản phẩm chỉ dựa trên thông tin quảng cáo chưa được kiểm chứng.</w:t>
       </w:r>
     </w:p>
     <w:p>
       <w:pPr>
         <w:pStyle w:val="u2"/>
       </w:pPr>
-      <w:bookmarkStart w:id="30" w:name="_Toc237711330"/>
+      <w:bookmarkStart w:id="30" w:name="_Toc237714998"/>
       <w:r>
         <w:rPr>
           <w:rFonts w:ascii="Times New Roman" w:eastAsia="Times New Roman" w:hAnsi="Times New Roman"/>
@@ -8364,7 +8364,7 @@
       <w:pPr>
         <w:pStyle w:val="u1"/>
       </w:pPr>
-      <w:bookmarkStart w:id="31" w:name="_Toc237711331"/>
+      <w:bookmarkStart w:id="31" w:name="_Toc237714999"/>
       <w:r>
         <w:rPr>
           <w:rFonts w:ascii="Times New Roman" w:eastAsia="Times New Roman" w:hAnsi="Times New Roman"/>
@@ -8469,7 +8469,7 @@
       <w:pPr>
         <w:pStyle w:val="u1"/>
       </w:pPr>
-      <w:bookmarkStart w:id="32" w:name="_Toc237711332"/>
+      <w:bookmarkStart w:id="32" w:name="_Toc237715000"/>
       <w:r>
         <w:rPr>
           <w:rFonts w:ascii="Times New Roman" w:eastAsia="Times New Roman" w:hAnsi="Times New Roman"/>
@@ -8484,7 +8484,7 @@
       <w:pPr>
         <w:pStyle w:val="u2"/>
       </w:pPr>
-      <w:bookmarkStart w:id="33" w:name="_Toc237711333"/>
+      <w:bookmarkStart w:id="33" w:name="_Toc237715001"/>
       <w:r>
         <w:rPr>
           <w:rFonts w:ascii="Times New Roman" w:eastAsia="Times New Roman" w:hAnsi="Times New Roman"/>
@@ -8606,7 +8606,7 @@
       <w:pPr>
         <w:pStyle w:val="u2"/>
       </w:pPr>
-      <w:bookmarkStart w:id="34" w:name="_Toc237711334"/>
+      <w:bookmarkStart w:id="34" w:name="_Toc237715002"/>
       <w:r>
         <w:rPr>
           <w:rFonts w:ascii="Times New Roman" w:eastAsia="Times New Roman" w:hAnsi="Times New Roman"/>
@@ -8647,7 +8647,7 @@
       <w:pPr>
         <w:pStyle w:val="u2"/>
       </w:pPr>
-      <w:bookmarkStart w:id="35" w:name="_Toc237711335"/>
+      <w:bookmarkStart w:id="35" w:name="_Toc237715003"/>
       <w:r>
         <w:rPr>
           <w:rFonts w:ascii="Times New Roman" w:eastAsia="Times New Roman" w:hAnsi="Times New Roman"/>
@@ -8955,31 +8955,31 @@
       </w:rPr>
     </w:lvl>
   </w:abstractNum>
-  <w:num w:numId="1" w16cid:durableId="525217246">
+  <w:num w:numId="1" w16cid:durableId="601063177">
     <w:abstractNumId w:val="8"/>
   </w:num>
-  <w:num w:numId="2" w16cid:durableId="1341546569">
+  <w:num w:numId="2" w16cid:durableId="1803571236">
     <w:abstractNumId w:val="6"/>
   </w:num>
-  <w:num w:numId="3" w16cid:durableId="753623047">
+  <w:num w:numId="3" w16cid:durableId="1860198317">
     <w:abstractNumId w:val="5"/>
   </w:num>
-  <w:num w:numId="4" w16cid:durableId="1686177497">
+  <w:num w:numId="4" w16cid:durableId="276761120">
     <w:abstractNumId w:val="4"/>
   </w:num>
-  <w:num w:numId="5" w16cid:durableId="264581367">
+  <w:num w:numId="5" w16cid:durableId="630013153">
     <w:abstractNumId w:val="7"/>
   </w:num>
-  <w:num w:numId="6" w16cid:durableId="1086659114">
+  <w:num w:numId="6" w16cid:durableId="1219049928">
     <w:abstractNumId w:val="3"/>
   </w:num>
-  <w:num w:numId="7" w16cid:durableId="1946116538">
+  <w:num w:numId="7" w16cid:durableId="1238440407">
     <w:abstractNumId w:val="2"/>
   </w:num>
-  <w:num w:numId="8" w16cid:durableId="440607791">
+  <w:num w:numId="8" w16cid:durableId="450563320">
     <w:abstractNumId w:val="1"/>
   </w:num>
-  <w:num w:numId="9" w16cid:durableId="1818643130">
+  <w:num w:numId="9" w16cid:durableId="970404111">
     <w:abstractNumId w:val="0"/>
   </w:num>
 </w:numbering>
@@ -20382,7 +20382,7 @@
     <w:autoRedefine/>
     <w:uiPriority w:val="39"/>
     <w:unhideWhenUsed/>
-    <w:rsid w:val="008A4C59"/>
+    <w:rsid w:val="00C2242B"/>
     <w:pPr>
       <w:spacing w:after="100"/>
     </w:pPr>
@@ -20394,7 +20394,7 @@
     <w:autoRedefine/>
     <w:uiPriority w:val="39"/>
     <w:unhideWhenUsed/>
-    <w:rsid w:val="008A4C59"/>
+    <w:rsid w:val="00C2242B"/>
     <w:pPr>
       <w:spacing w:after="100"/>
       <w:ind w:left="260"/>
@@ -20405,7 +20405,7 @@
     <w:basedOn w:val="Phngmcinhcuaoanvn"/>
     <w:uiPriority w:val="99"/>
     <w:unhideWhenUsed/>
-    <w:rsid w:val="008A4C59"/>
+    <w:rsid w:val="00C2242B"/>
     <w:rPr>
       <w:color w:val="0000FF" w:themeColor="hyperlink"/>
       <w:u w:val="single"/>

</xml_diff>

<commit_message>
style: simplify report introduction
</commit_message>
<xml_diff>
--- a/report/BaoCao_TieuLuan_PLDC_UIT_FINAL.docx
+++ b/report/BaoCao_TieuLuan_PLDC_UIT_FINAL.docx
@@ -807,7 +807,7 @@
       <w:r>
         <w:fldChar w:fldCharType="separate"/>
       </w:r>
-      <w:hyperlink w:anchor="_Toc237714968" w:history="1">
+      <w:hyperlink w:anchor="_Toc237715686" w:history="1">
         <w:r>
           <w:rPr>
             <w:rStyle w:val="Siuktni"/>
@@ -834,7 +834,7 @@
             <w:noProof/>
             <w:webHidden/>
           </w:rPr>
-          <w:instrText xml:space="preserve"> PAGEREF _Toc237714968 \h </w:instrText>
+          <w:instrText xml:space="preserve"> PAGEREF _Toc237715686 \h </w:instrText>
         </w:r>
         <w:r>
           <w:rPr>
@@ -875,7 +875,7 @@
           <w:noProof/>
         </w:rPr>
       </w:pPr>
-      <w:hyperlink w:anchor="_Toc237714969" w:history="1">
+      <w:hyperlink w:anchor="_Toc237715687" w:history="1">
         <w:r>
           <w:rPr>
             <w:rStyle w:val="Siuktni"/>
@@ -902,7 +902,7 @@
             <w:noProof/>
             <w:webHidden/>
           </w:rPr>
-          <w:instrText xml:space="preserve"> PAGEREF _Toc237714969 \h </w:instrText>
+          <w:instrText xml:space="preserve"> PAGEREF _Toc237715687 \h </w:instrText>
         </w:r>
         <w:r>
           <w:rPr>
@@ -943,7 +943,7 @@
           <w:noProof/>
         </w:rPr>
       </w:pPr>
-      <w:hyperlink w:anchor="_Toc237714970" w:history="1">
+      <w:hyperlink w:anchor="_Toc237715688" w:history="1">
         <w:r>
           <w:rPr>
             <w:rStyle w:val="Siuktni"/>
@@ -970,7 +970,7 @@
             <w:noProof/>
             <w:webHidden/>
           </w:rPr>
-          <w:instrText xml:space="preserve"> PAGEREF _Toc237714970 \h </w:instrText>
+          <w:instrText xml:space="preserve"> PAGEREF _Toc237715688 \h </w:instrText>
         </w:r>
         <w:r>
           <w:rPr>
@@ -1011,13 +1011,13 @@
           <w:noProof/>
         </w:rPr>
       </w:pPr>
-      <w:hyperlink w:anchor="_Toc237714971" w:history="1">
+      <w:hyperlink w:anchor="_Toc237715689" w:history="1">
         <w:r>
           <w:rPr>
             <w:rStyle w:val="Siuktni"/>
             <w:noProof/>
           </w:rPr>
-          <w:t>3. Đối tượng nghiên cứu</w:t>
+          <w:t>3. Đối tượng và phạm vi nghiên cứu</w:t>
         </w:r>
         <w:r>
           <w:rPr>
@@ -1038,7 +1038,75 @@
             <w:noProof/>
             <w:webHidden/>
           </w:rPr>
-          <w:instrText xml:space="preserve"> PAGEREF _Toc237714971 \h </w:instrText>
+          <w:instrText xml:space="preserve"> PAGEREF _Toc237715689 \h </w:instrText>
+        </w:r>
+        <w:r>
+          <w:rPr>
+            <w:noProof/>
+            <w:webHidden/>
+          </w:rPr>
+        </w:r>
+        <w:r>
+          <w:rPr>
+            <w:noProof/>
+            <w:webHidden/>
+          </w:rPr>
+          <w:fldChar w:fldCharType="separate"/>
+        </w:r>
+        <w:r>
+          <w:rPr>
+            <w:noProof/>
+            <w:webHidden/>
+          </w:rPr>
+          <w:t>5</w:t>
+        </w:r>
+        <w:r>
+          <w:rPr>
+            <w:noProof/>
+            <w:webHidden/>
+          </w:rPr>
+          <w:fldChar w:fldCharType="end"/>
+        </w:r>
+      </w:hyperlink>
+    </w:p>
+    <w:p>
+      <w:pPr>
+        <w:pStyle w:val="Mucluc1"/>
+        <w:tabs>
+          <w:tab w:val="right" w:leader="dot" w:pos="8948"/>
+        </w:tabs>
+        <w:rPr>
+          <w:noProof/>
+        </w:rPr>
+      </w:pPr>
+      <w:hyperlink w:anchor="_Toc237715690" w:history="1">
+        <w:r>
+          <w:rPr>
+            <w:rStyle w:val="Siuktni"/>
+            <w:noProof/>
+          </w:rPr>
+          <w:t>CHƯƠNG 1: CƠ SỞ LÝ LUẬN VỀ VI PHẠM PHÁP LUẬT VÀ CẤU THÀNH VI PHẠM PHÁP LUẬT</w:t>
+        </w:r>
+        <w:r>
+          <w:rPr>
+            <w:noProof/>
+            <w:webHidden/>
+          </w:rPr>
+          <w:tab/>
+        </w:r>
+        <w:r>
+          <w:rPr>
+            <w:noProof/>
+            <w:webHidden/>
+          </w:rPr>
+          <w:fldChar w:fldCharType="begin"/>
+        </w:r>
+        <w:r>
+          <w:rPr>
+            <w:noProof/>
+            <w:webHidden/>
+          </w:rPr>
+          <w:instrText xml:space="preserve"> PAGEREF _Toc237715690 \h </w:instrText>
         </w:r>
         <w:r>
           <w:rPr>
@@ -1079,13 +1147,13 @@
           <w:noProof/>
         </w:rPr>
       </w:pPr>
-      <w:hyperlink w:anchor="_Toc237714972" w:history="1">
+      <w:hyperlink w:anchor="_Toc237715691" w:history="1">
         <w:r>
           <w:rPr>
             <w:rStyle w:val="Siuktni"/>
             <w:noProof/>
           </w:rPr>
-          <w:t>4. Phạm vi nghiên cứu</w:t>
+          <w:t>1.1. Khái niệm vi phạm pháp luật</w:t>
         </w:r>
         <w:r>
           <w:rPr>
@@ -1106,7 +1174,7 @@
             <w:noProof/>
             <w:webHidden/>
           </w:rPr>
-          <w:instrText xml:space="preserve"> PAGEREF _Toc237714972 \h </w:instrText>
+          <w:instrText xml:space="preserve"> PAGEREF _Toc237715691 \h </w:instrText>
         </w:r>
         <w:r>
           <w:rPr>
@@ -1147,13 +1215,13 @@
           <w:noProof/>
         </w:rPr>
       </w:pPr>
-      <w:hyperlink w:anchor="_Toc237714973" w:history="1">
+      <w:hyperlink w:anchor="_Toc237715692" w:history="1">
         <w:r>
           <w:rPr>
             <w:rStyle w:val="Siuktni"/>
             <w:noProof/>
           </w:rPr>
-          <w:t>5. Giới hạn dữ liệu và nguyên tắc tiếp cận</w:t>
+          <w:t>1.2. Các dấu hiệu cơ bản của vi phạm pháp luật</w:t>
         </w:r>
         <w:r>
           <w:rPr>
@@ -1174,7 +1242,7 @@
             <w:noProof/>
             <w:webHidden/>
           </w:rPr>
-          <w:instrText xml:space="preserve"> PAGEREF _Toc237714973 \h </w:instrText>
+          <w:instrText xml:space="preserve"> PAGEREF _Toc237715692 \h </w:instrText>
         </w:r>
         <w:r>
           <w:rPr>
@@ -1215,13 +1283,13 @@
           <w:noProof/>
         </w:rPr>
       </w:pPr>
-      <w:hyperlink w:anchor="_Toc237714974" w:history="1">
+      <w:hyperlink w:anchor="_Toc237715693" w:history="1">
         <w:r>
           <w:rPr>
             <w:rStyle w:val="Siuktni"/>
             <w:noProof/>
           </w:rPr>
-          <w:t>6. Phương pháp nghiên cứu</w:t>
+          <w:t>1.3. Khái niệm và ý nghĩa của cấu thành vi phạm pháp luật</w:t>
         </w:r>
         <w:r>
           <w:rPr>
@@ -1242,7 +1310,7 @@
             <w:noProof/>
             <w:webHidden/>
           </w:rPr>
-          <w:instrText xml:space="preserve"> PAGEREF _Toc237714974 \h </w:instrText>
+          <w:instrText xml:space="preserve"> PAGEREF _Toc237715693 \h </w:instrText>
         </w:r>
         <w:r>
           <w:rPr>
@@ -1262,7 +1330,279 @@
             <w:noProof/>
             <w:webHidden/>
           </w:rPr>
-          <w:t>6</w:t>
+          <w:t>7</w:t>
+        </w:r>
+        <w:r>
+          <w:rPr>
+            <w:noProof/>
+            <w:webHidden/>
+          </w:rPr>
+          <w:fldChar w:fldCharType="end"/>
+        </w:r>
+      </w:hyperlink>
+    </w:p>
+    <w:p>
+      <w:pPr>
+        <w:pStyle w:val="Mucluc2"/>
+        <w:tabs>
+          <w:tab w:val="right" w:leader="dot" w:pos="8948"/>
+        </w:tabs>
+        <w:rPr>
+          <w:noProof/>
+        </w:rPr>
+      </w:pPr>
+      <w:hyperlink w:anchor="_Toc237715694" w:history="1">
+        <w:r>
+          <w:rPr>
+            <w:rStyle w:val="Siuktni"/>
+            <w:noProof/>
+          </w:rPr>
+          <w:t>1.4. Khách thể của vi phạm pháp luật</w:t>
+        </w:r>
+        <w:r>
+          <w:rPr>
+            <w:noProof/>
+            <w:webHidden/>
+          </w:rPr>
+          <w:tab/>
+        </w:r>
+        <w:r>
+          <w:rPr>
+            <w:noProof/>
+            <w:webHidden/>
+          </w:rPr>
+          <w:fldChar w:fldCharType="begin"/>
+        </w:r>
+        <w:r>
+          <w:rPr>
+            <w:noProof/>
+            <w:webHidden/>
+          </w:rPr>
+          <w:instrText xml:space="preserve"> PAGEREF _Toc237715694 \h </w:instrText>
+        </w:r>
+        <w:r>
+          <w:rPr>
+            <w:noProof/>
+            <w:webHidden/>
+          </w:rPr>
+        </w:r>
+        <w:r>
+          <w:rPr>
+            <w:noProof/>
+            <w:webHidden/>
+          </w:rPr>
+          <w:fldChar w:fldCharType="separate"/>
+        </w:r>
+        <w:r>
+          <w:rPr>
+            <w:noProof/>
+            <w:webHidden/>
+          </w:rPr>
+          <w:t>7</w:t>
+        </w:r>
+        <w:r>
+          <w:rPr>
+            <w:noProof/>
+            <w:webHidden/>
+          </w:rPr>
+          <w:fldChar w:fldCharType="end"/>
+        </w:r>
+      </w:hyperlink>
+    </w:p>
+    <w:p>
+      <w:pPr>
+        <w:pStyle w:val="Mucluc2"/>
+        <w:tabs>
+          <w:tab w:val="right" w:leader="dot" w:pos="8948"/>
+        </w:tabs>
+        <w:rPr>
+          <w:noProof/>
+        </w:rPr>
+      </w:pPr>
+      <w:hyperlink w:anchor="_Toc237715695" w:history="1">
+        <w:r>
+          <w:rPr>
+            <w:rStyle w:val="Siuktni"/>
+            <w:noProof/>
+          </w:rPr>
+          <w:t>1.5. Mặt khách quan của vi phạm pháp luật</w:t>
+        </w:r>
+        <w:r>
+          <w:rPr>
+            <w:noProof/>
+            <w:webHidden/>
+          </w:rPr>
+          <w:tab/>
+        </w:r>
+        <w:r>
+          <w:rPr>
+            <w:noProof/>
+            <w:webHidden/>
+          </w:rPr>
+          <w:fldChar w:fldCharType="begin"/>
+        </w:r>
+        <w:r>
+          <w:rPr>
+            <w:noProof/>
+            <w:webHidden/>
+          </w:rPr>
+          <w:instrText xml:space="preserve"> PAGEREF _Toc237715695 \h </w:instrText>
+        </w:r>
+        <w:r>
+          <w:rPr>
+            <w:noProof/>
+            <w:webHidden/>
+          </w:rPr>
+        </w:r>
+        <w:r>
+          <w:rPr>
+            <w:noProof/>
+            <w:webHidden/>
+          </w:rPr>
+          <w:fldChar w:fldCharType="separate"/>
+        </w:r>
+        <w:r>
+          <w:rPr>
+            <w:noProof/>
+            <w:webHidden/>
+          </w:rPr>
+          <w:t>8</w:t>
+        </w:r>
+        <w:r>
+          <w:rPr>
+            <w:noProof/>
+            <w:webHidden/>
+          </w:rPr>
+          <w:fldChar w:fldCharType="end"/>
+        </w:r>
+      </w:hyperlink>
+    </w:p>
+    <w:p>
+      <w:pPr>
+        <w:pStyle w:val="Mucluc2"/>
+        <w:tabs>
+          <w:tab w:val="right" w:leader="dot" w:pos="8948"/>
+        </w:tabs>
+        <w:rPr>
+          <w:noProof/>
+        </w:rPr>
+      </w:pPr>
+      <w:hyperlink w:anchor="_Toc237715696" w:history="1">
+        <w:r>
+          <w:rPr>
+            <w:rStyle w:val="Siuktni"/>
+            <w:noProof/>
+          </w:rPr>
+          <w:t>1.6. Chủ thể của vi phạm pháp luật</w:t>
+        </w:r>
+        <w:r>
+          <w:rPr>
+            <w:noProof/>
+            <w:webHidden/>
+          </w:rPr>
+          <w:tab/>
+        </w:r>
+        <w:r>
+          <w:rPr>
+            <w:noProof/>
+            <w:webHidden/>
+          </w:rPr>
+          <w:fldChar w:fldCharType="begin"/>
+        </w:r>
+        <w:r>
+          <w:rPr>
+            <w:noProof/>
+            <w:webHidden/>
+          </w:rPr>
+          <w:instrText xml:space="preserve"> PAGEREF _Toc237715696 \h </w:instrText>
+        </w:r>
+        <w:r>
+          <w:rPr>
+            <w:noProof/>
+            <w:webHidden/>
+          </w:rPr>
+        </w:r>
+        <w:r>
+          <w:rPr>
+            <w:noProof/>
+            <w:webHidden/>
+          </w:rPr>
+          <w:fldChar w:fldCharType="separate"/>
+        </w:r>
+        <w:r>
+          <w:rPr>
+            <w:noProof/>
+            <w:webHidden/>
+          </w:rPr>
+          <w:t>9</w:t>
+        </w:r>
+        <w:r>
+          <w:rPr>
+            <w:noProof/>
+            <w:webHidden/>
+          </w:rPr>
+          <w:fldChar w:fldCharType="end"/>
+        </w:r>
+      </w:hyperlink>
+    </w:p>
+    <w:p>
+      <w:pPr>
+        <w:pStyle w:val="Mucluc2"/>
+        <w:tabs>
+          <w:tab w:val="right" w:leader="dot" w:pos="8948"/>
+        </w:tabs>
+        <w:rPr>
+          <w:noProof/>
+        </w:rPr>
+      </w:pPr>
+      <w:hyperlink w:anchor="_Toc237715697" w:history="1">
+        <w:r>
+          <w:rPr>
+            <w:rStyle w:val="Siuktni"/>
+            <w:noProof/>
+          </w:rPr>
+          <w:t>1.7. Mặt chủ quan của vi phạm pháp luật</w:t>
+        </w:r>
+        <w:r>
+          <w:rPr>
+            <w:noProof/>
+            <w:webHidden/>
+          </w:rPr>
+          <w:tab/>
+        </w:r>
+        <w:r>
+          <w:rPr>
+            <w:noProof/>
+            <w:webHidden/>
+          </w:rPr>
+          <w:fldChar w:fldCharType="begin"/>
+        </w:r>
+        <w:r>
+          <w:rPr>
+            <w:noProof/>
+            <w:webHidden/>
+          </w:rPr>
+          <w:instrText xml:space="preserve"> PAGEREF _Toc237715697 \h </w:instrText>
+        </w:r>
+        <w:r>
+          <w:rPr>
+            <w:noProof/>
+            <w:webHidden/>
+          </w:rPr>
+        </w:r>
+        <w:r>
+          <w:rPr>
+            <w:noProof/>
+            <w:webHidden/>
+          </w:rPr>
+          <w:fldChar w:fldCharType="separate"/>
+        </w:r>
+        <w:r>
+          <w:rPr>
+            <w:noProof/>
+            <w:webHidden/>
+          </w:rPr>
+          <w:t>9</w:t>
         </w:r>
         <w:r>
           <w:rPr>
@@ -1283,13 +1623,13 @@
           <w:noProof/>
         </w:rPr>
       </w:pPr>
-      <w:hyperlink w:anchor="_Toc237714975" w:history="1">
+      <w:hyperlink w:anchor="_Toc237715698" w:history="1">
         <w:r>
           <w:rPr>
             <w:rStyle w:val="Siuktni"/>
             <w:noProof/>
           </w:rPr>
-          <w:t>CHƯƠNG 1: CƠ SỞ LÝ LUẬN VỀ VI PHẠM PHÁP LUẬT VÀ CẤU THÀNH VI PHẠM PHÁP LUẬT</w:t>
+          <w:t>CHƯƠNG 2: KHÁI QUÁT VỤ VIỆC QUẢNG CÁO GIAN DỐI SẢN PHẨM ĐÔNG Y TRÊN MẠNG XÃ HỘI</w:t>
         </w:r>
         <w:r>
           <w:rPr>
@@ -1310,7 +1650,7 @@
             <w:noProof/>
             <w:webHidden/>
           </w:rPr>
-          <w:instrText xml:space="preserve"> PAGEREF _Toc237714975 \h </w:instrText>
+          <w:instrText xml:space="preserve"> PAGEREF _Toc237715698 \h </w:instrText>
         </w:r>
         <w:r>
           <w:rPr>
@@ -1330,7 +1670,7 @@
             <w:noProof/>
             <w:webHidden/>
           </w:rPr>
-          <w:t>8</w:t>
+          <w:t>10</w:t>
         </w:r>
         <w:r>
           <w:rPr>
@@ -1351,13 +1691,13 @@
           <w:noProof/>
         </w:rPr>
       </w:pPr>
-      <w:hyperlink w:anchor="_Toc237714976" w:history="1">
+      <w:hyperlink w:anchor="_Toc237715699" w:history="1">
         <w:r>
           <w:rPr>
             <w:rStyle w:val="Siuktni"/>
             <w:noProof/>
           </w:rPr>
-          <w:t>1.1. Khái niệm vi phạm pháp luật</w:t>
+          <w:t>2.1. Nguồn gốc thông tin và bối cảnh vụ việc</w:t>
         </w:r>
         <w:r>
           <w:rPr>
@@ -1378,7 +1718,7 @@
             <w:noProof/>
             <w:webHidden/>
           </w:rPr>
-          <w:instrText xml:space="preserve"> PAGEREF _Toc237714976 \h </w:instrText>
+          <w:instrText xml:space="preserve"> PAGEREF _Toc237715699 \h </w:instrText>
         </w:r>
         <w:r>
           <w:rPr>
@@ -1398,7 +1738,7 @@
             <w:noProof/>
             <w:webHidden/>
           </w:rPr>
-          <w:t>8</w:t>
+          <w:t>10</w:t>
         </w:r>
         <w:r>
           <w:rPr>
@@ -1419,13 +1759,13 @@
           <w:noProof/>
         </w:rPr>
       </w:pPr>
-      <w:hyperlink w:anchor="_Toc237714977" w:history="1">
+      <w:hyperlink w:anchor="_Toc237715700" w:history="1">
         <w:r>
           <w:rPr>
             <w:rStyle w:val="Siuktni"/>
             <w:noProof/>
           </w:rPr>
-          <w:t>1.2. Các dấu hiệu cơ bản của vi phạm pháp luật</w:t>
+          <w:t>2.2. Phương thức và diễn biến hành vi theo thông tin điều tra ban đầu</w:t>
         </w:r>
         <w:r>
           <w:rPr>
@@ -1446,7 +1786,7 @@
             <w:noProof/>
             <w:webHidden/>
           </w:rPr>
-          <w:instrText xml:space="preserve"> PAGEREF _Toc237714977 \h </w:instrText>
+          <w:instrText xml:space="preserve"> PAGEREF _Toc237715700 \h </w:instrText>
         </w:r>
         <w:r>
           <w:rPr>
@@ -1466,7 +1806,7 @@
             <w:noProof/>
             <w:webHidden/>
           </w:rPr>
-          <w:t>8</w:t>
+          <w:t>10</w:t>
         </w:r>
         <w:r>
           <w:rPr>
@@ -1487,13 +1827,13 @@
           <w:noProof/>
         </w:rPr>
       </w:pPr>
-      <w:hyperlink w:anchor="_Toc237714978" w:history="1">
+      <w:hyperlink w:anchor="_Toc237715701" w:history="1">
         <w:r>
           <w:rPr>
             <w:rStyle w:val="Siuktni"/>
             <w:noProof/>
           </w:rPr>
-          <w:t>1.3. Khái niệm và ý nghĩa của cấu thành vi phạm pháp luật</w:t>
+          <w:t>2.3. Các chủ thể liên quan và phân công vai trò</w:t>
         </w:r>
         <w:r>
           <w:rPr>
@@ -1514,7 +1854,7 @@
             <w:noProof/>
             <w:webHidden/>
           </w:rPr>
-          <w:instrText xml:space="preserve"> PAGEREF _Toc237714978 \h </w:instrText>
+          <w:instrText xml:space="preserve"> PAGEREF _Toc237715701 \h </w:instrText>
         </w:r>
         <w:r>
           <w:rPr>
@@ -1534,7 +1874,7 @@
             <w:noProof/>
             <w:webHidden/>
           </w:rPr>
-          <w:t>9</w:t>
+          <w:t>11</w:t>
         </w:r>
         <w:r>
           <w:rPr>
@@ -1555,13 +1895,13 @@
           <w:noProof/>
         </w:rPr>
       </w:pPr>
-      <w:hyperlink w:anchor="_Toc237714979" w:history="1">
+      <w:hyperlink w:anchor="_Toc237715702" w:history="1">
         <w:r>
           <w:rPr>
             <w:rStyle w:val="Siuktni"/>
             <w:noProof/>
           </w:rPr>
-          <w:t>1.4. Khách thể của vi phạm pháp luật</w:t>
+          <w:t>2.4. Trạng thái tố tụng hiện tại</w:t>
         </w:r>
         <w:r>
           <w:rPr>
@@ -1582,7 +1922,7 @@
             <w:noProof/>
             <w:webHidden/>
           </w:rPr>
-          <w:instrText xml:space="preserve"> PAGEREF _Toc237714979 \h </w:instrText>
+          <w:instrText xml:space="preserve"> PAGEREF _Toc237715702 \h </w:instrText>
         </w:r>
         <w:r>
           <w:rPr>
@@ -1602,7 +1942,7 @@
             <w:noProof/>
             <w:webHidden/>
           </w:rPr>
-          <w:t>10</w:t>
+          <w:t>11</w:t>
         </w:r>
         <w:r>
           <w:rPr>
@@ -1623,13 +1963,13 @@
           <w:noProof/>
         </w:rPr>
       </w:pPr>
-      <w:hyperlink w:anchor="_Toc237714980" w:history="1">
+      <w:hyperlink w:anchor="_Toc237715703" w:history="1">
         <w:r>
           <w:rPr>
             <w:rStyle w:val="Siuktni"/>
             <w:noProof/>
           </w:rPr>
-          <w:t>1.5. Mặt khách quan của vi phạm pháp luật</w:t>
+          <w:t>2.5. Bảng tổng hợp dữ kiện và dòng thời gian vụ việc</w:t>
         </w:r>
         <w:r>
           <w:rPr>
@@ -1650,7 +1990,7 @@
             <w:noProof/>
             <w:webHidden/>
           </w:rPr>
-          <w:instrText xml:space="preserve"> PAGEREF _Toc237714980 \h </w:instrText>
+          <w:instrText xml:space="preserve"> PAGEREF _Toc237715703 \h </w:instrText>
         </w:r>
         <w:r>
           <w:rPr>
@@ -1670,7 +2010,75 @@
             <w:noProof/>
             <w:webHidden/>
           </w:rPr>
-          <w:t>10</w:t>
+          <w:t>12</w:t>
+        </w:r>
+        <w:r>
+          <w:rPr>
+            <w:noProof/>
+            <w:webHidden/>
+          </w:rPr>
+          <w:fldChar w:fldCharType="end"/>
+        </w:r>
+      </w:hyperlink>
+    </w:p>
+    <w:p>
+      <w:pPr>
+        <w:pStyle w:val="Mucluc1"/>
+        <w:tabs>
+          <w:tab w:val="right" w:leader="dot" w:pos="8948"/>
+        </w:tabs>
+        <w:rPr>
+          <w:noProof/>
+        </w:rPr>
+      </w:pPr>
+      <w:hyperlink w:anchor="_Toc237715704" w:history="1">
+        <w:r>
+          <w:rPr>
+            <w:rStyle w:val="Siuktni"/>
+            <w:noProof/>
+          </w:rPr>
+          <w:t>CHƯƠNG 3: PHÂN TÍCH CÁC YẾU TỐ CẤU THÀNH VI PHẠM PHÁP LUẬT TRONG VỤ VIỆC</w:t>
+        </w:r>
+        <w:r>
+          <w:rPr>
+            <w:noProof/>
+            <w:webHidden/>
+          </w:rPr>
+          <w:tab/>
+        </w:r>
+        <w:r>
+          <w:rPr>
+            <w:noProof/>
+            <w:webHidden/>
+          </w:rPr>
+          <w:fldChar w:fldCharType="begin"/>
+        </w:r>
+        <w:r>
+          <w:rPr>
+            <w:noProof/>
+            <w:webHidden/>
+          </w:rPr>
+          <w:instrText xml:space="preserve"> PAGEREF _Toc237715704 \h </w:instrText>
+        </w:r>
+        <w:r>
+          <w:rPr>
+            <w:noProof/>
+            <w:webHidden/>
+          </w:rPr>
+        </w:r>
+        <w:r>
+          <w:rPr>
+            <w:noProof/>
+            <w:webHidden/>
+          </w:rPr>
+          <w:fldChar w:fldCharType="separate"/>
+        </w:r>
+        <w:r>
+          <w:rPr>
+            <w:noProof/>
+            <w:webHidden/>
+          </w:rPr>
+          <w:t>13</w:t>
         </w:r>
         <w:r>
           <w:rPr>
@@ -1691,13 +2099,13 @@
           <w:noProof/>
         </w:rPr>
       </w:pPr>
-      <w:hyperlink w:anchor="_Toc237714981" w:history="1">
+      <w:hyperlink w:anchor="_Toc237715705" w:history="1">
         <w:r>
           <w:rPr>
             <w:rStyle w:val="Siuktni"/>
             <w:noProof/>
           </w:rPr>
-          <w:t>1.6. Chủ thể của vi phạm pháp luật</w:t>
+          <w:t>3.1. Phân tích yếu tố Khách thể của vi phạm pháp luật</w:t>
         </w:r>
         <w:r>
           <w:rPr>
@@ -1718,7 +2126,7 @@
             <w:noProof/>
             <w:webHidden/>
           </w:rPr>
-          <w:instrText xml:space="preserve"> PAGEREF _Toc237714981 \h </w:instrText>
+          <w:instrText xml:space="preserve"> PAGEREF _Toc237715705 \h </w:instrText>
         </w:r>
         <w:r>
           <w:rPr>
@@ -1738,7 +2146,7 @@
             <w:noProof/>
             <w:webHidden/>
           </w:rPr>
-          <w:t>11</w:t>
+          <w:t>13</w:t>
         </w:r>
         <w:r>
           <w:rPr>
@@ -1759,13 +2167,13 @@
           <w:noProof/>
         </w:rPr>
       </w:pPr>
-      <w:hyperlink w:anchor="_Toc237714982" w:history="1">
+      <w:hyperlink w:anchor="_Toc237715706" w:history="1">
         <w:r>
           <w:rPr>
             <w:rStyle w:val="Siuktni"/>
             <w:noProof/>
           </w:rPr>
-          <w:t>1.7. Mặt chủ quan của vi phạm pháp luật</w:t>
+          <w:t>3.2. Phân tích yếu tố Mặt khách quan của vi phạm pháp luật</w:t>
         </w:r>
         <w:r>
           <w:rPr>
@@ -1786,7 +2194,7 @@
             <w:noProof/>
             <w:webHidden/>
           </w:rPr>
-          <w:instrText xml:space="preserve"> PAGEREF _Toc237714982 \h </w:instrText>
+          <w:instrText xml:space="preserve"> PAGEREF _Toc237715706 \h </w:instrText>
         </w:r>
         <w:r>
           <w:rPr>
@@ -1806,7 +2214,211 @@
             <w:noProof/>
             <w:webHidden/>
           </w:rPr>
-          <w:t>11</w:t>
+          <w:t>15</w:t>
+        </w:r>
+        <w:r>
+          <w:rPr>
+            <w:noProof/>
+            <w:webHidden/>
+          </w:rPr>
+          <w:fldChar w:fldCharType="end"/>
+        </w:r>
+      </w:hyperlink>
+    </w:p>
+    <w:p>
+      <w:pPr>
+        <w:pStyle w:val="Mucluc2"/>
+        <w:tabs>
+          <w:tab w:val="right" w:leader="dot" w:pos="8948"/>
+        </w:tabs>
+        <w:rPr>
+          <w:noProof/>
+        </w:rPr>
+      </w:pPr>
+      <w:hyperlink w:anchor="_Toc237715707" w:history="1">
+        <w:r>
+          <w:rPr>
+            <w:rStyle w:val="Siuktni"/>
+            <w:noProof/>
+          </w:rPr>
+          <w:t>3.3. Phân tích yếu tố Chủ thể của vi phạm pháp luật</w:t>
+        </w:r>
+        <w:r>
+          <w:rPr>
+            <w:noProof/>
+            <w:webHidden/>
+          </w:rPr>
+          <w:tab/>
+        </w:r>
+        <w:r>
+          <w:rPr>
+            <w:noProof/>
+            <w:webHidden/>
+          </w:rPr>
+          <w:fldChar w:fldCharType="begin"/>
+        </w:r>
+        <w:r>
+          <w:rPr>
+            <w:noProof/>
+            <w:webHidden/>
+          </w:rPr>
+          <w:instrText xml:space="preserve"> PAGEREF _Toc237715707 \h </w:instrText>
+        </w:r>
+        <w:r>
+          <w:rPr>
+            <w:noProof/>
+            <w:webHidden/>
+          </w:rPr>
+        </w:r>
+        <w:r>
+          <w:rPr>
+            <w:noProof/>
+            <w:webHidden/>
+          </w:rPr>
+          <w:fldChar w:fldCharType="separate"/>
+        </w:r>
+        <w:r>
+          <w:rPr>
+            <w:noProof/>
+            <w:webHidden/>
+          </w:rPr>
+          <w:t>16</w:t>
+        </w:r>
+        <w:r>
+          <w:rPr>
+            <w:noProof/>
+            <w:webHidden/>
+          </w:rPr>
+          <w:fldChar w:fldCharType="end"/>
+        </w:r>
+      </w:hyperlink>
+    </w:p>
+    <w:p>
+      <w:pPr>
+        <w:pStyle w:val="Mucluc2"/>
+        <w:tabs>
+          <w:tab w:val="right" w:leader="dot" w:pos="8948"/>
+        </w:tabs>
+        <w:rPr>
+          <w:noProof/>
+        </w:rPr>
+      </w:pPr>
+      <w:hyperlink w:anchor="_Toc237715708" w:history="1">
+        <w:r>
+          <w:rPr>
+            <w:rStyle w:val="Siuktni"/>
+            <w:noProof/>
+          </w:rPr>
+          <w:t>3.4. Phân tích yếu tố Mặt chủ quan của vi phạm pháp luật</w:t>
+        </w:r>
+        <w:r>
+          <w:rPr>
+            <w:noProof/>
+            <w:webHidden/>
+          </w:rPr>
+          <w:tab/>
+        </w:r>
+        <w:r>
+          <w:rPr>
+            <w:noProof/>
+            <w:webHidden/>
+          </w:rPr>
+          <w:fldChar w:fldCharType="begin"/>
+        </w:r>
+        <w:r>
+          <w:rPr>
+            <w:noProof/>
+            <w:webHidden/>
+          </w:rPr>
+          <w:instrText xml:space="preserve"> PAGEREF _Toc237715708 \h </w:instrText>
+        </w:r>
+        <w:r>
+          <w:rPr>
+            <w:noProof/>
+            <w:webHidden/>
+          </w:rPr>
+        </w:r>
+        <w:r>
+          <w:rPr>
+            <w:noProof/>
+            <w:webHidden/>
+          </w:rPr>
+          <w:fldChar w:fldCharType="separate"/>
+        </w:r>
+        <w:r>
+          <w:rPr>
+            <w:noProof/>
+            <w:webHidden/>
+          </w:rPr>
+          <w:t>18</w:t>
+        </w:r>
+        <w:r>
+          <w:rPr>
+            <w:noProof/>
+            <w:webHidden/>
+          </w:rPr>
+          <w:fldChar w:fldCharType="end"/>
+        </w:r>
+      </w:hyperlink>
+    </w:p>
+    <w:p>
+      <w:pPr>
+        <w:pStyle w:val="Mucluc2"/>
+        <w:tabs>
+          <w:tab w:val="right" w:leader="dot" w:pos="8948"/>
+        </w:tabs>
+        <w:rPr>
+          <w:noProof/>
+        </w:rPr>
+      </w:pPr>
+      <w:hyperlink w:anchor="_Toc237715709" w:history="1">
+        <w:r>
+          <w:rPr>
+            <w:rStyle w:val="Siuktni"/>
+            <w:noProof/>
+          </w:rPr>
+          <w:t>3.5. Bảng tổng hợp bốn yếu tố cấu thành vi phạm pháp luật</w:t>
+        </w:r>
+        <w:r>
+          <w:rPr>
+            <w:noProof/>
+            <w:webHidden/>
+          </w:rPr>
+          <w:tab/>
+        </w:r>
+        <w:r>
+          <w:rPr>
+            <w:noProof/>
+            <w:webHidden/>
+          </w:rPr>
+          <w:fldChar w:fldCharType="begin"/>
+        </w:r>
+        <w:r>
+          <w:rPr>
+            <w:noProof/>
+            <w:webHidden/>
+          </w:rPr>
+          <w:instrText xml:space="preserve"> PAGEREF _Toc237715709 \h </w:instrText>
+        </w:r>
+        <w:r>
+          <w:rPr>
+            <w:noProof/>
+            <w:webHidden/>
+          </w:rPr>
+        </w:r>
+        <w:r>
+          <w:rPr>
+            <w:noProof/>
+            <w:webHidden/>
+          </w:rPr>
+          <w:fldChar w:fldCharType="separate"/>
+        </w:r>
+        <w:r>
+          <w:rPr>
+            <w:noProof/>
+            <w:webHidden/>
+          </w:rPr>
+          <w:t>19</w:t>
         </w:r>
         <w:r>
           <w:rPr>
@@ -1827,13 +2439,13 @@
           <w:noProof/>
         </w:rPr>
       </w:pPr>
-      <w:hyperlink w:anchor="_Toc237714983" w:history="1">
+      <w:hyperlink w:anchor="_Toc237715710" w:history="1">
         <w:r>
           <w:rPr>
             <w:rStyle w:val="Siuktni"/>
             <w:noProof/>
           </w:rPr>
-          <w:t>CHƯƠNG 2: KHÁI QUÁT VỤ VIỆC QUẢNG CÁO GIAN DỐI SẢN PHẨM ĐÔNG Y TRÊN MẠNG XÃ HỘI</w:t>
+          <w:t>CHƯƠNG 4: NHẬN XÉT VÀ BÀI HỌC THỰC TIỄN</w:t>
         </w:r>
         <w:r>
           <w:rPr>
@@ -1854,7 +2466,7 @@
             <w:noProof/>
             <w:webHidden/>
           </w:rPr>
-          <w:instrText xml:space="preserve"> PAGEREF _Toc237714983 \h </w:instrText>
+          <w:instrText xml:space="preserve"> PAGEREF _Toc237715710 \h </w:instrText>
         </w:r>
         <w:r>
           <w:rPr>
@@ -1874,7 +2486,7 @@
             <w:noProof/>
             <w:webHidden/>
           </w:rPr>
-          <w:t>13</w:t>
+          <w:t>20</w:t>
         </w:r>
         <w:r>
           <w:rPr>
@@ -1895,13 +2507,13 @@
           <w:noProof/>
         </w:rPr>
       </w:pPr>
-      <w:hyperlink w:anchor="_Toc237714984" w:history="1">
+      <w:hyperlink w:anchor="_Toc237715711" w:history="1">
         <w:r>
           <w:rPr>
             <w:rStyle w:val="Siuktni"/>
             <w:noProof/>
           </w:rPr>
-          <w:t>2.1. Nguồn gốc thông tin và bối cảnh vụ việc</w:t>
+          <w:t>4.1. Ý nghĩa phòng ngừa từ vụ việc</w:t>
         </w:r>
         <w:r>
           <w:rPr>
@@ -1922,7 +2534,7 @@
             <w:noProof/>
             <w:webHidden/>
           </w:rPr>
-          <w:instrText xml:space="preserve"> PAGEREF _Toc237714984 \h </w:instrText>
+          <w:instrText xml:space="preserve"> PAGEREF _Toc237715711 \h </w:instrText>
         </w:r>
         <w:r>
           <w:rPr>
@@ -1942,7 +2554,7 @@
             <w:noProof/>
             <w:webHidden/>
           </w:rPr>
-          <w:t>13</w:t>
+          <w:t>20</w:t>
         </w:r>
         <w:r>
           <w:rPr>
@@ -1963,13 +2575,13 @@
           <w:noProof/>
         </w:rPr>
       </w:pPr>
-      <w:hyperlink w:anchor="_Toc237714985" w:history="1">
+      <w:hyperlink w:anchor="_Toc237715712" w:history="1">
         <w:r>
           <w:rPr>
             <w:rStyle w:val="Siuktni"/>
             <w:noProof/>
           </w:rPr>
-          <w:t>2.2. Phương thức và diễn biến hành vi theo thông tin điều tra ban đầu</w:t>
+          <w:t>4.2. Bài học đối với hoạt động kinh doanh trực tuyến và người tiêu dùng</w:t>
         </w:r>
         <w:r>
           <w:rPr>
@@ -1990,7 +2602,7 @@
             <w:noProof/>
             <w:webHidden/>
           </w:rPr>
-          <w:instrText xml:space="preserve"> PAGEREF _Toc237714985 \h </w:instrText>
+          <w:instrText xml:space="preserve"> PAGEREF _Toc237715712 \h </w:instrText>
         </w:r>
         <w:r>
           <w:rPr>
@@ -2010,7 +2622,7 @@
             <w:noProof/>
             <w:webHidden/>
           </w:rPr>
-          <w:t>13</w:t>
+          <w:t>20</w:t>
         </w:r>
         <w:r>
           <w:rPr>
@@ -2031,13 +2643,13 @@
           <w:noProof/>
         </w:rPr>
       </w:pPr>
-      <w:hyperlink w:anchor="_Toc237714986" w:history="1">
+      <w:hyperlink w:anchor="_Toc237715713" w:history="1">
         <w:r>
           <w:rPr>
             <w:rStyle w:val="Siuktni"/>
             <w:noProof/>
           </w:rPr>
-          <w:t>2.3. Các chủ thể liên quan và phân công vai trò</w:t>
+          <w:t>4.3. Bài học về nhận thức pháp luật và đạo đức số cho sinh viên CNTT</w:t>
         </w:r>
         <w:r>
           <w:rPr>
@@ -2058,7 +2670,7 @@
             <w:noProof/>
             <w:webHidden/>
           </w:rPr>
-          <w:instrText xml:space="preserve"> PAGEREF _Toc237714986 \h </w:instrText>
+          <w:instrText xml:space="preserve"> PAGEREF _Toc237715713 \h </w:instrText>
         </w:r>
         <w:r>
           <w:rPr>
@@ -2078,7 +2690,143 @@
             <w:noProof/>
             <w:webHidden/>
           </w:rPr>
-          <w:t>14</w:t>
+          <w:t>20</w:t>
+        </w:r>
+        <w:r>
+          <w:rPr>
+            <w:noProof/>
+            <w:webHidden/>
+          </w:rPr>
+          <w:fldChar w:fldCharType="end"/>
+        </w:r>
+      </w:hyperlink>
+    </w:p>
+    <w:p>
+      <w:pPr>
+        <w:pStyle w:val="Mucluc1"/>
+        <w:tabs>
+          <w:tab w:val="right" w:leader="dot" w:pos="8948"/>
+        </w:tabs>
+        <w:rPr>
+          <w:noProof/>
+        </w:rPr>
+      </w:pPr>
+      <w:hyperlink w:anchor="_Toc237715714" w:history="1">
+        <w:r>
+          <w:rPr>
+            <w:rStyle w:val="Siuktni"/>
+            <w:noProof/>
+          </w:rPr>
+          <w:t>KẾT LUẬN</w:t>
+        </w:r>
+        <w:r>
+          <w:rPr>
+            <w:noProof/>
+            <w:webHidden/>
+          </w:rPr>
+          <w:tab/>
+        </w:r>
+        <w:r>
+          <w:rPr>
+            <w:noProof/>
+            <w:webHidden/>
+          </w:rPr>
+          <w:fldChar w:fldCharType="begin"/>
+        </w:r>
+        <w:r>
+          <w:rPr>
+            <w:noProof/>
+            <w:webHidden/>
+          </w:rPr>
+          <w:instrText xml:space="preserve"> PAGEREF _Toc237715714 \h </w:instrText>
+        </w:r>
+        <w:r>
+          <w:rPr>
+            <w:noProof/>
+            <w:webHidden/>
+          </w:rPr>
+        </w:r>
+        <w:r>
+          <w:rPr>
+            <w:noProof/>
+            <w:webHidden/>
+          </w:rPr>
+          <w:fldChar w:fldCharType="separate"/>
+        </w:r>
+        <w:r>
+          <w:rPr>
+            <w:noProof/>
+            <w:webHidden/>
+          </w:rPr>
+          <w:t>22</w:t>
+        </w:r>
+        <w:r>
+          <w:rPr>
+            <w:noProof/>
+            <w:webHidden/>
+          </w:rPr>
+          <w:fldChar w:fldCharType="end"/>
+        </w:r>
+      </w:hyperlink>
+    </w:p>
+    <w:p>
+      <w:pPr>
+        <w:pStyle w:val="Mucluc1"/>
+        <w:tabs>
+          <w:tab w:val="right" w:leader="dot" w:pos="8948"/>
+        </w:tabs>
+        <w:rPr>
+          <w:noProof/>
+        </w:rPr>
+      </w:pPr>
+      <w:hyperlink w:anchor="_Toc237715715" w:history="1">
+        <w:r>
+          <w:rPr>
+            <w:rStyle w:val="Siuktni"/>
+            <w:noProof/>
+          </w:rPr>
+          <w:t>TÀI LIỆU THAM KHẢO</w:t>
+        </w:r>
+        <w:r>
+          <w:rPr>
+            <w:noProof/>
+            <w:webHidden/>
+          </w:rPr>
+          <w:tab/>
+        </w:r>
+        <w:r>
+          <w:rPr>
+            <w:noProof/>
+            <w:webHidden/>
+          </w:rPr>
+          <w:fldChar w:fldCharType="begin"/>
+        </w:r>
+        <w:r>
+          <w:rPr>
+            <w:noProof/>
+            <w:webHidden/>
+          </w:rPr>
+          <w:instrText xml:space="preserve"> PAGEREF _Toc237715715 \h </w:instrText>
+        </w:r>
+        <w:r>
+          <w:rPr>
+            <w:noProof/>
+            <w:webHidden/>
+          </w:rPr>
+        </w:r>
+        <w:r>
+          <w:rPr>
+            <w:noProof/>
+            <w:webHidden/>
+          </w:rPr>
+          <w:fldChar w:fldCharType="separate"/>
+        </w:r>
+        <w:r>
+          <w:rPr>
+            <w:noProof/>
+            <w:webHidden/>
+          </w:rPr>
+          <w:t>23</w:t>
         </w:r>
         <w:r>
           <w:rPr>
@@ -2099,13 +2847,13 @@
           <w:noProof/>
         </w:rPr>
       </w:pPr>
-      <w:hyperlink w:anchor="_Toc237714987" w:history="1">
+      <w:hyperlink w:anchor="_Toc237715716" w:history="1">
         <w:r>
           <w:rPr>
             <w:rStyle w:val="Siuktni"/>
             <w:noProof/>
           </w:rPr>
-          <w:t>2.4. Trạng thái tố tụng hiện tại</w:t>
+          <w:t>A. Văn bản quy phạm pháp luật</w:t>
         </w:r>
         <w:r>
           <w:rPr>
@@ -2126,7 +2874,7 @@
             <w:noProof/>
             <w:webHidden/>
           </w:rPr>
-          <w:instrText xml:space="preserve"> PAGEREF _Toc237714987 \h </w:instrText>
+          <w:instrText xml:space="preserve"> PAGEREF _Toc237715716 \h </w:instrText>
         </w:r>
         <w:r>
           <w:rPr>
@@ -2146,7 +2894,7 @@
             <w:noProof/>
             <w:webHidden/>
           </w:rPr>
-          <w:t>14</w:t>
+          <w:t>23</w:t>
         </w:r>
         <w:r>
           <w:rPr>
@@ -2167,13 +2915,13 @@
           <w:noProof/>
         </w:rPr>
       </w:pPr>
-      <w:hyperlink w:anchor="_Toc237714988" w:history="1">
+      <w:hyperlink w:anchor="_Toc237715717" w:history="1">
         <w:r>
           <w:rPr>
             <w:rStyle w:val="Siuktni"/>
             <w:noProof/>
           </w:rPr>
-          <w:t>2.5. Bảng tổng hợp dữ kiện và dòng thời gian vụ việc</w:t>
+          <w:t>B. Giáo trình và tài liệu học thuật</w:t>
         </w:r>
         <w:r>
           <w:rPr>
@@ -2194,7 +2942,7 @@
             <w:noProof/>
             <w:webHidden/>
           </w:rPr>
-          <w:instrText xml:space="preserve"> PAGEREF _Toc237714988 \h </w:instrText>
+          <w:instrText xml:space="preserve"> PAGEREF _Toc237715717 \h </w:instrText>
         </w:r>
         <w:r>
           <w:rPr>
@@ -2214,75 +2962,7 @@
             <w:noProof/>
             <w:webHidden/>
           </w:rPr>
-          <w:t>15</w:t>
-        </w:r>
-        <w:r>
-          <w:rPr>
-            <w:noProof/>
-            <w:webHidden/>
-          </w:rPr>
-          <w:fldChar w:fldCharType="end"/>
-        </w:r>
-      </w:hyperlink>
-    </w:p>
-    <w:p>
-      <w:pPr>
-        <w:pStyle w:val="Mucluc1"/>
-        <w:tabs>
-          <w:tab w:val="right" w:leader="dot" w:pos="8948"/>
-        </w:tabs>
-        <w:rPr>
-          <w:noProof/>
-        </w:rPr>
-      </w:pPr>
-      <w:hyperlink w:anchor="_Toc237714989" w:history="1">
-        <w:r>
-          <w:rPr>
-            <w:rStyle w:val="Siuktni"/>
-            <w:noProof/>
-          </w:rPr>
-          <w:t>CHƯƠNG 3: PHÂN TÍCH CÁC YẾU TỐ CẤU THÀNH VI PHẠM PHÁP LUẬT TRONG VỤ VIỆC</w:t>
-        </w:r>
-        <w:r>
-          <w:rPr>
-            <w:noProof/>
-            <w:webHidden/>
-          </w:rPr>
-          <w:tab/>
-        </w:r>
-        <w:r>
-          <w:rPr>
-            <w:noProof/>
-            <w:webHidden/>
-          </w:rPr>
-          <w:fldChar w:fldCharType="begin"/>
-        </w:r>
-        <w:r>
-          <w:rPr>
-            <w:noProof/>
-            <w:webHidden/>
-          </w:rPr>
-          <w:instrText xml:space="preserve"> PAGEREF _Toc237714989 \h </w:instrText>
-        </w:r>
-        <w:r>
-          <w:rPr>
-            <w:noProof/>
-            <w:webHidden/>
-          </w:rPr>
-        </w:r>
-        <w:r>
-          <w:rPr>
-            <w:noProof/>
-            <w:webHidden/>
-          </w:rPr>
-          <w:fldChar w:fldCharType="separate"/>
-        </w:r>
-        <w:r>
-          <w:rPr>
-            <w:noProof/>
-            <w:webHidden/>
-          </w:rPr>
-          <w:t>16</w:t>
+          <w:t>23</w:t>
         </w:r>
         <w:r>
           <w:rPr>
@@ -2303,13 +2983,13 @@
           <w:noProof/>
         </w:rPr>
       </w:pPr>
-      <w:hyperlink w:anchor="_Toc237714990" w:history="1">
+      <w:hyperlink w:anchor="_Toc237715718" w:history="1">
         <w:r>
           <w:rPr>
             <w:rStyle w:val="Siuktni"/>
             <w:noProof/>
           </w:rPr>
-          <w:t>3.1. Phân tích yếu tố Khách thể của vi phạm pháp luật</w:t>
+          <w:t>C. Nguồn dữ liệu báo chí chính thức về vụ việc</w:t>
         </w:r>
         <w:r>
           <w:rPr>
@@ -2330,7 +3010,7 @@
             <w:noProof/>
             <w:webHidden/>
           </w:rPr>
-          <w:instrText xml:space="preserve"> PAGEREF _Toc237714990 \h </w:instrText>
+          <w:instrText xml:space="preserve"> PAGEREF _Toc237715718 \h </w:instrText>
         </w:r>
         <w:r>
           <w:rPr>
@@ -2350,891 +3030,7 @@
             <w:noProof/>
             <w:webHidden/>
           </w:rPr>
-          <w:t>16</w:t>
-        </w:r>
-        <w:r>
-          <w:rPr>
-            <w:noProof/>
-            <w:webHidden/>
-          </w:rPr>
-          <w:fldChar w:fldCharType="end"/>
-        </w:r>
-      </w:hyperlink>
-    </w:p>
-    <w:p>
-      <w:pPr>
-        <w:pStyle w:val="Mucluc2"/>
-        <w:tabs>
-          <w:tab w:val="right" w:leader="dot" w:pos="8948"/>
-        </w:tabs>
-        <w:rPr>
-          <w:noProof/>
-        </w:rPr>
-      </w:pPr>
-      <w:hyperlink w:anchor="_Toc237714991" w:history="1">
-        <w:r>
-          <w:rPr>
-            <w:rStyle w:val="Siuktni"/>
-            <w:noProof/>
-          </w:rPr>
-          <w:t>3.2. Phân tích yếu tố Mặt khách quan của vi phạm pháp luật</w:t>
-        </w:r>
-        <w:r>
-          <w:rPr>
-            <w:noProof/>
-            <w:webHidden/>
-          </w:rPr>
-          <w:tab/>
-        </w:r>
-        <w:r>
-          <w:rPr>
-            <w:noProof/>
-            <w:webHidden/>
-          </w:rPr>
-          <w:fldChar w:fldCharType="begin"/>
-        </w:r>
-        <w:r>
-          <w:rPr>
-            <w:noProof/>
-            <w:webHidden/>
-          </w:rPr>
-          <w:instrText xml:space="preserve"> PAGEREF _Toc237714991 \h </w:instrText>
-        </w:r>
-        <w:r>
-          <w:rPr>
-            <w:noProof/>
-            <w:webHidden/>
-          </w:rPr>
-        </w:r>
-        <w:r>
-          <w:rPr>
-            <w:noProof/>
-            <w:webHidden/>
-          </w:rPr>
-          <w:fldChar w:fldCharType="separate"/>
-        </w:r>
-        <w:r>
-          <w:rPr>
-            <w:noProof/>
-            <w:webHidden/>
-          </w:rPr>
-          <w:t>18</w:t>
-        </w:r>
-        <w:r>
-          <w:rPr>
-            <w:noProof/>
-            <w:webHidden/>
-          </w:rPr>
-          <w:fldChar w:fldCharType="end"/>
-        </w:r>
-      </w:hyperlink>
-    </w:p>
-    <w:p>
-      <w:pPr>
-        <w:pStyle w:val="Mucluc2"/>
-        <w:tabs>
-          <w:tab w:val="right" w:leader="dot" w:pos="8948"/>
-        </w:tabs>
-        <w:rPr>
-          <w:noProof/>
-        </w:rPr>
-      </w:pPr>
-      <w:hyperlink w:anchor="_Toc237714992" w:history="1">
-        <w:r>
-          <w:rPr>
-            <w:rStyle w:val="Siuktni"/>
-            <w:noProof/>
-          </w:rPr>
-          <w:t>3.3. Phân tích yếu tố Chủ thể của vi phạm pháp luật</w:t>
-        </w:r>
-        <w:r>
-          <w:rPr>
-            <w:noProof/>
-            <w:webHidden/>
-          </w:rPr>
-          <w:tab/>
-        </w:r>
-        <w:r>
-          <w:rPr>
-            <w:noProof/>
-            <w:webHidden/>
-          </w:rPr>
-          <w:fldChar w:fldCharType="begin"/>
-        </w:r>
-        <w:r>
-          <w:rPr>
-            <w:noProof/>
-            <w:webHidden/>
-          </w:rPr>
-          <w:instrText xml:space="preserve"> PAGEREF _Toc237714992 \h </w:instrText>
-        </w:r>
-        <w:r>
-          <w:rPr>
-            <w:noProof/>
-            <w:webHidden/>
-          </w:rPr>
-        </w:r>
-        <w:r>
-          <w:rPr>
-            <w:noProof/>
-            <w:webHidden/>
-          </w:rPr>
-          <w:fldChar w:fldCharType="separate"/>
-        </w:r>
-        <w:r>
-          <w:rPr>
-            <w:noProof/>
-            <w:webHidden/>
-          </w:rPr>
-          <w:t>19</w:t>
-        </w:r>
-        <w:r>
-          <w:rPr>
-            <w:noProof/>
-            <w:webHidden/>
-          </w:rPr>
-          <w:fldChar w:fldCharType="end"/>
-        </w:r>
-      </w:hyperlink>
-    </w:p>
-    <w:p>
-      <w:pPr>
-        <w:pStyle w:val="Mucluc2"/>
-        <w:tabs>
-          <w:tab w:val="right" w:leader="dot" w:pos="8948"/>
-        </w:tabs>
-        <w:rPr>
-          <w:noProof/>
-        </w:rPr>
-      </w:pPr>
-      <w:hyperlink w:anchor="_Toc237714993" w:history="1">
-        <w:r>
-          <w:rPr>
-            <w:rStyle w:val="Siuktni"/>
-            <w:noProof/>
-          </w:rPr>
-          <w:t>3.4. Phân tích yếu tố Mặt chủ quan của vi phạm pháp luật</w:t>
-        </w:r>
-        <w:r>
-          <w:rPr>
-            <w:noProof/>
-            <w:webHidden/>
-          </w:rPr>
-          <w:tab/>
-        </w:r>
-        <w:r>
-          <w:rPr>
-            <w:noProof/>
-            <w:webHidden/>
-          </w:rPr>
-          <w:fldChar w:fldCharType="begin"/>
-        </w:r>
-        <w:r>
-          <w:rPr>
-            <w:noProof/>
-            <w:webHidden/>
-          </w:rPr>
-          <w:instrText xml:space="preserve"> PAGEREF _Toc237714993 \h </w:instrText>
-        </w:r>
-        <w:r>
-          <w:rPr>
-            <w:noProof/>
-            <w:webHidden/>
-          </w:rPr>
-        </w:r>
-        <w:r>
-          <w:rPr>
-            <w:noProof/>
-            <w:webHidden/>
-          </w:rPr>
-          <w:fldChar w:fldCharType="separate"/>
-        </w:r>
-        <w:r>
-          <w:rPr>
-            <w:noProof/>
-            <w:webHidden/>
-          </w:rPr>
-          <w:t>21</w:t>
-        </w:r>
-        <w:r>
-          <w:rPr>
-            <w:noProof/>
-            <w:webHidden/>
-          </w:rPr>
-          <w:fldChar w:fldCharType="end"/>
-        </w:r>
-      </w:hyperlink>
-    </w:p>
-    <w:p>
-      <w:pPr>
-        <w:pStyle w:val="Mucluc2"/>
-        <w:tabs>
-          <w:tab w:val="right" w:leader="dot" w:pos="8948"/>
-        </w:tabs>
-        <w:rPr>
-          <w:noProof/>
-        </w:rPr>
-      </w:pPr>
-      <w:hyperlink w:anchor="_Toc237714994" w:history="1">
-        <w:r>
-          <w:rPr>
-            <w:rStyle w:val="Siuktni"/>
-            <w:noProof/>
-          </w:rPr>
-          <w:t>3.5. Bảng tổng hợp bốn yếu tố cấu thành vi phạm pháp luật</w:t>
-        </w:r>
-        <w:r>
-          <w:rPr>
-            <w:noProof/>
-            <w:webHidden/>
-          </w:rPr>
-          <w:tab/>
-        </w:r>
-        <w:r>
-          <w:rPr>
-            <w:noProof/>
-            <w:webHidden/>
-          </w:rPr>
-          <w:fldChar w:fldCharType="begin"/>
-        </w:r>
-        <w:r>
-          <w:rPr>
-            <w:noProof/>
-            <w:webHidden/>
-          </w:rPr>
-          <w:instrText xml:space="preserve"> PAGEREF _Toc237714994 \h </w:instrText>
-        </w:r>
-        <w:r>
-          <w:rPr>
-            <w:noProof/>
-            <w:webHidden/>
-          </w:rPr>
-        </w:r>
-        <w:r>
-          <w:rPr>
-            <w:noProof/>
-            <w:webHidden/>
-          </w:rPr>
-          <w:fldChar w:fldCharType="separate"/>
-        </w:r>
-        <w:r>
-          <w:rPr>
-            <w:noProof/>
-            <w:webHidden/>
-          </w:rPr>
-          <w:t>22</w:t>
-        </w:r>
-        <w:r>
-          <w:rPr>
-            <w:noProof/>
-            <w:webHidden/>
-          </w:rPr>
-          <w:fldChar w:fldCharType="end"/>
-        </w:r>
-      </w:hyperlink>
-    </w:p>
-    <w:p>
-      <w:pPr>
-        <w:pStyle w:val="Mucluc1"/>
-        <w:tabs>
-          <w:tab w:val="right" w:leader="dot" w:pos="8948"/>
-        </w:tabs>
-        <w:rPr>
-          <w:noProof/>
-        </w:rPr>
-      </w:pPr>
-      <w:hyperlink w:anchor="_Toc237714995" w:history="1">
-        <w:r>
-          <w:rPr>
-            <w:rStyle w:val="Siuktni"/>
-            <w:noProof/>
-          </w:rPr>
-          <w:t>CHƯƠNG 4: NHẬN XÉT VÀ BÀI HỌC THỰC TIỄN</w:t>
-        </w:r>
-        <w:r>
-          <w:rPr>
-            <w:noProof/>
-            <w:webHidden/>
-          </w:rPr>
-          <w:tab/>
-        </w:r>
-        <w:r>
-          <w:rPr>
-            <w:noProof/>
-            <w:webHidden/>
-          </w:rPr>
-          <w:fldChar w:fldCharType="begin"/>
-        </w:r>
-        <w:r>
-          <w:rPr>
-            <w:noProof/>
-            <w:webHidden/>
-          </w:rPr>
-          <w:instrText xml:space="preserve"> PAGEREF _Toc237714995 \h </w:instrText>
-        </w:r>
-        <w:r>
-          <w:rPr>
-            <w:noProof/>
-            <w:webHidden/>
-          </w:rPr>
-        </w:r>
-        <w:r>
-          <w:rPr>
-            <w:noProof/>
-            <w:webHidden/>
-          </w:rPr>
-          <w:fldChar w:fldCharType="separate"/>
-        </w:r>
-        <w:r>
-          <w:rPr>
-            <w:noProof/>
-            <w:webHidden/>
-          </w:rPr>
           <w:t>23</w:t>
-        </w:r>
-        <w:r>
-          <w:rPr>
-            <w:noProof/>
-            <w:webHidden/>
-          </w:rPr>
-          <w:fldChar w:fldCharType="end"/>
-        </w:r>
-      </w:hyperlink>
-    </w:p>
-    <w:p>
-      <w:pPr>
-        <w:pStyle w:val="Mucluc2"/>
-        <w:tabs>
-          <w:tab w:val="right" w:leader="dot" w:pos="8948"/>
-        </w:tabs>
-        <w:rPr>
-          <w:noProof/>
-        </w:rPr>
-      </w:pPr>
-      <w:hyperlink w:anchor="_Toc237714996" w:history="1">
-        <w:r>
-          <w:rPr>
-            <w:rStyle w:val="Siuktni"/>
-            <w:noProof/>
-          </w:rPr>
-          <w:t>4.1. Ý nghĩa phòng ngừa từ vụ việc</w:t>
-        </w:r>
-        <w:r>
-          <w:rPr>
-            <w:noProof/>
-            <w:webHidden/>
-          </w:rPr>
-          <w:tab/>
-        </w:r>
-        <w:r>
-          <w:rPr>
-            <w:noProof/>
-            <w:webHidden/>
-          </w:rPr>
-          <w:fldChar w:fldCharType="begin"/>
-        </w:r>
-        <w:r>
-          <w:rPr>
-            <w:noProof/>
-            <w:webHidden/>
-          </w:rPr>
-          <w:instrText xml:space="preserve"> PAGEREF _Toc237714996 \h </w:instrText>
-        </w:r>
-        <w:r>
-          <w:rPr>
-            <w:noProof/>
-            <w:webHidden/>
-          </w:rPr>
-        </w:r>
-        <w:r>
-          <w:rPr>
-            <w:noProof/>
-            <w:webHidden/>
-          </w:rPr>
-          <w:fldChar w:fldCharType="separate"/>
-        </w:r>
-        <w:r>
-          <w:rPr>
-            <w:noProof/>
-            <w:webHidden/>
-          </w:rPr>
-          <w:t>23</w:t>
-        </w:r>
-        <w:r>
-          <w:rPr>
-            <w:noProof/>
-            <w:webHidden/>
-          </w:rPr>
-          <w:fldChar w:fldCharType="end"/>
-        </w:r>
-      </w:hyperlink>
-    </w:p>
-    <w:p>
-      <w:pPr>
-        <w:pStyle w:val="Mucluc2"/>
-        <w:tabs>
-          <w:tab w:val="right" w:leader="dot" w:pos="8948"/>
-        </w:tabs>
-        <w:rPr>
-          <w:noProof/>
-        </w:rPr>
-      </w:pPr>
-      <w:hyperlink w:anchor="_Toc237714997" w:history="1">
-        <w:r>
-          <w:rPr>
-            <w:rStyle w:val="Siuktni"/>
-            <w:noProof/>
-          </w:rPr>
-          <w:t>4.2. Bài học đối với hoạt động kinh doanh trực tuyến và người tiêu dùng</w:t>
-        </w:r>
-        <w:r>
-          <w:rPr>
-            <w:noProof/>
-            <w:webHidden/>
-          </w:rPr>
-          <w:tab/>
-        </w:r>
-        <w:r>
-          <w:rPr>
-            <w:noProof/>
-            <w:webHidden/>
-          </w:rPr>
-          <w:fldChar w:fldCharType="begin"/>
-        </w:r>
-        <w:r>
-          <w:rPr>
-            <w:noProof/>
-            <w:webHidden/>
-          </w:rPr>
-          <w:instrText xml:space="preserve"> PAGEREF _Toc237714997 \h </w:instrText>
-        </w:r>
-        <w:r>
-          <w:rPr>
-            <w:noProof/>
-            <w:webHidden/>
-          </w:rPr>
-        </w:r>
-        <w:r>
-          <w:rPr>
-            <w:noProof/>
-            <w:webHidden/>
-          </w:rPr>
-          <w:fldChar w:fldCharType="separate"/>
-        </w:r>
-        <w:r>
-          <w:rPr>
-            <w:noProof/>
-            <w:webHidden/>
-          </w:rPr>
-          <w:t>23</w:t>
-        </w:r>
-        <w:r>
-          <w:rPr>
-            <w:noProof/>
-            <w:webHidden/>
-          </w:rPr>
-          <w:fldChar w:fldCharType="end"/>
-        </w:r>
-      </w:hyperlink>
-    </w:p>
-    <w:p>
-      <w:pPr>
-        <w:pStyle w:val="Mucluc2"/>
-        <w:tabs>
-          <w:tab w:val="right" w:leader="dot" w:pos="8948"/>
-        </w:tabs>
-        <w:rPr>
-          <w:noProof/>
-        </w:rPr>
-      </w:pPr>
-      <w:hyperlink w:anchor="_Toc237714998" w:history="1">
-        <w:r>
-          <w:rPr>
-            <w:rStyle w:val="Siuktni"/>
-            <w:noProof/>
-          </w:rPr>
-          <w:t>4.3. Bài học về nhận thức pháp luật và đạo đức số cho sinh viên CNTT</w:t>
-        </w:r>
-        <w:r>
-          <w:rPr>
-            <w:noProof/>
-            <w:webHidden/>
-          </w:rPr>
-          <w:tab/>
-        </w:r>
-        <w:r>
-          <w:rPr>
-            <w:noProof/>
-            <w:webHidden/>
-          </w:rPr>
-          <w:fldChar w:fldCharType="begin"/>
-        </w:r>
-        <w:r>
-          <w:rPr>
-            <w:noProof/>
-            <w:webHidden/>
-          </w:rPr>
-          <w:instrText xml:space="preserve"> PAGEREF _Toc237714998 \h </w:instrText>
-        </w:r>
-        <w:r>
-          <w:rPr>
-            <w:noProof/>
-            <w:webHidden/>
-          </w:rPr>
-        </w:r>
-        <w:r>
-          <w:rPr>
-            <w:noProof/>
-            <w:webHidden/>
-          </w:rPr>
-          <w:fldChar w:fldCharType="separate"/>
-        </w:r>
-        <w:r>
-          <w:rPr>
-            <w:noProof/>
-            <w:webHidden/>
-          </w:rPr>
-          <w:t>23</w:t>
-        </w:r>
-        <w:r>
-          <w:rPr>
-            <w:noProof/>
-            <w:webHidden/>
-          </w:rPr>
-          <w:fldChar w:fldCharType="end"/>
-        </w:r>
-      </w:hyperlink>
-    </w:p>
-    <w:p>
-      <w:pPr>
-        <w:pStyle w:val="Mucluc1"/>
-        <w:tabs>
-          <w:tab w:val="right" w:leader="dot" w:pos="8948"/>
-        </w:tabs>
-        <w:rPr>
-          <w:noProof/>
-        </w:rPr>
-      </w:pPr>
-      <w:hyperlink w:anchor="_Toc237714999" w:history="1">
-        <w:r>
-          <w:rPr>
-            <w:rStyle w:val="Siuktni"/>
-            <w:noProof/>
-          </w:rPr>
-          <w:t>KẾT LUẬN</w:t>
-        </w:r>
-        <w:r>
-          <w:rPr>
-            <w:noProof/>
-            <w:webHidden/>
-          </w:rPr>
-          <w:tab/>
-        </w:r>
-        <w:r>
-          <w:rPr>
-            <w:noProof/>
-            <w:webHidden/>
-          </w:rPr>
-          <w:fldChar w:fldCharType="begin"/>
-        </w:r>
-        <w:r>
-          <w:rPr>
-            <w:noProof/>
-            <w:webHidden/>
-          </w:rPr>
-          <w:instrText xml:space="preserve"> PAGEREF _Toc237714999 \h </w:instrText>
-        </w:r>
-        <w:r>
-          <w:rPr>
-            <w:noProof/>
-            <w:webHidden/>
-          </w:rPr>
-        </w:r>
-        <w:r>
-          <w:rPr>
-            <w:noProof/>
-            <w:webHidden/>
-          </w:rPr>
-          <w:fldChar w:fldCharType="separate"/>
-        </w:r>
-        <w:r>
-          <w:rPr>
-            <w:noProof/>
-            <w:webHidden/>
-          </w:rPr>
-          <w:t>25</w:t>
-        </w:r>
-        <w:r>
-          <w:rPr>
-            <w:noProof/>
-            <w:webHidden/>
-          </w:rPr>
-          <w:fldChar w:fldCharType="end"/>
-        </w:r>
-      </w:hyperlink>
-    </w:p>
-    <w:p>
-      <w:pPr>
-        <w:pStyle w:val="Mucluc1"/>
-        <w:tabs>
-          <w:tab w:val="right" w:leader="dot" w:pos="8948"/>
-        </w:tabs>
-        <w:rPr>
-          <w:noProof/>
-        </w:rPr>
-      </w:pPr>
-      <w:hyperlink w:anchor="_Toc237715000" w:history="1">
-        <w:r>
-          <w:rPr>
-            <w:rStyle w:val="Siuktni"/>
-            <w:noProof/>
-          </w:rPr>
-          <w:t>TÀI LIỆU THAM KHẢO</w:t>
-        </w:r>
-        <w:r>
-          <w:rPr>
-            <w:noProof/>
-            <w:webHidden/>
-          </w:rPr>
-          <w:tab/>
-        </w:r>
-        <w:r>
-          <w:rPr>
-            <w:noProof/>
-            <w:webHidden/>
-          </w:rPr>
-          <w:fldChar w:fldCharType="begin"/>
-        </w:r>
-        <w:r>
-          <w:rPr>
-            <w:noProof/>
-            <w:webHidden/>
-          </w:rPr>
-          <w:instrText xml:space="preserve"> PAGEREF _Toc237715000 \h </w:instrText>
-        </w:r>
-        <w:r>
-          <w:rPr>
-            <w:noProof/>
-            <w:webHidden/>
-          </w:rPr>
-        </w:r>
-        <w:r>
-          <w:rPr>
-            <w:noProof/>
-            <w:webHidden/>
-          </w:rPr>
-          <w:fldChar w:fldCharType="separate"/>
-        </w:r>
-        <w:r>
-          <w:rPr>
-            <w:noProof/>
-            <w:webHidden/>
-          </w:rPr>
-          <w:t>26</w:t>
-        </w:r>
-        <w:r>
-          <w:rPr>
-            <w:noProof/>
-            <w:webHidden/>
-          </w:rPr>
-          <w:fldChar w:fldCharType="end"/>
-        </w:r>
-      </w:hyperlink>
-    </w:p>
-    <w:p>
-      <w:pPr>
-        <w:pStyle w:val="Mucluc2"/>
-        <w:tabs>
-          <w:tab w:val="right" w:leader="dot" w:pos="8948"/>
-        </w:tabs>
-        <w:rPr>
-          <w:noProof/>
-        </w:rPr>
-      </w:pPr>
-      <w:hyperlink w:anchor="_Toc237715001" w:history="1">
-        <w:r>
-          <w:rPr>
-            <w:rStyle w:val="Siuktni"/>
-            <w:noProof/>
-          </w:rPr>
-          <w:t>A. Văn bản quy phạm pháp luật</w:t>
-        </w:r>
-        <w:r>
-          <w:rPr>
-            <w:noProof/>
-            <w:webHidden/>
-          </w:rPr>
-          <w:tab/>
-        </w:r>
-        <w:r>
-          <w:rPr>
-            <w:noProof/>
-            <w:webHidden/>
-          </w:rPr>
-          <w:fldChar w:fldCharType="begin"/>
-        </w:r>
-        <w:r>
-          <w:rPr>
-            <w:noProof/>
-            <w:webHidden/>
-          </w:rPr>
-          <w:instrText xml:space="preserve"> PAGEREF _Toc237715001 \h </w:instrText>
-        </w:r>
-        <w:r>
-          <w:rPr>
-            <w:noProof/>
-            <w:webHidden/>
-          </w:rPr>
-        </w:r>
-        <w:r>
-          <w:rPr>
-            <w:noProof/>
-            <w:webHidden/>
-          </w:rPr>
-          <w:fldChar w:fldCharType="separate"/>
-        </w:r>
-        <w:r>
-          <w:rPr>
-            <w:noProof/>
-            <w:webHidden/>
-          </w:rPr>
-          <w:t>26</w:t>
-        </w:r>
-        <w:r>
-          <w:rPr>
-            <w:noProof/>
-            <w:webHidden/>
-          </w:rPr>
-          <w:fldChar w:fldCharType="end"/>
-        </w:r>
-      </w:hyperlink>
-    </w:p>
-    <w:p>
-      <w:pPr>
-        <w:pStyle w:val="Mucluc2"/>
-        <w:tabs>
-          <w:tab w:val="right" w:leader="dot" w:pos="8948"/>
-        </w:tabs>
-        <w:rPr>
-          <w:noProof/>
-        </w:rPr>
-      </w:pPr>
-      <w:hyperlink w:anchor="_Toc237715002" w:history="1">
-        <w:r>
-          <w:rPr>
-            <w:rStyle w:val="Siuktni"/>
-            <w:noProof/>
-          </w:rPr>
-          <w:t>B. Giáo trình và tài liệu học thuật</w:t>
-        </w:r>
-        <w:r>
-          <w:rPr>
-            <w:noProof/>
-            <w:webHidden/>
-          </w:rPr>
-          <w:tab/>
-        </w:r>
-        <w:r>
-          <w:rPr>
-            <w:noProof/>
-            <w:webHidden/>
-          </w:rPr>
-          <w:fldChar w:fldCharType="begin"/>
-        </w:r>
-        <w:r>
-          <w:rPr>
-            <w:noProof/>
-            <w:webHidden/>
-          </w:rPr>
-          <w:instrText xml:space="preserve"> PAGEREF _Toc237715002 \h </w:instrText>
-        </w:r>
-        <w:r>
-          <w:rPr>
-            <w:noProof/>
-            <w:webHidden/>
-          </w:rPr>
-        </w:r>
-        <w:r>
-          <w:rPr>
-            <w:noProof/>
-            <w:webHidden/>
-          </w:rPr>
-          <w:fldChar w:fldCharType="separate"/>
-        </w:r>
-        <w:r>
-          <w:rPr>
-            <w:noProof/>
-            <w:webHidden/>
-          </w:rPr>
-          <w:t>26</w:t>
-        </w:r>
-        <w:r>
-          <w:rPr>
-            <w:noProof/>
-            <w:webHidden/>
-          </w:rPr>
-          <w:fldChar w:fldCharType="end"/>
-        </w:r>
-      </w:hyperlink>
-    </w:p>
-    <w:p>
-      <w:pPr>
-        <w:pStyle w:val="Mucluc2"/>
-        <w:tabs>
-          <w:tab w:val="right" w:leader="dot" w:pos="8948"/>
-        </w:tabs>
-        <w:rPr>
-          <w:noProof/>
-        </w:rPr>
-      </w:pPr>
-      <w:hyperlink w:anchor="_Toc237715003" w:history="1">
-        <w:r>
-          <w:rPr>
-            <w:rStyle w:val="Siuktni"/>
-            <w:noProof/>
-          </w:rPr>
-          <w:t>C. Nguồn dữ liệu báo chí chính thức về vụ việc</w:t>
-        </w:r>
-        <w:r>
-          <w:rPr>
-            <w:noProof/>
-            <w:webHidden/>
-          </w:rPr>
-          <w:tab/>
-        </w:r>
-        <w:r>
-          <w:rPr>
-            <w:noProof/>
-            <w:webHidden/>
-          </w:rPr>
-          <w:fldChar w:fldCharType="begin"/>
-        </w:r>
-        <w:r>
-          <w:rPr>
-            <w:noProof/>
-            <w:webHidden/>
-          </w:rPr>
-          <w:instrText xml:space="preserve"> PAGEREF _Toc237715003 \h </w:instrText>
-        </w:r>
-        <w:r>
-          <w:rPr>
-            <w:noProof/>
-            <w:webHidden/>
-          </w:rPr>
-        </w:r>
-        <w:r>
-          <w:rPr>
-            <w:noProof/>
-            <w:webHidden/>
-          </w:rPr>
-          <w:fldChar w:fldCharType="separate"/>
-        </w:r>
-        <w:r>
-          <w:rPr>
-            <w:noProof/>
-            <w:webHidden/>
-          </w:rPr>
-          <w:t>26</w:t>
         </w:r>
         <w:r>
           <w:rPr>
@@ -3263,7 +3059,7 @@
       <w:pPr>
         <w:pStyle w:val="u1"/>
       </w:pPr>
-      <w:bookmarkStart w:id="0" w:name="_Toc237714968"/>
+      <w:bookmarkStart w:id="0" w:name="_Toc237715686"/>
       <w:r>
         <w:rPr>
           <w:rFonts w:ascii="Times New Roman" w:eastAsia="Times New Roman" w:hAnsi="Times New Roman"/>
@@ -3278,7 +3074,7 @@
       <w:pPr>
         <w:pStyle w:val="u2"/>
       </w:pPr>
-      <w:bookmarkStart w:id="1" w:name="_Toc237714969"/>
+      <w:bookmarkStart w:id="1" w:name="_Toc237715687"/>
       <w:r>
         <w:rPr>
           <w:rFonts w:ascii="Times New Roman" w:eastAsia="Times New Roman" w:hAnsi="Times New Roman"/>
@@ -3289,28 +3085,21 @@
       <w:bookmarkEnd w:id="1"/>
     </w:p>
     <w:p>
-      <w:r>
-        <w:t>Trong sự phát triển nhanh chóng của nền kinh tế số và mạng xã hội tại Việt Nam, tiếp thị và phân phối hàng hóa trực tuyến đã trở thành phương thức giao thương phổ biến. Tuy nhiên, môi trường số cũng làm phát sinh nhiều hiện tượng gian dối thương mại tinh vi, trong đó có tình trạng lợi dụng tính ẩn danh và khả năng lan tỏa nhanh của mạng xã hội để quảng cáo sai sự thật. Đặc biệt đối với các sản phẩm chăm sóc sức khỏe và Đông y, việc cắt ghép hình ảnh người có uy tín để thổi phồng công dụng không chỉ gây nhầm</w:t>
-      </w:r>
-      <w:r>
-        <w:t xml:space="preserve"> lẫn cho người mua mà còn xâm phạm trật tự quản lý thị trường và quyền lợi của người tiêu dùng.</w:t>
-      </w:r>
-    </w:p>
-    <w:p>
-      <w:r>
-        <w:t>Vụ việc Cơ quan Cảnh sát điều tra Công an tỉnh Phú Thọ khởi tố vụ án, khởi tố Nguyễn Tiến Đạt cùng 20 bị can liên quan đến hoạt động quảng cáo sản phẩm Đông y “Xương khớp bà Sáu” trên mạng xã hội vào tháng 8/2026 là một tình huống thực tiễn điển hình để vận dụng lý luận môn học. Dưới góc độ môn Pháp luật đại cương, vụ việc thể hiện đầy đủ các khía cạnh pháp lý của một vi phạm pháp luật diễn ra qua nhiều khâu trong môi trường số, đòi hỏi sự xem xét có hệ thống dựa trên bốn yếu tố cấu thành.</w:t>
-      </w:r>
-    </w:p>
-    <w:p>
-      <w:r>
-        <w:t>Việc nghiên cứu đề tài này giúp sinh viên củng cố vững chắc phương pháp luận phân tích vi phạm pháp luật, rèn luyện kỹ năng đánh giá chứng cứ khách quan, đồng thời nâng cao ý thức tuân thủ pháp luật và đạo đức nghề nghiệp trong môi trường số cho sinh viên Trường Đại học Công nghệ Thông tin – ĐHQG-HCM.</w:t>
+      <w:pPr>
+        <w:spacing w:after="80"/>
+      </w:pPr>
+      <w:r>
+        <w:t>Mạng xã hội hiện là kênh tiếp thị và bán hàng phổ biến nhưng cũng phát sinh nhiều hành vi quảng cáo sai sự thật. Tình trạng cắt ghép hình ảnh người có uy tín để thổi phồng công dụng sản phẩm Đông y gây nhầm lẫn cho người mua và ảnh hưởng quyền lợi người tiêu dùng. Vụ việc Công an tỉnh Phú Thọ khởi tố 21 bị can liên quan đến việc quảng cáo sản phẩm Đông y “Xương khớp bà Sáu” trên mạng xã hội (tháng 8/2026) là tình huống thực tế điển hình để vận dụng mô hình bốn yếu tố cấu thành vi phạm pháp luật trong môn Ph</w:t>
+      </w:r>
+      <w:r>
+        <w:t>áp luật đại cương, đồng thời nâng cao ý thức tuân thủ pháp luật và đạo đức nghề nghiệp trong môi trường số cho sinh viên UIT.</w:t>
       </w:r>
     </w:p>
     <w:p>
       <w:pPr>
         <w:pStyle w:val="u2"/>
       </w:pPr>
-      <w:bookmarkStart w:id="2" w:name="_Toc237714970"/>
+      <w:bookmarkStart w:id="2" w:name="_Toc237715688"/>
       <w:r>
         <w:rPr>
           <w:rFonts w:ascii="Times New Roman" w:eastAsia="Times New Roman" w:hAnsi="Times New Roman"/>
@@ -3327,7 +3116,7 @@
         <w:ind w:left="709" w:firstLine="0"/>
       </w:pPr>
       <w:r>
-        <w:t>Hệ thống hóa cơ sở lý luận về vi phạm pháp luật và bốn yếu tố cấu thành theo chương trình học phần Pháp luật đại cương tại UIT.</w:t>
+        <w:t>Hệ thống hóa lý thuyết cấu thành vi phạm pháp luật theo học phần Pháp luật đại cương tại UIT.</w:t>
       </w:r>
     </w:p>
     <w:p>
@@ -3337,7 +3126,7 @@
         <w:ind w:left="709" w:firstLine="0"/>
       </w:pPr>
       <w:r>
-        <w:t>Tổng hợp và đối chiếu các dữ kiện thực tế từ nguồn tin chính thức của cơ quan điều tra do Báo Điện tử Chính phủ công bố.</w:t>
+        <w:t>Phân tích bản chất pháp lý của vụ việc qua bốn yếu tố cấu thành từ nguồn tin chính thức của Báo Điện tử Chính phủ [6].</w:t>
       </w:r>
     </w:p>
     <w:p>
@@ -3347,52 +3136,22 @@
         <w:ind w:left="709" w:firstLine="0"/>
       </w:pPr>
       <w:r>
-        <w:t>Vận dụng mô hình bốn yếu tố (Khách thể, Mặt khách quan, Chủ thể, Mặt chủ quan) để phân tích bản chất pháp lý của vụ việc một cách khoa học, khách quan.</w:t>
-      </w:r>
-    </w:p>
-    <w:p>
-      <w:pPr>
-        <w:pStyle w:val="Duudong"/>
-        <w:spacing w:after="60"/>
-        <w:ind w:left="709" w:firstLine="0"/>
-      </w:pPr>
-      <w:r>
-        <w:lastRenderedPageBreak/>
-        <w:t>Rút ra các bài học thực tiễn về pháp luật và đạo đức nghề nghiệp đối với cá nhân kinh doanh trực tuyến, người tiêu dùng và sinh viên ngành công nghệ thông tin.</w:t>
+        <w:t>Rút ra bài học thực tiễn về pháp luật và đạo đức nghề nghiệp cho người kinh doanh trực tuyến, người tiêu dùng và sinh viên công nghệ thông tin.</w:t>
       </w:r>
     </w:p>
     <w:p>
       <w:pPr>
         <w:pStyle w:val="u2"/>
       </w:pPr>
-      <w:bookmarkStart w:id="3" w:name="_Toc237714971"/>
+      <w:bookmarkStart w:id="3" w:name="_Toc237715689"/>
       <w:r>
         <w:rPr>
           <w:rFonts w:ascii="Times New Roman" w:eastAsia="Times New Roman" w:hAnsi="Times New Roman"/>
           <w:b w:val="0"/>
         </w:rPr>
-        <w:t>3. Đối tượng nghiên cứu</w:t>
+        <w:t>3. Đối tượng và phạm vi nghiên cứu</w:t>
       </w:r>
       <w:bookmarkEnd w:id="3"/>
-    </w:p>
-    <w:p>
-      <w:r>
-        <w:t>Đối tượng nghiên cứu của tiểu luận là các yếu tố cấu thành vi phạm pháp luật trong vụ việc khởi tố đường dây quảng cáo gian dối sản phẩm Đông y "Xương khớp bà Sáu" trên mạng xã hội theo thông tin công bố của Công an tỉnh Phú Thọ.</w:t>
-      </w:r>
-    </w:p>
-    <w:p>
-      <w:pPr>
-        <w:pStyle w:val="u2"/>
-      </w:pPr>
-      <w:bookmarkStart w:id="4" w:name="_Toc237714972"/>
-      <w:r>
-        <w:rPr>
-          <w:rFonts w:ascii="Times New Roman" w:eastAsia="Times New Roman" w:hAnsi="Times New Roman"/>
-          <w:b w:val="0"/>
-        </w:rPr>
-        <w:t>4. Phạm vi nghiên cứu</w:t>
-      </w:r>
-      <w:bookmarkEnd w:id="4"/>
     </w:p>
     <w:p>
       <w:pPr>
@@ -3404,10 +3163,10 @@
         <w:rPr>
           <w:b/>
         </w:rPr>
-        <w:t>Phạm vi lý luận:</w:t>
-      </w:r>
-      <w:r>
-        <w:t xml:space="preserve"> Giới hạn trong khuôn khổ lý thuyết cấu thành vi phạm pháp luật của môn học Pháp luật đại cương. Các văn bản quy phạm pháp luật như Bộ luật Hình sự, Luật Quảng cáo, Luật Bảo vệ quyền lợi người tiêu dùng và Bộ luật Dân sự được sử dụng làm căn cứ tham chiếu, không đi sâu vào tiểu tiết tố tụng chuyên ngành.</w:t>
+        <w:t>Đối tượng nghiên cứu:</w:t>
+      </w:r>
+      <w:r>
+        <w:t xml:space="preserve"> Các yếu tố cấu thành vi phạm pháp luật trong vụ việc quảng cáo sản phẩm Đông y "Xương khớp bà Sáu" trên mạng xã hội [6].</w:t>
       </w:r>
     </w:p>
     <w:p>
@@ -3420,120 +3179,25 @@
         <w:rPr>
           <w:b/>
         </w:rPr>
-        <w:t>Phạm vi dữ liệu:</w:t>
-      </w:r>
-      <w:r>
-        <w:t xml:space="preserve"> Dữ liệu vụ việc được trích xuất từ bài viết chính thức của Báo Điện tử Chính phủ đăng lúc 14:47 ngày 10/8/2026, dẫn nguồn từ Công an tỉnh Phú Thọ [6].</w:t>
-      </w:r>
-    </w:p>
-    <w:p>
-      <w:pPr>
-        <w:pStyle w:val="u2"/>
-      </w:pPr>
-      <w:bookmarkStart w:id="5" w:name="_Toc237714973"/>
-      <w:r>
-        <w:rPr>
-          <w:rFonts w:ascii="Times New Roman" w:eastAsia="Times New Roman" w:hAnsi="Times New Roman"/>
-          <w:b w:val="0"/>
-        </w:rPr>
-        <w:t>5. Giới hạn dữ liệu và nguyên tắc tiếp cận</w:t>
-      </w:r>
-      <w:bookmarkEnd w:id="5"/>
-    </w:p>
-    <w:p>
-      <w:r>
-        <w:t>Vụ án hiện đang trong giai đoạn điều tra mở rộng, chưa có bản án có hiệu lực pháp luật của Tòa án. Báo cáo tiếp cận vụ việc hoàn toàn dưới góc độ nghiên cứu học thuật thuần túy, phân định rạch ròi giữa dữ kiện thực tế đã công bố và nhận định phân tích lý luận. Tuân thủ nghiêm ngặt nguyên tắc suy đoán vô tội, các thuật ngữ như “bị cáo buộc”, “dấu hiệu vi phạm” và “phân tích học thuật” được sử dụng nhất quán để bảo đảm tính chuẩn mực khoa học.</w:t>
-      </w:r>
-    </w:p>
-    <w:p>
-      <w:pPr>
-        <w:pStyle w:val="u2"/>
-      </w:pPr>
-      <w:bookmarkStart w:id="6" w:name="_Toc237714974"/>
-      <w:r>
-        <w:rPr>
-          <w:rFonts w:ascii="Times New Roman" w:eastAsia="Times New Roman" w:hAnsi="Times New Roman"/>
-          <w:b w:val="0"/>
-        </w:rPr>
-        <w:t>6. Phương pháp nghiên cứu</w:t>
-      </w:r>
-      <w:bookmarkEnd w:id="6"/>
-    </w:p>
-    <w:p>
-      <w:r>
-        <w:t>Tiểu luận kết hợp các phương pháp nghiên cứu khoa học xã hội và pháp lý cơ bản:</w:t>
-      </w:r>
-    </w:p>
-    <w:p>
-      <w:pPr>
-        <w:pStyle w:val="Duudong"/>
-        <w:spacing w:after="60"/>
-        <w:ind w:left="709" w:firstLine="0"/>
-      </w:pPr>
-      <w:r>
-        <w:rPr>
-          <w:b/>
-        </w:rPr>
-        <w:lastRenderedPageBreak/>
-        <w:t>Phương pháp phân tích và tổng hợp tài liệu:</w:t>
-      </w:r>
-      <w:r>
-        <w:t xml:space="preserve"> Khái quát hóa lý luận cấu thành vi phạm pháp luật từ tài liệu giảng dạy của UIT và văn bản pháp luật hiện hành.</w:t>
-      </w:r>
-    </w:p>
-    <w:p>
-      <w:pPr>
-        <w:pStyle w:val="Duudong"/>
-        <w:spacing w:after="60"/>
-        <w:ind w:left="709" w:firstLine="0"/>
-      </w:pPr>
-      <w:r>
-        <w:rPr>
-          <w:b/>
-        </w:rPr>
-        <w:t>Phương pháp nghiên cứu trường hợp (Case study):</w:t>
-      </w:r>
-      <w:r>
-        <w:t xml:space="preserve"> Mổ xẻ chi tiết các dữ kiện của vụ việc thực tế để minh họa cho lý luận.</w:t>
-      </w:r>
-    </w:p>
-    <w:p>
-      <w:pPr>
-        <w:pStyle w:val="Duudong"/>
-        <w:spacing w:after="60"/>
-        <w:ind w:left="709" w:firstLine="0"/>
-      </w:pPr>
-      <w:r>
-        <w:rPr>
-          <w:b/>
-        </w:rPr>
-        <w:t>Phương pháp đối chiếu quy phạm:</w:t>
-      </w:r>
-      <w:r>
-        <w:t xml:space="preserve"> So sánh hành vi thực tế với các quy định cấm của pháp luật.</w:t>
-      </w:r>
-    </w:p>
-    <w:p>
-      <w:pPr>
-        <w:pStyle w:val="Duudong"/>
-        <w:spacing w:after="60"/>
-        <w:ind w:left="709" w:firstLine="0"/>
-      </w:pPr>
-      <w:r>
-        <w:rPr>
-          <w:b/>
-        </w:rPr>
-        <w:t>Phương pháp logic học:</w:t>
-      </w:r>
-      <w:r>
-        <w:t xml:space="preserve"> Xây dựng chuỗi lập luận chặt chẽ: Dữ kiện thực tế (Fact) $\rightarrow$ Đánh giá pháp lý (Legal Reasoning) $\rightarrow$ Kết luận khoa học (Conclusion).</w:t>
+        <w:t>Phạm vi nghiên cứu:</w:t>
+      </w:r>
+      <w:r>
+        <w:t xml:space="preserve"> Giới hạn trong lý thuyết môn học; các luật chuyên ngành (Luật Quảng cáo, Luật BVQLNTD, BLDS, BLHS) làm căn cứ đối chiếu.</w:t>
+      </w:r>
+    </w:p>
+    <w:p>
+      <w:pPr>
+        <w:spacing w:after="80"/>
+      </w:pPr>
+      <w:r>
+        <w:t>Do vụ án vẫn đang trong quá trình điều tra, nhóm chỉ phân tích trên cơ sở thông tin công khai hiện có và không đưa ra kết luận thay cho cơ quan tiến hành tố tụng. Trong quá trình thực hiện, nhóm chủ yếu sử dụng phương pháp tổng hợp tài liệu, phân tích vụ việc và đối chiếu với các quy định pháp luật có liên quan.</w:t>
       </w:r>
     </w:p>
     <w:p>
       <w:pPr>
         <w:pStyle w:val="u1"/>
       </w:pPr>
-      <w:bookmarkStart w:id="7" w:name="_Toc237714975"/>
+      <w:bookmarkStart w:id="4" w:name="_Toc237715690"/>
       <w:r>
         <w:rPr>
           <w:rFonts w:ascii="Times New Roman" w:eastAsia="Times New Roman" w:hAnsi="Times New Roman"/>
@@ -3542,13 +3206,13 @@
         <w:lastRenderedPageBreak/>
         <w:t>CHƯƠNG 1: CƠ SỞ LÝ LUẬN VỀ VI PHẠM PHÁP LUẬT VÀ CẤU THÀNH VI PHẠM PHÁP LUẬT</w:t>
       </w:r>
-      <w:bookmarkEnd w:id="7"/>
+      <w:bookmarkEnd w:id="4"/>
     </w:p>
     <w:p>
       <w:pPr>
         <w:pStyle w:val="u2"/>
       </w:pPr>
-      <w:bookmarkStart w:id="8" w:name="_Toc237714976"/>
+      <w:bookmarkStart w:id="5" w:name="_Toc237715691"/>
       <w:r>
         <w:rPr>
           <w:rFonts w:ascii="Times New Roman" w:eastAsia="Times New Roman" w:hAnsi="Times New Roman"/>
@@ -3556,14 +3220,20 @@
         </w:rPr>
         <w:t>1.1. Khái niệm vi phạm pháp luật</w:t>
       </w:r>
-      <w:bookmarkEnd w:id="8"/>
-    </w:p>
-    <w:p>
+      <w:bookmarkEnd w:id="5"/>
+    </w:p>
+    <w:p>
+      <w:pPr>
+        <w:spacing w:after="80"/>
+      </w:pPr>
       <w:r>
         <w:t>Trong đời sống xã hội, pháp luật giữ vai trò là quy tắc xử sự chung có tính bắt buộc nhằm duy trì trật tự kỷ cương và bảo vệ lợi ích công cộng. Khi một chủ thể thực hiện hành vi trái với các quy tắc do Nhà nước xác lập, gây nguy hại hoặc đe dọa gây nguy hại cho xã hội thì hành vi đó bị coi là vi phạm pháp luật.</w:t>
       </w:r>
     </w:p>
     <w:p>
+      <w:pPr>
+        <w:spacing w:after="80"/>
+      </w:pPr>
       <w:r>
         <w:t xml:space="preserve">Theo tài liệu học phần Pháp luật đại cương của Trường Đại học Công nghệ Thông tin – ĐHQG-HCM, </w:t>
       </w:r>
@@ -3578,6 +3248,9 @@
       </w:r>
     </w:p>
     <w:p>
+      <w:pPr>
+        <w:spacing w:after="80"/>
+      </w:pPr>
       <w:r>
         <w:t>Vi phạm pháp luật là hiện tượng xã hội – pháp lý tiêu cực, phản ánh sự mâu thuẫn giữa ý chí, hành vi của chủ thể cụ thể với ý chí của Nhà nước được thể hiện trong các quy phạm pháp luật, và là căn cứ duy nhất để truy cứu trách nhiệm pháp lý.</w:t>
       </w:r>
@@ -3586,7 +3259,7 @@
       <w:pPr>
         <w:pStyle w:val="u2"/>
       </w:pPr>
-      <w:bookmarkStart w:id="9" w:name="_Toc237714977"/>
+      <w:bookmarkStart w:id="6" w:name="_Toc237715692"/>
       <w:r>
         <w:rPr>
           <w:rFonts w:ascii="Times New Roman" w:eastAsia="Times New Roman" w:hAnsi="Times New Roman"/>
@@ -3594,9 +3267,12 @@
         </w:rPr>
         <w:t>1.2. Các dấu hiệu cơ bản của vi phạm pháp luật</w:t>
       </w:r>
-      <w:bookmarkEnd w:id="9"/>
-    </w:p>
-    <w:p>
+      <w:bookmarkEnd w:id="6"/>
+    </w:p>
+    <w:p>
+      <w:pPr>
+        <w:spacing w:after="80"/>
+      </w:pPr>
       <w:r>
         <w:t>Để nhận diện một hiện tượng thực tế có cấu thành vi phạm pháp luật hay không, khoa học pháp lý xác định bốn dấu hiệu đặc trưng bắt buộc phải hội tụ đồng thời [5]:</w:t>
       </w:r>
@@ -3617,6 +3293,9 @@
       </w:r>
     </w:p>
     <w:p>
+      <w:pPr>
+        <w:spacing w:after="80"/>
+      </w:pPr>
       <w:r>
         <w:t xml:space="preserve">   Pháp luật chỉ điều chỉnh hành vi thực tế bộc lộ ra thế giới khách quan dưới dạng </w:t>
       </w:r>
@@ -3655,6 +3334,9 @@
       </w:r>
     </w:p>
     <w:p>
+      <w:pPr>
+        <w:spacing w:after="80"/>
+      </w:pPr>
       <w:r>
         <w:t xml:space="preserve">   Hành vi không phù hợp với các quy tắc xử sự do Nhà nước ban hành, thể hiện qua việc làm trái điều cấm, vượt quá quyền hạn cho phép hoặc không thực hiện nghĩa vụ pháp lý, qua đó xâm hại hoặc đe dọa xâm hại đến các quan hệ xã hội được bảo vệ.</w:t>
       </w:r>
@@ -3665,7 +3347,6 @@
         <w:ind w:left="709" w:firstLine="0"/>
       </w:pPr>
       <w:r>
-        <w:lastRenderedPageBreak/>
         <w:t xml:space="preserve">3. </w:t>
       </w:r>
       <w:r>
@@ -3676,7 +3357,11 @@
       </w:r>
     </w:p>
     <w:p>
-      <w:r>
+      <w:pPr>
+        <w:spacing w:after="80"/>
+      </w:pPr>
+      <w:r>
+        <w:lastRenderedPageBreak/>
         <w:t xml:space="preserve">   Lỗi là trạng thái tâm lý chủ quan phản ánh thái độ tiêu cực của chủ thể đối với hành vi trái pháp luật và hậu quả của hành vi đó tại thời điểm thực hiện. Chủ thể có điều kiện và khả năng lựa chọn xử sự hợp pháp nhưng đã lựa chọn xử sự trái pháp luật. Hành vi gây thiệt hại do sự kiện bất khả kháng hoặc phòng vệ chính đáng không có lỗi thì không cấu thành vi phạm pháp luật.</w:t>
       </w:r>
     </w:p>
@@ -3696,6 +3381,9 @@
       </w:r>
     </w:p>
     <w:p>
+      <w:pPr>
+        <w:spacing w:after="80"/>
+      </w:pPr>
       <w:r>
         <w:t xml:space="preserve">   Chủ thể thực hiện hành vi phải đạt độ tuổi luật định và có trạng thái tâm thần bình thường, đủ khả năng nhận thức tính chất nguy hiểm cho xã hội của hành vi và có khả năng điều khiển hành vi của mình.</w:t>
       </w:r>
@@ -3704,7 +3392,7 @@
       <w:pPr>
         <w:pStyle w:val="u2"/>
       </w:pPr>
-      <w:bookmarkStart w:id="10" w:name="_Toc237714978"/>
+      <w:bookmarkStart w:id="7" w:name="_Toc237715693"/>
       <w:r>
         <w:rPr>
           <w:rFonts w:ascii="Times New Roman" w:eastAsia="Times New Roman" w:hAnsi="Times New Roman"/>
@@ -3712,9 +3400,12 @@
         </w:rPr>
         <w:t>1.3. Khái niệm và ý nghĩa của cấu thành vi phạm pháp luật</w:t>
       </w:r>
-      <w:bookmarkEnd w:id="10"/>
-    </w:p>
-    <w:p>
+      <w:bookmarkEnd w:id="7"/>
+    </w:p>
+    <w:p>
+      <w:pPr>
+        <w:spacing w:after="80"/>
+      </w:pPr>
       <w:r>
         <w:rPr>
           <w:b/>
@@ -3726,6 +3417,9 @@
       </w:r>
     </w:p>
     <w:p>
+      <w:pPr>
+        <w:spacing w:after="80"/>
+      </w:pPr>
       <w:r>
         <w:t>Mô hình cấu thành vi phạm pháp luật gồm bốn yếu tố có mối quan hệ biện chứng, hữu cơ với nhau:</w:t>
       </w:r>
@@ -3928,6 +3622,9 @@
       </w:tr>
     </w:tbl>
     <w:p>
+      <w:pPr>
+        <w:spacing w:after="80"/>
+      </w:pPr>
       <w:r>
         <w:t>Việc nghiên cứu và áp dụng mô hình cấu thành có ý nghĩa nền tảng:</w:t>
       </w:r>
@@ -3966,185 +3663,194 @@
       <w:pPr>
         <w:pStyle w:val="u2"/>
       </w:pPr>
-      <w:bookmarkStart w:id="11" w:name="_Toc237714979"/>
+      <w:bookmarkStart w:id="8" w:name="_Toc237715694"/>
+      <w:r>
+        <w:rPr>
+          <w:rFonts w:ascii="Times New Roman" w:eastAsia="Times New Roman" w:hAnsi="Times New Roman"/>
+          <w:b w:val="0"/>
+        </w:rPr>
+        <w:t>1.4. Khách thể của vi phạm pháp luật</w:t>
+      </w:r>
+      <w:bookmarkEnd w:id="8"/>
+    </w:p>
+    <w:p>
+      <w:pPr>
+        <w:spacing w:after="80"/>
+      </w:pPr>
+      <w:r>
+        <w:t>Khách thể của vi phạm pháp luật là những quan hệ xã hội được pháp luật xác lập và bảo vệ nhưng bị hành vi vi phạm pháp luật xâm hại, làm thay đổi hoặc đe dọa làm biến đổi trạng thái an toàn, bình thường của các quan hệ đó [5].</w:t>
+      </w:r>
+    </w:p>
+    <w:p>
+      <w:pPr>
+        <w:spacing w:after="80"/>
+      </w:pPr>
+      <w:r>
+        <w:t>Trong khoa học pháp lý, cần phân biệt rõ ba khái niệm:</w:t>
+      </w:r>
+    </w:p>
+    <w:p>
+      <w:pPr>
+        <w:pStyle w:val="Duudong"/>
+        <w:spacing w:after="60"/>
+        <w:ind w:left="709" w:firstLine="0"/>
+      </w:pPr>
+      <w:r>
+        <w:rPr>
+          <w:b/>
+        </w:rPr>
+        <w:lastRenderedPageBreak/>
+        <w:t>Khách thể:</w:t>
+      </w:r>
+      <w:r>
+        <w:t xml:space="preserve"> Là quan hệ xã hội được pháp luật bảo vệ (như trật tự quản lý kinh tế, trật tự quản lý quảng cáo, quyền tài sản, quyền được bảo vệ an toàn tính mạng, sức khỏe và quyền được thông tin trung thực của người tiêu dùng).</w:t>
+      </w:r>
+    </w:p>
+    <w:p>
+      <w:pPr>
+        <w:pStyle w:val="Duudong"/>
+        <w:spacing w:after="60"/>
+        <w:ind w:left="709" w:firstLine="0"/>
+      </w:pPr>
+      <w:r>
+        <w:rPr>
+          <w:b/>
+        </w:rPr>
+        <w:t>Đối tượng tác động:</w:t>
+      </w:r>
+      <w:r>
+        <w:t xml:space="preserve"> Là những thực thể vật chất, thông tin hoặc tài sản cụ thể mà thông qua việc tác động vào đó, chủ thể xâm hại đến khách thể (ví dụ: sản phẩm hàng hóa, bao bì nhãn mác, bài viết/video quảng cáo, dòng tiền thanh toán).</w:t>
+      </w:r>
+    </w:p>
+    <w:p>
+      <w:pPr>
+        <w:pStyle w:val="Duudong"/>
+        <w:spacing w:after="60"/>
+        <w:ind w:left="709" w:firstLine="0"/>
+      </w:pPr>
+      <w:r>
+        <w:rPr>
+          <w:b/>
+        </w:rPr>
+        <w:t>Chủ thể của quan hệ bị xâm hại (Người bị ảnh hưởng / Người bị thiệt hại):</w:t>
+      </w:r>
+      <w:r>
+        <w:t xml:space="preserve"> Là các cá nhân, tổ chức tham gia vào quan hệ xã hội bị xâm hại và chịu tổn hại trực tiếp hoặc gián tiếp từ hành vi vi phạm.</w:t>
+      </w:r>
+    </w:p>
+    <w:p>
+      <w:pPr>
+        <w:pStyle w:val="u2"/>
+      </w:pPr>
+      <w:bookmarkStart w:id="9" w:name="_Toc237715695"/>
+      <w:r>
+        <w:rPr>
+          <w:rFonts w:ascii="Times New Roman" w:eastAsia="Times New Roman" w:hAnsi="Times New Roman"/>
+          <w:b w:val="0"/>
+        </w:rPr>
+        <w:t>1.5. Mặt khách quan của vi phạm pháp luật</w:t>
+      </w:r>
+      <w:bookmarkEnd w:id="9"/>
+    </w:p>
+    <w:p>
+      <w:pPr>
+        <w:spacing w:after="80"/>
+      </w:pPr>
+      <w:r>
+        <w:t>Mặt khách quan của vi phạm pháp luật là toàn bộ những biểu hiện bên ngoài của vi phạm pháp luật diễn ra trong thế giới khách quan, có thể nhận biết và kiểm chứng được [5]. Trong cấu thành mặt khách quan:</w:t>
+      </w:r>
+    </w:p>
+    <w:p>
+      <w:pPr>
+        <w:spacing w:after="60"/>
+        <w:ind w:left="709" w:firstLine="0"/>
+      </w:pPr>
+      <w:r>
+        <w:t xml:space="preserve">1. </w:t>
+      </w:r>
+      <w:r>
+        <w:rPr>
+          <w:b/>
+        </w:rPr>
+        <w:t>Hành vi trái pháp luật:</w:t>
+      </w:r>
+      <w:r>
+        <w:t xml:space="preserve"> Là yếu tố trung tâm và bắt buộc trong mọi vi phạm pháp luật, thể hiện dưới dạng hành động (làm điều pháp luật cấm) hoặc không hành động (không làm điều pháp luật bắt buộc phải làm dù có đủ điều kiện thực hiện).</w:t>
+      </w:r>
+    </w:p>
+    <w:p>
+      <w:pPr>
+        <w:spacing w:after="60"/>
+        <w:ind w:left="709" w:firstLine="0"/>
+      </w:pPr>
+      <w:r>
+        <w:t xml:space="preserve">2. </w:t>
+      </w:r>
+      <w:r>
+        <w:rPr>
+          <w:b/>
+        </w:rPr>
+        <w:t>Hậu quả nguy hiểm cho xã hội:</w:t>
+      </w:r>
+      <w:r>
+        <w:t xml:space="preserve"> Là những tổn hại thực tế hoặc nguy cơ đe dọa gây tổn hại cho các quan hệ xã hội được pháp luật bảo vệ. Tùy thuộc vào loại vi phạm và quy định của từng ngành luật, hậu quả có thể là thiệt hại vật chất, thể chất, tinh thần, trật tự quản lý xã hội hoặc nguy cơ đe dọa gây thiệt hại mà không nhất thiết phải luôn là thiệt hại vật chất đã được định lượng [5].</w:t>
+      </w:r>
+    </w:p>
+    <w:p>
+      <w:pPr>
+        <w:spacing w:after="60"/>
+        <w:ind w:left="709" w:firstLine="0"/>
+      </w:pPr>
+      <w:r>
+        <w:t xml:space="preserve">3. </w:t>
+      </w:r>
+      <w:r>
+        <w:rPr>
+          <w:b/>
+        </w:rPr>
+        <w:t>Mối quan hệ nhân quả:</w:t>
+      </w:r>
+      <w:r>
+        <w:t xml:space="preserve"> Được xem xét khi cần quy kết một hậu quả pháp lý xác định cho hành vi vi phạm. Hành vi trái pháp luật phải xảy ra trước hậu quả về mặt thời gian và giữ vai trò là nguyên nhân có mối liên hệ nội tại tất yếu dẫn tới hậu quả nguy hại đó.</w:t>
+      </w:r>
+    </w:p>
+    <w:p>
+      <w:pPr>
+        <w:spacing w:after="60"/>
+        <w:ind w:left="709" w:firstLine="0"/>
+      </w:pPr>
+      <w:r>
+        <w:t xml:space="preserve">4. </w:t>
+      </w:r>
+      <w:r>
+        <w:rPr>
+          <w:b/>
+        </w:rPr>
+        <w:t>Các yếu tố khách quan khác:</w:t>
+      </w:r>
+      <w:r>
+        <w:t xml:space="preserve"> Bao gồm thời gian, địa điểm, công cụ, phương tiện và phương thức thực hiện hành vi, phản ánh mức độ tinh vi, quy mô và tính chất nguy hiểm của vi phạm.</w:t>
+      </w:r>
+    </w:p>
+    <w:p>
+      <w:pPr>
+        <w:pStyle w:val="u2"/>
+      </w:pPr>
+      <w:bookmarkStart w:id="10" w:name="_Toc237715696"/>
       <w:r>
         <w:rPr>
           <w:rFonts w:ascii="Times New Roman" w:eastAsia="Times New Roman" w:hAnsi="Times New Roman"/>
           <w:b w:val="0"/>
         </w:rPr>
         <w:lastRenderedPageBreak/>
-        <w:t>1.4. Khách thể của vi phạm pháp luật</w:t>
-      </w:r>
-      <w:bookmarkEnd w:id="11"/>
-    </w:p>
-    <w:p>
-      <w:r>
-        <w:t>Khách thể của vi phạm pháp luật là những quan hệ xã hội được pháp luật xác lập và bảo vệ nhưng bị hành vi vi phạm pháp luật xâm hại, làm thay đổi hoặc đe dọa làm biến đổi trạng thái an toàn, bình thường của các quan hệ đó [5].</w:t>
-      </w:r>
-    </w:p>
-    <w:p>
-      <w:r>
-        <w:t>Trong khoa học pháp lý, cần phân biệt rõ ba khái niệm:</w:t>
-      </w:r>
-    </w:p>
-    <w:p>
-      <w:pPr>
-        <w:pStyle w:val="Duudong"/>
-        <w:spacing w:after="60"/>
-        <w:ind w:left="709" w:firstLine="0"/>
-      </w:pPr>
-      <w:r>
-        <w:rPr>
-          <w:b/>
-        </w:rPr>
-        <w:t>Khách thể:</w:t>
-      </w:r>
-      <w:r>
-        <w:t xml:space="preserve"> Là quan hệ xã hội được pháp luật bảo vệ (như trật tự quản lý kinh tế, trật tự quản lý quảng cáo, quyền tài sản, quyền được bảo vệ an toàn tính mạng, sức khỏe và quyền được thông tin trung thực của người tiêu dùng).</w:t>
-      </w:r>
-    </w:p>
-    <w:p>
-      <w:pPr>
-        <w:pStyle w:val="Duudong"/>
-        <w:spacing w:after="60"/>
-        <w:ind w:left="709" w:firstLine="0"/>
-      </w:pPr>
-      <w:r>
-        <w:rPr>
-          <w:b/>
-        </w:rPr>
-        <w:t>Đối tượng tác động:</w:t>
-      </w:r>
-      <w:r>
-        <w:t xml:space="preserve"> Là những thực thể vật chất, thông tin hoặc tài sản cụ thể mà thông qua việc tác động vào đó, chủ thể xâm hại đến khách thể (ví dụ: sản phẩm hàng hóa, bao bì nhãn mác, bài viết/video quảng cáo, dòng tiền thanh toán).</w:t>
-      </w:r>
-    </w:p>
-    <w:p>
-      <w:pPr>
-        <w:pStyle w:val="Duudong"/>
-        <w:spacing w:after="60"/>
-        <w:ind w:left="709" w:firstLine="0"/>
-      </w:pPr>
-      <w:r>
-        <w:rPr>
-          <w:b/>
-        </w:rPr>
-        <w:t>Chủ thể của quan hệ bị xâm hại (Người bị ảnh hưởng / Người bị thiệt hại):</w:t>
-      </w:r>
-      <w:r>
-        <w:t xml:space="preserve"> Là các cá nhân, tổ chức tham gia vào quan hệ xã hội bị xâm hại và chịu tổn hại trực tiếp hoặc gián tiếp từ hành vi vi phạm.</w:t>
-      </w:r>
-    </w:p>
-    <w:p>
-      <w:pPr>
-        <w:pStyle w:val="u2"/>
-      </w:pPr>
-      <w:bookmarkStart w:id="12" w:name="_Toc237714980"/>
-      <w:r>
-        <w:rPr>
-          <w:rFonts w:ascii="Times New Roman" w:eastAsia="Times New Roman" w:hAnsi="Times New Roman"/>
-          <w:b w:val="0"/>
-        </w:rPr>
-        <w:t>1.5. Mặt khách quan của vi phạm pháp luật</w:t>
-      </w:r>
-      <w:bookmarkEnd w:id="12"/>
-    </w:p>
-    <w:p>
-      <w:r>
-        <w:t>Mặt khách quan của vi phạm pháp luật là toàn bộ những biểu hiện bên ngoài của vi phạm pháp luật diễn ra trong thế giới khách quan, có thể nhận biết và kiểm chứng được [5]. Trong cấu thành mặt khách quan:</w:t>
-      </w:r>
-    </w:p>
-    <w:p>
-      <w:pPr>
-        <w:spacing w:after="60"/>
-        <w:ind w:left="709" w:firstLine="0"/>
-      </w:pPr>
-      <w:r>
-        <w:t xml:space="preserve">1. </w:t>
-      </w:r>
-      <w:r>
-        <w:rPr>
-          <w:b/>
-        </w:rPr>
-        <w:t>Hành vi trái pháp luật:</w:t>
-      </w:r>
-      <w:r>
-        <w:t xml:space="preserve"> Là yếu tố trung tâm và bắt buộc trong mọi vi phạm pháp luật, thể hiện dưới dạng hành động (làm điều pháp luật cấm) hoặc không hành động (không làm điều pháp luật bắt buộc phải làm dù có đủ điều kiện thực hiện).</w:t>
-      </w:r>
-    </w:p>
-    <w:p>
-      <w:pPr>
-        <w:spacing w:after="60"/>
-        <w:ind w:left="709" w:firstLine="0"/>
-      </w:pPr>
-      <w:r>
-        <w:t xml:space="preserve">2. </w:t>
-      </w:r>
-      <w:r>
-        <w:rPr>
-          <w:b/>
-        </w:rPr>
-        <w:t>Hậu quả nguy hiểm cho xã hội:</w:t>
-      </w:r>
-      <w:r>
-        <w:t xml:space="preserve"> Là những tổn hại thực tế hoặc nguy cơ đe dọa gây tổn hại cho các quan hệ xã hội được pháp luật bảo vệ. Tùy thuộc vào loại vi phạm và quy định của từng ngành luật, hậu quả có thể là thiệt hại vật chất, thể chất, tinh thần, trật tự quản lý xã hội hoặc nguy cơ đe dọa gây thiệt hại mà không nhất thiết phải luôn là thiệt hại vật chất đã được định lượng [5].</w:t>
-      </w:r>
-    </w:p>
-    <w:p>
-      <w:pPr>
-        <w:spacing w:after="60"/>
-        <w:ind w:left="709" w:firstLine="0"/>
-      </w:pPr>
-      <w:r>
-        <w:t xml:space="preserve">3. </w:t>
-      </w:r>
-      <w:r>
-        <w:rPr>
-          <w:b/>
-        </w:rPr>
-        <w:t>Mối quan hệ nhân quả:</w:t>
-      </w:r>
-      <w:r>
-        <w:t xml:space="preserve"> Được xem xét khi cần quy kết một hậu quả pháp lý xác định cho hành vi vi phạm. Hành vi trái pháp luật phải xảy ra trước hậu </w:t>
-      </w:r>
-      <w:r>
-        <w:lastRenderedPageBreak/>
-        <w:t>quả về mặt thời gian và giữ vai trò là nguyên nhân có mối liên hệ nội tại tất yếu dẫn tới hậu quả nguy hại đó.</w:t>
-      </w:r>
-    </w:p>
-    <w:p>
-      <w:pPr>
-        <w:spacing w:after="60"/>
-        <w:ind w:left="709" w:firstLine="0"/>
-      </w:pPr>
-      <w:r>
-        <w:t xml:space="preserve">4. </w:t>
-      </w:r>
-      <w:r>
-        <w:rPr>
-          <w:b/>
-        </w:rPr>
-        <w:t>Các yếu tố khách quan khác:</w:t>
-      </w:r>
-      <w:r>
-        <w:t xml:space="preserve"> Bao gồm thời gian, địa điểm, công cụ, phương tiện và phương thức thực hiện hành vi, phản ánh mức độ tinh vi, quy mô và tính chất nguy hiểm của vi phạm.</w:t>
-      </w:r>
-    </w:p>
-    <w:p>
-      <w:pPr>
-        <w:pStyle w:val="u2"/>
-      </w:pPr>
-      <w:bookmarkStart w:id="13" w:name="_Toc237714981"/>
-      <w:r>
-        <w:rPr>
-          <w:rFonts w:ascii="Times New Roman" w:eastAsia="Times New Roman" w:hAnsi="Times New Roman"/>
-          <w:b w:val="0"/>
-        </w:rPr>
         <w:t>1.6. Chủ thể của vi phạm pháp luật</w:t>
       </w:r>
-      <w:bookmarkEnd w:id="13"/>
-    </w:p>
-    <w:p>
+      <w:bookmarkEnd w:id="10"/>
+    </w:p>
+    <w:p>
+      <w:pPr>
+        <w:spacing w:after="80"/>
+      </w:pPr>
       <w:r>
         <w:t>Chủ thể của vi phạm pháp luật là cá nhân hoặc tổ chức có năng lực trách nhiệm pháp lý đã thực hiện hành vi vi phạm pháp luật [5].</w:t>
       </w:r>
@@ -4182,6 +3888,9 @@
       </w:r>
     </w:p>
     <w:p>
+      <w:pPr>
+        <w:spacing w:after="80"/>
+      </w:pPr>
       <w:r>
         <w:t>Trong các vụ việc có nhiều người cùng tham gia, việc phân hóa vai trò cụ thể giữa người tổ chức, người thực hành và người giúp sức là cơ sở để xác định chính xác mức độ trách nhiệm của từng cá nhân.</w:t>
       </w:r>
@@ -4190,7 +3899,7 @@
       <w:pPr>
         <w:pStyle w:val="u2"/>
       </w:pPr>
-      <w:bookmarkStart w:id="14" w:name="_Toc237714982"/>
+      <w:bookmarkStart w:id="11" w:name="_Toc237715697"/>
       <w:r>
         <w:rPr>
           <w:rFonts w:ascii="Times New Roman" w:eastAsia="Times New Roman" w:hAnsi="Times New Roman"/>
@@ -4198,9 +3907,12 @@
         </w:rPr>
         <w:t>1.7. Mặt chủ quan của vi phạm pháp luật</w:t>
       </w:r>
-      <w:bookmarkEnd w:id="14"/>
-    </w:p>
-    <w:p>
+      <w:bookmarkEnd w:id="11"/>
+    </w:p>
+    <w:p>
+      <w:pPr>
+        <w:spacing w:after="80"/>
+      </w:pPr>
       <w:r>
         <w:t>Mặt chủ quan của vi phạm pháp luật là trạng thái tâm lý bên trong của chủ thể gắn liền với hành vi trái pháp luật và hậu quả do hành vi đó gây ra, bao gồm lỗi, động cơ và mục đích [5]:</w:t>
       </w:r>
@@ -4279,7 +3991,6 @@
         <w:ind w:left="709" w:firstLine="0"/>
       </w:pPr>
       <w:r>
-        <w:lastRenderedPageBreak/>
         <w:t xml:space="preserve">3. </w:t>
       </w:r>
       <w:r>
@@ -4296,7 +4007,7 @@
       <w:pPr>
         <w:pStyle w:val="u1"/>
       </w:pPr>
-      <w:bookmarkStart w:id="15" w:name="_Toc237714983"/>
+      <w:bookmarkStart w:id="12" w:name="_Toc237715698"/>
       <w:r>
         <w:rPr>
           <w:rFonts w:ascii="Times New Roman" w:eastAsia="Times New Roman" w:hAnsi="Times New Roman"/>
@@ -4305,13 +4016,13 @@
         <w:lastRenderedPageBreak/>
         <w:t>CHƯƠNG 2: KHÁI QUÁT VỤ VIỆC QUẢNG CÁO GIAN DỐI SẢN PHẨM ĐÔNG Y TRÊN MẠNG XÃ HỘI</w:t>
       </w:r>
-      <w:bookmarkEnd w:id="15"/>
+      <w:bookmarkEnd w:id="12"/>
     </w:p>
     <w:p>
       <w:pPr>
         <w:pStyle w:val="u2"/>
       </w:pPr>
-      <w:bookmarkStart w:id="16" w:name="_Toc237714984"/>
+      <w:bookmarkStart w:id="13" w:name="_Toc237715699"/>
       <w:r>
         <w:rPr>
           <w:rFonts w:ascii="Times New Roman" w:eastAsia="Times New Roman" w:hAnsi="Times New Roman"/>
@@ -4319,14 +4030,20 @@
         </w:rPr>
         <w:t>2.1. Nguồn gốc thông tin và bối cảnh vụ việc</w:t>
       </w:r>
-      <w:bookmarkEnd w:id="16"/>
-    </w:p>
-    <w:p>
+      <w:bookmarkEnd w:id="13"/>
+    </w:p>
+    <w:p>
+      <w:pPr>
+        <w:spacing w:after="80"/>
+      </w:pPr>
       <w:r>
         <w:t>Trong những năm gần đây, sự bùng nổ của thương mại điện tử trên các nền tảng mạng xã hội đã tạo điều kiện thuận lợi cho hoạt động giao thương. Tuy nhiên, môi trường này cũng bị một số đối tượng lợi dụng để thực hiện các hành vi gian dối thương mại, quảng cáo không đúng sự thật nhằm trục lợi. Đặc biệt trong lĩnh vực sản phẩm y dược cổ truyền, thảo dược chăm sóc sức khỏe, sự thiếu hụt thông tin của người tiêu dùng dễ bị khai thác bởi các nội dung quảng cáo phóng đại.</w:t>
       </w:r>
     </w:p>
     <w:p>
+      <w:pPr>
+        <w:spacing w:after="80"/>
+      </w:pPr>
       <w:r>
         <w:t xml:space="preserve">Báo Điện tử Chính phủ đăng bài lúc 14:47 ngày 10/8/2026, dẫn thông tin chính thức từ Công an tỉnh Phú Thọ về việc triệt phá đường dây sản xuất, kinh doanh và quảng cáo sản phẩm Đông y “Xương khớp bà Sáu” trên mạng xã hội [6]. Cần phân biệt rõ ngày công bố thông tin báo chí với thời điểm ban hành quyết định tố tụng: theo bài báo này, Cơ quan Cảnh sát điều tra Công an tỉnh Phú Thọ đã ra quyết định khởi tố vụ án hình sự và khởi tố Nguyễn Tiến Đạt cùng 20 bị can vào ngày </w:t>
       </w:r>
@@ -4353,7 +4070,7 @@
       <w:pPr>
         <w:pStyle w:val="u2"/>
       </w:pPr>
-      <w:bookmarkStart w:id="17" w:name="_Toc237714985"/>
+      <w:bookmarkStart w:id="14" w:name="_Toc237715700"/>
       <w:r>
         <w:rPr>
           <w:rFonts w:ascii="Times New Roman" w:eastAsia="Times New Roman" w:hAnsi="Times New Roman"/>
@@ -4361,9 +4078,12 @@
         </w:rPr>
         <w:t>2.2. Phương thức và diễn biến hành vi theo thông tin điều tra ban đầu</w:t>
       </w:r>
-      <w:bookmarkEnd w:id="17"/>
-    </w:p>
-    <w:p>
+      <w:bookmarkEnd w:id="14"/>
+    </w:p>
+    <w:p>
+      <w:pPr>
+        <w:spacing w:after="80"/>
+      </w:pPr>
       <w:r>
         <w:t>Theo tài liệu điều tra ban đầu được cơ quan công an công bố trên Báo Điện tử Chính phủ, chuỗi hoạt động của đường dây thể hiện qua các khâu chính sau [6]:</w:t>
       </w:r>
@@ -4384,6 +4104,9 @@
       </w:r>
     </w:p>
     <w:p>
+      <w:pPr>
+        <w:spacing w:after="80"/>
+      </w:pPr>
       <w:r>
         <w:t xml:space="preserve">   Nguyễn Tiến Đạt thỏa thuận thu mua sản phẩm Đông y mang tên “Xương khớp bà Sáu” từ Phùng Thị Nguyệt Ánh (Giám đốc Công ty TNHH Dược liệu Nguyệt Ánh) với mức giá gốc khoảng </w:t>
       </w:r>
@@ -4413,6 +4136,9 @@
       </w:r>
     </w:p>
     <w:p>
+      <w:pPr>
+        <w:spacing w:after="80"/>
+      </w:pPr>
       <w:r>
         <w:t xml:space="preserve">   Đạt chỉ đạo xây dựng bài viết, hình ảnh và video có hình người nổi tiếng đã được chỉnh sửa, cắt ghép; đồng thời đưa ra nội dung phóng đại, sai lệch về công dụng, chất lượng sản phẩm nhằm tạo niềm tin và thúc đẩy người tiếp cận đặt mua hàng [6]. Nguồn tin xác định phương tiện tiếp thị là mạng xã hội nói chung.</w:t>
       </w:r>
@@ -4423,7 +4149,6 @@
         <w:ind w:left="709" w:firstLine="0"/>
       </w:pPr>
       <w:r>
-        <w:lastRenderedPageBreak/>
         <w:t xml:space="preserve">3. </w:t>
       </w:r>
       <w:r>
@@ -4434,7 +4159,11 @@
       </w:r>
     </w:p>
     <w:p>
-      <w:r>
+      <w:pPr>
+        <w:spacing w:after="80"/>
+      </w:pPr>
+      <w:r>
+        <w:lastRenderedPageBreak/>
         <w:t xml:space="preserve">   Sản phẩm được bán ra với mức giá </w:t>
       </w:r>
       <w:r>
@@ -4819,7 +4548,7 @@
       <w:pPr>
         <w:pStyle w:val="u2"/>
       </w:pPr>
-      <w:bookmarkStart w:id="18" w:name="_Toc237714986"/>
+      <w:bookmarkStart w:id="15" w:name="_Toc237715701"/>
       <w:r>
         <w:rPr>
           <w:rFonts w:ascii="Times New Roman" w:eastAsia="Times New Roman" w:hAnsi="Times New Roman"/>
@@ -4827,9 +4556,12 @@
         </w:rPr>
         <w:t>2.3. Các chủ thể liên quan và phân công vai trò</w:t>
       </w:r>
-      <w:bookmarkEnd w:id="18"/>
-    </w:p>
-    <w:p>
+      <w:bookmarkEnd w:id="15"/>
+    </w:p>
+    <w:p>
+      <w:pPr>
+        <w:spacing w:after="80"/>
+      </w:pPr>
       <w:r>
         <w:t>Theo thông tin điều tra ban đầu, vụ việc liên quan đến các chủ thể sau:</w:t>
       </w:r>
@@ -4886,7 +4618,7 @@
       <w:pPr>
         <w:pStyle w:val="u2"/>
       </w:pPr>
-      <w:bookmarkStart w:id="19" w:name="_Toc237714987"/>
+      <w:bookmarkStart w:id="16" w:name="_Toc237715702"/>
       <w:r>
         <w:rPr>
           <w:rFonts w:ascii="Times New Roman" w:eastAsia="Times New Roman" w:hAnsi="Times New Roman"/>
@@ -4894,7 +4626,7 @@
         </w:rPr>
         <w:t>2.4. Trạng thái tố tụng hiện tại</w:t>
       </w:r>
-      <w:bookmarkEnd w:id="19"/>
+      <w:bookmarkEnd w:id="16"/>
     </w:p>
     <w:p>
       <w:pPr>
@@ -4976,7 +4708,7 @@
       <w:pPr>
         <w:pStyle w:val="u2"/>
       </w:pPr>
-      <w:bookmarkStart w:id="20" w:name="_Toc237714988"/>
+      <w:bookmarkStart w:id="17" w:name="_Toc237715703"/>
       <w:r>
         <w:rPr>
           <w:rFonts w:ascii="Times New Roman" w:eastAsia="Times New Roman" w:hAnsi="Times New Roman"/>
@@ -4984,7 +4716,7 @@
         </w:rPr>
         <w:t>2.5. Bảng tổng hợp dữ kiện và dòng thời gian vụ việc</w:t>
       </w:r>
-      <w:bookmarkEnd w:id="20"/>
+      <w:bookmarkEnd w:id="17"/>
     </w:p>
     <w:p>
       <w:pPr>
@@ -6138,7 +5870,7 @@
       <w:pPr>
         <w:pStyle w:val="u1"/>
       </w:pPr>
-      <w:bookmarkStart w:id="21" w:name="_Toc237714989"/>
+      <w:bookmarkStart w:id="18" w:name="_Toc237715704"/>
       <w:r>
         <w:rPr>
           <w:rFonts w:ascii="Times New Roman" w:eastAsia="Times New Roman" w:hAnsi="Times New Roman"/>
@@ -6147,9 +5879,12 @@
         <w:lastRenderedPageBreak/>
         <w:t>CHƯƠNG 3: PHÂN TÍCH CÁC YẾU TỐ CẤU THÀNH VI PHẠM PHÁP LUẬT TRONG VỤ VIỆC</w:t>
       </w:r>
-      <w:bookmarkEnd w:id="21"/>
-    </w:p>
-    <w:p>
+      <w:bookmarkEnd w:id="18"/>
+    </w:p>
+    <w:p>
+      <w:pPr>
+        <w:spacing w:after="80"/>
+      </w:pPr>
       <w:r>
         <w:t>Chương 3 là phần trọng tâm của báo cáo, vận dụng khung lý thuyết cấu thành vi phạm pháp luật của học phần Pháp luật đại cương để phân tích có hệ thống bốn yếu tố: Khách thể, Mặt khách quan, Chủ thể và Mặt chủ quan trong vụ việc tại Phú Thọ.</w:t>
       </w:r>
@@ -6158,7 +5893,7 @@
       <w:pPr>
         <w:pStyle w:val="u2"/>
       </w:pPr>
-      <w:bookmarkStart w:id="22" w:name="_Toc237714990"/>
+      <w:bookmarkStart w:id="19" w:name="_Toc237715705"/>
       <w:r>
         <w:rPr>
           <w:rFonts w:ascii="Times New Roman" w:eastAsia="Times New Roman" w:hAnsi="Times New Roman"/>
@@ -6166,7 +5901,7 @@
         </w:rPr>
         <w:t>3.1. Phân tích yếu tố Khách thể của vi phạm pháp luật</w:t>
       </w:r>
-      <w:bookmarkEnd w:id="22"/>
+      <w:bookmarkEnd w:id="19"/>
     </w:p>
     <w:p>
       <w:pPr>
@@ -6181,6 +5916,9 @@
       </w:r>
     </w:p>
     <w:p>
+      <w:pPr>
+        <w:spacing w:after="80"/>
+      </w:pPr>
       <w:r>
         <w:t>Khách thể của vi phạm pháp luật là những quan hệ xã hội được pháp luật xác lập và bảo vệ nhưng bị hành vi vi phạm pháp luật xâm hại [5]. Trong hoạt động thương mại và tiếp thị sản phẩm Đông y chăm sóc sức khỏe, pháp luật bảo vệ trật tự quản lý nhà nước về quảng cáo và thương mại, quyền và lợi ích hợp pháp của người tiêu dùng, cũng như quyền nhân thân về hình ảnh của cá nhân.</w:t>
       </w:r>
@@ -6240,6 +5978,9 @@
       </w:r>
     </w:p>
     <w:p>
+      <w:pPr>
+        <w:spacing w:after="80"/>
+      </w:pPr>
       <w:r>
         <w:t>Hành vi bị cáo buộc của các đối tượng đã tác động tiêu cực đến các nhóm quan hệ xã hội sau:</w:t>
       </w:r>
@@ -6260,6 +6001,9 @@
       </w:r>
     </w:p>
     <w:p>
+      <w:pPr>
+        <w:spacing w:after="80"/>
+      </w:pPr>
       <w:r>
         <w:t xml:space="preserve">   Nhà nước ban hành các quy chuẩn nhằm bảo đảm sự minh bạch và lành mạnh của thị trường. Việc đưa thông tin sai lệch về công dụng sản phẩm và sử dụng hình ảnh không đúng quy định vi phạm trực tiếp các quy tắc quản lý tại Điều 8 và </w:t>
       </w:r>
@@ -6284,6 +6028,9 @@
       </w:r>
     </w:p>
     <w:p>
+      <w:pPr>
+        <w:spacing w:after="80"/>
+      </w:pPr>
       <w:r>
         <w:t xml:space="preserve">   Theo quy định tại </w:t>
       </w:r>
@@ -6313,6 +6060,9 @@
       </w:r>
     </w:p>
     <w:p>
+      <w:pPr>
+        <w:spacing w:after="80"/>
+      </w:pPr>
       <w:r>
         <w:t xml:space="preserve">   Căn cứ </w:t>
       </w:r>
@@ -6628,6 +6378,9 @@
       </w:r>
     </w:p>
     <w:p>
+      <w:pPr>
+        <w:spacing w:after="80"/>
+      </w:pPr>
       <w:r>
         <w:t>Việc xác định khách thể cho thấy hành vi bị cáo buộc có thể tác động đa chiều đến các quan hệ xã hội được pháp luật bảo vệ, bao gồm cả trật tự quản lý công cộng và quyền lợi hợp pháp của các chủ thể tham gia giao dịch trên không gian mạng.</w:t>
       </w:r>
@@ -6636,7 +6389,7 @@
       <w:pPr>
         <w:pStyle w:val="u2"/>
       </w:pPr>
-      <w:bookmarkStart w:id="23" w:name="_Toc237714991"/>
+      <w:bookmarkStart w:id="20" w:name="_Toc237715706"/>
       <w:r>
         <w:rPr>
           <w:rFonts w:ascii="Times New Roman" w:eastAsia="Times New Roman" w:hAnsi="Times New Roman"/>
@@ -6645,7 +6398,7 @@
         <w:lastRenderedPageBreak/>
         <w:t>3.2. Phân tích yếu tố Mặt khách quan của vi phạm pháp luật</w:t>
       </w:r>
-      <w:bookmarkEnd w:id="23"/>
+      <w:bookmarkEnd w:id="20"/>
     </w:p>
     <w:p>
       <w:pPr>
@@ -6660,6 +6413,9 @@
       </w:r>
     </w:p>
     <w:p>
+      <w:pPr>
+        <w:spacing w:after="80"/>
+      </w:pPr>
       <w:r>
         <w:t>Mặt khách quan của vi phạm pháp luật bao gồm hành vi trái pháp luật, hậu quả nguy hiểm cho xã hội, mối quan hệ nhân quả và các yếu tố công cụ, phương tiện, phương thức thực hiện [5].</w:t>
       </w:r>
@@ -6836,6 +6592,9 @@
       </w:r>
     </w:p>
     <w:p>
+      <w:pPr>
+        <w:spacing w:after="80"/>
+      </w:pPr>
       <w:r>
         <w:t xml:space="preserve">Bài báo nêu rõ con số 5.429 đơn hàng thành công với </w:t>
       </w:r>
@@ -6863,6 +6622,9 @@
       </w:r>
     </w:p>
     <w:p>
+      <w:pPr>
+        <w:spacing w:after="80"/>
+      </w:pPr>
       <w:r>
         <w:t>Nội dung quảng cáo sai sự thật và hình ảnh cắt ghép có khả năng tác động trực tiếp đến nhận thức, định hướng niềm tin của người tiếp cận thông tin trên mạng xã hội. Mối liên hệ giữa quy trình quảng cáo sai lệch và kết quả 5.429 đơn hàng được xác lập tạo cơ sở lý luận để phân tích mối quan hệ nhân quả trong học phần Pháp luật đại cương. Dưới góc độ nghiên cứu học thuật, báo cáo không khái quát rằng toàn bộ 5.429 đơn hàng đều xuất phát duy nhất từ yếu tố quảng cáo gian dối do dữ liệu công khai chưa cung cấp đ</w:t>
       </w:r>
@@ -6883,6 +6645,9 @@
       </w:r>
     </w:p>
     <w:p>
+      <w:pPr>
+        <w:spacing w:after="80"/>
+      </w:pPr>
       <w:r>
         <w:t>Mặt khách quan thể hiện rõ chuỗi hành vi hành động được triển khai theo nhiều khâu, sử dụng công nghệ số để phát tán thông tin sai lệch diện rộng, tạo ra quy mô giao dịch đáng kể trên thị trường trực tuyến.</w:t>
       </w:r>
@@ -6891,7 +6656,7 @@
       <w:pPr>
         <w:pStyle w:val="u2"/>
       </w:pPr>
-      <w:bookmarkStart w:id="24" w:name="_Toc237714992"/>
+      <w:bookmarkStart w:id="21" w:name="_Toc237715707"/>
       <w:r>
         <w:rPr>
           <w:rFonts w:ascii="Times New Roman" w:eastAsia="Times New Roman" w:hAnsi="Times New Roman"/>
@@ -6899,7 +6664,7 @@
         </w:rPr>
         <w:t>3.3. Phân tích yếu tố Chủ thể của vi phạm pháp luật</w:t>
       </w:r>
-      <w:bookmarkEnd w:id="24"/>
+      <w:bookmarkEnd w:id="21"/>
     </w:p>
     <w:p>
       <w:pPr>
@@ -6914,6 +6679,9 @@
       </w:r>
     </w:p>
     <w:p>
+      <w:pPr>
+        <w:spacing w:after="80"/>
+      </w:pPr>
       <w:r>
         <w:t>Chủ thể của vi phạm pháp luật là cá nhân hoặc tổ chức có năng lực trách nhiệm pháp lý đã thực hiện hành vi vi phạm [5]. Năng lực trách nhiệm pháp lý của cá nhân bao gồm việc đạt độ tuổi luật định và có trạng thái tâm thần bình thường, đủ khả năng nhận thức và điều khiển hành vi.</w:t>
       </w:r>
@@ -6931,6 +6699,9 @@
       </w:r>
     </w:p>
     <w:p>
+      <w:pPr>
+        <w:spacing w:after="80"/>
+      </w:pPr>
       <w:r>
         <w:t xml:space="preserve">Cơ quan CSĐT Công an tỉnh Phú Thọ đã ra quyết định khởi tố đối với </w:t>
       </w:r>
@@ -7016,6 +6787,9 @@
       </w:r>
     </w:p>
     <w:p>
+      <w:pPr>
+        <w:spacing w:after="80"/>
+      </w:pPr>
       <w:r>
         <w:t>Dữ liệu công khai phản ánh sự phân công vai trò bước đầu:</w:t>
       </w:r>
@@ -7087,6 +6861,9 @@
       </w:r>
     </w:p>
     <w:p>
+      <w:pPr>
+        <w:spacing w:after="80"/>
+      </w:pPr>
       <w:r>
         <w:t>Về mặt lý luận, dữ kiện công khai cho phép xác định độ tuổi thành niên của người tổ chức (Nguyễn Tiến Đạt), trong khi các chủ thể khác cần thêm dữ liệu chứng cứ để đánh giá đầy đủ. Hoạt động thực tế thể hiện sự phân công công việc rõ nét giữa các khâu.</w:t>
       </w:r>
@@ -7095,7 +6872,7 @@
       <w:pPr>
         <w:pStyle w:val="u2"/>
       </w:pPr>
-      <w:bookmarkStart w:id="25" w:name="_Toc237714993"/>
+      <w:bookmarkStart w:id="22" w:name="_Toc237715708"/>
       <w:r>
         <w:rPr>
           <w:rFonts w:ascii="Times New Roman" w:eastAsia="Times New Roman" w:hAnsi="Times New Roman"/>
@@ -7104,7 +6881,7 @@
         <w:lastRenderedPageBreak/>
         <w:t>3.4. Phân tích yếu tố Mặt chủ quan của vi phạm pháp luật</w:t>
       </w:r>
-      <w:bookmarkEnd w:id="25"/>
+      <w:bookmarkEnd w:id="22"/>
     </w:p>
     <w:p>
       <w:pPr>
@@ -7119,6 +6896,9 @@
       </w:r>
     </w:p>
     <w:p>
+      <w:pPr>
+        <w:spacing w:after="80"/>
+      </w:pPr>
       <w:r>
         <w:t>Mặt chủ quan phản ánh trạng thái tâm lý nội tâm của chủ thể đối với hành vi và hậu quả do hành vi đó gây ra, bao gồm lỗi, động cơ và mục đích [5]. Việc phân tích mặt chủ quan phải căn cứ vào hành vi khách quan đã bộc lộ và có sự phân hóa theo từng vị trí vai trò.</w:t>
       </w:r>
@@ -7264,6 +7044,9 @@
       </w:r>
     </w:p>
     <w:p>
+      <w:pPr>
+        <w:spacing w:after="80"/>
+      </w:pPr>
       <w:r>
         <w:t>Chênh lệch giữa giá mua 23.000 đồng và giá bán 199.000 đồng cùng chi phí tiếp thị qua mạng xã hội phản ánh định hướng thúc đẩy giao dịch bán hàng trên thực tế. Dưới góc độ nghiên cứu học thuật, báo cáo không tự ý tính toán con số lợi nhuận thuần túy hay khoản thu lợi bất chính khi cơ quan tiến hành tố tụng chưa công bố kết luận tài chính chính thức.</w:t>
       </w:r>
@@ -7282,6 +7065,9 @@
       </w:r>
     </w:p>
     <w:p>
+      <w:pPr>
+        <w:spacing w:after="80"/>
+      </w:pPr>
       <w:r>
         <w:t xml:space="preserve">Đối với các nhân viên ở khâu marketing, bán hàng, vận đơn và đóng gói, tài liệu ban đầu chưa thể hiện chi tiết ý thức chủ quan của từng người. Cơ quan tiến hành </w:t>
       </w:r>
@@ -7653,6 +7439,9 @@
       </w:r>
     </w:p>
     <w:p>
+      <w:pPr>
+        <w:spacing w:after="80"/>
+      </w:pPr>
       <w:r>
         <w:t>Dưới góc độ lý luận, các dữ kiện công khai tạo cơ sở phân tích hướng lỗi cố ý trực tiếp và động cơ vụ lợi của người tổ chức điều hành. Việc không áp đặt đồng loạt trạng thái tâm lý cho các nhân sự hỗ trợ thể hiện sự chuẩn mực và thận trọng trong phương pháp luận nghiên cứu pháp lý.</w:t>
       </w:r>
@@ -7661,7 +7450,7 @@
       <w:pPr>
         <w:pStyle w:val="u2"/>
       </w:pPr>
-      <w:bookmarkStart w:id="26" w:name="_Toc237714994"/>
+      <w:bookmarkStart w:id="23" w:name="_Toc237715709"/>
       <w:r>
         <w:rPr>
           <w:rFonts w:ascii="Times New Roman" w:eastAsia="Times New Roman" w:hAnsi="Times New Roman"/>
@@ -7669,7 +7458,7 @@
         </w:rPr>
         <w:t>3.5. Bảng tổng hợp bốn yếu tố cấu thành vi phạm pháp luật</w:t>
       </w:r>
-      <w:bookmarkEnd w:id="26"/>
+      <w:bookmarkEnd w:id="23"/>
     </w:p>
     <w:p>
       <w:pPr>
@@ -8150,7 +7939,7 @@
       <w:pPr>
         <w:pStyle w:val="u1"/>
       </w:pPr>
-      <w:bookmarkStart w:id="27" w:name="_Toc237714995"/>
+      <w:bookmarkStart w:id="24" w:name="_Toc237715710"/>
       <w:r>
         <w:rPr>
           <w:rFonts w:ascii="Times New Roman" w:eastAsia="Times New Roman" w:hAnsi="Times New Roman"/>
@@ -8159,13 +7948,13 @@
         <w:lastRenderedPageBreak/>
         <w:t>CHƯƠNG 4: NHẬN XÉT VÀ BÀI HỌC THỰC TIỄN</w:t>
       </w:r>
-      <w:bookmarkEnd w:id="27"/>
+      <w:bookmarkEnd w:id="24"/>
     </w:p>
     <w:p>
       <w:pPr>
         <w:pStyle w:val="u2"/>
       </w:pPr>
-      <w:bookmarkStart w:id="28" w:name="_Toc237714996"/>
+      <w:bookmarkStart w:id="25" w:name="_Toc237715711"/>
       <w:r>
         <w:rPr>
           <w:rFonts w:ascii="Times New Roman" w:eastAsia="Times New Roman" w:hAnsi="Times New Roman"/>
@@ -8173,9 +7962,12 @@
         </w:rPr>
         <w:t>4.1. Ý nghĩa phòng ngừa từ vụ việc</w:t>
       </w:r>
-      <w:bookmarkEnd w:id="28"/>
-    </w:p>
-    <w:p>
+      <w:bookmarkEnd w:id="25"/>
+    </w:p>
+    <w:p>
+      <w:pPr>
+        <w:spacing w:after="80"/>
+      </w:pPr>
       <w:r>
         <w:t>Vụ việc đường dây quảng cáo gian dối sản phẩm Đông y bị triệt phá tại Phú Thọ mang lại nhiều giá trị thực tiễn trong công tác phòng ngừa vi phạm pháp luật trên không gian mạng:</w:t>
       </w:r>
@@ -8216,7 +8008,7 @@
       <w:pPr>
         <w:pStyle w:val="u2"/>
       </w:pPr>
-      <w:bookmarkStart w:id="29" w:name="_Toc237714997"/>
+      <w:bookmarkStart w:id="26" w:name="_Toc237715712"/>
       <w:r>
         <w:rPr>
           <w:rFonts w:ascii="Times New Roman" w:eastAsia="Times New Roman" w:hAnsi="Times New Roman"/>
@@ -8224,7 +8016,7 @@
         </w:rPr>
         <w:t>4.2. Bài học đối với hoạt động kinh doanh trực tuyến và người tiêu dùng</w:t>
       </w:r>
-      <w:bookmarkEnd w:id="29"/>
+      <w:bookmarkEnd w:id="26"/>
     </w:p>
     <w:p>
       <w:pPr>
@@ -8246,7 +8038,7 @@
         <w:ind w:left="709" w:firstLine="0"/>
       </w:pPr>
       <w:r>
-        <w:t>Hoạt động quảng cáo phải tuân thủ nghiêm ngặt Luật Quảng cáo và các quy định chuyên ngành; tuyệt đối không đưa thông tin phóng đại, sai sự thật về công dụng, chất lượng hàng hóa.</w:t>
+        <w:t>Hoạt động quảng cáo phải tuân thủ đúng quy định của Luật Quảng cáo và các văn bản liên quan; tuyệt đối không đưa thông tin phóng đại, sai sự thật về công dụng, chất lượng hàng hóa.</w:t>
       </w:r>
     </w:p>
     <w:p>
@@ -8296,7 +8088,7 @@
       <w:pPr>
         <w:pStyle w:val="u2"/>
       </w:pPr>
-      <w:bookmarkStart w:id="30" w:name="_Toc237714998"/>
+      <w:bookmarkStart w:id="27" w:name="_Toc237715713"/>
       <w:r>
         <w:rPr>
           <w:rFonts w:ascii="Times New Roman" w:eastAsia="Times New Roman" w:hAnsi="Times New Roman"/>
@@ -8304,9 +8096,12 @@
         </w:rPr>
         <w:t>4.3. Bài học về nhận thức pháp luật và đạo đức số cho sinh viên CNTT</w:t>
       </w:r>
-      <w:bookmarkEnd w:id="30"/>
-    </w:p>
-    <w:p>
+      <w:bookmarkEnd w:id="27"/>
+    </w:p>
+    <w:p>
+      <w:pPr>
+        <w:spacing w:after="80"/>
+      </w:pPr>
       <w:r>
         <w:t>Vụ việc mang lại bài học sâu sắc cho sinh viên Trường Đại học Công nghệ Thông tin (UIT):</w:t>
       </w:r>
@@ -8321,11 +8116,14 @@
         <w:rPr>
           <w:b/>
         </w:rPr>
+        <w:t>Trách nhiệm pháp lý trong công việc kỹ thuật số:</w:t>
+      </w:r>
+      <w:r>
+        <w:t xml:space="preserve"> Khi tham gia các công việc làm thêm như chạy quảng cáo, chỉnh sửa video, quản trị trang mạng </w:t>
+      </w:r>
+      <w:r>
         <w:lastRenderedPageBreak/>
-        <w:t>Trách nhiệm pháp lý trong công việc kỹ thuật số:</w:t>
-      </w:r>
-      <w:r>
-        <w:t xml:space="preserve"> Khi tham gia các công việc làm thêm như chạy quảng cáo, chỉnh sửa video, quản trị trang mạng xã hội, sinh viên cần có nhận thức rõ ràng về tính hợp pháp của nội dung mình tạo ra; tuyệt đối từ chối tham gia các hoạt động cắt ghép hình ảnh giả mạo hoặc truyền bá thông tin lừa dối.</w:t>
+        <w:t>xã hội, sinh viên cần có nhận thức rõ ràng về tính hợp pháp của nội dung mình tạo ra; tuyệt đối từ chối tham gia các hoạt động cắt ghép hình ảnh giả mạo hoặc truyền bá thông tin lừa dối.</w:t>
       </w:r>
     </w:p>
     <w:p>
@@ -8364,7 +8162,7 @@
       <w:pPr>
         <w:pStyle w:val="u1"/>
       </w:pPr>
-      <w:bookmarkStart w:id="31" w:name="_Toc237714999"/>
+      <w:bookmarkStart w:id="28" w:name="_Toc237715714"/>
       <w:r>
         <w:rPr>
           <w:rFonts w:ascii="Times New Roman" w:eastAsia="Times New Roman" w:hAnsi="Times New Roman"/>
@@ -8373,9 +8171,12 @@
         <w:lastRenderedPageBreak/>
         <w:t>KẾT LUẬN</w:t>
       </w:r>
-      <w:bookmarkEnd w:id="31"/>
-    </w:p>
-    <w:p>
+      <w:bookmarkEnd w:id="28"/>
+    </w:p>
+    <w:p>
+      <w:pPr>
+        <w:spacing w:after="80"/>
+      </w:pPr>
       <w:r>
         <w:t>Vận dụng lý luận cấu thành vi phạm pháp luật là phương pháp luận nền tảng của môn học Pháp luật đại cương, giúp phân tích và làm sáng tỏ bản chất pháp lý của các hành vi thực tế trong đời sống xã hội. Qua việc xem xét vụ việc Cơ quan Cảnh sát điều tra Công an tỉnh Phú Thọ khởi tố 21 bị can liên quan đến sản phẩm "Xương khớp bà Sáu", bài tiểu luận đã tổng hợp bốn yếu tố cấu thành dưới góc độ học thuật:</w:t>
       </w:r>
@@ -8453,11 +8254,17 @@
       </w:r>
     </w:p>
     <w:p>
+      <w:pPr>
+        <w:spacing w:after="80"/>
+      </w:pPr>
       <w:r>
         <w:t>Tiểu luận không chỉ giúp sinh viên UIT rèn luyện tư duy pháp lý khoa học mà còn nhấn mạnh ý nghĩa của việc thượng tôn pháp luật và giữ gìn đạo đức nghề nghiệp trong kỷ nguyên công nghệ số.</w:t>
       </w:r>
     </w:p>
     <w:p>
+      <w:pPr>
+        <w:spacing w:after="80"/>
+      </w:pPr>
       <w:r>
         <w:rPr>
           <w:i/>
@@ -8469,7 +8276,7 @@
       <w:pPr>
         <w:pStyle w:val="u1"/>
       </w:pPr>
-      <w:bookmarkStart w:id="32" w:name="_Toc237715000"/>
+      <w:bookmarkStart w:id="29" w:name="_Toc237715715"/>
       <w:r>
         <w:rPr>
           <w:rFonts w:ascii="Times New Roman" w:eastAsia="Times New Roman" w:hAnsi="Times New Roman"/>
@@ -8478,13 +8285,13 @@
         <w:lastRenderedPageBreak/>
         <w:t>TÀI LIỆU THAM KHẢO</w:t>
       </w:r>
-      <w:bookmarkEnd w:id="32"/>
+      <w:bookmarkEnd w:id="29"/>
     </w:p>
     <w:p>
       <w:pPr>
         <w:pStyle w:val="u2"/>
       </w:pPr>
-      <w:bookmarkStart w:id="33" w:name="_Toc237715001"/>
+      <w:bookmarkStart w:id="30" w:name="_Toc237715716"/>
       <w:r>
         <w:rPr>
           <w:rFonts w:ascii="Times New Roman" w:eastAsia="Times New Roman" w:hAnsi="Times New Roman"/>
@@ -8492,7 +8299,7 @@
         </w:rPr>
         <w:t>A. Văn bản quy phạm pháp luật</w:t>
       </w:r>
-      <w:bookmarkEnd w:id="33"/>
+      <w:bookmarkEnd w:id="30"/>
     </w:p>
     <w:p>
       <w:pPr>
@@ -8606,7 +8413,7 @@
       <w:pPr>
         <w:pStyle w:val="u2"/>
       </w:pPr>
-      <w:bookmarkStart w:id="34" w:name="_Toc237715002"/>
+      <w:bookmarkStart w:id="31" w:name="_Toc237715717"/>
       <w:r>
         <w:rPr>
           <w:rFonts w:ascii="Times New Roman" w:eastAsia="Times New Roman" w:hAnsi="Times New Roman"/>
@@ -8614,7 +8421,7 @@
         </w:rPr>
         <w:t>B. Giáo trình và tài liệu học thuật</w:t>
       </w:r>
-      <w:bookmarkEnd w:id="34"/>
+      <w:bookmarkEnd w:id="31"/>
     </w:p>
     <w:p>
       <w:pPr>
@@ -8647,7 +8454,7 @@
       <w:pPr>
         <w:pStyle w:val="u2"/>
       </w:pPr>
-      <w:bookmarkStart w:id="35" w:name="_Toc237715003"/>
+      <w:bookmarkStart w:id="32" w:name="_Toc237715718"/>
       <w:r>
         <w:rPr>
           <w:rFonts w:ascii="Times New Roman" w:eastAsia="Times New Roman" w:hAnsi="Times New Roman"/>
@@ -8655,7 +8462,7 @@
         </w:rPr>
         <w:t>C. Nguồn dữ liệu báo chí chính thức về vụ việc</w:t>
       </w:r>
-      <w:bookmarkEnd w:id="35"/>
+      <w:bookmarkEnd w:id="32"/>
     </w:p>
     <w:p>
       <w:pPr>
@@ -8955,31 +8762,31 @@
       </w:rPr>
     </w:lvl>
   </w:abstractNum>
-  <w:num w:numId="1" w16cid:durableId="601063177">
+  <w:num w:numId="1" w16cid:durableId="1209680748">
     <w:abstractNumId w:val="8"/>
   </w:num>
-  <w:num w:numId="2" w16cid:durableId="1803571236">
+  <w:num w:numId="2" w16cid:durableId="2087992525">
     <w:abstractNumId w:val="6"/>
   </w:num>
-  <w:num w:numId="3" w16cid:durableId="1860198317">
+  <w:num w:numId="3" w16cid:durableId="1605763596">
     <w:abstractNumId w:val="5"/>
   </w:num>
-  <w:num w:numId="4" w16cid:durableId="276761120">
+  <w:num w:numId="4" w16cid:durableId="601232035">
     <w:abstractNumId w:val="4"/>
   </w:num>
-  <w:num w:numId="5" w16cid:durableId="630013153">
+  <w:num w:numId="5" w16cid:durableId="1758401975">
     <w:abstractNumId w:val="7"/>
   </w:num>
-  <w:num w:numId="6" w16cid:durableId="1219049928">
+  <w:num w:numId="6" w16cid:durableId="321661003">
     <w:abstractNumId w:val="3"/>
   </w:num>
-  <w:num w:numId="7" w16cid:durableId="1238440407">
+  <w:num w:numId="7" w16cid:durableId="1525947566">
     <w:abstractNumId w:val="2"/>
   </w:num>
-  <w:num w:numId="8" w16cid:durableId="450563320">
+  <w:num w:numId="8" w16cid:durableId="1976181189">
     <w:abstractNumId w:val="1"/>
   </w:num>
-  <w:num w:numId="9" w16cid:durableId="970404111">
+  <w:num w:numId="9" w16cid:durableId="1405878705">
     <w:abstractNumId w:val="0"/>
   </w:num>
 </w:numbering>
@@ -9423,7 +9230,7 @@
     <w:pPr>
       <w:keepNext/>
       <w:keepLines/>
-      <w:spacing w:before="280" w:line="312" w:lineRule="auto"/>
+      <w:spacing w:before="220" w:after="80" w:line="312" w:lineRule="auto"/>
       <w:ind w:firstLine="0"/>
       <w:jc w:val="left"/>
       <w:outlineLvl w:val="1"/>
@@ -9449,7 +9256,7 @@
     <w:pPr>
       <w:keepNext/>
       <w:keepLines/>
-      <w:spacing w:before="200" w:after="80" w:line="312" w:lineRule="auto"/>
+      <w:spacing w:before="180" w:after="60" w:line="312" w:lineRule="auto"/>
       <w:ind w:firstLine="0"/>
       <w:jc w:val="left"/>
       <w:outlineLvl w:val="2"/>
@@ -9474,7 +9281,7 @@
     <w:pPr>
       <w:keepNext/>
       <w:keepLines/>
-      <w:spacing w:before="160" w:after="60" w:line="312" w:lineRule="auto"/>
+      <w:spacing w:before="140" w:after="40" w:line="312" w:lineRule="auto"/>
       <w:ind w:firstLine="0"/>
       <w:jc w:val="left"/>
       <w:outlineLvl w:val="3"/>
@@ -20382,7 +20189,7 @@
     <w:autoRedefine/>
     <w:uiPriority w:val="39"/>
     <w:unhideWhenUsed/>
-    <w:rsid w:val="00C2242B"/>
+    <w:rsid w:val="003345AE"/>
     <w:pPr>
       <w:spacing w:after="100"/>
     </w:pPr>
@@ -20394,7 +20201,7 @@
     <w:autoRedefine/>
     <w:uiPriority w:val="39"/>
     <w:unhideWhenUsed/>
-    <w:rsid w:val="00C2242B"/>
+    <w:rsid w:val="003345AE"/>
     <w:pPr>
       <w:spacing w:after="100"/>
       <w:ind w:left="260"/>
@@ -20405,7 +20212,7 @@
     <w:basedOn w:val="Phngmcinhcuaoanvn"/>
     <w:uiPriority w:val="99"/>
     <w:unhideWhenUsed/>
-    <w:rsid w:val="00C2242B"/>
+    <w:rsid w:val="003345AE"/>
     <w:rPr>
       <w:color w:val="0000FF" w:themeColor="hyperlink"/>
       <w:u w:val="single"/>

</xml_diff>

<commit_message>
docs: rebuild concise submission package
</commit_message>
<xml_diff>
--- a/report/BaoCao_TieuLuan_PLDC_UIT_FINAL.docx
+++ b/report/BaoCao_TieuLuan_PLDC_UIT_FINAL.docx
@@ -807,7 +807,7 @@
       <w:r>
         <w:fldChar w:fldCharType="separate"/>
       </w:r>
-      <w:hyperlink w:anchor="_Toc237715686" w:history="1">
+      <w:hyperlink w:anchor="_Toc237716076" w:history="1">
         <w:r>
           <w:rPr>
             <w:rStyle w:val="Siuktni"/>
@@ -834,7 +834,7 @@
             <w:noProof/>
             <w:webHidden/>
           </w:rPr>
-          <w:instrText xml:space="preserve"> PAGEREF _Toc237715686 \h </w:instrText>
+          <w:instrText xml:space="preserve"> PAGEREF _Toc237716076 \h </w:instrText>
         </w:r>
         <w:r>
           <w:rPr>
@@ -875,7 +875,7 @@
           <w:noProof/>
         </w:rPr>
       </w:pPr>
-      <w:hyperlink w:anchor="_Toc237715687" w:history="1">
+      <w:hyperlink w:anchor="_Toc237716077" w:history="1">
         <w:r>
           <w:rPr>
             <w:rStyle w:val="Siuktni"/>
@@ -902,7 +902,7 @@
             <w:noProof/>
             <w:webHidden/>
           </w:rPr>
-          <w:instrText xml:space="preserve"> PAGEREF _Toc237715687 \h </w:instrText>
+          <w:instrText xml:space="preserve"> PAGEREF _Toc237716077 \h </w:instrText>
         </w:r>
         <w:r>
           <w:rPr>
@@ -943,7 +943,7 @@
           <w:noProof/>
         </w:rPr>
       </w:pPr>
-      <w:hyperlink w:anchor="_Toc237715688" w:history="1">
+      <w:hyperlink w:anchor="_Toc237716078" w:history="1">
         <w:r>
           <w:rPr>
             <w:rStyle w:val="Siuktni"/>
@@ -970,7 +970,7 @@
             <w:noProof/>
             <w:webHidden/>
           </w:rPr>
-          <w:instrText xml:space="preserve"> PAGEREF _Toc237715688 \h </w:instrText>
+          <w:instrText xml:space="preserve"> PAGEREF _Toc237716078 \h </w:instrText>
         </w:r>
         <w:r>
           <w:rPr>
@@ -1011,7 +1011,7 @@
           <w:noProof/>
         </w:rPr>
       </w:pPr>
-      <w:hyperlink w:anchor="_Toc237715689" w:history="1">
+      <w:hyperlink w:anchor="_Toc237716079" w:history="1">
         <w:r>
           <w:rPr>
             <w:rStyle w:val="Siuktni"/>
@@ -1038,7 +1038,7 @@
             <w:noProof/>
             <w:webHidden/>
           </w:rPr>
-          <w:instrText xml:space="preserve"> PAGEREF _Toc237715689 \h </w:instrText>
+          <w:instrText xml:space="preserve"> PAGEREF _Toc237716079 \h </w:instrText>
         </w:r>
         <w:r>
           <w:rPr>
@@ -1079,7 +1079,7 @@
           <w:noProof/>
         </w:rPr>
       </w:pPr>
-      <w:hyperlink w:anchor="_Toc237715690" w:history="1">
+      <w:hyperlink w:anchor="_Toc237716080" w:history="1">
         <w:r>
           <w:rPr>
             <w:rStyle w:val="Siuktni"/>
@@ -1106,7 +1106,7 @@
             <w:noProof/>
             <w:webHidden/>
           </w:rPr>
-          <w:instrText xml:space="preserve"> PAGEREF _Toc237715690 \h </w:instrText>
+          <w:instrText xml:space="preserve"> PAGEREF _Toc237716080 \h </w:instrText>
         </w:r>
         <w:r>
           <w:rPr>
@@ -1147,7 +1147,7 @@
           <w:noProof/>
         </w:rPr>
       </w:pPr>
-      <w:hyperlink w:anchor="_Toc237715691" w:history="1">
+      <w:hyperlink w:anchor="_Toc237716081" w:history="1">
         <w:r>
           <w:rPr>
             <w:rStyle w:val="Siuktni"/>
@@ -1174,7 +1174,7 @@
             <w:noProof/>
             <w:webHidden/>
           </w:rPr>
-          <w:instrText xml:space="preserve"> PAGEREF _Toc237715691 \h </w:instrText>
+          <w:instrText xml:space="preserve"> PAGEREF _Toc237716081 \h </w:instrText>
         </w:r>
         <w:r>
           <w:rPr>
@@ -1215,7 +1215,7 @@
           <w:noProof/>
         </w:rPr>
       </w:pPr>
-      <w:hyperlink w:anchor="_Toc237715692" w:history="1">
+      <w:hyperlink w:anchor="_Toc237716082" w:history="1">
         <w:r>
           <w:rPr>
             <w:rStyle w:val="Siuktni"/>
@@ -1242,7 +1242,7 @@
             <w:noProof/>
             <w:webHidden/>
           </w:rPr>
-          <w:instrText xml:space="preserve"> PAGEREF _Toc237715692 \h </w:instrText>
+          <w:instrText xml:space="preserve"> PAGEREF _Toc237716082 \h </w:instrText>
         </w:r>
         <w:r>
           <w:rPr>
@@ -1283,13 +1283,13 @@
           <w:noProof/>
         </w:rPr>
       </w:pPr>
-      <w:hyperlink w:anchor="_Toc237715693" w:history="1">
+      <w:hyperlink w:anchor="_Toc237716083" w:history="1">
         <w:r>
           <w:rPr>
             <w:rStyle w:val="Siuktni"/>
             <w:noProof/>
           </w:rPr>
-          <w:t>1.3. Khái niệm và ý nghĩa của cấu thành vi phạm pháp luật</w:t>
+          <w:t>1.3. Khái niệm cấu thành vi phạm pháp luật</w:t>
         </w:r>
         <w:r>
           <w:rPr>
@@ -1310,7 +1310,7 @@
             <w:noProof/>
             <w:webHidden/>
           </w:rPr>
-          <w:instrText xml:space="preserve"> PAGEREF _Toc237715693 \h </w:instrText>
+          <w:instrText xml:space="preserve"> PAGEREF _Toc237716083 \h </w:instrText>
         </w:r>
         <w:r>
           <w:rPr>
@@ -1351,7 +1351,7 @@
           <w:noProof/>
         </w:rPr>
       </w:pPr>
-      <w:hyperlink w:anchor="_Toc237715694" w:history="1">
+      <w:hyperlink w:anchor="_Toc237716084" w:history="1">
         <w:r>
           <w:rPr>
             <w:rStyle w:val="Siuktni"/>
@@ -1378,7 +1378,7 @@
             <w:noProof/>
             <w:webHidden/>
           </w:rPr>
-          <w:instrText xml:space="preserve"> PAGEREF _Toc237715694 \h </w:instrText>
+          <w:instrText xml:space="preserve"> PAGEREF _Toc237716084 \h </w:instrText>
         </w:r>
         <w:r>
           <w:rPr>
@@ -1419,7 +1419,7 @@
           <w:noProof/>
         </w:rPr>
       </w:pPr>
-      <w:hyperlink w:anchor="_Toc237715695" w:history="1">
+      <w:hyperlink w:anchor="_Toc237716085" w:history="1">
         <w:r>
           <w:rPr>
             <w:rStyle w:val="Siuktni"/>
@@ -1446,7 +1446,7 @@
             <w:noProof/>
             <w:webHidden/>
           </w:rPr>
-          <w:instrText xml:space="preserve"> PAGEREF _Toc237715695 \h </w:instrText>
+          <w:instrText xml:space="preserve"> PAGEREF _Toc237716085 \h </w:instrText>
         </w:r>
         <w:r>
           <w:rPr>
@@ -1466,7 +1466,7 @@
             <w:noProof/>
             <w:webHidden/>
           </w:rPr>
-          <w:t>8</w:t>
+          <w:t>7</w:t>
         </w:r>
         <w:r>
           <w:rPr>
@@ -1487,7 +1487,7 @@
           <w:noProof/>
         </w:rPr>
       </w:pPr>
-      <w:hyperlink w:anchor="_Toc237715696" w:history="1">
+      <w:hyperlink w:anchor="_Toc237716086" w:history="1">
         <w:r>
           <w:rPr>
             <w:rStyle w:val="Siuktni"/>
@@ -1514,7 +1514,7 @@
             <w:noProof/>
             <w:webHidden/>
           </w:rPr>
-          <w:instrText xml:space="preserve"> PAGEREF _Toc237715696 \h </w:instrText>
+          <w:instrText xml:space="preserve"> PAGEREF _Toc237716086 \h </w:instrText>
         </w:r>
         <w:r>
           <w:rPr>
@@ -1534,7 +1534,7 @@
             <w:noProof/>
             <w:webHidden/>
           </w:rPr>
-          <w:t>9</w:t>
+          <w:t>8</w:t>
         </w:r>
         <w:r>
           <w:rPr>
@@ -1555,7 +1555,7 @@
           <w:noProof/>
         </w:rPr>
       </w:pPr>
-      <w:hyperlink w:anchor="_Toc237715697" w:history="1">
+      <w:hyperlink w:anchor="_Toc237716087" w:history="1">
         <w:r>
           <w:rPr>
             <w:rStyle w:val="Siuktni"/>
@@ -1582,7 +1582,7 @@
             <w:noProof/>
             <w:webHidden/>
           </w:rPr>
-          <w:instrText xml:space="preserve"> PAGEREF _Toc237715697 \h </w:instrText>
+          <w:instrText xml:space="preserve"> PAGEREF _Toc237716087 \h </w:instrText>
         </w:r>
         <w:r>
           <w:rPr>
@@ -1602,7 +1602,7 @@
             <w:noProof/>
             <w:webHidden/>
           </w:rPr>
-          <w:t>9</w:t>
+          <w:t>8</w:t>
         </w:r>
         <w:r>
           <w:rPr>
@@ -1623,7 +1623,7 @@
           <w:noProof/>
         </w:rPr>
       </w:pPr>
-      <w:hyperlink w:anchor="_Toc237715698" w:history="1">
+      <w:hyperlink w:anchor="_Toc237716088" w:history="1">
         <w:r>
           <w:rPr>
             <w:rStyle w:val="Siuktni"/>
@@ -1650,7 +1650,7 @@
             <w:noProof/>
             <w:webHidden/>
           </w:rPr>
-          <w:instrText xml:space="preserve"> PAGEREF _Toc237715698 \h </w:instrText>
+          <w:instrText xml:space="preserve"> PAGEREF _Toc237716088 \h </w:instrText>
         </w:r>
         <w:r>
           <w:rPr>
@@ -1670,7 +1670,7 @@
             <w:noProof/>
             <w:webHidden/>
           </w:rPr>
-          <w:t>10</w:t>
+          <w:t>9</w:t>
         </w:r>
         <w:r>
           <w:rPr>
@@ -1691,7 +1691,7 @@
           <w:noProof/>
         </w:rPr>
       </w:pPr>
-      <w:hyperlink w:anchor="_Toc237715699" w:history="1">
+      <w:hyperlink w:anchor="_Toc237716089" w:history="1">
         <w:r>
           <w:rPr>
             <w:rStyle w:val="Siuktni"/>
@@ -1718,7 +1718,7 @@
             <w:noProof/>
             <w:webHidden/>
           </w:rPr>
-          <w:instrText xml:space="preserve"> PAGEREF _Toc237715699 \h </w:instrText>
+          <w:instrText xml:space="preserve"> PAGEREF _Toc237716089 \h </w:instrText>
         </w:r>
         <w:r>
           <w:rPr>
@@ -1738,7 +1738,7 @@
             <w:noProof/>
             <w:webHidden/>
           </w:rPr>
-          <w:t>10</w:t>
+          <w:t>9</w:t>
         </w:r>
         <w:r>
           <w:rPr>
@@ -1759,7 +1759,7 @@
           <w:noProof/>
         </w:rPr>
       </w:pPr>
-      <w:hyperlink w:anchor="_Toc237715700" w:history="1">
+      <w:hyperlink w:anchor="_Toc237716090" w:history="1">
         <w:r>
           <w:rPr>
             <w:rStyle w:val="Siuktni"/>
@@ -1786,7 +1786,7 @@
             <w:noProof/>
             <w:webHidden/>
           </w:rPr>
-          <w:instrText xml:space="preserve"> PAGEREF _Toc237715700 \h </w:instrText>
+          <w:instrText xml:space="preserve"> PAGEREF _Toc237716090 \h </w:instrText>
         </w:r>
         <w:r>
           <w:rPr>
@@ -1806,7 +1806,7 @@
             <w:noProof/>
             <w:webHidden/>
           </w:rPr>
-          <w:t>10</w:t>
+          <w:t>9</w:t>
         </w:r>
         <w:r>
           <w:rPr>
@@ -1827,7 +1827,7 @@
           <w:noProof/>
         </w:rPr>
       </w:pPr>
-      <w:hyperlink w:anchor="_Toc237715701" w:history="1">
+      <w:hyperlink w:anchor="_Toc237716091" w:history="1">
         <w:r>
           <w:rPr>
             <w:rStyle w:val="Siuktni"/>
@@ -1854,7 +1854,7 @@
             <w:noProof/>
             <w:webHidden/>
           </w:rPr>
-          <w:instrText xml:space="preserve"> PAGEREF _Toc237715701 \h </w:instrText>
+          <w:instrText xml:space="preserve"> PAGEREF _Toc237716091 \h </w:instrText>
         </w:r>
         <w:r>
           <w:rPr>
@@ -1874,7 +1874,7 @@
             <w:noProof/>
             <w:webHidden/>
           </w:rPr>
-          <w:t>11</w:t>
+          <w:t>9</w:t>
         </w:r>
         <w:r>
           <w:rPr>
@@ -1895,7 +1895,7 @@
           <w:noProof/>
         </w:rPr>
       </w:pPr>
-      <w:hyperlink w:anchor="_Toc237715702" w:history="1">
+      <w:hyperlink w:anchor="_Toc237716092" w:history="1">
         <w:r>
           <w:rPr>
             <w:rStyle w:val="Siuktni"/>
@@ -1922,7 +1922,7 @@
             <w:noProof/>
             <w:webHidden/>
           </w:rPr>
-          <w:instrText xml:space="preserve"> PAGEREF _Toc237715702 \h </w:instrText>
+          <w:instrText xml:space="preserve"> PAGEREF _Toc237716092 \h </w:instrText>
         </w:r>
         <w:r>
           <w:rPr>
@@ -1942,7 +1942,7 @@
             <w:noProof/>
             <w:webHidden/>
           </w:rPr>
-          <w:t>11</w:t>
+          <w:t>10</w:t>
         </w:r>
         <w:r>
           <w:rPr>
@@ -1963,7 +1963,7 @@
           <w:noProof/>
         </w:rPr>
       </w:pPr>
-      <w:hyperlink w:anchor="_Toc237715703" w:history="1">
+      <w:hyperlink w:anchor="_Toc237716093" w:history="1">
         <w:r>
           <w:rPr>
             <w:rStyle w:val="Siuktni"/>
@@ -1990,7 +1990,7 @@
             <w:noProof/>
             <w:webHidden/>
           </w:rPr>
-          <w:instrText xml:space="preserve"> PAGEREF _Toc237715703 \h </w:instrText>
+          <w:instrText xml:space="preserve"> PAGEREF _Toc237716093 \h </w:instrText>
         </w:r>
         <w:r>
           <w:rPr>
@@ -2010,7 +2010,7 @@
             <w:noProof/>
             <w:webHidden/>
           </w:rPr>
-          <w:t>12</w:t>
+          <w:t>10</w:t>
         </w:r>
         <w:r>
           <w:rPr>
@@ -2031,7 +2031,7 @@
           <w:noProof/>
         </w:rPr>
       </w:pPr>
-      <w:hyperlink w:anchor="_Toc237715704" w:history="1">
+      <w:hyperlink w:anchor="_Toc237716094" w:history="1">
         <w:r>
           <w:rPr>
             <w:rStyle w:val="Siuktni"/>
@@ -2058,7 +2058,7 @@
             <w:noProof/>
             <w:webHidden/>
           </w:rPr>
-          <w:instrText xml:space="preserve"> PAGEREF _Toc237715704 \h </w:instrText>
+          <w:instrText xml:space="preserve"> PAGEREF _Toc237716094 \h </w:instrText>
         </w:r>
         <w:r>
           <w:rPr>
@@ -2078,7 +2078,7 @@
             <w:noProof/>
             <w:webHidden/>
           </w:rPr>
-          <w:t>13</w:t>
+          <w:t>12</w:t>
         </w:r>
         <w:r>
           <w:rPr>
@@ -2099,7 +2099,7 @@
           <w:noProof/>
         </w:rPr>
       </w:pPr>
-      <w:hyperlink w:anchor="_Toc237715705" w:history="1">
+      <w:hyperlink w:anchor="_Toc237716095" w:history="1">
         <w:r>
           <w:rPr>
             <w:rStyle w:val="Siuktni"/>
@@ -2126,7 +2126,7 @@
             <w:noProof/>
             <w:webHidden/>
           </w:rPr>
-          <w:instrText xml:space="preserve"> PAGEREF _Toc237715705 \h </w:instrText>
+          <w:instrText xml:space="preserve"> PAGEREF _Toc237716095 \h </w:instrText>
         </w:r>
         <w:r>
           <w:rPr>
@@ -2146,7 +2146,7 @@
             <w:noProof/>
             <w:webHidden/>
           </w:rPr>
-          <w:t>13</w:t>
+          <w:t>12</w:t>
         </w:r>
         <w:r>
           <w:rPr>
@@ -2167,7 +2167,7 @@
           <w:noProof/>
         </w:rPr>
       </w:pPr>
-      <w:hyperlink w:anchor="_Toc237715706" w:history="1">
+      <w:hyperlink w:anchor="_Toc237716096" w:history="1">
         <w:r>
           <w:rPr>
             <w:rStyle w:val="Siuktni"/>
@@ -2194,7 +2194,7 @@
             <w:noProof/>
             <w:webHidden/>
           </w:rPr>
-          <w:instrText xml:space="preserve"> PAGEREF _Toc237715706 \h </w:instrText>
+          <w:instrText xml:space="preserve"> PAGEREF _Toc237716096 \h </w:instrText>
         </w:r>
         <w:r>
           <w:rPr>
@@ -2214,7 +2214,7 @@
             <w:noProof/>
             <w:webHidden/>
           </w:rPr>
-          <w:t>15</w:t>
+          <w:t>13</w:t>
         </w:r>
         <w:r>
           <w:rPr>
@@ -2235,7 +2235,7 @@
           <w:noProof/>
         </w:rPr>
       </w:pPr>
-      <w:hyperlink w:anchor="_Toc237715707" w:history="1">
+      <w:hyperlink w:anchor="_Toc237716097" w:history="1">
         <w:r>
           <w:rPr>
             <w:rStyle w:val="Siuktni"/>
@@ -2262,7 +2262,7 @@
             <w:noProof/>
             <w:webHidden/>
           </w:rPr>
-          <w:instrText xml:space="preserve"> PAGEREF _Toc237715707 \h </w:instrText>
+          <w:instrText xml:space="preserve"> PAGEREF _Toc237716097 \h </w:instrText>
         </w:r>
         <w:r>
           <w:rPr>
@@ -2282,7 +2282,7 @@
             <w:noProof/>
             <w:webHidden/>
           </w:rPr>
-          <w:t>16</w:t>
+          <w:t>14</w:t>
         </w:r>
         <w:r>
           <w:rPr>
@@ -2303,7 +2303,7 @@
           <w:noProof/>
         </w:rPr>
       </w:pPr>
-      <w:hyperlink w:anchor="_Toc237715708" w:history="1">
+      <w:hyperlink w:anchor="_Toc237716098" w:history="1">
         <w:r>
           <w:rPr>
             <w:rStyle w:val="Siuktni"/>
@@ -2330,7 +2330,7 @@
             <w:noProof/>
             <w:webHidden/>
           </w:rPr>
-          <w:instrText xml:space="preserve"> PAGEREF _Toc237715708 \h </w:instrText>
+          <w:instrText xml:space="preserve"> PAGEREF _Toc237716098 \h </w:instrText>
         </w:r>
         <w:r>
           <w:rPr>
@@ -2350,7 +2350,7 @@
             <w:noProof/>
             <w:webHidden/>
           </w:rPr>
-          <w:t>18</w:t>
+          <w:t>15</w:t>
         </w:r>
         <w:r>
           <w:rPr>
@@ -2371,13 +2371,13 @@
           <w:noProof/>
         </w:rPr>
       </w:pPr>
-      <w:hyperlink w:anchor="_Toc237715709" w:history="1">
+      <w:hyperlink w:anchor="_Toc237716099" w:history="1">
         <w:r>
           <w:rPr>
             <w:rStyle w:val="Siuktni"/>
             <w:noProof/>
           </w:rPr>
-          <w:t>3.5. Bảng tổng hợp bốn yếu tố cấu thành vi phạm pháp luật</w:t>
+          <w:t>3.5. Tổng hợp bốn yếu tố cấu thành vi phạm pháp luật</w:t>
         </w:r>
         <w:r>
           <w:rPr>
@@ -2398,7 +2398,7 @@
             <w:noProof/>
             <w:webHidden/>
           </w:rPr>
-          <w:instrText xml:space="preserve"> PAGEREF _Toc237715709 \h </w:instrText>
+          <w:instrText xml:space="preserve"> PAGEREF _Toc237716099 \h </w:instrText>
         </w:r>
         <w:r>
           <w:rPr>
@@ -2418,7 +2418,7 @@
             <w:noProof/>
             <w:webHidden/>
           </w:rPr>
-          <w:t>19</w:t>
+          <w:t>15</w:t>
         </w:r>
         <w:r>
           <w:rPr>
@@ -2439,7 +2439,7 @@
           <w:noProof/>
         </w:rPr>
       </w:pPr>
-      <w:hyperlink w:anchor="_Toc237715710" w:history="1">
+      <w:hyperlink w:anchor="_Toc237716100" w:history="1">
         <w:r>
           <w:rPr>
             <w:rStyle w:val="Siuktni"/>
@@ -2466,7 +2466,7 @@
             <w:noProof/>
             <w:webHidden/>
           </w:rPr>
-          <w:instrText xml:space="preserve"> PAGEREF _Toc237715710 \h </w:instrText>
+          <w:instrText xml:space="preserve"> PAGEREF _Toc237716100 \h </w:instrText>
         </w:r>
         <w:r>
           <w:rPr>
@@ -2486,7 +2486,7 @@
             <w:noProof/>
             <w:webHidden/>
           </w:rPr>
-          <w:t>20</w:t>
+          <w:t>17</w:t>
         </w:r>
         <w:r>
           <w:rPr>
@@ -2507,13 +2507,13 @@
           <w:noProof/>
         </w:rPr>
       </w:pPr>
-      <w:hyperlink w:anchor="_Toc237715711" w:history="1">
+      <w:hyperlink w:anchor="_Toc237716101" w:history="1">
         <w:r>
           <w:rPr>
             <w:rStyle w:val="Siuktni"/>
             <w:noProof/>
           </w:rPr>
-          <w:t>4.1. Ý nghĩa phòng ngừa từ vụ việc</w:t>
+          <w:t>4.1. Một số nhận xét từ vụ việc</w:t>
         </w:r>
         <w:r>
           <w:rPr>
@@ -2534,7 +2534,7 @@
             <w:noProof/>
             <w:webHidden/>
           </w:rPr>
-          <w:instrText xml:space="preserve"> PAGEREF _Toc237715711 \h </w:instrText>
+          <w:instrText xml:space="preserve"> PAGEREF _Toc237716101 \h </w:instrText>
         </w:r>
         <w:r>
           <w:rPr>
@@ -2554,7 +2554,7 @@
             <w:noProof/>
             <w:webHidden/>
           </w:rPr>
-          <w:t>20</w:t>
+          <w:t>17</w:t>
         </w:r>
         <w:r>
           <w:rPr>
@@ -2575,13 +2575,13 @@
           <w:noProof/>
         </w:rPr>
       </w:pPr>
-      <w:hyperlink w:anchor="_Toc237715712" w:history="1">
+      <w:hyperlink w:anchor="_Toc237716102" w:history="1">
         <w:r>
           <w:rPr>
             <w:rStyle w:val="Siuktni"/>
             <w:noProof/>
           </w:rPr>
-          <w:t>4.2. Bài học đối với hoạt động kinh doanh trực tuyến và người tiêu dùng</w:t>
+          <w:t>4.2. Bài học rút ra</w:t>
         </w:r>
         <w:r>
           <w:rPr>
@@ -2602,7 +2602,7 @@
             <w:noProof/>
             <w:webHidden/>
           </w:rPr>
-          <w:instrText xml:space="preserve"> PAGEREF _Toc237715712 \h </w:instrText>
+          <w:instrText xml:space="preserve"> PAGEREF _Toc237716102 \h </w:instrText>
         </w:r>
         <w:r>
           <w:rPr>
@@ -2622,7 +2622,143 @@
             <w:noProof/>
             <w:webHidden/>
           </w:rPr>
-          <w:t>20</w:t>
+          <w:t>17</w:t>
+        </w:r>
+        <w:r>
+          <w:rPr>
+            <w:noProof/>
+            <w:webHidden/>
+          </w:rPr>
+          <w:fldChar w:fldCharType="end"/>
+        </w:r>
+      </w:hyperlink>
+    </w:p>
+    <w:p>
+      <w:pPr>
+        <w:pStyle w:val="Mucluc1"/>
+        <w:tabs>
+          <w:tab w:val="right" w:leader="dot" w:pos="8948"/>
+        </w:tabs>
+        <w:rPr>
+          <w:noProof/>
+        </w:rPr>
+      </w:pPr>
+      <w:hyperlink w:anchor="_Toc237716103" w:history="1">
+        <w:r>
+          <w:rPr>
+            <w:rStyle w:val="Siuktni"/>
+            <w:noProof/>
+          </w:rPr>
+          <w:t>KẾT LUẬN</w:t>
+        </w:r>
+        <w:r>
+          <w:rPr>
+            <w:noProof/>
+            <w:webHidden/>
+          </w:rPr>
+          <w:tab/>
+        </w:r>
+        <w:r>
+          <w:rPr>
+            <w:noProof/>
+            <w:webHidden/>
+          </w:rPr>
+          <w:fldChar w:fldCharType="begin"/>
+        </w:r>
+        <w:r>
+          <w:rPr>
+            <w:noProof/>
+            <w:webHidden/>
+          </w:rPr>
+          <w:instrText xml:space="preserve"> PAGEREF _Toc237716103 \h </w:instrText>
+        </w:r>
+        <w:r>
+          <w:rPr>
+            <w:noProof/>
+            <w:webHidden/>
+          </w:rPr>
+        </w:r>
+        <w:r>
+          <w:rPr>
+            <w:noProof/>
+            <w:webHidden/>
+          </w:rPr>
+          <w:fldChar w:fldCharType="separate"/>
+        </w:r>
+        <w:r>
+          <w:rPr>
+            <w:noProof/>
+            <w:webHidden/>
+          </w:rPr>
+          <w:t>18</w:t>
+        </w:r>
+        <w:r>
+          <w:rPr>
+            <w:noProof/>
+            <w:webHidden/>
+          </w:rPr>
+          <w:fldChar w:fldCharType="end"/>
+        </w:r>
+      </w:hyperlink>
+    </w:p>
+    <w:p>
+      <w:pPr>
+        <w:pStyle w:val="Mucluc1"/>
+        <w:tabs>
+          <w:tab w:val="right" w:leader="dot" w:pos="8948"/>
+        </w:tabs>
+        <w:rPr>
+          <w:noProof/>
+        </w:rPr>
+      </w:pPr>
+      <w:hyperlink w:anchor="_Toc237716104" w:history="1">
+        <w:r>
+          <w:rPr>
+            <w:rStyle w:val="Siuktni"/>
+            <w:noProof/>
+          </w:rPr>
+          <w:t>TÀI LIỆU THAM KHẢO</w:t>
+        </w:r>
+        <w:r>
+          <w:rPr>
+            <w:noProof/>
+            <w:webHidden/>
+          </w:rPr>
+          <w:tab/>
+        </w:r>
+        <w:r>
+          <w:rPr>
+            <w:noProof/>
+            <w:webHidden/>
+          </w:rPr>
+          <w:fldChar w:fldCharType="begin"/>
+        </w:r>
+        <w:r>
+          <w:rPr>
+            <w:noProof/>
+            <w:webHidden/>
+          </w:rPr>
+          <w:instrText xml:space="preserve"> PAGEREF _Toc237716104 \h </w:instrText>
+        </w:r>
+        <w:r>
+          <w:rPr>
+            <w:noProof/>
+            <w:webHidden/>
+          </w:rPr>
+        </w:r>
+        <w:r>
+          <w:rPr>
+            <w:noProof/>
+            <w:webHidden/>
+          </w:rPr>
+          <w:fldChar w:fldCharType="separate"/>
+        </w:r>
+        <w:r>
+          <w:rPr>
+            <w:noProof/>
+            <w:webHidden/>
+          </w:rPr>
+          <w:t>19</w:t>
         </w:r>
         <w:r>
           <w:rPr>
@@ -2643,13 +2779,13 @@
           <w:noProof/>
         </w:rPr>
       </w:pPr>
-      <w:hyperlink w:anchor="_Toc237715713" w:history="1">
+      <w:hyperlink w:anchor="_Toc237716105" w:history="1">
         <w:r>
           <w:rPr>
             <w:rStyle w:val="Siuktni"/>
             <w:noProof/>
           </w:rPr>
-          <w:t>4.3. Bài học về nhận thức pháp luật và đạo đức số cho sinh viên CNTT</w:t>
+          <w:t>A. Văn bản quy phạm pháp luật</w:t>
         </w:r>
         <w:r>
           <w:rPr>
@@ -2670,7 +2806,7 @@
             <w:noProof/>
             <w:webHidden/>
           </w:rPr>
-          <w:instrText xml:space="preserve"> PAGEREF _Toc237715713 \h </w:instrText>
+          <w:instrText xml:space="preserve"> PAGEREF _Toc237716105 \h </w:instrText>
         </w:r>
         <w:r>
           <w:rPr>
@@ -2690,143 +2826,7 @@
             <w:noProof/>
             <w:webHidden/>
           </w:rPr>
-          <w:t>20</w:t>
-        </w:r>
-        <w:r>
-          <w:rPr>
-            <w:noProof/>
-            <w:webHidden/>
-          </w:rPr>
-          <w:fldChar w:fldCharType="end"/>
-        </w:r>
-      </w:hyperlink>
-    </w:p>
-    <w:p>
-      <w:pPr>
-        <w:pStyle w:val="Mucluc1"/>
-        <w:tabs>
-          <w:tab w:val="right" w:leader="dot" w:pos="8948"/>
-        </w:tabs>
-        <w:rPr>
-          <w:noProof/>
-        </w:rPr>
-      </w:pPr>
-      <w:hyperlink w:anchor="_Toc237715714" w:history="1">
-        <w:r>
-          <w:rPr>
-            <w:rStyle w:val="Siuktni"/>
-            <w:noProof/>
-          </w:rPr>
-          <w:t>KẾT LUẬN</w:t>
-        </w:r>
-        <w:r>
-          <w:rPr>
-            <w:noProof/>
-            <w:webHidden/>
-          </w:rPr>
-          <w:tab/>
-        </w:r>
-        <w:r>
-          <w:rPr>
-            <w:noProof/>
-            <w:webHidden/>
-          </w:rPr>
-          <w:fldChar w:fldCharType="begin"/>
-        </w:r>
-        <w:r>
-          <w:rPr>
-            <w:noProof/>
-            <w:webHidden/>
-          </w:rPr>
-          <w:instrText xml:space="preserve"> PAGEREF _Toc237715714 \h </w:instrText>
-        </w:r>
-        <w:r>
-          <w:rPr>
-            <w:noProof/>
-            <w:webHidden/>
-          </w:rPr>
-        </w:r>
-        <w:r>
-          <w:rPr>
-            <w:noProof/>
-            <w:webHidden/>
-          </w:rPr>
-          <w:fldChar w:fldCharType="separate"/>
-        </w:r>
-        <w:r>
-          <w:rPr>
-            <w:noProof/>
-            <w:webHidden/>
-          </w:rPr>
-          <w:t>22</w:t>
-        </w:r>
-        <w:r>
-          <w:rPr>
-            <w:noProof/>
-            <w:webHidden/>
-          </w:rPr>
-          <w:fldChar w:fldCharType="end"/>
-        </w:r>
-      </w:hyperlink>
-    </w:p>
-    <w:p>
-      <w:pPr>
-        <w:pStyle w:val="Mucluc1"/>
-        <w:tabs>
-          <w:tab w:val="right" w:leader="dot" w:pos="8948"/>
-        </w:tabs>
-        <w:rPr>
-          <w:noProof/>
-        </w:rPr>
-      </w:pPr>
-      <w:hyperlink w:anchor="_Toc237715715" w:history="1">
-        <w:r>
-          <w:rPr>
-            <w:rStyle w:val="Siuktni"/>
-            <w:noProof/>
-          </w:rPr>
-          <w:t>TÀI LIỆU THAM KHẢO</w:t>
-        </w:r>
-        <w:r>
-          <w:rPr>
-            <w:noProof/>
-            <w:webHidden/>
-          </w:rPr>
-          <w:tab/>
-        </w:r>
-        <w:r>
-          <w:rPr>
-            <w:noProof/>
-            <w:webHidden/>
-          </w:rPr>
-          <w:fldChar w:fldCharType="begin"/>
-        </w:r>
-        <w:r>
-          <w:rPr>
-            <w:noProof/>
-            <w:webHidden/>
-          </w:rPr>
-          <w:instrText xml:space="preserve"> PAGEREF _Toc237715715 \h </w:instrText>
-        </w:r>
-        <w:r>
-          <w:rPr>
-            <w:noProof/>
-            <w:webHidden/>
-          </w:rPr>
-        </w:r>
-        <w:r>
-          <w:rPr>
-            <w:noProof/>
-            <w:webHidden/>
-          </w:rPr>
-          <w:fldChar w:fldCharType="separate"/>
-        </w:r>
-        <w:r>
-          <w:rPr>
-            <w:noProof/>
-            <w:webHidden/>
-          </w:rPr>
-          <w:t>23</w:t>
+          <w:t>19</w:t>
         </w:r>
         <w:r>
           <w:rPr>
@@ -2847,13 +2847,13 @@
           <w:noProof/>
         </w:rPr>
       </w:pPr>
-      <w:hyperlink w:anchor="_Toc237715716" w:history="1">
+      <w:hyperlink w:anchor="_Toc237716106" w:history="1">
         <w:r>
           <w:rPr>
             <w:rStyle w:val="Siuktni"/>
             <w:noProof/>
           </w:rPr>
-          <w:t>A. Văn bản quy phạm pháp luật</w:t>
+          <w:t>B. Giáo trình và tài liệu học thuật</w:t>
         </w:r>
         <w:r>
           <w:rPr>
@@ -2874,7 +2874,7 @@
             <w:noProof/>
             <w:webHidden/>
           </w:rPr>
-          <w:instrText xml:space="preserve"> PAGEREF _Toc237715716 \h </w:instrText>
+          <w:instrText xml:space="preserve"> PAGEREF _Toc237716106 \h </w:instrText>
         </w:r>
         <w:r>
           <w:rPr>
@@ -2894,7 +2894,7 @@
             <w:noProof/>
             <w:webHidden/>
           </w:rPr>
-          <w:t>23</w:t>
+          <w:t>19</w:t>
         </w:r>
         <w:r>
           <w:rPr>
@@ -2915,13 +2915,13 @@
           <w:noProof/>
         </w:rPr>
       </w:pPr>
-      <w:hyperlink w:anchor="_Toc237715717" w:history="1">
+      <w:hyperlink w:anchor="_Toc237716107" w:history="1">
         <w:r>
           <w:rPr>
             <w:rStyle w:val="Siuktni"/>
             <w:noProof/>
           </w:rPr>
-          <w:t>B. Giáo trình và tài liệu học thuật</w:t>
+          <w:t>C. Nguồn dữ liệu báo chí chính thức về vụ việc</w:t>
         </w:r>
         <w:r>
           <w:rPr>
@@ -2942,7 +2942,7 @@
             <w:noProof/>
             <w:webHidden/>
           </w:rPr>
-          <w:instrText xml:space="preserve"> PAGEREF _Toc237715717 \h </w:instrText>
+          <w:instrText xml:space="preserve"> PAGEREF _Toc237716107 \h </w:instrText>
         </w:r>
         <w:r>
           <w:rPr>
@@ -2962,7 +2962,7 @@
             <w:noProof/>
             <w:webHidden/>
           </w:rPr>
-          <w:t>23</w:t>
+          <w:t>19</w:t>
         </w:r>
         <w:r>
           <w:rPr>
@@ -2975,91 +2975,23 @@
     </w:p>
     <w:p>
       <w:pPr>
-        <w:pStyle w:val="Mucluc2"/>
-        <w:tabs>
-          <w:tab w:val="right" w:leader="dot" w:pos="8948"/>
-        </w:tabs>
-        <w:rPr>
-          <w:noProof/>
-        </w:rPr>
-      </w:pPr>
-      <w:hyperlink w:anchor="_Toc237715718" w:history="1">
-        <w:r>
-          <w:rPr>
-            <w:rStyle w:val="Siuktni"/>
-            <w:noProof/>
-          </w:rPr>
-          <w:t>C. Nguồn dữ liệu báo chí chính thức về vụ việc</w:t>
-        </w:r>
-        <w:r>
-          <w:rPr>
-            <w:noProof/>
-            <w:webHidden/>
-          </w:rPr>
-          <w:tab/>
-        </w:r>
-        <w:r>
-          <w:rPr>
-            <w:noProof/>
-            <w:webHidden/>
-          </w:rPr>
-          <w:fldChar w:fldCharType="begin"/>
-        </w:r>
-        <w:r>
-          <w:rPr>
-            <w:noProof/>
-            <w:webHidden/>
-          </w:rPr>
-          <w:instrText xml:space="preserve"> PAGEREF _Toc237715718 \h </w:instrText>
-        </w:r>
-        <w:r>
-          <w:rPr>
-            <w:noProof/>
-            <w:webHidden/>
-          </w:rPr>
-        </w:r>
-        <w:r>
-          <w:rPr>
-            <w:noProof/>
-            <w:webHidden/>
-          </w:rPr>
-          <w:fldChar w:fldCharType="separate"/>
-        </w:r>
-        <w:r>
-          <w:rPr>
-            <w:noProof/>
-            <w:webHidden/>
-          </w:rPr>
-          <w:t>23</w:t>
-        </w:r>
-        <w:r>
-          <w:rPr>
-            <w:noProof/>
-            <w:webHidden/>
-          </w:rPr>
-          <w:fldChar w:fldCharType="end"/>
-        </w:r>
-      </w:hyperlink>
+        <w:spacing w:after="240" w:line="312" w:lineRule="auto"/>
+        <w:ind w:firstLine="0"/>
+      </w:pPr>
+      <w:r>
+        <w:fldChar w:fldCharType="end"/>
+      </w:r>
     </w:p>
     <w:p>
-      <w:pPr>
-        <w:spacing w:after="240" w:line="312" w:lineRule="auto"/>
-        <w:ind w:firstLine="0"/>
-      </w:pPr>
-      <w:r>
-        <w:fldChar w:fldCharType="end"/>
+      <w:r>
+        <w:br w:type="page"/>
       </w:r>
     </w:p>
     <w:p>
-      <w:r>
-        <w:br w:type="page"/>
-      </w:r>
-    </w:p>
-    <w:p>
       <w:pPr>
         <w:pStyle w:val="u1"/>
       </w:pPr>
-      <w:bookmarkStart w:id="0" w:name="_Toc237715686"/>
+      <w:bookmarkStart w:id="0" w:name="_Toc237716076"/>
       <w:r>
         <w:rPr>
           <w:rFonts w:ascii="Times New Roman" w:eastAsia="Times New Roman" w:hAnsi="Times New Roman"/>
@@ -3074,7 +3006,7 @@
       <w:pPr>
         <w:pStyle w:val="u2"/>
       </w:pPr>
-      <w:bookmarkStart w:id="1" w:name="_Toc237715687"/>
+      <w:bookmarkStart w:id="1" w:name="_Toc237716077"/>
       <w:r>
         <w:rPr>
           <w:rFonts w:ascii="Times New Roman" w:eastAsia="Times New Roman" w:hAnsi="Times New Roman"/>
@@ -3099,7 +3031,7 @@
       <w:pPr>
         <w:pStyle w:val="u2"/>
       </w:pPr>
-      <w:bookmarkStart w:id="2" w:name="_Toc237715688"/>
+      <w:bookmarkStart w:id="2" w:name="_Toc237716078"/>
       <w:r>
         <w:rPr>
           <w:rFonts w:ascii="Times New Roman" w:eastAsia="Times New Roman" w:hAnsi="Times New Roman"/>
@@ -3143,7 +3075,7 @@
       <w:pPr>
         <w:pStyle w:val="u2"/>
       </w:pPr>
-      <w:bookmarkStart w:id="3" w:name="_Toc237715689"/>
+      <w:bookmarkStart w:id="3" w:name="_Toc237716079"/>
       <w:r>
         <w:rPr>
           <w:rFonts w:ascii="Times New Roman" w:eastAsia="Times New Roman" w:hAnsi="Times New Roman"/>
@@ -3197,7 +3129,7 @@
       <w:pPr>
         <w:pStyle w:val="u1"/>
       </w:pPr>
-      <w:bookmarkStart w:id="4" w:name="_Toc237715690"/>
+      <w:bookmarkStart w:id="4" w:name="_Toc237716080"/>
       <w:r>
         <w:rPr>
           <w:rFonts w:ascii="Times New Roman" w:eastAsia="Times New Roman" w:hAnsi="Times New Roman"/>
@@ -3212,7 +3144,7 @@
       <w:pPr>
         <w:pStyle w:val="u2"/>
       </w:pPr>
-      <w:bookmarkStart w:id="5" w:name="_Toc237715691"/>
+      <w:bookmarkStart w:id="5" w:name="_Toc237716081"/>
       <w:r>
         <w:rPr>
           <w:rFonts w:ascii="Times New Roman" w:eastAsia="Times New Roman" w:hAnsi="Times New Roman"/>
@@ -3227,7 +3159,7 @@
         <w:spacing w:after="80"/>
       </w:pPr>
       <w:r>
-        <w:t>Trong đời sống xã hội, pháp luật giữ vai trò là quy tắc xử sự chung có tính bắt buộc nhằm duy trì trật tự kỷ cương và bảo vệ lợi ích công cộng. Khi một chủ thể thực hiện hành vi trái với các quy tắc do Nhà nước xác lập, gây nguy hại hoặc đe dọa gây nguy hại cho xã hội thì hành vi đó bị coi là vi phạm pháp luật.</w:t>
+        <w:t>Trong đời sống xã hội, pháp luật giữ vai trò là quy tắc xử sự chung nhằm duy trì trật tự và bảo vệ lợi ích công cộng. Khi một chủ thể thực hiện hành vi trái với quy tắc do Nhà nước xác lập, gây nguy hại cho xã hội thì hành vi đó bị coi là vi phạm pháp luật.</w:t>
       </w:r>
     </w:p>
     <w:p>
@@ -3235,7 +3167,7 @@
         <w:spacing w:after="80"/>
       </w:pPr>
       <w:r>
-        <w:t xml:space="preserve">Theo tài liệu học phần Pháp luật đại cương của Trường Đại học Công nghệ Thông tin – ĐHQG-HCM, </w:t>
+        <w:t xml:space="preserve">Theo tài liệu học phần Pháp luật đại cương tại UIT, </w:t>
       </w:r>
       <w:r>
         <w:rPr>
@@ -3244,22 +3176,14 @@
         <w:t>vi phạm pháp luật</w:t>
       </w:r>
       <w:r>
-        <w:t xml:space="preserve"> là hành vi (hành động hoặc không hành động) trái pháp luật, có lỗi, do chủ thể có năng lực trách nhiệm pháp lý thực hiện, xâm hại đến các quan hệ xã hội được pháp luật bảo vệ [5].</w:t>
+        <w:t xml:space="preserve"> là hành vi (hành động hoặc không hành động) trái pháp luật, có lỗi, do chủ thể có năng lực trách nhiệm pháp lý thực hiện, xâm hại đến các quan hệ xã hội được pháp luật bảo vệ [5]. Đây là căn cứ để xác định trách nhiệm pháp lý của chủ thể.</w:t>
       </w:r>
     </w:p>
     <w:p>
       <w:pPr>
-        <w:spacing w:after="80"/>
-      </w:pPr>
-      <w:r>
-        <w:t>Vi phạm pháp luật là hiện tượng xã hội – pháp lý tiêu cực, phản ánh sự mâu thuẫn giữa ý chí, hành vi của chủ thể cụ thể với ý chí của Nhà nước được thể hiện trong các quy phạm pháp luật, và là căn cứ duy nhất để truy cứu trách nhiệm pháp lý.</w:t>
-      </w:r>
-    </w:p>
-    <w:p>
-      <w:pPr>
         <w:pStyle w:val="u2"/>
       </w:pPr>
-      <w:bookmarkStart w:id="6" w:name="_Toc237715692"/>
+      <w:bookmarkStart w:id="6" w:name="_Toc237716082"/>
       <w:r>
         <w:rPr>
           <w:rFonts w:ascii="Times New Roman" w:eastAsia="Times New Roman" w:hAnsi="Times New Roman"/>
@@ -3274,7 +3198,7 @@
         <w:spacing w:after="80"/>
       </w:pPr>
       <w:r>
-        <w:t>Để nhận diện một hiện tượng thực tế có cấu thành vi phạm pháp luật hay không, khoa học pháp lý xác định bốn dấu hiệu đặc trưng bắt buộc phải hội tụ đồng thời [5]:</w:t>
+        <w:t>Một hành vi cấu thành vi phạm pháp luật khi hội tụ đầy đủ bốn dấu hiệu sau [5]:</w:t>
       </w:r>
     </w:p>
     <w:p>
@@ -3291,13 +3215,8 @@
         </w:rPr>
         <w:t>Là hành vi xác định của con người:</w:t>
       </w:r>
-    </w:p>
-    <w:p>
-      <w:pPr>
-        <w:spacing w:after="80"/>
-      </w:pPr>
-      <w:r>
-        <w:t xml:space="preserve">   Pháp luật chỉ điều chỉnh hành vi thực tế bộc lộ ra thế giới khách quan dưới dạng </w:t>
+      <w:r>
+        <w:t xml:space="preserve"> Thể hiện ra bên ngoài dưới dạng </w:t>
       </w:r>
       <w:r>
         <w:rPr>
@@ -3315,7 +3234,7 @@
         <w:t>không hành động</w:t>
       </w:r>
       <w:r>
-        <w:t xml:space="preserve"> (không thực hiện nghĩa vụ bắt buộc dù có đủ điều kiện). Ý nghĩ, tư tưởng hay cảm xúc nội tâm chưa biểu hiện thành hành vi thực tế thì không bị coi là vi phạm pháp luật.</w:t>
+        <w:t xml:space="preserve"> (không làm điều pháp luật bắt buộc). Suy nghĩ hay ý định trong đầu chưa bộc lộ thành hành vi thì pháp luật không điều chỉnh.</w:t>
       </w:r>
     </w:p>
     <w:p>
@@ -3332,13 +3251,8 @@
         </w:rPr>
         <w:t>Có tính chất trái pháp luật:</w:t>
       </w:r>
-    </w:p>
-    <w:p>
-      <w:pPr>
-        <w:spacing w:after="80"/>
-      </w:pPr>
-      <w:r>
-        <w:t xml:space="preserve">   Hành vi không phù hợp với các quy tắc xử sự do Nhà nước ban hành, thể hiện qua việc làm trái điều cấm, vượt quá quyền hạn cho phép hoặc không thực hiện nghĩa vụ pháp lý, qua đó xâm hại hoặc đe dọa xâm hại đến các quan hệ xã hội được bảo vệ.</w:t>
+      <w:r>
+        <w:t xml:space="preserve"> Hành vi vi phạm các quy tắc xử sự do Nhà nước ban hành, như làm trái điều cấm, vượt quá quyền hạn hoặc không thực hiện nghĩa vụ pháp lý, xâm hại đến các quan hệ xã hội được bảo vệ.</w:t>
       </w:r>
     </w:p>
     <w:p>
@@ -3355,14 +3269,8 @@
         </w:rPr>
         <w:t>Có lỗi của chủ thể:</w:t>
       </w:r>
-    </w:p>
-    <w:p>
-      <w:pPr>
-        <w:spacing w:after="80"/>
-      </w:pPr>
-      <w:r>
-        <w:lastRenderedPageBreak/>
-        <w:t xml:space="preserve">   Lỗi là trạng thái tâm lý chủ quan phản ánh thái độ tiêu cực của chủ thể đối với hành vi trái pháp luật và hậu quả của hành vi đó tại thời điểm thực hiện. Chủ thể có điều kiện và khả năng lựa chọn xử sự hợp pháp nhưng đã lựa chọn xử sự trái pháp luật. Hành vi gây thiệt hại do sự kiện bất khả kháng hoặc phòng vệ chính đáng không có lỗi thì không cấu thành vi phạm pháp luật.</w:t>
+      <w:r>
+        <w:t xml:space="preserve"> Thể hiện thái độ tâm lý chủ quan của chủ thể đối với hành vi và hậu quả nguy hại. Chủ thể có đủ điều kiện lựa chọn xử sự hợp pháp nhưng vẫn lựa chọn thực hiện hành vi trái luật. Trường hợp bất khả kháng hoặc phòng vệ chính đáng không có lỗi thì không cấu thành vi phạm pháp luật.</w:t>
       </w:r>
     </w:p>
     <w:p>
@@ -3379,26 +3287,22 @@
         </w:rPr>
         <w:t>Do chủ thể có năng lực trách nhiệm pháp lý thực hiện:</w:t>
       </w:r>
+      <w:r>
+        <w:t xml:space="preserve"> Chủ thể phải đạt độ tuổi luật định và có khả năng nhận thức, điều khiển hành vi của mình.</w:t>
+      </w:r>
     </w:p>
     <w:p>
       <w:pPr>
-        <w:spacing w:after="80"/>
-      </w:pPr>
-      <w:r>
-        <w:t xml:space="preserve">   Chủ thể thực hiện hành vi phải đạt độ tuổi luật định và có trạng thái tâm thần bình thường, đủ khả năng nhận thức tính chất nguy hiểm cho xã hội của hành vi và có khả năng điều khiển hành vi của mình.</w:t>
-      </w:r>
-    </w:p>
-    <w:p>
-      <w:pPr>
         <w:pStyle w:val="u2"/>
       </w:pPr>
-      <w:bookmarkStart w:id="7" w:name="_Toc237715693"/>
+      <w:bookmarkStart w:id="7" w:name="_Toc237716083"/>
       <w:r>
         <w:rPr>
           <w:rFonts w:ascii="Times New Roman" w:eastAsia="Times New Roman" w:hAnsi="Times New Roman"/>
           <w:b w:val="0"/>
         </w:rPr>
-        <w:t>1.3. Khái niệm và ý nghĩa của cấu thành vi phạm pháp luật</w:t>
+        <w:lastRenderedPageBreak/>
+        <w:t>1.3. Khái niệm cấu thành vi phạm pháp luật</w:t>
       </w:r>
       <w:bookmarkEnd w:id="7"/>
     </w:p>
@@ -3413,7 +3317,7 @@
         <w:t>Cấu thành vi phạm pháp luật</w:t>
       </w:r>
       <w:r>
-        <w:t xml:space="preserve"> là tổng thể các yếu tố, điều kiện khách quan và chủ quan được pháp luật quy định, đặc trưng cho một vi phạm pháp luật cụ thể [5].</w:t>
+        <w:t xml:space="preserve"> là tổng thể các yếu tố khách quan và chủ quan do pháp luật quy định, đặc trưng cho một vi phạm pháp luật cụ thể [5].</w:t>
       </w:r>
     </w:p>
     <w:p>
@@ -3421,7 +3325,7 @@
         <w:spacing w:after="80"/>
       </w:pPr>
       <w:r>
-        <w:t>Mô hình cấu thành vi phạm pháp luật gồm bốn yếu tố có mối quan hệ biện chứng, hữu cơ với nhau:</w:t>
+        <w:t>Cấu thành vi phạm pháp luật gồm bốn yếu tố cơ bản:</w:t>
       </w:r>
     </w:p>
     <w:p>
@@ -3558,7 +3462,7 @@
               <w:rPr>
                 <w:sz w:val="19"/>
               </w:rPr>
-              <w:t>Quan hệ xã hội được pháp luật xác lập và bảo vệ bị xâm hại</w:t>
+              <w:t>Quan hệ xã hội được pháp luật bảo vệ bị xâm hại</w:t>
             </w:r>
           </w:p>
         </w:tc>
@@ -3577,7 +3481,7 @@
               <w:rPr>
                 <w:sz w:val="19"/>
               </w:rPr>
-              <w:t>Hành vi trái pháp luật; hậu quả nguy hiểm; quan hệ nhân quả; các yếu tố khách quan khác</w:t>
+              <w:t>Hành vi trái pháp luật; hậu quả nguy hại; quan hệ nhân quả; thời gian, địa điểm, phương tiện</w:t>
             </w:r>
           </w:p>
         </w:tc>
@@ -3615,7 +3519,7 @@
               <w:rPr>
                 <w:sz w:val="19"/>
               </w:rPr>
-              <w:t>Lỗi (cố ý/vô ý), động cơ và mục đích của chủ thể</w:t>
+              <w:t>Lỗi (cố ý hoặc vô ý), động cơ và mục đích</w:t>
             </w:r>
           </w:p>
         </w:tc>
@@ -3626,44 +3530,14 @@
         <w:spacing w:after="80"/>
       </w:pPr>
       <w:r>
-        <w:t>Việc nghiên cứu và áp dụng mô hình cấu thành có ý nghĩa nền tảng:</w:t>
+        <w:t>Việc xem xét bốn yếu tố cấu thành giúp làm rõ bản chất pháp lý của hành vi, phân biệt vi phạm pháp luật với các hành vi hợp pháp hoặc vi phạm chuẩn mực đạo đức, làm căn cứ áp dụng chế tài phù hợp.</w:t>
       </w:r>
     </w:p>
     <w:p>
       <w:pPr>
-        <w:pStyle w:val="Duudong"/>
-        <w:spacing w:after="60"/>
-        <w:ind w:left="709" w:firstLine="0"/>
-      </w:pPr>
-      <w:r>
-        <w:t>Là công cụ khoa học duy nhất để xem xét, đánh giá đầy đủ bản chất pháp lý của một hành vi thực tế.</w:t>
-      </w:r>
-    </w:p>
-    <w:p>
-      <w:pPr>
-        <w:pStyle w:val="Duudong"/>
-        <w:spacing w:after="60"/>
-        <w:ind w:left="709" w:firstLine="0"/>
-      </w:pPr>
-      <w:r>
-        <w:t>Phân biệt hành vi vi phạm pháp luật với các vi phạm chuẩn mực đạo đức, tập quán hoặc hành vi hợp pháp.</w:t>
-      </w:r>
-    </w:p>
-    <w:p>
-      <w:pPr>
-        <w:pStyle w:val="Duudong"/>
-        <w:spacing w:after="60"/>
-        <w:ind w:left="709" w:firstLine="0"/>
-      </w:pPr>
-      <w:r>
-        <w:t>Là căn cứ định danh vi phạm và áp dụng đúng đắn, công bằng chế tài trách nhiệm pháp lý tương ứng (hình sự, hành chính, dân sự, kỷ luật).</w:t>
-      </w:r>
-    </w:p>
-    <w:p>
-      <w:pPr>
         <w:pStyle w:val="u2"/>
       </w:pPr>
-      <w:bookmarkStart w:id="8" w:name="_Toc237715694"/>
+      <w:bookmarkStart w:id="8" w:name="_Toc237716084"/>
       <w:r>
         <w:rPr>
           <w:rFonts w:ascii="Times New Roman" w:eastAsia="Times New Roman" w:hAnsi="Times New Roman"/>
@@ -3678,7 +3552,7 @@
         <w:spacing w:after="80"/>
       </w:pPr>
       <w:r>
-        <w:t>Khách thể của vi phạm pháp luật là những quan hệ xã hội được pháp luật xác lập và bảo vệ nhưng bị hành vi vi phạm pháp luật xâm hại, làm thay đổi hoặc đe dọa làm biến đổi trạng thái an toàn, bình thường của các quan hệ đó [5].</w:t>
+        <w:t>Khách thể của vi phạm pháp luật là những quan hệ xã hội được pháp luật bảo vệ nhưng bị hành vi vi phạm xâm hại hoặc đe dọa xâm hại [5].</w:t>
       </w:r>
     </w:p>
     <w:p>
@@ -3686,7 +3560,7 @@
         <w:spacing w:after="80"/>
       </w:pPr>
       <w:r>
-        <w:t>Trong khoa học pháp lý, cần phân biệt rõ ba khái niệm:</w:t>
+        <w:t>Trong phân tích pháp lý, cần phân biệt ba khái niệm:</w:t>
       </w:r>
     </w:p>
     <w:p>
@@ -3699,11 +3573,10 @@
         <w:rPr>
           <w:b/>
         </w:rPr>
-        <w:lastRenderedPageBreak/>
         <w:t>Khách thể:</w:t>
       </w:r>
       <w:r>
-        <w:t xml:space="preserve"> Là quan hệ xã hội được pháp luật bảo vệ (như trật tự quản lý kinh tế, trật tự quản lý quảng cáo, quyền tài sản, quyền được bảo vệ an toàn tính mạng, sức khỏe và quyền được thông tin trung thực của người tiêu dùng).</w:t>
+        <w:t xml:space="preserve"> Là quan hệ xã hội được bảo vệ (trật tự quản lý quảng cáo, quyền thông tin trung thực của người tiêu dùng, quyền nhân thân về hình ảnh).</w:t>
       </w:r>
     </w:p>
     <w:p>
@@ -3719,7 +3592,7 @@
         <w:t>Đối tượng tác động:</w:t>
       </w:r>
       <w:r>
-        <w:t xml:space="preserve"> Là những thực thể vật chất, thông tin hoặc tài sản cụ thể mà thông qua việc tác động vào đó, chủ thể xâm hại đến khách thể (ví dụ: sản phẩm hàng hóa, bao bì nhãn mác, bài viết/video quảng cáo, dòng tiền thanh toán).</w:t>
+        <w:t xml:space="preserve"> Là thực thể vật chất, tài sản hoặc thông tin mà hành vi tác động vào để xâm hại khách thể (sản phẩm, hình ảnh, bài viết quảng cáo, tiền thanh toán).</w:t>
       </w:r>
     </w:p>
     <w:p>
@@ -3732,17 +3605,17 @@
         <w:rPr>
           <w:b/>
         </w:rPr>
-        <w:t>Chủ thể của quan hệ bị xâm hại (Người bị ảnh hưởng / Người bị thiệt hại):</w:t>
-      </w:r>
-      <w:r>
-        <w:t xml:space="preserve"> Là các cá nhân, tổ chức tham gia vào quan hệ xã hội bị xâm hại và chịu tổn hại trực tiếp hoặc gián tiếp từ hành vi vi phạm.</w:t>
+        <w:t>Người bị ảnh hưởng / Người bị thiệt hại:</w:t>
+      </w:r>
+      <w:r>
+        <w:t xml:space="preserve"> Là cá nhân, tổ chức tham gia quan hệ xã hội bị xâm hại và chịu tổn hại từ hành vi vi phạm.</w:t>
       </w:r>
     </w:p>
     <w:p>
       <w:pPr>
         <w:pStyle w:val="u2"/>
       </w:pPr>
-      <w:bookmarkStart w:id="9" w:name="_Toc237715695"/>
+      <w:bookmarkStart w:id="9" w:name="_Toc237716085"/>
       <w:r>
         <w:rPr>
           <w:rFonts w:ascii="Times New Roman" w:eastAsia="Times New Roman" w:hAnsi="Times New Roman"/>
@@ -3757,7 +3630,7 @@
         <w:spacing w:after="80"/>
       </w:pPr>
       <w:r>
-        <w:t>Mặt khách quan của vi phạm pháp luật là toàn bộ những biểu hiện bên ngoài của vi phạm pháp luật diễn ra trong thế giới khách quan, có thể nhận biết và kiểm chứng được [5]. Trong cấu thành mặt khách quan:</w:t>
+        <w:t>Mặt khách quan là những biểu hiện bên ngoài của vi phạm pháp luật, có thể nhận biết và kiểm chứng được [5], bao gồm:</w:t>
       </w:r>
     </w:p>
     <w:p>
@@ -3775,7 +3648,7 @@
         <w:t>Hành vi trái pháp luật:</w:t>
       </w:r>
       <w:r>
-        <w:t xml:space="preserve"> Là yếu tố trung tâm và bắt buộc trong mọi vi phạm pháp luật, thể hiện dưới dạng hành động (làm điều pháp luật cấm) hoặc không hành động (không làm điều pháp luật bắt buộc phải làm dù có đủ điều kiện thực hiện).</w:t>
+        <w:t xml:space="preserve"> Là yếu tố bắt buộc, thể hiện dưới dạng hành động hoặc không hành động trái với quy định pháp luật.</w:t>
       </w:r>
     </w:p>
     <w:p>
@@ -3784,16 +3657,17 @@
         <w:ind w:left="709" w:firstLine="0"/>
       </w:pPr>
       <w:r>
+        <w:lastRenderedPageBreak/>
         <w:t xml:space="preserve">2. </w:t>
       </w:r>
       <w:r>
         <w:rPr>
           <w:b/>
         </w:rPr>
-        <w:t>Hậu quả nguy hiểm cho xã hội:</w:t>
-      </w:r>
-      <w:r>
-        <w:t xml:space="preserve"> Là những tổn hại thực tế hoặc nguy cơ đe dọa gây tổn hại cho các quan hệ xã hội được pháp luật bảo vệ. Tùy thuộc vào loại vi phạm và quy định của từng ngành luật, hậu quả có thể là thiệt hại vật chất, thể chất, tinh thần, trật tự quản lý xã hội hoặc nguy cơ đe dọa gây thiệt hại mà không nhất thiết phải luôn là thiệt hại vật chất đã được định lượng [5].</w:t>
+        <w:t>Hậu quả nguy hại cho xã hội:</w:t>
+      </w:r>
+      <w:r>
+        <w:t xml:space="preserve"> Là thiệt hại thực tế hoặc nguy cơ đe dọa gây thiệt hại cho các quan hệ xã hội được bảo vệ. Hậu quả có thể là thiệt hại vật chất, tổn hại quyền lợi hoặc xáo trộn trật tự quản lý [5].</w:t>
       </w:r>
     </w:p>
     <w:p>
@@ -3811,7 +3685,7 @@
         <w:t>Mối quan hệ nhân quả:</w:t>
       </w:r>
       <w:r>
-        <w:t xml:space="preserve"> Được xem xét khi cần quy kết một hậu quả pháp lý xác định cho hành vi vi phạm. Hành vi trái pháp luật phải xảy ra trước hậu quả về mặt thời gian và giữ vai trò là nguyên nhân có mối liên hệ nội tại tất yếu dẫn tới hậu quả nguy hại đó.</w:t>
+        <w:t xml:space="preserve"> Xem xét khi quy kết hậu quả cho hành vi vi phạm. Hành vi trái pháp luật phải xảy ra trước và có mối liên hệ tất yếu dẫn đến hậu quả nguy hại.</w:t>
       </w:r>
     </w:p>
     <w:p>
@@ -3826,23 +3700,22 @@
         <w:rPr>
           <w:b/>
         </w:rPr>
-        <w:t>Các yếu tố khách quan khác:</w:t>
-      </w:r>
-      <w:r>
-        <w:t xml:space="preserve"> Bao gồm thời gian, địa điểm, công cụ, phương tiện và phương thức thực hiện hành vi, phản ánh mức độ tinh vi, quy mô và tính chất nguy hiểm của vi phạm.</w:t>
+        <w:t>Các yếu tố khác:</w:t>
+      </w:r>
+      <w:r>
+        <w:t xml:space="preserve"> Thời gian, địa điểm, công cụ, phương tiện và phương thức thực hiện hành vi.</w:t>
       </w:r>
     </w:p>
     <w:p>
       <w:pPr>
         <w:pStyle w:val="u2"/>
       </w:pPr>
-      <w:bookmarkStart w:id="10" w:name="_Toc237715696"/>
+      <w:bookmarkStart w:id="10" w:name="_Toc237716086"/>
       <w:r>
         <w:rPr>
           <w:rFonts w:ascii="Times New Roman" w:eastAsia="Times New Roman" w:hAnsi="Times New Roman"/>
           <w:b w:val="0"/>
         </w:rPr>
-        <w:lastRenderedPageBreak/>
         <w:t>1.6. Chủ thể của vi phạm pháp luật</w:t>
       </w:r>
       <w:bookmarkEnd w:id="10"/>
@@ -3852,7 +3725,7 @@
         <w:spacing w:after="80"/>
       </w:pPr>
       <w:r>
-        <w:t>Chủ thể của vi phạm pháp luật là cá nhân hoặc tổ chức có năng lực trách nhiệm pháp lý đã thực hiện hành vi vi phạm pháp luật [5].</w:t>
+        <w:t>Chủ thể của vi phạm pháp luật là cá nhân hoặc tổ chức có năng lực trách nhiệm pháp lý đã thực hiện hành vi vi phạm [5].</w:t>
       </w:r>
     </w:p>
     <w:p>
@@ -3865,10 +3738,10 @@
         <w:rPr>
           <w:b/>
         </w:rPr>
-        <w:t>Đối với cá nhân:</w:t>
-      </w:r>
-      <w:r>
-        <w:t xml:space="preserve"> Cần thỏa mãn hai điều kiện: đạt độ tuổi luật định và có khả năng nhận thức, điều khiển hành vi.</w:t>
+        <w:t>Cá nhân:</w:t>
+      </w:r>
+      <w:r>
+        <w:t xml:space="preserve"> Phải đạt độ tuổi luật định và có năng lực nhận thức, điều khiển hành vi.</w:t>
       </w:r>
     </w:p>
     <w:p>
@@ -3881,10 +3754,10 @@
         <w:rPr>
           <w:b/>
         </w:rPr>
-        <w:t>Đối với tổ chức / pháp nhân:</w:t>
-      </w:r>
-      <w:r>
-        <w:t xml:space="preserve"> Chịu trách nhiệm pháp lý theo các quy định riêng của pháp luật khi hành vi vi phạm được thực hiện nhân danh tổ chức.</w:t>
+        <w:t>Tổ chức:</w:t>
+      </w:r>
+      <w:r>
+        <w:t xml:space="preserve"> Chịu trách nhiệm pháp lý theo quy định khi hành vi được thực hiện nhân danh tổ chức.</w:t>
       </w:r>
     </w:p>
     <w:p>
@@ -3892,14 +3765,14 @@
         <w:spacing w:after="80"/>
       </w:pPr>
       <w:r>
-        <w:t>Trong các vụ việc có nhiều người cùng tham gia, việc phân hóa vai trò cụ thể giữa người tổ chức, người thực hành và người giúp sức là cơ sở để xác định chính xác mức độ trách nhiệm của từng cá nhân.</w:t>
+        <w:t>Trong các vụ việc có nhiều người tham gia, việc làm rõ vai trò giữa người tổ chức, người trực tiếp thực hiện và người hỗ trợ là cơ sở để xác định mức độ trách nhiệm của từng cá nhân.</w:t>
       </w:r>
     </w:p>
     <w:p>
       <w:pPr>
         <w:pStyle w:val="u2"/>
       </w:pPr>
-      <w:bookmarkStart w:id="11" w:name="_Toc237715697"/>
+      <w:bookmarkStart w:id="11" w:name="_Toc237716087"/>
       <w:r>
         <w:rPr>
           <w:rFonts w:ascii="Times New Roman" w:eastAsia="Times New Roman" w:hAnsi="Times New Roman"/>
@@ -3914,17 +3787,15 @@
         <w:spacing w:after="80"/>
       </w:pPr>
       <w:r>
-        <w:t>Mặt chủ quan của vi phạm pháp luật là trạng thái tâm lý bên trong của chủ thể gắn liền với hành vi trái pháp luật và hậu quả do hành vi đó gây ra, bao gồm lỗi, động cơ và mục đích [5]:</w:t>
+        <w:t>Mặt chủ quan là trạng thái tâm lý bên trong của chủ thể đối với hành vi và hậu quả của hành vi [5], gồm:</w:t>
       </w:r>
     </w:p>
     <w:p>
       <w:pPr>
+        <w:pStyle w:val="Duudong"/>
         <w:spacing w:after="60"/>
         <w:ind w:left="709" w:firstLine="0"/>
       </w:pPr>
-      <w:r>
-        <w:t xml:space="preserve">1. </w:t>
-      </w:r>
       <w:r>
         <w:rPr>
           <w:b/>
@@ -3932,7 +3803,25 @@
         <w:t>Lỗi:</w:t>
       </w:r>
       <w:r>
-        <w:t xml:space="preserve"> Thái độ tâm lý của chủ thể đối với hành vi và hậu quả do hành vi gây ra:</w:t>
+        <w:t xml:space="preserve"> Thái độ tâm lý của chủ thể, gồm </w:t>
+      </w:r>
+      <w:r>
+        <w:rPr>
+          <w:i/>
+        </w:rPr>
+        <w:t>lỗi cố ý</w:t>
+      </w:r>
+      <w:r>
+        <w:t xml:space="preserve"> (cố ý trực tiếp hoặc cố ý gián tiếp) và </w:t>
+      </w:r>
+      <w:r>
+        <w:rPr>
+          <w:i/>
+        </w:rPr>
+        <w:t>lỗi vô ý</w:t>
+      </w:r>
+      <w:r>
+        <w:t xml:space="preserve"> (vô ý vì quá tự tin hoặc vô ý do cẩu thả).</w:t>
       </w:r>
     </w:p>
     <w:p>
@@ -3941,40 +3830,6 @@
         <w:spacing w:after="60"/>
         <w:ind w:left="709" w:firstLine="0"/>
       </w:pPr>
-      <w:r>
-        <w:rPr>
-          <w:i/>
-        </w:rPr>
-        <w:t>Lỗi cố ý:</w:t>
-      </w:r>
-      <w:r>
-        <w:t xml:space="preserve"> Cố ý trực tiếp (nhận thức rõ hành vi là trái luật, thấy trước hậu quả và mong muốn hậu quả xảy ra) hoặc cố ý gián tiếp (thấy trước hậu quả, tuy không mong muốn nhưng có ý thức để mặc cho hậu quả xảy ra).</w:t>
-      </w:r>
-    </w:p>
-    <w:p>
-      <w:pPr>
-        <w:pStyle w:val="Duudong"/>
-        <w:spacing w:after="60"/>
-        <w:ind w:left="709" w:firstLine="0"/>
-      </w:pPr>
-      <w:r>
-        <w:rPr>
-          <w:i/>
-        </w:rPr>
-        <w:t>Lỗi vô ý:</w:t>
-      </w:r>
-      <w:r>
-        <w:t xml:space="preserve"> Vô ý do quá tự tin hoặc vô ý do cẩu thả.</w:t>
-      </w:r>
-    </w:p>
-    <w:p>
-      <w:pPr>
-        <w:spacing w:after="60"/>
-        <w:ind w:left="709" w:firstLine="0"/>
-      </w:pPr>
-      <w:r>
-        <w:t xml:space="preserve">2. </w:t>
-      </w:r>
       <w:r>
         <w:rPr>
           <w:b/>
@@ -3982,17 +3837,15 @@
         <w:t>Động cơ:</w:t>
       </w:r>
       <w:r>
-        <w:t xml:space="preserve"> Động lực tâm lý bên trong thúc đẩy chủ thể thực hiện hành vi (như động cơ vụ lợi kinh tế, tư lợi cá nhân).</w:t>
+        <w:t xml:space="preserve"> Động lực tâm lý bên trong thúc đẩy chủ thể thực hiện hành vi vi phạm (như động cơ vụ lợi).</w:t>
       </w:r>
     </w:p>
     <w:p>
       <w:pPr>
+        <w:pStyle w:val="Duudong"/>
         <w:spacing w:after="60"/>
         <w:ind w:left="709" w:firstLine="0"/>
       </w:pPr>
-      <w:r>
-        <w:t xml:space="preserve">3. </w:t>
-      </w:r>
       <w:r>
         <w:rPr>
           <w:b/>
@@ -4000,14 +3853,14 @@
         <w:t>Mục đích:</w:t>
       </w:r>
       <w:r>
-        <w:t xml:space="preserve"> Kết quả cuối cùng trong ý thức mà chủ thể mong muốn đạt được khi thực hiện hành vi (như mục đích thu tiền, thu lợi bất chính).</w:t>
+        <w:t xml:space="preserve"> Kết quả cuối cùng trong ý thức mà chủ thể mong muốn đạt được khi thực hiện hành vi.</w:t>
       </w:r>
     </w:p>
     <w:p>
       <w:pPr>
         <w:pStyle w:val="u1"/>
       </w:pPr>
-      <w:bookmarkStart w:id="12" w:name="_Toc237715698"/>
+      <w:bookmarkStart w:id="12" w:name="_Toc237716088"/>
       <w:r>
         <w:rPr>
           <w:rFonts w:ascii="Times New Roman" w:eastAsia="Times New Roman" w:hAnsi="Times New Roman"/>
@@ -4022,7 +3875,7 @@
       <w:pPr>
         <w:pStyle w:val="u2"/>
       </w:pPr>
-      <w:bookmarkStart w:id="13" w:name="_Toc237715699"/>
+      <w:bookmarkStart w:id="13" w:name="_Toc237716089"/>
       <w:r>
         <w:rPr>
           <w:rFonts w:ascii="Times New Roman" w:eastAsia="Times New Roman" w:hAnsi="Times New Roman"/>
@@ -4037,7 +3890,7 @@
         <w:spacing w:after="80"/>
       </w:pPr>
       <w:r>
-        <w:t>Trong những năm gần đây, sự bùng nổ của thương mại điện tử trên các nền tảng mạng xã hội đã tạo điều kiện thuận lợi cho hoạt động giao thương. Tuy nhiên, môi trường này cũng bị một số đối tượng lợi dụng để thực hiện các hành vi gian dối thương mại, quảng cáo không đúng sự thật nhằm trục lợi. Đặc biệt trong lĩnh vực sản phẩm y dược cổ truyền, thảo dược chăm sóc sức khỏe, sự thiếu hụt thông tin của người tiêu dùng dễ bị khai thác bởi các nội dung quảng cáo phóng đại.</w:t>
+        <w:t>Ngày 10/8/2026, Báo Điện tử Chính phủ đăng thông tin từ Công an tỉnh Phú Thọ về việc triệt phá đường dây sản xuất, kinh doanh và quảng cáo sản phẩm Đông y “Xương khớp bà Sáu” trên mạng xã hội [6].</w:t>
       </w:r>
     </w:p>
     <w:p>
@@ -4045,7 +3898,7 @@
         <w:spacing w:after="80"/>
       </w:pPr>
       <w:r>
-        <w:t xml:space="preserve">Báo Điện tử Chính phủ đăng bài lúc 14:47 ngày 10/8/2026, dẫn thông tin chính thức từ Công an tỉnh Phú Thọ về việc triệt phá đường dây sản xuất, kinh doanh và quảng cáo sản phẩm Đông y “Xương khớp bà Sáu” trên mạng xã hội [6]. Cần phân biệt rõ ngày công bố thông tin báo chí với thời điểm ban hành quyết định tố tụng: theo bài báo này, Cơ quan Cảnh sát điều tra Công an tỉnh Phú Thọ đã ra quyết định khởi tố vụ án hình sự và khởi tố Nguyễn Tiến Đạt cùng 20 bị can vào ngày </w:t>
+        <w:t xml:space="preserve">Theo nguồn tin trên, trước đó vào ngày </w:t>
       </w:r>
       <w:r>
         <w:rPr>
@@ -4054,7 +3907,7 @@
         <w:t>07/8/2026</w:t>
       </w:r>
       <w:r>
-        <w:t xml:space="preserve"> về tội </w:t>
+        <w:t xml:space="preserve">, Cơ quan Cảnh sát điều tra Công an tỉnh Phú Thọ đã ra quyết định khởi tố vụ án hình sự và khởi tố Nguyễn Tiến Đạt cùng 20 bị can về tội </w:t>
       </w:r>
       <w:r>
         <w:rPr>
@@ -4070,7 +3923,7 @@
       <w:pPr>
         <w:pStyle w:val="u2"/>
       </w:pPr>
-      <w:bookmarkStart w:id="14" w:name="_Toc237715700"/>
+      <w:bookmarkStart w:id="14" w:name="_Toc237716090"/>
       <w:r>
         <w:rPr>
           <w:rFonts w:ascii="Times New Roman" w:eastAsia="Times New Roman" w:hAnsi="Times New Roman"/>
@@ -4085,7 +3938,7 @@
         <w:spacing w:after="80"/>
       </w:pPr>
       <w:r>
-        <w:t>Theo tài liệu điều tra ban đầu được cơ quan công an công bố trên Báo Điện tử Chính phủ, chuỗi hoạt động của đường dây thể hiện qua các khâu chính sau [6]:</w:t>
+        <w:t>Theo tài liệu điều tra ban đầu được công bố trên Báo Điện tử Chính phủ [6], hoạt động của nhóm đối tượng diễn ra qua các khâu chính:</w:t>
       </w:r>
     </w:p>
     <w:p>
@@ -4100,15 +3953,10 @@
         <w:rPr>
           <w:b/>
         </w:rPr>
-        <w:t>Nguồn gốc hàng hóa và chênh lệch giá:</w:t>
-      </w:r>
-    </w:p>
-    <w:p>
-      <w:pPr>
-        <w:spacing w:after="80"/>
-      </w:pPr>
-      <w:r>
-        <w:t xml:space="preserve">   Nguyễn Tiến Đạt thỏa thuận thu mua sản phẩm Đông y mang tên “Xương khớp bà Sáu” từ Phùng Thị Nguyệt Ánh (Giám đốc Công ty TNHH Dược liệu Nguyệt Ánh) với mức giá gốc khoảng </w:t>
+        <w:t>Nguồn hàng:</w:t>
+      </w:r>
+      <w:r>
+        <w:t xml:space="preserve"> Nguyễn Tiến Đạt thỏa thuận thu mua sản phẩm Đông y “Xương khớp bà Sáu” từ Phùng Thị Nguyệt Ánh (Giám đốc Công ty TNHH Dược liệu Nguyệt Ánh) với giá gốc khoảng </w:t>
       </w:r>
       <w:r>
         <w:rPr>
@@ -4132,15 +3980,10 @@
         <w:rPr>
           <w:b/>
         </w:rPr>
-        <w:t>Tổ chức tiếp thị qua mạng xã hội với nội dung sai lệch:</w:t>
-      </w:r>
-    </w:p>
-    <w:p>
-      <w:pPr>
-        <w:spacing w:after="80"/>
-      </w:pPr>
-      <w:r>
-        <w:t xml:space="preserve">   Đạt chỉ đạo xây dựng bài viết, hình ảnh và video có hình người nổi tiếng đã được chỉnh sửa, cắt ghép; đồng thời đưa ra nội dung phóng đại, sai lệch về công dụng, chất lượng sản phẩm nhằm tạo niềm tin và thúc đẩy người tiếp cận đặt mua hàng [6]. Nguồn tin xác định phương tiện tiếp thị là mạng xã hội nói chung.</w:t>
+        <w:t>Tiếp thị trên mạng xã hội:</w:t>
+      </w:r>
+      <w:r>
+        <w:t xml:space="preserve"> Đạt chỉ đạo dựng bài viết, hình ảnh và video có hình người nổi tiếng đã qua chỉnh sửa, cắt ghép; đồng thời đưa nội dung phóng đại, sai lệch về công dụng sản phẩm nhằm tạo niềm tin cho người xem [6].</w:t>
       </w:r>
     </w:p>
     <w:p>
@@ -4155,16 +3998,10 @@
         <w:rPr>
           <w:b/>
         </w:rPr>
-        <w:t>Phân phối và kết quả giao dịch:</w:t>
-      </w:r>
-    </w:p>
-    <w:p>
-      <w:pPr>
-        <w:spacing w:after="80"/>
-      </w:pPr>
-      <w:r>
-        <w:lastRenderedPageBreak/>
-        <w:t xml:space="preserve">   Sản phẩm được bán ra với mức giá </w:t>
+        <w:t>Bán hàng và phân phối:</w:t>
+      </w:r>
+      <w:r>
+        <w:t xml:space="preserve"> Sản phẩm được bán ra với giá </w:t>
       </w:r>
       <w:r>
         <w:rPr>
@@ -4173,7 +4010,7 @@
         <w:t>199.000 đồng/sản phẩm</w:t>
       </w:r>
       <w:r>
-        <w:t xml:space="preserve"> (chênh lệch gần 9 lần so với giá mua). Đạt chuyển đơn hàng cho Ánh thực hiện đóng gói và gửi cho khách hàng. Trong giai đoạn từ tháng 5 đến tháng 7/2026, đường dây đã thực hiện thành công </w:t>
+        <w:t xml:space="preserve">. Đạt chuyển thông tin đơn hàng để bên Ánh đóng gói và gửi cho người mua. Từ tháng 5 đến tháng 7/2026, nhóm đã thực hiện thành công </w:t>
       </w:r>
       <w:r>
         <w:rPr>
@@ -4196,359 +4033,9 @@
     </w:p>
     <w:p>
       <w:pPr>
-        <w:keepNext/>
-        <w:spacing w:before="200" w:after="60"/>
-        <w:ind w:firstLine="0"/>
-      </w:pPr>
-      <w:r>
-        <w:rPr>
-          <w:b/>
-          <w:sz w:val="22"/>
-        </w:rPr>
-        <w:t>Bảng 2. Chuỗi hoạt động theo thông tin điều tra ban đầu</w:t>
-      </w:r>
-    </w:p>
-    <w:tbl>
-      <w:tblPr>
-        <w:tblStyle w:val="LiBang"/>
-        <w:tblW w:w="0" w:type="auto"/>
-        <w:jc w:val="center"/>
-        <w:tblLook w:val="04A0" w:firstRow="1" w:lastRow="0" w:firstColumn="1" w:lastColumn="0" w:noHBand="0" w:noVBand="1"/>
-      </w:tblPr>
-      <w:tblGrid>
-        <w:gridCol w:w="2154"/>
-        <w:gridCol w:w="4082"/>
-        <w:gridCol w:w="2721"/>
-      </w:tblGrid>
-      <w:tr>
-        <w:trPr>
-          <w:cantSplit/>
-          <w:tblHeader/>
-          <w:jc w:val="center"/>
-        </w:trPr>
-        <w:tc>
-          <w:tcPr>
-            <w:tcW w:w="2154" w:type="dxa"/>
-            <w:vAlign w:val="center"/>
-          </w:tcPr>
-          <w:p>
-            <w:pPr>
-              <w:spacing w:before="40" w:after="40" w:line="276" w:lineRule="auto"/>
-              <w:ind w:firstLine="0"/>
-              <w:jc w:val="center"/>
-            </w:pPr>
-            <w:r>
-              <w:rPr>
-                <w:b/>
-                <w:sz w:val="19"/>
-              </w:rPr>
-              <w:t>Khâu hoạt động</w:t>
-            </w:r>
-          </w:p>
-        </w:tc>
-        <w:tc>
-          <w:tcPr>
-            <w:tcW w:w="4082" w:type="dxa"/>
-            <w:vAlign w:val="center"/>
-          </w:tcPr>
-          <w:p>
-            <w:pPr>
-              <w:spacing w:before="40" w:after="40" w:line="276" w:lineRule="auto"/>
-              <w:ind w:firstLine="0"/>
-              <w:jc w:val="center"/>
-            </w:pPr>
-            <w:r>
-              <w:rPr>
-                <w:b/>
-                <w:sz w:val="19"/>
-              </w:rPr>
-              <w:t>Dữ kiện xác minh từ nguồn công khai [6]</w:t>
-            </w:r>
-          </w:p>
-        </w:tc>
-        <w:tc>
-          <w:tcPr>
-            <w:tcW w:w="2721" w:type="dxa"/>
-            <w:vAlign w:val="center"/>
-          </w:tcPr>
-          <w:p>
-            <w:pPr>
-              <w:spacing w:before="40" w:after="40" w:line="276" w:lineRule="auto"/>
-              <w:ind w:firstLine="0"/>
-              <w:jc w:val="center"/>
-            </w:pPr>
-            <w:r>
-              <w:rPr>
-                <w:b/>
-                <w:sz w:val="19"/>
-              </w:rPr>
-              <w:t>Giới hạn học thuật</w:t>
-            </w:r>
-          </w:p>
-        </w:tc>
-      </w:tr>
-      <w:tr>
-        <w:trPr>
-          <w:cantSplit/>
-          <w:jc w:val="center"/>
-        </w:trPr>
-        <w:tc>
-          <w:tcPr>
-            <w:tcW w:w="2154" w:type="dxa"/>
-            <w:vAlign w:val="center"/>
-          </w:tcPr>
-          <w:p>
-            <w:pPr>
-              <w:spacing w:before="40" w:after="40" w:line="276" w:lineRule="auto"/>
-              <w:ind w:firstLine="0"/>
-              <w:jc w:val="left"/>
-            </w:pPr>
-            <w:r>
-              <w:rPr>
-                <w:b/>
-                <w:sz w:val="19"/>
-              </w:rPr>
-              <w:t>Nguồn cung hàng hóa</w:t>
-            </w:r>
-          </w:p>
-        </w:tc>
-        <w:tc>
-          <w:tcPr>
-            <w:tcW w:w="4082" w:type="dxa"/>
-            <w:vAlign w:val="center"/>
-          </w:tcPr>
-          <w:p>
-            <w:pPr>
-              <w:spacing w:before="40" w:after="40" w:line="276" w:lineRule="auto"/>
-              <w:ind w:firstLine="0"/>
-              <w:jc w:val="left"/>
-            </w:pPr>
-            <w:r>
-              <w:rPr>
-                <w:sz w:val="19"/>
-              </w:rPr>
-              <w:t>Ánh cung cấp sản phẩm Đông y với giá 23.000 đồng/sản phẩm</w:t>
-            </w:r>
-          </w:p>
-        </w:tc>
-        <w:tc>
-          <w:tcPr>
-            <w:tcW w:w="2721" w:type="dxa"/>
-            <w:vAlign w:val="center"/>
-          </w:tcPr>
-          <w:p>
-            <w:pPr>
-              <w:spacing w:before="40" w:after="40" w:line="276" w:lineRule="auto"/>
-              <w:ind w:firstLine="0"/>
-              <w:jc w:val="left"/>
-            </w:pPr>
-            <w:r>
-              <w:rPr>
-                <w:sz w:val="19"/>
-              </w:rPr>
-              <w:t>Mức độ liên quan pháp lý của Ánh đang được làm rõ</w:t>
-            </w:r>
-          </w:p>
-        </w:tc>
-      </w:tr>
-      <w:tr>
-        <w:trPr>
-          <w:cantSplit/>
-          <w:jc w:val="center"/>
-        </w:trPr>
-        <w:tc>
-          <w:tcPr>
-            <w:tcW w:w="2154" w:type="dxa"/>
-            <w:vAlign w:val="center"/>
-          </w:tcPr>
-          <w:p>
-            <w:pPr>
-              <w:spacing w:before="40" w:after="40" w:line="276" w:lineRule="auto"/>
-              <w:ind w:firstLine="0"/>
-              <w:jc w:val="left"/>
-            </w:pPr>
-            <w:r>
-              <w:rPr>
-                <w:b/>
-                <w:sz w:val="19"/>
-              </w:rPr>
-              <w:t>Tổ chức tiếp thị</w:t>
-            </w:r>
-          </w:p>
-        </w:tc>
-        <w:tc>
-          <w:tcPr>
-            <w:tcW w:w="4082" w:type="dxa"/>
-            <w:vAlign w:val="center"/>
-          </w:tcPr>
-          <w:p>
-            <w:pPr>
-              <w:spacing w:before="40" w:after="40" w:line="276" w:lineRule="auto"/>
-              <w:ind w:firstLine="0"/>
-              <w:jc w:val="left"/>
-            </w:pPr>
-            <w:r>
-              <w:rPr>
-                <w:sz w:val="19"/>
-              </w:rPr>
-              <w:t>Đạt chỉ đạo dùng bài viết, video cắt ghép người nổi tiếng, phóng đại công dụng</w:t>
-            </w:r>
-          </w:p>
-        </w:tc>
-        <w:tc>
-          <w:tcPr>
-            <w:tcW w:w="2721" w:type="dxa"/>
-            <w:vAlign w:val="center"/>
-          </w:tcPr>
-          <w:p>
-            <w:pPr>
-              <w:spacing w:before="40" w:after="40" w:line="276" w:lineRule="auto"/>
-              <w:ind w:firstLine="0"/>
-              <w:jc w:val="left"/>
-            </w:pPr>
-            <w:r>
-              <w:rPr>
-                <w:sz w:val="19"/>
-              </w:rPr>
-              <w:t>Nguồn xác định phương tiện là mạng xã hội</w:t>
-            </w:r>
-          </w:p>
-        </w:tc>
-      </w:tr>
-      <w:tr>
-        <w:trPr>
-          <w:cantSplit/>
-          <w:jc w:val="center"/>
-        </w:trPr>
-        <w:tc>
-          <w:tcPr>
-            <w:tcW w:w="2154" w:type="dxa"/>
-            <w:vAlign w:val="center"/>
-          </w:tcPr>
-          <w:p>
-            <w:pPr>
-              <w:spacing w:before="40" w:after="40" w:line="276" w:lineRule="auto"/>
-              <w:ind w:firstLine="0"/>
-              <w:jc w:val="left"/>
-            </w:pPr>
-            <w:r>
-              <w:rPr>
-                <w:b/>
-                <w:sz w:val="19"/>
-              </w:rPr>
-              <w:t>Bán hàng và phân phối</w:t>
-            </w:r>
-          </w:p>
-        </w:tc>
-        <w:tc>
-          <w:tcPr>
-            <w:tcW w:w="4082" w:type="dxa"/>
-            <w:vAlign w:val="center"/>
-          </w:tcPr>
-          <w:p>
-            <w:pPr>
-              <w:spacing w:before="40" w:after="40" w:line="276" w:lineRule="auto"/>
-              <w:ind w:firstLine="0"/>
-              <w:jc w:val="left"/>
-            </w:pPr>
-            <w:r>
-              <w:rPr>
-                <w:sz w:val="19"/>
-              </w:rPr>
-              <w:t>Giá bán 199.000 đồng/sản phẩm; có các khâu marketing, bán hàng, đóng hàng, chuyển đơn</w:t>
-            </w:r>
-          </w:p>
-        </w:tc>
-        <w:tc>
-          <w:tcPr>
-            <w:tcW w:w="2721" w:type="dxa"/>
-            <w:vAlign w:val="center"/>
-          </w:tcPr>
-          <w:p>
-            <w:pPr>
-              <w:spacing w:before="40" w:after="40" w:line="276" w:lineRule="auto"/>
-              <w:ind w:firstLine="0"/>
-              <w:jc w:val="left"/>
-            </w:pPr>
-            <w:r>
-              <w:rPr>
-                <w:sz w:val="19"/>
-              </w:rPr>
-              <w:t>Không suy đoán phương thức giao hàng hoặc nền tảng cụ thể</w:t>
-            </w:r>
-          </w:p>
-        </w:tc>
-      </w:tr>
-      <w:tr>
-        <w:trPr>
-          <w:cantSplit/>
-          <w:jc w:val="center"/>
-        </w:trPr>
-        <w:tc>
-          <w:tcPr>
-            <w:tcW w:w="2154" w:type="dxa"/>
-            <w:vAlign w:val="center"/>
-          </w:tcPr>
-          <w:p>
-            <w:pPr>
-              <w:spacing w:before="40" w:after="40" w:line="276" w:lineRule="auto"/>
-              <w:ind w:firstLine="0"/>
-              <w:jc w:val="left"/>
-            </w:pPr>
-            <w:r>
-              <w:rPr>
-                <w:b/>
-                <w:sz w:val="19"/>
-              </w:rPr>
-              <w:t>Quy mô giao dịch</w:t>
-            </w:r>
-          </w:p>
-        </w:tc>
-        <w:tc>
-          <w:tcPr>
-            <w:tcW w:w="4082" w:type="dxa"/>
-            <w:vAlign w:val="center"/>
-          </w:tcPr>
-          <w:p>
-            <w:pPr>
-              <w:spacing w:before="40" w:after="40" w:line="276" w:lineRule="auto"/>
-              <w:ind w:firstLine="0"/>
-              <w:jc w:val="left"/>
-            </w:pPr>
-            <w:r>
-              <w:rPr>
-                <w:sz w:val="19"/>
-              </w:rPr>
-              <w:t>5.429 đơn hàng thành công; tổng giá trị tiền hàng hơn 2,67 tỷ đồng</w:t>
-            </w:r>
-          </w:p>
-        </w:tc>
-        <w:tc>
-          <w:tcPr>
-            <w:tcW w:w="2721" w:type="dxa"/>
-            <w:vAlign w:val="center"/>
-          </w:tcPr>
-          <w:p>
-            <w:pPr>
-              <w:spacing w:before="40" w:after="40" w:line="276" w:lineRule="auto"/>
-              <w:ind w:firstLine="0"/>
-              <w:jc w:val="left"/>
-            </w:pPr>
-            <w:r>
-              <w:rPr>
-                <w:sz w:val="19"/>
-              </w:rPr>
-              <w:t>Là quy mô giao dịch, không đồng nhất với thiệt hại thực tế</w:t>
-            </w:r>
-          </w:p>
-        </w:tc>
-      </w:tr>
-    </w:tbl>
-    <w:p>
-      <w:pPr>
         <w:pStyle w:val="u2"/>
       </w:pPr>
-      <w:bookmarkStart w:id="15" w:name="_Toc237715701"/>
+      <w:bookmarkStart w:id="15" w:name="_Toc237716091"/>
       <w:r>
         <w:rPr>
           <w:rFonts w:ascii="Times New Roman" w:eastAsia="Times New Roman" w:hAnsi="Times New Roman"/>
@@ -4563,7 +4050,7 @@
         <w:spacing w:after="80"/>
       </w:pPr>
       <w:r>
-        <w:t>Theo thông tin điều tra ban đầu, vụ việc liên quan đến các chủ thể sau:</w:t>
+        <w:t>Theo thông tin ban đầu từ cơ quan điều tra [6]:</w:t>
       </w:r>
     </w:p>
     <w:p>
@@ -4579,7 +4066,7 @@
         <w:t>Người tổ chức điều hành:</w:t>
       </w:r>
       <w:r>
-        <w:t xml:space="preserve"> Nguyễn Tiến Đạt (sinh năm 1997, trú tại Hà Nội), người bị cáo buộc thỏa thuận giá mua, chỉ đạo sản xuất nội dung quảng cáo và tổ chức bộ máy nhân sự [6].</w:t>
+        <w:t xml:space="preserve"> Nguyễn Tiến Đạt (sinh năm 1997, trú tại Hà Nội), thỏa thuận giá mua, chỉ đạo làm nội dung quảng cáo và điều hành bán hàng.</w:t>
       </w:r>
     </w:p>
     <w:p>
@@ -4592,10 +4079,11 @@
         <w:rPr>
           <w:b/>
         </w:rPr>
-        <w:t>Chủ thể liên quan đến nguồn hàng:</w:t>
-      </w:r>
-      <w:r>
-        <w:t xml:space="preserve"> Phùng Thị Nguyệt Ánh (Giám đốc Công ty TNHH Dược liệu Nguyệt Ánh). Cơ quan điều tra đang tiếp tục làm rõ dấu hiệu vi phạm và mức độ hành vi của Ánh; nguồn tin chưa xác định Ánh là một trong 21 bị can [6].</w:t>
+        <w:lastRenderedPageBreak/>
+        <w:t>Người liên quan đến nguồn hàng:</w:t>
+      </w:r>
+      <w:r>
+        <w:t xml:space="preserve"> Phùng Thị Nguyệt Ánh (Giám đốc Công ty TNHH Dược liệu Nguyệt Ánh). Cơ quan điều tra đang tiếp tục làm rõ mức độ liên quan; nguồn tin chưa xác định Ánh nằm trong số 21 bị can đã khởi tố.</w:t>
       </w:r>
     </w:p>
     <w:p>
@@ -4608,17 +4096,17 @@
         <w:rPr>
           <w:b/>
         </w:rPr>
-        <w:t>Các nhóm nhân sự hỗ trợ:</w:t>
-      </w:r>
-      <w:r>
-        <w:t xml:space="preserve"> Được phân chia theo các khâu marketing, bán hàng, vận đơn, đóng hàng và chuyển đơn. Mức độ nhận thức và hành vi cụ thể của từng cá nhân đang tiếp tục được cơ quan điều tra làm rõ [6].</w:t>
+        <w:t>Nhóm nhân sự hỗ trợ:</w:t>
+      </w:r>
+      <w:r>
+        <w:t xml:space="preserve"> Được phân chia theo các khâu làm marketing, tư vấn bán hàng, vận đơn và đóng hàng. Mức độ tham gia và nhận thức của từng người đang được cơ quan công an tiếp tục làm rõ.</w:t>
       </w:r>
     </w:p>
     <w:p>
       <w:pPr>
         <w:pStyle w:val="u2"/>
       </w:pPr>
-      <w:bookmarkStart w:id="16" w:name="_Toc237715702"/>
+      <w:bookmarkStart w:id="16" w:name="_Toc237716092"/>
       <w:r>
         <w:rPr>
           <w:rFonts w:ascii="Times New Roman" w:eastAsia="Times New Roman" w:hAnsi="Times New Roman"/>
@@ -4641,42 +4129,32 @@
         <w:t>Ngày 31/7/2026:</w:t>
       </w:r>
       <w:r>
-        <w:t xml:space="preserve"> Cơ quan CSĐT Công an tỉnh Phú Thọ tiến hành triệu tập, khám xét khẩn cấp nơi ở và nơi làm việc của các đối tượng liên quan; tạm giữ nhiều máy tính, điện thoại, tài liệu bán hàng cùng hàng trăm hộp sản phẩm Đông y; đồng thời </w:t>
+        <w:t xml:space="preserve"> Cơ quan CSĐT Công an tỉnh Phú Thọ khám xét khẩn cấp nơi ở và nơi làm việc của các đối tượng; tạm giữ máy tính, điện thoại, tài liệu bán hàng, sản phẩm Đông y và </w:t>
       </w:r>
       <w:r>
         <w:rPr>
           <w:b/>
         </w:rPr>
-        <w:t>tạm giữ</w:t>
-      </w:r>
-      <w:r>
-        <w:t xml:space="preserve"> hơn </w:t>
-      </w:r>
+        <w:t>tạm giữ hơn 1,77 tỷ đồng</w:t>
+      </w:r>
+      <w:r>
+        <w:t xml:space="preserve"> trong tài khoản ngân hàng [6].</w:t>
+      </w:r>
+    </w:p>
+    <w:p>
+      <w:pPr>
+        <w:pStyle w:val="Duudong"/>
+        <w:spacing w:after="60"/>
+        <w:ind w:left="709" w:firstLine="0"/>
+      </w:pPr>
       <w:r>
         <w:rPr>
           <w:b/>
         </w:rPr>
-        <w:t>1,77 tỷ đồng</w:t>
-      </w:r>
-      <w:r>
-        <w:t xml:space="preserve"> trong tài khoản ngân hàng [6].</w:t>
-      </w:r>
-    </w:p>
-    <w:p>
-      <w:pPr>
-        <w:pStyle w:val="Duudong"/>
-        <w:spacing w:after="60"/>
-        <w:ind w:left="709" w:firstLine="0"/>
-      </w:pPr>
-      <w:r>
-        <w:rPr>
-          <w:b/>
-        </w:rPr>
-        <w:lastRenderedPageBreak/>
         <w:t>Ngày 07/8/2026:</w:t>
       </w:r>
       <w:r>
-        <w:t xml:space="preserve"> Cơ quan CSĐT Công an tỉnh Phú Thọ ra quyết định khởi tố vụ án hình sự và khởi tố Nguyễn Tiến Đạt cùng 20 bị can về tội </w:t>
+        <w:t xml:space="preserve"> Cơ quan CSĐT Công an tỉnh Phú Thọ khởi tố vụ án, khởi tố Nguyễn Tiến Đạt cùng 20 bị can về tội </w:t>
       </w:r>
       <w:r>
         <w:rPr>
@@ -4685,7 +4163,7 @@
         <w:t>“Lừa dối khách hàng”</w:t>
       </w:r>
       <w:r>
-        <w:t xml:space="preserve"> theo quy định tại khoản 2 Điều 198 Bộ luật Hình sự [6].</w:t>
+        <w:t xml:space="preserve"> (khoản 2 Điều 198 BLHS) [6].</w:t>
       </w:r>
     </w:p>
     <w:p>
@@ -4701,14 +4179,14 @@
         <w:t>Trạng thái hiện tại:</w:t>
       </w:r>
       <w:r>
-        <w:t xml:space="preserve"> Vụ án đang trong giai đoạn điều tra mở rộng nhằm xác minh đầy đủ hành vi của từng bị can và chất lượng thực tế của sản phẩm theo quy định tố tụng.</w:t>
+        <w:t xml:space="preserve"> Vụ án đang trong giai đoạn điều tra mở rộng để xác định hành vi của từng cá nhân và kiểm định chất lượng sản phẩm.</w:t>
       </w:r>
     </w:p>
     <w:p>
       <w:pPr>
         <w:pStyle w:val="u2"/>
       </w:pPr>
-      <w:bookmarkStart w:id="17" w:name="_Toc237715703"/>
+      <w:bookmarkStart w:id="17" w:name="_Toc237716093"/>
       <w:r>
         <w:rPr>
           <w:rFonts w:ascii="Times New Roman" w:eastAsia="Times New Roman" w:hAnsi="Times New Roman"/>
@@ -4729,7 +4207,7 @@
           <w:b/>
           <w:sz w:val="22"/>
         </w:rPr>
-        <w:t>Bảng 3. Tổng hợp dữ kiện chính thức của vụ việc</w:t>
+        <w:t>Bảng 2. Tổng hợp dữ kiện chính thức của vụ việc</w:t>
       </w:r>
     </w:p>
     <w:tbl>
@@ -5088,7 +4566,7 @@
                 <w:b/>
                 <w:sz w:val="19"/>
               </w:rPr>
-              <w:t>Người liên quan đến nguồn hàng</w:t>
+              <w:t>Người liên quan nguồn hàng</w:t>
             </w:r>
           </w:p>
         </w:tc>
@@ -5107,7 +4585,7 @@
               <w:rPr>
                 <w:sz w:val="19"/>
               </w:rPr>
-              <w:t>Phùng Thị Nguyệt Ánh (Giám đốc Công ty TNHH Dược liệu Nguyệt Ánh)</w:t>
+              <w:t>Phùng Thị Nguyệt Ánh (Giám đốc Công ty Dược liệu Nguyệt Ánh)</w:t>
             </w:r>
           </w:p>
         </w:tc>
@@ -5299,7 +4777,7 @@
               <w:rPr>
                 <w:sz w:val="19"/>
               </w:rPr>
-              <w:t>5.429 đơn hàng thành công (từ tháng 5 đến tháng 7/2026)</w:t>
+              <w:t>5.429 đơn hàng thành công (tháng 5–7/2026)</w:t>
             </w:r>
           </w:p>
         </w:tc>
@@ -5463,7 +4941,8 @@
           <w:b/>
           <w:sz w:val="22"/>
         </w:rPr>
-        <w:t>Bảng 4. Các mốc thời gian đã xác minh</w:t>
+        <w:lastRenderedPageBreak/>
+        <w:t>Bảng 3. Các mốc thời gian đã xác minh</w:t>
       </w:r>
     </w:p>
     <w:tbl>
@@ -5540,7 +5019,7 @@
                 <w:b/>
                 <w:sz w:val="19"/>
               </w:rPr>
-              <w:t>Ý nghĩa trong báo cáo</w:t>
+              <w:t>Ý nghĩa pháp lý / thực tiễn</w:t>
             </w:r>
           </w:p>
         </w:tc>
@@ -5604,7 +5083,7 @@
               <w:rPr>
                 <w:sz w:val="19"/>
               </w:rPr>
-              <w:t>Mốc khởi đầu quá trình trinh sát [6]</w:t>
+              <w:t>Mốc bắt đầu xác minh vụ việc [6]</w:t>
             </w:r>
           </w:p>
         </w:tc>
@@ -5668,7 +5147,7 @@
               <w:rPr>
                 <w:sz w:val="19"/>
               </w:rPr>
-              <w:t>Quy mô giao dịch thực tế được ghi nhận [6]</w:t>
+              <w:t>Giai đoạn phát sinh giao dịch [6]</w:t>
             </w:r>
           </w:p>
         </w:tc>
@@ -5732,7 +5211,7 @@
               <w:rPr>
                 <w:sz w:val="19"/>
               </w:rPr>
-              <w:t>Hoạt động điều tra và thu giữ vật chứng [6]</w:t>
+              <w:t>Hoạt động điều tra, thu giữ vật chứng [6]</w:t>
             </w:r>
           </w:p>
         </w:tc>
@@ -5777,7 +5256,7 @@
               <w:rPr>
                 <w:sz w:val="19"/>
               </w:rPr>
-              <w:t>Quyết định khởi tố vụ án, khởi tố Đạt cùng 20 bị can theo Điều 198 BLHS</w:t>
+              <w:t>Khởi tố vụ án, khởi tố Đạt cùng 20 bị can theo Điều 198 BLHS</w:t>
             </w:r>
           </w:p>
         </w:tc>
@@ -5860,7 +5339,7 @@
               <w:rPr>
                 <w:sz w:val="19"/>
               </w:rPr>
-              <w:t>Mốc công bố thông tin báo chí chính thức [6]</w:t>
+              <w:t>Công bố thông tin chính thức [6]</w:t>
             </w:r>
           </w:p>
         </w:tc>
@@ -5870,7 +5349,7 @@
       <w:pPr>
         <w:pStyle w:val="u1"/>
       </w:pPr>
-      <w:bookmarkStart w:id="18" w:name="_Toc237715704"/>
+      <w:bookmarkStart w:id="18" w:name="_Toc237716094"/>
       <w:r>
         <w:rPr>
           <w:rFonts w:ascii="Times New Roman" w:eastAsia="Times New Roman" w:hAnsi="Times New Roman"/>
@@ -5886,14 +5365,14 @@
         <w:spacing w:after="80"/>
       </w:pPr>
       <w:r>
-        <w:t>Chương 3 là phần trọng tâm của báo cáo, vận dụng khung lý thuyết cấu thành vi phạm pháp luật của học phần Pháp luật đại cương để phân tích có hệ thống bốn yếu tố: Khách thể, Mặt khách quan, Chủ thể và Mặt chủ quan trong vụ việc tại Phú Thọ.</w:t>
+        <w:t>Chương 3 vận dụng khung lý thuyết cấu thành vi phạm pháp luật của môn Pháp luật đại cương để phân tích bốn yếu tố: Khách thể, Mặt khách quan, Chủ thể và Mặt chủ quan trong vụ việc tại Phú Thọ.</w:t>
       </w:r>
     </w:p>
     <w:p>
       <w:pPr>
         <w:pStyle w:val="u2"/>
       </w:pPr>
-      <w:bookmarkStart w:id="19" w:name="_Toc237715705"/>
+      <w:bookmarkStart w:id="19" w:name="_Toc237716095"/>
       <w:r>
         <w:rPr>
           <w:rFonts w:ascii="Times New Roman" w:eastAsia="Times New Roman" w:hAnsi="Times New Roman"/>
@@ -5912,7 +5391,7 @@
           <w:rFonts w:ascii="Times New Roman" w:eastAsia="Times New Roman" w:hAnsi="Times New Roman"/>
           <w:b w:val="0"/>
         </w:rPr>
-        <w:t>3.1.1. Cơ sở lý luận áp dụng</w:t>
+        <w:t>3.1.1. Cơ sở lý luận và các quan hệ xã hội bị xâm hại</w:t>
       </w:r>
     </w:p>
     <w:p>
@@ -5920,7 +5399,76 @@
         <w:spacing w:after="80"/>
       </w:pPr>
       <w:r>
-        <w:t>Khách thể của vi phạm pháp luật là những quan hệ xã hội được pháp luật xác lập và bảo vệ nhưng bị hành vi vi phạm pháp luật xâm hại [5]. Trong hoạt động thương mại và tiếp thị sản phẩm Đông y chăm sóc sức khỏe, pháp luật bảo vệ trật tự quản lý nhà nước về quảng cáo và thương mại, quyền và lợi ích hợp pháp của người tiêu dùng, cũng như quyền nhân thân về hình ảnh của cá nhân.</w:t>
+        <w:t>Khách thể của vi phạm pháp luật là quan hệ xã hội được pháp luật bảo vệ nhưng bị hành vi vi phạm xâm hại [5]. Trong vụ việc này, các hành vi bị xem xét tác động đến ba nhóm quan hệ xã hội chính:</w:t>
+      </w:r>
+    </w:p>
+    <w:p>
+      <w:pPr>
+        <w:spacing w:after="60"/>
+        <w:ind w:left="709" w:firstLine="0"/>
+      </w:pPr>
+      <w:r>
+        <w:t xml:space="preserve">1. </w:t>
+      </w:r>
+      <w:r>
+        <w:rPr>
+          <w:b/>
+        </w:rPr>
+        <w:t>Trật tự quản lý nhà nước về quảng cáo và thương mại:</w:t>
+      </w:r>
+    </w:p>
+    <w:p>
+      <w:pPr>
+        <w:spacing w:after="80"/>
+      </w:pPr>
+      <w:r>
+        <w:t xml:space="preserve">   Nhà nước ban hành các quy định nhằm bảo đảm tính trung thực và cạnh tranh lành mạnh trên thị trường. Việc đưa thông tin sai lệch về công dụng sản phẩm và sử dụng hình ảnh không đúng quy định vi phạm quy tắc quản lý tại Điều 8 và Điều 19 Luật Quảng cáo [3], làm ảnh hưởng đến trật tự kinh doanh chung.</w:t>
+      </w:r>
+    </w:p>
+    <w:p>
+      <w:pPr>
+        <w:spacing w:after="60"/>
+        <w:ind w:left="709" w:firstLine="0"/>
+      </w:pPr>
+      <w:r>
+        <w:t xml:space="preserve">2. </w:t>
+      </w:r>
+      <w:r>
+        <w:rPr>
+          <w:b/>
+        </w:rPr>
+        <w:t>Quyền và lợi ích hợp pháp của người tiêu dùng:</w:t>
+      </w:r>
+    </w:p>
+    <w:p>
+      <w:pPr>
+        <w:spacing w:after="80"/>
+      </w:pPr>
+      <w:r>
+        <w:t xml:space="preserve">   Theo Điều 10 Luật Bảo vệ quyền lợi người tiêu dùng năm 2023, pháp luật nghiêm cấm hành vi lừa dối hoặc gây nhầm lẫn cho người tiêu dùng thông qua hoạt động cung cấp thông tin, quảng cáo [4]. Người tiêu dùng có quyền được cung cấp thông tin trung thực về công dụng và giá trị sản phẩm. Việc tiếp nhận thông tin phóng đại làm ảnh hưởng trực tiếp đến quyền lựa chọn đúng đắn của người mua.</w:t>
+      </w:r>
+    </w:p>
+    <w:p>
+      <w:pPr>
+        <w:spacing w:after="60"/>
+        <w:ind w:left="709" w:firstLine="0"/>
+      </w:pPr>
+      <w:r>
+        <w:t xml:space="preserve">3. </w:t>
+      </w:r>
+      <w:r>
+        <w:rPr>
+          <w:b/>
+        </w:rPr>
+        <w:t>Quyền nhân thân về hình ảnh của cá nhân:</w:t>
+      </w:r>
+    </w:p>
+    <w:p>
+      <w:pPr>
+        <w:spacing w:after="80"/>
+      </w:pPr>
+      <w:r>
+        <w:t xml:space="preserve">   Theo Điều 32 Bộ luật Dân sự năm 2015 [2] và pháp luật về quảng cáo [3], việc sử dụng hình ảnh cá nhân trong hoạt động thương mại phải tuân thủ sự đồng ý hợp pháp hoặc các trường hợp ngoại lệ theo luật định. Dữ kiện ghi nhận nhóm đối tượng sử dụng hình ảnh, video cắt ghép người nổi tiếng để quảng cáo [6]. Nếu việc khai thác này không có sự đồng ý hoặc không thuộc trường hợp luật định thì làm phát sinh vấn đề xâm phạm quyền hình ảnh cá nhân.</w:t>
       </w:r>
     </w:p>
     <w:p>
@@ -5932,151 +5480,8 @@
           <w:rFonts w:ascii="Times New Roman" w:eastAsia="Times New Roman" w:hAnsi="Times New Roman"/>
           <w:b w:val="0"/>
         </w:rPr>
-        <w:t>3.1.2. Dữ kiện thực tế ghi nhận</w:t>
-      </w:r>
-    </w:p>
-    <w:p>
-      <w:pPr>
-        <w:pStyle w:val="Duudong"/>
-        <w:spacing w:after="60"/>
-        <w:ind w:left="709" w:firstLine="0"/>
-      </w:pPr>
-      <w:r>
-        <w:t>Sản phẩm Đông y có giá mua 23.000 đồng được bán ra với mức giá 199.000 đồng/sản phẩm [6].</w:t>
-      </w:r>
-    </w:p>
-    <w:p>
-      <w:pPr>
-        <w:pStyle w:val="Duudong"/>
-        <w:spacing w:after="60"/>
-        <w:ind w:left="709" w:firstLine="0"/>
-      </w:pPr>
-      <w:r>
-        <w:t>Sử dụng bài viết, hình ảnh, video có hình người nổi tiếng đã qua chỉnh sửa, cắt ghép cùng nội dung phóng đại, sai lệch về công dụng để tiếp thị trên mạng xã hội [6].</w:t>
-      </w:r>
-    </w:p>
-    <w:p>
-      <w:pPr>
-        <w:pStyle w:val="Duudong"/>
-        <w:spacing w:after="60"/>
-        <w:ind w:left="709" w:firstLine="0"/>
-      </w:pPr>
-      <w:r>
-        <w:t>Ghi nhận 5.429 đơn hàng thành công trên phạm vi cả nước với tổng giá trị tiền hàng hơn 2,67 tỷ đồng [6].</w:t>
-      </w:r>
-    </w:p>
-    <w:p>
-      <w:pPr>
-        <w:pStyle w:val="u3"/>
-      </w:pPr>
-      <w:r>
-        <w:rPr>
-          <w:rFonts w:ascii="Times New Roman" w:eastAsia="Times New Roman" w:hAnsi="Times New Roman"/>
-          <w:b w:val="0"/>
-        </w:rPr>
-        <w:t>3.1.3. Phân tích pháp lý chi tiết</w:t>
-      </w:r>
-    </w:p>
-    <w:p>
-      <w:pPr>
-        <w:spacing w:after="80"/>
-      </w:pPr>
-      <w:r>
-        <w:t>Hành vi bị cáo buộc của các đối tượng đã tác động tiêu cực đến các nhóm quan hệ xã hội sau:</w:t>
-      </w:r>
-    </w:p>
-    <w:p>
-      <w:pPr>
-        <w:spacing w:after="60"/>
-        <w:ind w:left="709" w:firstLine="0"/>
-      </w:pPr>
-      <w:r>
-        <w:t xml:space="preserve">1. </w:t>
-      </w:r>
-      <w:r>
-        <w:rPr>
-          <w:b/>
-        </w:rPr>
-        <w:t>Trật tự quản lý hành chính nhà nước về hoạt động quảng cáo và thương mại:</w:t>
-      </w:r>
-    </w:p>
-    <w:p>
-      <w:pPr>
-        <w:spacing w:after="80"/>
-      </w:pPr>
-      <w:r>
-        <w:t xml:space="preserve">   Nhà nước ban hành các quy chuẩn nhằm bảo đảm sự minh bạch và lành mạnh của thị trường. Việc đưa thông tin sai lệch về công dụng sản phẩm và sử dụng hình ảnh không đúng quy định vi phạm trực tiếp các quy tắc quản lý tại Điều 8 và </w:t>
-      </w:r>
-      <w:r>
         <w:lastRenderedPageBreak/>
-        <w:t>Điều 19 Luật Quảng cáo (Văn bản hợp nhất số 88/VBHN-VPQH) [3], làm xáo trộn trật tự lưu thông hàng hóa bình thường.</w:t>
-      </w:r>
-    </w:p>
-    <w:p>
-      <w:pPr>
-        <w:spacing w:after="60"/>
-        <w:ind w:left="709" w:firstLine="0"/>
-      </w:pPr>
-      <w:r>
-        <w:t xml:space="preserve">2. </w:t>
-      </w:r>
-      <w:r>
-        <w:rPr>
-          <w:b/>
-        </w:rPr>
-        <w:t>Quyền và lợi ích hợp pháp của người tiêu dùng:</w:t>
-      </w:r>
-    </w:p>
-    <w:p>
-      <w:pPr>
-        <w:spacing w:after="80"/>
-      </w:pPr>
-      <w:r>
-        <w:t xml:space="preserve">   Theo quy định tại </w:t>
-      </w:r>
-      <w:r>
-        <w:rPr>
-          <w:b/>
-        </w:rPr>
-        <w:t>Điều 10 Luật Bảo vệ quyền lợi người tiêu dùng năm 2023</w:t>
-      </w:r>
-      <w:r>
-        <w:t>, pháp luật nghiêm cấm hành vi lừa dối hoặc gây nhầm lẫn cho người tiêu dùng thông qua cung cấp thông tin, quảng cáo [4]. Người tiêu dùng có quyền được cung cấp thông tin trung thực về công dụng và giá trị của sản phẩm. Việc tiếp nhận thông tin phóng đại làm tổn hại quyền được lựa chọn minh bạch của khách hàng.</w:t>
-      </w:r>
-    </w:p>
-    <w:p>
-      <w:pPr>
-        <w:spacing w:after="60"/>
-        <w:ind w:left="709" w:firstLine="0"/>
-      </w:pPr>
-      <w:r>
-        <w:t xml:space="preserve">3. </w:t>
-      </w:r>
-      <w:r>
-        <w:rPr>
-          <w:b/>
-        </w:rPr>
-        <w:t>Quyền nhân thân về hình ảnh của cá nhân:</w:t>
-      </w:r>
-    </w:p>
-    <w:p>
-      <w:pPr>
-        <w:spacing w:after="80"/>
-      </w:pPr>
-      <w:r>
-        <w:t xml:space="preserve">   Căn cứ </w:t>
-      </w:r>
-      <w:r>
-        <w:rPr>
-          <w:b/>
-        </w:rPr>
-        <w:t>Điều 32 Bộ luật Dân sự năm 2015</w:t>
-      </w:r>
-      <w:r>
-        <w:t xml:space="preserve"> [2] và pháp luật về quảng cáo [3], việc sử dụng hình ảnh cá nhân trong tiếp thị phải tuân thủ sự đồng ý hợp pháp hoặc các trường hợp luật định. Dữ kiện công khai ghi nhận việc sử dụng video, hình ảnh người nổi tiếng đã qua chỉnh sửa, cắt ghép để tiếp thị [6]. Dưới góc độ lý luận, nếu việc khai thác hình ảnh này diễn ra ngoài phạm vi đồng ý hoặc không thuộc ngoại lệ luật định thì đặt ra vấn đề xâm hại quyền nhân thân về hình ảnh. Cần lưu ý rằng nguồn tin công khai hiện chưa cung cấp đầy đủ thông tin về tình</w:t>
-      </w:r>
-      <w:r>
-        <w:t xml:space="preserve"> trạng thỏa thuận hoặc sự đồng ý của từng cá nhân xuất hiện trong hình ảnh.</w:t>
+        <w:t>3.1.2. Phân biệt các bình diện trong yếu tố Khách thể</w:t>
       </w:r>
     </w:p>
     <w:p>
@@ -6090,7 +5495,7 @@
           <w:b/>
           <w:sz w:val="22"/>
         </w:rPr>
-        <w:t>Bảng 5. Phân biệt khách thể, đối tượng tác động và người bị ảnh hưởng</w:t>
+        <w:t>Bảng 4. Phân biệt khách thể, đối tượng tác động và người bị ảnh hưởng</w:t>
       </w:r>
     </w:p>
     <w:tbl>
@@ -6147,7 +5552,7 @@
                 <w:b/>
                 <w:sz w:val="19"/>
               </w:rPr>
-              <w:t>Nội dung phân tích trong vụ việc</w:t>
+              <w:t>Nội dung trong vụ việc</w:t>
             </w:r>
           </w:p>
         </w:tc>
@@ -6167,7 +5572,7 @@
                 <w:b/>
                 <w:sz w:val="19"/>
               </w:rPr>
-              <w:t>Giới hạn học thuật</w:t>
+              <w:t>Lưu ý phạm vi dữ liệu</w:t>
             </w:r>
           </w:p>
         </w:tc>
@@ -6212,7 +5617,7 @@
               <w:rPr>
                 <w:sz w:val="19"/>
               </w:rPr>
-              <w:t>Trật tự quản lý quảng cáo, thương mại; quyền được thông tin trung thực của NTD; quyền hình ảnh</w:t>
+              <w:t>Trật tự quản lý quảng cáo, thương mại; quyền được thông tin trung thực của người tiêu dùng; quyền hình ảnh</w:t>
             </w:r>
           </w:p>
         </w:tc>
@@ -6231,7 +5636,7 @@
               <w:rPr>
                 <w:sz w:val="19"/>
               </w:rPr>
-              <w:t>Mức độ tác động cụ thể chờ kết luận của cơ quan tố tụng</w:t>
+              <w:t>Đánh giá theo quy định pháp luật hiện hành</w:t>
             </w:r>
           </w:p>
         </w:tc>
@@ -6276,7 +5681,7 @@
               <w:rPr>
                 <w:sz w:val="19"/>
               </w:rPr>
-              <w:t>Bài viết, video cắt ghép; sản phẩm Đông y “Xương khớp bà Sáu”; dòng tiền từ 5.429 đơn hàng</w:t>
+              <w:t>Bài viết, video cắt ghép; sản phẩm Đông y “Xương khớp bà Sáu”; tiền thanh toán từ 5.429 đơn hàng</w:t>
             </w:r>
           </w:p>
         </w:tc>
@@ -6295,7 +5700,7 @@
               <w:rPr>
                 <w:sz w:val="19"/>
               </w:rPr>
-              <w:t>Là thực thể vật chất/thông tin cụ thể bị tác động</w:t>
+              <w:t>Là thực thể vật chất hoặc dữ liệu cụ thể bị tác động</w:t>
             </w:r>
           </w:p>
         </w:tc>
@@ -6340,7 +5745,7 @@
               <w:rPr>
                 <w:sz w:val="19"/>
               </w:rPr>
-              <w:t>Khách hàng đặt mua qua 5.429 đơn hàng; người nổi tiếng xuất hiện trong tư liệu quảng cáo cắt ghép</w:t>
+              <w:t>Người mua qua 5.429 đơn hàng; người nổi tiếng bị sử dụng hình ảnh cắt ghép</w:t>
             </w:r>
           </w:p>
         </w:tc>
@@ -6359,7 +5764,7 @@
               <w:rPr>
                 <w:sz w:val="19"/>
               </w:rPr>
-              <w:t>Không suy đoán số lượng khách hàng riêng biệt, ý chí từng người hay tình trạng thỏa thuận hình ảnh</w:t>
+              <w:t>Không suy đoán số lượng khách hàng riêng biệt hay thỏa thuận hình ảnh cụ thể</w:t>
             </w:r>
           </w:p>
         </w:tc>
@@ -6367,296 +5772,159 @@
     </w:tbl>
     <w:p>
       <w:pPr>
-        <w:pStyle w:val="u3"/>
-      </w:pPr>
+        <w:pStyle w:val="u2"/>
+      </w:pPr>
+      <w:bookmarkStart w:id="20" w:name="_Toc237716096"/>
       <w:r>
         <w:rPr>
           <w:rFonts w:ascii="Times New Roman" w:eastAsia="Times New Roman" w:hAnsi="Times New Roman"/>
           <w:b w:val="0"/>
         </w:rPr>
-        <w:t>3.1.4. Nhận xét tiểu mục 3.1</w:t>
-      </w:r>
+        <w:t>3.2. Phân tích yếu tố Mặt khách quan của vi phạm pháp luật</w:t>
+      </w:r>
+      <w:bookmarkEnd w:id="20"/>
     </w:p>
     <w:p>
       <w:pPr>
-        <w:spacing w:after="80"/>
-      </w:pPr>
-      <w:r>
-        <w:t>Việc xác định khách thể cho thấy hành vi bị cáo buộc có thể tác động đa chiều đến các quan hệ xã hội được pháp luật bảo vệ, bao gồm cả trật tự quản lý công cộng và quyền lợi hợp pháp của các chủ thể tham gia giao dịch trên không gian mạng.</w:t>
+        <w:pStyle w:val="u3"/>
+      </w:pPr>
+      <w:r>
+        <w:rPr>
+          <w:rFonts w:ascii="Times New Roman" w:eastAsia="Times New Roman" w:hAnsi="Times New Roman"/>
+          <w:b w:val="0"/>
+        </w:rPr>
+        <w:t>3.2.1. Hành vi trái pháp luật</w:t>
       </w:r>
     </w:p>
     <w:p>
       <w:pPr>
-        <w:pStyle w:val="u2"/>
-      </w:pPr>
-      <w:bookmarkStart w:id="20" w:name="_Toc237715706"/>
+        <w:spacing w:after="80"/>
+      </w:pPr>
+      <w:r>
+        <w:t>Mặt khách quan thể hiện qua chuỗi hành vi hành động cụ thể trên thực tế:</w:t>
+      </w:r>
+    </w:p>
+    <w:p>
+      <w:pPr>
+        <w:pStyle w:val="Duudong"/>
+        <w:spacing w:after="60"/>
+        <w:ind w:left="709" w:firstLine="0"/>
+      </w:pPr>
+      <w:r>
+        <w:rPr>
+          <w:b/>
+        </w:rPr>
+        <w:t>Quảng cáo sai sự thật:</w:t>
+      </w:r>
+      <w:r>
+        <w:t xml:space="preserve"> Đưa ra thông tin phóng đại, không đúng về công dụng của sản phẩm Đông y nhằm tạo niềm tin cho người mua, vi phạm khoản 9 Điều 8 Luật Quảng cáo [3].</w:t>
+      </w:r>
+    </w:p>
+    <w:p>
+      <w:pPr>
+        <w:pStyle w:val="Duudong"/>
+        <w:spacing w:after="60"/>
+        <w:ind w:left="709" w:firstLine="0"/>
+      </w:pPr>
+      <w:r>
+        <w:rPr>
+          <w:b/>
+        </w:rPr>
+        <w:t>Sử dụng tư liệu cắt ghép người nổi tiếng:</w:t>
+      </w:r>
+      <w:r>
+        <w:t xml:space="preserve"> Lồng ghép hình ảnh, video người có uy tín đã qua chỉnh sửa vào nội dung bán hàng [6], vi phạm khoản 8 Điều 8 Luật Quảng cáo [3] và Điều 32 Bộ luật Dân sự 2015 [2] nếu không có sự đồng ý hợp lệ.</w:t>
+      </w:r>
+    </w:p>
+    <w:p>
+      <w:pPr>
+        <w:pStyle w:val="Duudong"/>
+        <w:spacing w:after="60"/>
+        <w:ind w:left="709" w:firstLine="0"/>
+      </w:pPr>
+      <w:r>
+        <w:rPr>
+          <w:b/>
+        </w:rPr>
+        <w:t>Bối cảnh tố tụng:</w:t>
+      </w:r>
+      <w:r>
+        <w:t xml:space="preserve"> Cơ quan điều tra đã khởi tố Đạt cùng 20 bị can về tội </w:t>
+      </w:r>
+      <w:r>
+        <w:rPr>
+          <w:i/>
+        </w:rPr>
+        <w:t>“Lừa dối khách hàng”</w:t>
+      </w:r>
+      <w:r>
+        <w:t xml:space="preserve"> theo khoản 2 Điều 198 Bộ luật Hình sự [1], [6], phản ánh tính chất trái pháp luật của chuỗi hành vi.</w:t>
+      </w:r>
+    </w:p>
+    <w:p>
+      <w:pPr>
+        <w:pStyle w:val="u3"/>
+      </w:pPr>
+      <w:r>
+        <w:rPr>
+          <w:rFonts w:ascii="Times New Roman" w:eastAsia="Times New Roman" w:hAnsi="Times New Roman"/>
+          <w:b w:val="0"/>
+        </w:rPr>
+        <w:t>3.2.2. Quy mô giao dịch và hậu quả ghi nhận</w:t>
+      </w:r>
+    </w:p>
+    <w:p>
+      <w:pPr>
+        <w:spacing w:after="80"/>
+      </w:pPr>
+      <w:r>
+        <w:t xml:space="preserve">Nguồn tin chính thức ghi nhận nhóm đã thực hiện thành công </w:t>
+      </w:r>
+      <w:r>
+        <w:rPr>
+          <w:b/>
+        </w:rPr>
+        <w:t>5.429 đơn hàng</w:t>
+      </w:r>
+      <w:r>
+        <w:t xml:space="preserve"> với </w:t>
+      </w:r>
+      <w:r>
+        <w:rPr>
+          <w:b/>
+        </w:rPr>
+        <w:t>tổng giá trị tiền hàng hơn 2,67 tỷ đồng</w:t>
+      </w:r>
+      <w:r>
+        <w:t xml:space="preserve"> [6]. Đây là quy mô giao dịch phát sinh trên thực tế. Cần phân biệt tổng giá trị tiền hàng với thiệt hại thực tế của người mua hay lợi nhuận thuần túy của người bán, bởi việc xác định chính xác thiệt hại phụ thuộc vào kết luận tài chính của cơ quan tố tụng.</w:t>
+      </w:r>
+    </w:p>
+    <w:p>
+      <w:pPr>
+        <w:pStyle w:val="u3"/>
+      </w:pPr>
       <w:r>
         <w:rPr>
           <w:rFonts w:ascii="Times New Roman" w:eastAsia="Times New Roman" w:hAnsi="Times New Roman"/>
           <w:b w:val="0"/>
         </w:rPr>
         <w:lastRenderedPageBreak/>
-        <w:t>3.2. Phân tích yếu tố Mặt khách quan của vi phạm pháp luật</w:t>
-      </w:r>
-      <w:bookmarkEnd w:id="20"/>
+        <w:t>3.2.3. Mối liên hệ nhân quả</w:t>
+      </w:r>
     </w:p>
     <w:p>
       <w:pPr>
-        <w:pStyle w:val="u3"/>
-      </w:pPr>
-      <w:r>
-        <w:rPr>
-          <w:rFonts w:ascii="Times New Roman" w:eastAsia="Times New Roman" w:hAnsi="Times New Roman"/>
-          <w:b w:val="0"/>
-        </w:rPr>
-        <w:t>3.2.1. Cơ sở lý luận áp dụng</w:t>
+        <w:spacing w:after="80"/>
+      </w:pPr>
+      <w:r>
+        <w:t>Nội dung quảng cáo phóng đại và hình ảnh cắt ghép có khả năng tác động đến nhận thức, thúc đẩy người xem tin tưởng và đặt mua sản phẩm. Mối liên hệ giữa hoạt động tiếp thị sai sự thật và 5.429 đơn hàng phát sinh là cơ sở để xem xét quan hệ nhân quả trong môn học. Tuy nhiên, thông tin công khai chưa thể hiện lý do mua hàng cụ thể của từng cá nhân trong 5.429 đơn hàng, nên nhóm không nhận định rằng toàn bộ đơn hàng đều phát sinh duy nhất từ việc quảng cáo gian dối.</w:t>
       </w:r>
     </w:p>
     <w:p>
       <w:pPr>
-        <w:spacing w:after="80"/>
-      </w:pPr>
-      <w:r>
-        <w:t>Mặt khách quan của vi phạm pháp luật bao gồm hành vi trái pháp luật, hậu quả nguy hiểm cho xã hội, mối quan hệ nhân quả và các yếu tố công cụ, phương tiện, phương thức thực hiện [5].</w:t>
-      </w:r>
-    </w:p>
-    <w:p>
-      <w:pPr>
-        <w:pStyle w:val="u3"/>
-      </w:pPr>
-      <w:r>
-        <w:rPr>
-          <w:rFonts w:ascii="Times New Roman" w:eastAsia="Times New Roman" w:hAnsi="Times New Roman"/>
-          <w:b w:val="0"/>
-        </w:rPr>
-        <w:t>3.2.2. Dữ kiện thực tế ghi nhận</w:t>
-      </w:r>
-    </w:p>
-    <w:p>
-      <w:pPr>
-        <w:pStyle w:val="Duudong"/>
-        <w:spacing w:after="60"/>
-        <w:ind w:left="709" w:firstLine="0"/>
-      </w:pPr>
-      <w:r>
-        <w:t>Thỏa thuận mua sản phẩm với giá 23.000 đồng/sản phẩm và bán ra với giá 199.000 đồng/sản phẩm [6].</w:t>
-      </w:r>
-    </w:p>
-    <w:p>
-      <w:pPr>
-        <w:pStyle w:val="Duudong"/>
-        <w:spacing w:after="60"/>
-        <w:ind w:left="709" w:firstLine="0"/>
-      </w:pPr>
-      <w:r>
-        <w:t>Chỉ đạo sử dụng bài viết, hình ảnh, video chỉnh sửa/cắt ghép hình người nổi tiếng và nội dung phóng đại, sai lệch về công dụng để quảng cáo trên mạng xã hội [6].</w:t>
-      </w:r>
-    </w:p>
-    <w:p>
-      <w:pPr>
-        <w:pStyle w:val="Duudong"/>
-        <w:spacing w:after="60"/>
-        <w:ind w:left="709" w:firstLine="0"/>
-      </w:pPr>
-      <w:r>
-        <w:t>Thực hiện thành công 5.429 đơn hàng trong giai đoạn tháng 5–7/2026 với tổng giá trị tiền hàng hơn 2,67 tỷ đồng [6].</w:t>
-      </w:r>
-    </w:p>
-    <w:p>
-      <w:pPr>
-        <w:pStyle w:val="u3"/>
-      </w:pPr>
-      <w:r>
-        <w:rPr>
-          <w:rFonts w:ascii="Times New Roman" w:eastAsia="Times New Roman" w:hAnsi="Times New Roman"/>
-          <w:b w:val="0"/>
-        </w:rPr>
-        <w:t>3.2.3. Phân tích pháp lý chi tiết</w:t>
-      </w:r>
-    </w:p>
-    <w:p>
-      <w:pPr>
-        <w:pStyle w:val="u4"/>
-      </w:pPr>
-      <w:r>
-        <w:rPr>
-          <w:rFonts w:ascii="Times New Roman" w:eastAsia="Times New Roman" w:hAnsi="Times New Roman"/>
-          <w:b w:val="0"/>
-          <w:i w:val="0"/>
-        </w:rPr>
-        <w:t>A. Hành vi trái pháp luật (Dạng hành động)</w:t>
-      </w:r>
-    </w:p>
-    <w:p>
-      <w:pPr>
-        <w:spacing w:after="60"/>
-        <w:ind w:left="709" w:firstLine="0"/>
-      </w:pPr>
-      <w:r>
-        <w:t xml:space="preserve">1. </w:t>
-      </w:r>
-      <w:r>
-        <w:rPr>
-          <w:b/>
-        </w:rPr>
-        <w:t>Hành vi quảng cáo sai sự thật:</w:t>
-      </w:r>
-      <w:r>
-        <w:t xml:space="preserve"> Đưa ra thông tin phóng đại, sai lệch về công dụng, chất lượng sản phẩm Đông y nhằm tạo niềm tin cho người mua. Hành vi này trái với quy định tại </w:t>
-      </w:r>
-      <w:r>
-        <w:rPr>
-          <w:b/>
-        </w:rPr>
-        <w:t>khoản 9 Điều 8 Luật Quảng cáo</w:t>
-      </w:r>
-      <w:r>
-        <w:t xml:space="preserve"> [3].</w:t>
-      </w:r>
-    </w:p>
-    <w:p>
-      <w:pPr>
-        <w:spacing w:after="60"/>
-        <w:ind w:left="709" w:firstLine="0"/>
-      </w:pPr>
-      <w:r>
-        <w:t xml:space="preserve">2. </w:t>
-      </w:r>
-      <w:r>
-        <w:rPr>
-          <w:b/>
-        </w:rPr>
-        <w:t>Hành vi khai thác hình ảnh cắt ghép người nổi tiếng trong quảng cáo:</w:t>
-      </w:r>
-      <w:r>
-        <w:t xml:space="preserve"> Nguồn tin ghi nhận việc sử dụng hình ảnh, video cắt ghép người nổi tiếng lồng ghép vào nội dung tiếp thị [6]. Hoạt động này được đối chiếu với quy định tại </w:t>
-      </w:r>
-      <w:r>
-        <w:rPr>
-          <w:b/>
-        </w:rPr>
-        <w:t>khoản 8 Điều 8 Luật Quảng cáo</w:t>
-      </w:r>
-      <w:r>
-        <w:t xml:space="preserve"> [3] và </w:t>
-      </w:r>
-      <w:r>
-        <w:rPr>
-          <w:b/>
-        </w:rPr>
-        <w:t>Điều 32 Bộ luật Dân sự 2015</w:t>
-      </w:r>
-      <w:r>
-        <w:t xml:space="preserve"> [2] về điều kiện sử dụng hình ảnh cá nhân; nếu việc sử dụng không có sự đồng ý hợp lệ thì đây là một dạng hành vi trái quy định pháp luật.</w:t>
-      </w:r>
-    </w:p>
-    <w:p>
-      <w:pPr>
-        <w:spacing w:after="60"/>
-        <w:ind w:left="709" w:firstLine="0"/>
-      </w:pPr>
-      <w:r>
-        <w:t xml:space="preserve">3. </w:t>
-      </w:r>
-      <w:r>
-        <w:rPr>
-          <w:b/>
-        </w:rPr>
-        <w:t>Bối cảnh tố tụng về hành vi gian dối thương mại:</w:t>
-      </w:r>
-      <w:r>
-        <w:t xml:space="preserve"> Cơ quan CSĐT đã khởi tố Đạt cùng 20 bị can về tội </w:t>
-      </w:r>
-      <w:r>
-        <w:rPr>
-          <w:i/>
-        </w:rPr>
-        <w:t>“Lừa dối khách hàng”</w:t>
-      </w:r>
-      <w:r>
-        <w:t xml:space="preserve"> theo khoản 2 Điều 198 Bộ luật Hình sự [1], [6]. Đây là cơ sở pháp lý tham chiếu xác định tính chất trái pháp luật của chuỗi hành vi.</w:t>
-      </w:r>
-    </w:p>
-    <w:p>
-      <w:pPr>
-        <w:pStyle w:val="u4"/>
-      </w:pPr>
-      <w:r>
-        <w:rPr>
-          <w:rFonts w:ascii="Times New Roman" w:eastAsia="Times New Roman" w:hAnsi="Times New Roman"/>
-          <w:b w:val="0"/>
-          <w:i w:val="0"/>
-        </w:rPr>
-        <w:lastRenderedPageBreak/>
-        <w:t>B. Quy mô và kết quả giao dịch ghi nhận</w:t>
-      </w:r>
-    </w:p>
-    <w:p>
-      <w:pPr>
-        <w:spacing w:after="80"/>
-      </w:pPr>
-      <w:r>
-        <w:t xml:space="preserve">Bài báo nêu rõ con số 5.429 đơn hàng thành công với </w:t>
-      </w:r>
-      <w:r>
-        <w:rPr>
-          <w:b/>
-        </w:rPr>
-        <w:t>tổng giá trị tiền hàng</w:t>
-      </w:r>
-      <w:r>
-        <w:t xml:space="preserve"> hơn 2,67 tỷ đồng [6]. Đây là quy mô kinh tế thực tế của hoạt động giao dịch. Dưới góc độ khoa học pháp lý, cần phân biệt tổng giá trị tiền hàng với số tiền thiệt hại thực tế của người mua, lợi nhuận thuần túy hay khoản thu lợi bất chính (vốn đòi hỏi phải bóc tách chi phí hợp lý và giá trị sử dụng thực theo kết luận của cơ quan tài phán).</w:t>
-      </w:r>
-    </w:p>
-    <w:p>
-      <w:pPr>
-        <w:pStyle w:val="u4"/>
-      </w:pPr>
-      <w:r>
-        <w:rPr>
-          <w:rFonts w:ascii="Times New Roman" w:eastAsia="Times New Roman" w:hAnsi="Times New Roman"/>
-          <w:b w:val="0"/>
-          <w:i w:val="0"/>
-        </w:rPr>
-        <w:t>C. Mối quan hệ nhân quả ở mức độ học thuật</w:t>
-      </w:r>
-    </w:p>
-    <w:p>
-      <w:pPr>
-        <w:spacing w:after="80"/>
-      </w:pPr>
-      <w:r>
-        <w:t>Nội dung quảng cáo sai sự thật và hình ảnh cắt ghép có khả năng tác động trực tiếp đến nhận thức, định hướng niềm tin của người tiếp cận thông tin trên mạng xã hội. Mối liên hệ giữa quy trình quảng cáo sai lệch và kết quả 5.429 đơn hàng được xác lập tạo cơ sở lý luận để phân tích mối quan hệ nhân quả trong học phần Pháp luật đại cương. Dưới góc độ nghiên cứu học thuật, báo cáo không khái quát rằng toàn bộ 5.429 đơn hàng đều xuất phát duy nhất từ yếu tố quảng cáo gian dối do dữ liệu công khai chưa cung cấp đ</w:t>
-      </w:r>
-      <w:r>
-        <w:t>ộng cơ mua hàng cụ thể của từng người mua.</w:t>
-      </w:r>
-    </w:p>
-    <w:p>
-      <w:pPr>
-        <w:pStyle w:val="u3"/>
-      </w:pPr>
-      <w:r>
-        <w:rPr>
-          <w:rFonts w:ascii="Times New Roman" w:eastAsia="Times New Roman" w:hAnsi="Times New Roman"/>
-          <w:b w:val="0"/>
-        </w:rPr>
-        <w:t>3.2.4. Nhận xét tiểu mục 3.2</w:t>
-      </w:r>
-    </w:p>
-    <w:p>
-      <w:pPr>
-        <w:spacing w:after="80"/>
-      </w:pPr>
-      <w:r>
-        <w:t>Mặt khách quan thể hiện rõ chuỗi hành vi hành động được triển khai theo nhiều khâu, sử dụng công nghệ số để phát tán thông tin sai lệch diện rộng, tạo ra quy mô giao dịch đáng kể trên thị trường trực tuyến.</w:t>
-      </w:r>
-    </w:p>
-    <w:p>
-      <w:pPr>
         <w:pStyle w:val="u2"/>
       </w:pPr>
-      <w:bookmarkStart w:id="21" w:name="_Toc237715707"/>
+      <w:bookmarkStart w:id="21" w:name="_Toc237716097"/>
       <w:r>
         <w:rPr>
           <w:rFonts w:ascii="Times New Roman" w:eastAsia="Times New Roman" w:hAnsi="Times New Roman"/>
@@ -6675,7 +5943,7 @@
           <w:rFonts w:ascii="Times New Roman" w:eastAsia="Times New Roman" w:hAnsi="Times New Roman"/>
           <w:b w:val="0"/>
         </w:rPr>
-        <w:t>3.3.1. Cơ sở lý luận áp dụng</w:t>
+        <w:t>3.3.1. Đánh giá năng lực trách nhiệm pháp lý</w:t>
       </w:r>
     </w:p>
     <w:p>
@@ -6683,7 +5951,39 @@
         <w:spacing w:after="80"/>
       </w:pPr>
       <w:r>
-        <w:t>Chủ thể của vi phạm pháp luật là cá nhân hoặc tổ chức có năng lực trách nhiệm pháp lý đã thực hiện hành vi vi phạm [5]. Năng lực trách nhiệm pháp lý của cá nhân bao gồm việc đạt độ tuổi luật định và có trạng thái tâm thần bình thường, đủ khả năng nhận thức và điều khiển hành vi.</w:t>
+        <w:t>Chủ thể của vi phạm pháp luật phải thỏa mãn điều kiện về độ tuổi và khả năng nhận thức, điều khiển hành vi [5]:</w:t>
+      </w:r>
+    </w:p>
+    <w:p>
+      <w:pPr>
+        <w:pStyle w:val="Duudong"/>
+        <w:spacing w:after="60"/>
+        <w:ind w:left="709" w:firstLine="0"/>
+      </w:pPr>
+      <w:r>
+        <w:rPr>
+          <w:b/>
+        </w:rPr>
+        <w:t>Về độ tuổi:</w:t>
+      </w:r>
+      <w:r>
+        <w:t xml:space="preserve"> Bị can Nguyễn Tiến Đạt sinh năm 1997, đã đủ tuổi thành niên tại thời điểm diễn ra vụ việc (năm 2026). Đối với 20 bị can còn lại, tài liệu công khai chưa nêu năm sinh cụ thể; quyết định khởi tố phản ánh việc thẩm tra ban đầu của cơ quan điều tra, nhưng chưa đủ dữ liệu công khai để đánh giá độ tuổi chính xác của từng người.</w:t>
+      </w:r>
+    </w:p>
+    <w:p>
+      <w:pPr>
+        <w:pStyle w:val="Duudong"/>
+        <w:spacing w:after="60"/>
+        <w:ind w:left="709" w:firstLine="0"/>
+      </w:pPr>
+      <w:r>
+        <w:rPr>
+          <w:b/>
+        </w:rPr>
+        <w:t>Về khả năng nhận thức:</w:t>
+      </w:r>
+      <w:r>
+        <w:t xml:space="preserve"> Nguồn tin ghi nhận các cá nhân tham gia vào các khâu công việc cụ thể. Việc thẩm định chính xác tình trạng tâm thần và khả năng nhận thức của từng bị can thuộc thẩm quyền của cơ quan tiến hành tố tụng.</w:t>
       </w:r>
     </w:p>
     <w:p>
@@ -6695,7 +5995,7 @@
           <w:rFonts w:ascii="Times New Roman" w:eastAsia="Times New Roman" w:hAnsi="Times New Roman"/>
           <w:b w:val="0"/>
         </w:rPr>
-        <w:t>3.3.2. Dữ kiện thực tế ghi nhận</w:t>
+        <w:t>3.3.2. Phân hóa vai trò của các nhóm cá nhân</w:t>
       </w:r>
     </w:p>
     <w:p>
@@ -6703,150 +6003,77 @@
         <w:spacing w:after="80"/>
       </w:pPr>
       <w:r>
-        <w:t xml:space="preserve">Cơ quan CSĐT Công an tỉnh Phú Thọ đã ra quyết định khởi tố đối với </w:t>
+        <w:t>Dữ liệu công khai cho thấy có sự phân công công việc giữa các cá nhân:</w:t>
+      </w:r>
+    </w:p>
+    <w:p>
+      <w:pPr>
+        <w:spacing w:after="60"/>
+        <w:ind w:left="709" w:firstLine="0"/>
+      </w:pPr>
+      <w:r>
+        <w:t xml:space="preserve">1. </w:t>
       </w:r>
       <w:r>
         <w:rPr>
           <w:b/>
         </w:rPr>
-        <w:t>21 bị can</w:t>
-      </w:r>
-      <w:r>
-        <w:t>, trong đó Nguyễn Tiến Đạt sinh năm 1997 được xác định là người tổ chức [6]. Phùng Thị Nguyệt Ánh là người liên quan đang tiếp tục được làm rõ hành vi; các nhân sự khác được phân công theo nhóm marketing, bán hàng, vận đơn [6].</w:t>
+        <w:t>Nguyễn Tiến Đạt (Người tổ chức điều hành):</w:t>
+      </w:r>
+      <w:r>
+        <w:t xml:space="preserve"> Thỏa thuận giá mua sản phẩm, chỉ đạo sản xuất nội dung quảng cáo và điều hành hoạt động bán hàng [6].</w:t>
       </w:r>
     </w:p>
     <w:p>
       <w:pPr>
-        <w:pStyle w:val="u3"/>
-      </w:pPr>
+        <w:spacing w:after="60"/>
+        <w:ind w:left="709" w:firstLine="0"/>
+      </w:pPr>
+      <w:r>
+        <w:t xml:space="preserve">2. </w:t>
+      </w:r>
+      <w:r>
+        <w:rPr>
+          <w:b/>
+        </w:rPr>
+        <w:t>Phùng Thị Nguyệt Ánh (Người liên quan nguồn hàng):</w:t>
+      </w:r>
+      <w:r>
+        <w:t xml:space="preserve"> Giám đốc doanh nghiệp cung ứng sản phẩm; mức độ liên đới đang được cơ quan công an tiếp tục làm rõ [6].</w:t>
+      </w:r>
+    </w:p>
+    <w:p>
+      <w:pPr>
+        <w:spacing w:after="60"/>
+        <w:ind w:left="709" w:firstLine="0"/>
+      </w:pPr>
+      <w:r>
+        <w:lastRenderedPageBreak/>
+        <w:t xml:space="preserve">3. </w:t>
+      </w:r>
+      <w:r>
+        <w:rPr>
+          <w:b/>
+        </w:rPr>
+        <w:t>Nhóm nhân sự hỗ trợ:</w:t>
+      </w:r>
+      <w:r>
+        <w:t xml:space="preserve"> Thực hiện các công việc kỹ thuật marketing, tư vấn bán hàng, vận đơn và đóng gói [6]. Mức độ nhận thức và trách nhiệm của từng cá nhân sẽ được cơ quan tố tụng cá thể hóa theo chứng cứ cụ thể.</w:t>
+      </w:r>
+    </w:p>
+    <w:p>
+      <w:pPr>
+        <w:pStyle w:val="u2"/>
+      </w:pPr>
+      <w:bookmarkStart w:id="22" w:name="_Toc237716098"/>
       <w:r>
         <w:rPr>
           <w:rFonts w:ascii="Times New Roman" w:eastAsia="Times New Roman" w:hAnsi="Times New Roman"/>
           <w:b w:val="0"/>
         </w:rPr>
-        <w:lastRenderedPageBreak/>
-        <w:t>3.3.3. Phân tích pháp lý chi tiết</w:t>
-      </w:r>
-    </w:p>
-    <w:p>
-      <w:pPr>
-        <w:pStyle w:val="u4"/>
-      </w:pPr>
-      <w:r>
-        <w:rPr>
-          <w:rFonts w:ascii="Times New Roman" w:eastAsia="Times New Roman" w:hAnsi="Times New Roman"/>
-          <w:b w:val="0"/>
-          <w:i w:val="0"/>
-        </w:rPr>
-        <w:t>A. Đánh giá năng lực trách nhiệm pháp lý</w:t>
-      </w:r>
-    </w:p>
-    <w:p>
-      <w:pPr>
-        <w:pStyle w:val="Duudong"/>
-        <w:spacing w:after="60"/>
-        <w:ind w:left="709" w:firstLine="0"/>
-      </w:pPr>
-      <w:r>
-        <w:rPr>
-          <w:b/>
-        </w:rPr>
-        <w:t>Về độ tuổi:</w:t>
-      </w:r>
-      <w:r>
-        <w:t xml:space="preserve"> Bị can Nguyễn Tiến Đạt sinh năm 1997, đã đủ tuổi thành niên tại thời điểm diễn ra vụ việc (năm 2026). Đối với 20 bị can còn lại, tài liệu công khai chưa công bố năm sinh cụ thể; quyết định khởi tố của cơ quan điều tra là bối cảnh tố tụng phản ánh việc thẩm tra ban đầu, nhưng dữ liệu này chưa đủ để đánh giá độc lập về độ tuổi chính xác của từng cá nhân.</w:t>
-      </w:r>
-    </w:p>
-    <w:p>
-      <w:pPr>
-        <w:pStyle w:val="Duudong"/>
-        <w:spacing w:after="60"/>
-        <w:ind w:left="709" w:firstLine="0"/>
-      </w:pPr>
-      <w:r>
-        <w:rPr>
-          <w:b/>
-        </w:rPr>
-        <w:t>Về khả năng nhận thức và điều khiển hành vi:</w:t>
-      </w:r>
-      <w:r>
-        <w:t xml:space="preserve"> Nguồn tin công khai ghi nhận các cá nhân tham gia vào các khâu công việc cụ thể. Tuy nhiên, các tài liệu công khai được tiếp cận chưa cung cấp đủ dữ liệu để đánh giá độc lập tình trạng nhận thức và điều khiển hành vi của từng bị can; việc xác định chính xác năng lực trách nhiệm pháp lý thuộc thẩm quyền chuyên môn của cơ quan tiến hành tố tụng.</w:t>
-      </w:r>
-    </w:p>
-    <w:p>
-      <w:pPr>
-        <w:pStyle w:val="u4"/>
-      </w:pPr>
-      <w:r>
-        <w:rPr>
-          <w:rFonts w:ascii="Times New Roman" w:eastAsia="Times New Roman" w:hAnsi="Times New Roman"/>
-          <w:b w:val="0"/>
-          <w:i w:val="0"/>
-        </w:rPr>
-        <w:t>B. Phân hóa vai trò của các nhóm cá nhân</w:t>
-      </w:r>
-    </w:p>
-    <w:p>
-      <w:pPr>
-        <w:spacing w:after="80"/>
-      </w:pPr>
-      <w:r>
-        <w:t>Dữ liệu công khai phản ánh sự phân công vai trò bước đầu:</w:t>
-      </w:r>
-    </w:p>
-    <w:p>
-      <w:pPr>
-        <w:spacing w:after="60"/>
-        <w:ind w:left="709" w:firstLine="0"/>
-      </w:pPr>
-      <w:r>
-        <w:t xml:space="preserve">1. </w:t>
-      </w:r>
-      <w:r>
-        <w:rPr>
-          <w:b/>
-        </w:rPr>
-        <w:t>Nguyễn Tiến Đạt (Người tổ chức điều hành):</w:t>
-      </w:r>
-      <w:r>
-        <w:t xml:space="preserve"> Thỏa thuận giá mua sản phẩm, chỉ đạo sản xuất nội dung quảng cáo và điều hành hoạt động bán hàng [6].</w:t>
-      </w:r>
-    </w:p>
-    <w:p>
-      <w:pPr>
-        <w:spacing w:after="60"/>
-        <w:ind w:left="709" w:firstLine="0"/>
-      </w:pPr>
-      <w:r>
-        <w:t xml:space="preserve">2. </w:t>
-      </w:r>
-      <w:r>
-        <w:rPr>
-          <w:b/>
-        </w:rPr>
-        <w:t>Phùng Thị Nguyệt Ánh (Người liên quan nguồn hàng):</w:t>
-      </w:r>
-      <w:r>
-        <w:t xml:space="preserve"> Cung ứng sản phẩm; mức độ liên đới đang được cơ quan công an tiếp tục làm rõ [6].</w:t>
-      </w:r>
-    </w:p>
-    <w:p>
-      <w:pPr>
-        <w:spacing w:after="60"/>
-        <w:ind w:left="709" w:firstLine="0"/>
-      </w:pPr>
-      <w:r>
-        <w:t xml:space="preserve">3. </w:t>
-      </w:r>
-      <w:r>
-        <w:rPr>
-          <w:b/>
-        </w:rPr>
-        <w:t>Các nhóm nhân sự hỗ trợ:</w:t>
-      </w:r>
-      <w:r>
-        <w:t xml:space="preserve"> Thực hiện các khâu kỹ thuật marketing, tư vấn bán hàng, vận đơn và đóng hàng [6]. Mức độ nhận thức của từng nhân sự cần được cơ quan tố tụng cá thể hóa theo chứng cứ cụ thể.</w:t>
-      </w:r>
+        <w:t>3.4. Phân tích yếu tố Mặt chủ quan của vi phạm pháp luật</w:t>
+      </w:r>
+      <w:bookmarkEnd w:id="22"/>
     </w:p>
     <w:p>
       <w:pPr>
@@ -6857,224 +6084,144 @@
           <w:rFonts w:ascii="Times New Roman" w:eastAsia="Times New Roman" w:hAnsi="Times New Roman"/>
           <w:b w:val="0"/>
         </w:rPr>
-        <w:t>3.3.4. Nhận xét tiểu mục 3.3</w:t>
+        <w:t>3.4.1. Phân tích đối với người tổ chức (Nguyễn Tiến Đạt)</w:t>
       </w:r>
     </w:p>
     <w:p>
       <w:pPr>
-        <w:spacing w:after="80"/>
-      </w:pPr>
-      <w:r>
-        <w:t>Về mặt lý luận, dữ kiện công khai cho phép xác định độ tuổi thành niên của người tổ chức (Nguyễn Tiến Đạt), trong khi các chủ thể khác cần thêm dữ liệu chứng cứ để đánh giá đầy đủ. Hoạt động thực tế thể hiện sự phân công công việc rõ nét giữa các khâu.</w:t>
+        <w:pStyle w:val="Duudong"/>
+        <w:spacing w:after="60"/>
+        <w:ind w:left="709" w:firstLine="0"/>
+      </w:pPr>
+      <w:r>
+        <w:rPr>
+          <w:b/>
+        </w:rPr>
+        <w:t>Về yếu tố Lỗi:</w:t>
+      </w:r>
+      <w:r>
+        <w:t xml:space="preserve"> Việc chỉ đạo tạo lập nội dung cắt ghép hình ảnh và phóng đại công dụng sản phẩm để tạo niềm tin cho người mua tạo cơ sở để phân tích theo hướng </w:t>
+      </w:r>
+      <w:r>
+        <w:rPr>
+          <w:b/>
+        </w:rPr>
+        <w:t>Lỗi cố ý trực tiếp</w:t>
+      </w:r>
+      <w:r>
+        <w:t>:</w:t>
       </w:r>
     </w:p>
     <w:p>
       <w:pPr>
-        <w:pStyle w:val="u2"/>
-      </w:pPr>
-      <w:bookmarkStart w:id="22" w:name="_Toc237715708"/>
+        <w:pStyle w:val="Duudong"/>
+        <w:spacing w:after="60"/>
+        <w:ind w:left="709" w:firstLine="0"/>
+      </w:pPr>
+      <w:r>
+        <w:rPr>
+          <w:i/>
+        </w:rPr>
+        <w:t>Về lý trí:</w:t>
+      </w:r>
+      <w:r>
+        <w:t xml:space="preserve"> Nhận thức rõ giá mua 23.000 đồng và nội dung quảng cáo cắt ghép là không đúng sự thật; thấy trước việc quảng cáo này sẽ khiến khách hàng tin tưởng đặt mua.</w:t>
+      </w:r>
+    </w:p>
+    <w:p>
+      <w:pPr>
+        <w:pStyle w:val="Duudong"/>
+        <w:spacing w:after="60"/>
+        <w:ind w:left="709" w:firstLine="0"/>
+      </w:pPr>
+      <w:r>
+        <w:rPr>
+          <w:i/>
+        </w:rPr>
+        <w:t>Về ý chí:</w:t>
+      </w:r>
+      <w:r>
+        <w:t xml:space="preserve"> Mong muốn bán được nhiều sản phẩm với mức giá 199.000 đồng/sản phẩm để thu tiền.</w:t>
+      </w:r>
+    </w:p>
+    <w:p>
+      <w:pPr>
+        <w:pStyle w:val="Duudong"/>
+        <w:spacing w:after="60"/>
+        <w:ind w:left="709" w:firstLine="0"/>
+      </w:pPr>
+      <w:r>
+        <w:rPr>
+          <w:b/>
+        </w:rPr>
+        <w:t>Về Động cơ và Mục đích:</w:t>
+      </w:r>
+    </w:p>
+    <w:p>
+      <w:pPr>
+        <w:pStyle w:val="Duudong"/>
+        <w:spacing w:after="60"/>
+        <w:ind w:left="709" w:firstLine="0"/>
+      </w:pPr>
+      <w:r>
+        <w:rPr>
+          <w:i/>
+        </w:rPr>
+        <w:t>Động cơ:</w:t>
+      </w:r>
+      <w:r>
+        <w:t xml:space="preserve"> Chênh lệch giữa giá mua và giá bán cùng quy mô tiếp thị tạo cơ sở phân tích theo hướng có động cơ vụ lợi kinh tế.</w:t>
+      </w:r>
+    </w:p>
+    <w:p>
+      <w:pPr>
+        <w:pStyle w:val="Duudong"/>
+        <w:spacing w:after="60"/>
+        <w:ind w:left="709" w:firstLine="0"/>
+      </w:pPr>
+      <w:r>
+        <w:rPr>
+          <w:i/>
+        </w:rPr>
+        <w:t>Mục đích:</w:t>
+      </w:r>
+      <w:r>
+        <w:t xml:space="preserve"> Tạo niềm tin để người tiếp cận đặt mua sản phẩm và phát sinh giao dịch bán hàng [6].</w:t>
+      </w:r>
+    </w:p>
+    <w:p>
+      <w:pPr>
+        <w:pStyle w:val="u3"/>
+      </w:pPr>
       <w:r>
         <w:rPr>
           <w:rFonts w:ascii="Times New Roman" w:eastAsia="Times New Roman" w:hAnsi="Times New Roman"/>
           <w:b w:val="0"/>
         </w:rPr>
-        <w:lastRenderedPageBreak/>
-        <w:t>3.4. Phân tích yếu tố Mặt chủ quan của vi phạm pháp luật</w:t>
-      </w:r>
-      <w:bookmarkEnd w:id="22"/>
+        <w:t>3.4.2. Giới hạn đánh giá đối với nhân sự hỗ trợ</w:t>
+      </w:r>
     </w:p>
     <w:p>
       <w:pPr>
-        <w:pStyle w:val="u3"/>
-      </w:pPr>
+        <w:spacing w:after="80"/>
+      </w:pPr>
+      <w:r>
+        <w:t>Đối với các nhân viên tham gia marketing, tư vấn, đóng gói và vận chuyển, tài liệu ban đầu chưa thể hiện chi tiết ý thức chủ quan của từng người. Trong quá trình điều tra, cơ quan chức năng sẽ làm rõ mức độ nhận thức của từng nhân viên để xác định vai trò, mức độ tham gia và trách nhiệm pháp lý tương ứng.</w:t>
+      </w:r>
+    </w:p>
+    <w:p>
+      <w:pPr>
+        <w:pStyle w:val="u2"/>
+      </w:pPr>
+      <w:bookmarkStart w:id="23" w:name="_Toc237716099"/>
       <w:r>
         <w:rPr>
           <w:rFonts w:ascii="Times New Roman" w:eastAsia="Times New Roman" w:hAnsi="Times New Roman"/>
           <w:b w:val="0"/>
         </w:rPr>
-        <w:t>3.4.1. Cơ sở lý luận áp dụng</w:t>
-      </w:r>
-    </w:p>
-    <w:p>
-      <w:pPr>
-        <w:spacing w:after="80"/>
-      </w:pPr>
-      <w:r>
-        <w:t>Mặt chủ quan phản ánh trạng thái tâm lý nội tâm của chủ thể đối với hành vi và hậu quả do hành vi đó gây ra, bao gồm lỗi, động cơ và mục đích [5]. Việc phân tích mặt chủ quan phải căn cứ vào hành vi khách quan đã bộc lộ và có sự phân hóa theo từng vị trí vai trò.</w:t>
-      </w:r>
-    </w:p>
-    <w:p>
-      <w:pPr>
-        <w:pStyle w:val="u3"/>
-      </w:pPr>
-      <w:r>
-        <w:rPr>
-          <w:rFonts w:ascii="Times New Roman" w:eastAsia="Times New Roman" w:hAnsi="Times New Roman"/>
-          <w:b w:val="0"/>
-        </w:rPr>
-        <w:t>3.4.2. Phân tích chi tiết theo vai trò chủ thể</w:t>
-      </w:r>
-    </w:p>
-    <w:p>
-      <w:pPr>
-        <w:pStyle w:val="u4"/>
-      </w:pPr>
-      <w:r>
-        <w:rPr>
-          <w:rFonts w:ascii="Times New Roman" w:eastAsia="Times New Roman" w:hAnsi="Times New Roman"/>
-          <w:b w:val="0"/>
-          <w:i w:val="0"/>
-        </w:rPr>
-        <w:t>A. Dữ kiện và đánh giá đối với Nguyễn Tiến Đạt</w:t>
-      </w:r>
-    </w:p>
-    <w:p>
-      <w:pPr>
-        <w:pStyle w:val="Duudong"/>
-        <w:spacing w:after="60"/>
-        <w:ind w:left="709" w:firstLine="0"/>
-      </w:pPr>
-      <w:r>
-        <w:rPr>
-          <w:b/>
-        </w:rPr>
-        <w:t>Về yếu tố Lỗi:</w:t>
-      </w:r>
-      <w:r>
-        <w:t xml:space="preserve"> Dữ kiện Đạt chỉ đạo dùng bài viết, video chỉnh sửa/cắt ghép và nội dung phóng đại, sai lệch để tạo niềm tin cho khách hàng cho thấy dấu hiệu và tạo cơ sở để phân tích theo hướng </w:t>
-      </w:r>
-      <w:r>
-        <w:rPr>
-          <w:b/>
-        </w:rPr>
-        <w:t>Lỗi cố ý trực tiếp</w:t>
-      </w:r>
-      <w:r>
-        <w:t>:</w:t>
-      </w:r>
-    </w:p>
-    <w:p>
-      <w:pPr>
-        <w:pStyle w:val="Duudong"/>
-        <w:spacing w:after="60"/>
-        <w:ind w:left="709" w:firstLine="0"/>
-      </w:pPr>
-      <w:r>
-        <w:rPr>
-          <w:i/>
-        </w:rPr>
-        <w:t>Về lý trí:</w:t>
-      </w:r>
-      <w:r>
-        <w:t xml:space="preserve"> Nhận thức rõ mức giá mua 23.000 đồng và việc sử dụng nội dung cắt ghép, sai lệch là không trung thực; thấy trước khách hàng sẽ tin vào quảng cáo để mua hàng.</w:t>
-      </w:r>
-    </w:p>
-    <w:p>
-      <w:pPr>
-        <w:pStyle w:val="Duudong"/>
-        <w:spacing w:after="60"/>
-        <w:ind w:left="709" w:firstLine="0"/>
-      </w:pPr>
-      <w:r>
-        <w:rPr>
-          <w:i/>
-        </w:rPr>
-        <w:t>Về ý chí:</w:t>
-      </w:r>
-      <w:r>
-        <w:t xml:space="preserve"> Chủ động thúc đẩy nội dung tiếp thị nhằm mục đích bán được nhiều đơn hàng với mức giá 199.000 đồng/sản phẩm.</w:t>
-      </w:r>
-    </w:p>
-    <w:p>
-      <w:pPr>
-        <w:pStyle w:val="Duudong"/>
-        <w:spacing w:after="60"/>
-        <w:ind w:left="709" w:firstLine="0"/>
-      </w:pPr>
-      <w:r>
-        <w:rPr>
-          <w:b/>
-        </w:rPr>
-        <w:t>Về Động cơ và Mục đích:</w:t>
-      </w:r>
-    </w:p>
-    <w:p>
-      <w:pPr>
-        <w:pStyle w:val="Duudong"/>
-        <w:spacing w:after="60"/>
-        <w:ind w:left="709" w:firstLine="0"/>
-      </w:pPr>
-      <w:r>
-        <w:rPr>
-          <w:i/>
-        </w:rPr>
-        <w:t>Động cơ:</w:t>
-      </w:r>
-      <w:r>
-        <w:t xml:space="preserve"> Các dữ kiện về chênh lệch giá, tổ chức quảng cáo và hoạt động bán hàng tạo cơ sở để phân tích theo hướng có động cơ vụ lợi kinh tế.</w:t>
-      </w:r>
-    </w:p>
-    <w:p>
-      <w:pPr>
-        <w:pStyle w:val="Duudong"/>
-        <w:spacing w:after="60"/>
-        <w:ind w:left="709" w:firstLine="0"/>
-      </w:pPr>
-      <w:r>
-        <w:rPr>
-          <w:i/>
-        </w:rPr>
-        <w:t>Mục đích:</w:t>
-      </w:r>
-      <w:r>
-        <w:t xml:space="preserve"> Tạo niềm tin để người tiếp cận đặt mua sản phẩm và phát sinh giao dịch từ các đơn hàng [6].</w:t>
-      </w:r>
-    </w:p>
-    <w:p>
-      <w:pPr>
-        <w:pStyle w:val="u4"/>
-      </w:pPr>
-      <w:r>
-        <w:rPr>
-          <w:rFonts w:ascii="Times New Roman" w:eastAsia="Times New Roman" w:hAnsi="Times New Roman"/>
-          <w:b w:val="0"/>
-          <w:i w:val="0"/>
-        </w:rPr>
-        <w:t>B. Những gì có thể suy luận về mục đích kinh tế</w:t>
-      </w:r>
-    </w:p>
-    <w:p>
-      <w:pPr>
-        <w:spacing w:after="80"/>
-      </w:pPr>
-      <w:r>
-        <w:t>Chênh lệch giữa giá mua 23.000 đồng và giá bán 199.000 đồng cùng chi phí tiếp thị qua mạng xã hội phản ánh định hướng thúc đẩy giao dịch bán hàng trên thực tế. Dưới góc độ nghiên cứu học thuật, báo cáo không tự ý tính toán con số lợi nhuận thuần túy hay khoản thu lợi bất chính khi cơ quan tiến hành tố tụng chưa công bố kết luận tài chính chính thức.</w:t>
-      </w:r>
-    </w:p>
-    <w:p>
-      <w:pPr>
-        <w:pStyle w:val="u4"/>
-      </w:pPr>
-      <w:r>
-        <w:rPr>
-          <w:rFonts w:ascii="Times New Roman" w:eastAsia="Times New Roman" w:hAnsi="Times New Roman"/>
-          <w:b w:val="0"/>
-          <w:i w:val="0"/>
-        </w:rPr>
-        <w:t>C. Giới hạn dữ liệu đối với nhân sự hỗ trợ</w:t>
-      </w:r>
-    </w:p>
-    <w:p>
-      <w:pPr>
-        <w:spacing w:after="80"/>
-      </w:pPr>
-      <w:r>
-        <w:t xml:space="preserve">Đối với các nhân viên ở khâu marketing, bán hàng, vận đơn và đóng gói, tài liệu ban đầu chưa thể hiện chi tiết ý thức chủ quan của từng người. Cơ quan tiến hành </w:t>
-      </w:r>
-      <w:r>
-        <w:lastRenderedPageBreak/>
-        <w:t>tố tụng sẽ làm rõ nhận thức của từng cá nhân để cá thể hóa trách nhiệm, xác định vai trò, mức độ tham gia và trách nhiệm pháp lý của từng cá nhân.</w:t>
-      </w:r>
+        <w:t>3.5. Tổng hợp bốn yếu tố cấu thành vi phạm pháp luật</w:t>
+      </w:r>
+      <w:bookmarkEnd w:id="23"/>
     </w:p>
     <w:p>
       <w:pPr>
@@ -7087,391 +6234,7 @@
           <w:b/>
           <w:sz w:val="22"/>
         </w:rPr>
-        <w:t>Bảng 6. Đối chiếu lập luận khoa học về mặt chủ quan</w:t>
-      </w:r>
-    </w:p>
-    <w:tbl>
-      <w:tblPr>
-        <w:tblStyle w:val="LiBang"/>
-        <w:tblW w:w="0" w:type="auto"/>
-        <w:jc w:val="center"/>
-        <w:tblLook w:val="04A0" w:firstRow="1" w:lastRow="0" w:firstColumn="1" w:lastColumn="0" w:noHBand="0" w:noVBand="1"/>
-      </w:tblPr>
-      <w:tblGrid>
-        <w:gridCol w:w="2154"/>
-        <w:gridCol w:w="4082"/>
-        <w:gridCol w:w="2721"/>
-      </w:tblGrid>
-      <w:tr>
-        <w:trPr>
-          <w:cantSplit/>
-          <w:tblHeader/>
-          <w:jc w:val="center"/>
-        </w:trPr>
-        <w:tc>
-          <w:tcPr>
-            <w:tcW w:w="2154" w:type="dxa"/>
-            <w:vAlign w:val="center"/>
-          </w:tcPr>
-          <w:p>
-            <w:pPr>
-              <w:spacing w:before="40" w:after="40" w:line="276" w:lineRule="auto"/>
-              <w:ind w:firstLine="0"/>
-              <w:jc w:val="center"/>
-            </w:pPr>
-            <w:r>
-              <w:rPr>
-                <w:b/>
-                <w:sz w:val="19"/>
-              </w:rPr>
-              <w:t>Tiêu chí</w:t>
-            </w:r>
-          </w:p>
-        </w:tc>
-        <w:tc>
-          <w:tcPr>
-            <w:tcW w:w="4082" w:type="dxa"/>
-            <w:vAlign w:val="center"/>
-          </w:tcPr>
-          <w:p>
-            <w:pPr>
-              <w:spacing w:before="40" w:after="40" w:line="276" w:lineRule="auto"/>
-              <w:ind w:firstLine="0"/>
-              <w:jc w:val="center"/>
-            </w:pPr>
-            <w:r>
-              <w:rPr>
-                <w:b/>
-                <w:sz w:val="19"/>
-              </w:rPr>
-              <w:t>Nội dung phân tích theo chuỗi lập luận</w:t>
-            </w:r>
-          </w:p>
-        </w:tc>
-        <w:tc>
-          <w:tcPr>
-            <w:tcW w:w="2721" w:type="dxa"/>
-            <w:vAlign w:val="center"/>
-          </w:tcPr>
-          <w:p>
-            <w:pPr>
-              <w:spacing w:before="40" w:after="40" w:line="276" w:lineRule="auto"/>
-              <w:ind w:firstLine="0"/>
-              <w:jc w:val="center"/>
-            </w:pPr>
-            <w:r>
-              <w:rPr>
-                <w:b/>
-                <w:sz w:val="19"/>
-              </w:rPr>
-              <w:t>Đánh giá học thuật</w:t>
-            </w:r>
-          </w:p>
-        </w:tc>
-      </w:tr>
-      <w:tr>
-        <w:trPr>
-          <w:cantSplit/>
-          <w:jc w:val="center"/>
-        </w:trPr>
-        <w:tc>
-          <w:tcPr>
-            <w:tcW w:w="2154" w:type="dxa"/>
-            <w:vAlign w:val="center"/>
-          </w:tcPr>
-          <w:p>
-            <w:pPr>
-              <w:spacing w:before="40" w:after="40" w:line="276" w:lineRule="auto"/>
-              <w:ind w:firstLine="0"/>
-              <w:jc w:val="left"/>
-            </w:pPr>
-            <w:r>
-              <w:rPr>
-                <w:b/>
-                <w:sz w:val="19"/>
-              </w:rPr>
-              <w:t>Fact (Dữ kiện)</w:t>
-            </w:r>
-          </w:p>
-        </w:tc>
-        <w:tc>
-          <w:tcPr>
-            <w:tcW w:w="4082" w:type="dxa"/>
-            <w:vAlign w:val="center"/>
-          </w:tcPr>
-          <w:p>
-            <w:pPr>
-              <w:spacing w:before="40" w:after="40" w:line="276" w:lineRule="auto"/>
-              <w:ind w:firstLine="0"/>
-              <w:jc w:val="left"/>
-            </w:pPr>
-            <w:r>
-              <w:rPr>
-                <w:sz w:val="19"/>
-              </w:rPr>
-              <w:t>Đạt mua sản phẩm giá 23k, bán 199k; chỉ đạo nội dung cắt ghép, phóng đại công dụng [6].</w:t>
-            </w:r>
-          </w:p>
-        </w:tc>
-        <w:tc>
-          <w:tcPr>
-            <w:tcW w:w="2721" w:type="dxa"/>
-            <w:vAlign w:val="center"/>
-          </w:tcPr>
-          <w:p>
-            <w:pPr>
-              <w:spacing w:before="40" w:after="40" w:line="276" w:lineRule="auto"/>
-              <w:ind w:firstLine="0"/>
-              <w:jc w:val="left"/>
-            </w:pPr>
-            <w:r>
-              <w:rPr>
-                <w:sz w:val="19"/>
-              </w:rPr>
-              <w:t>Dữ liệu chính thức từ cơ quan điều tra</w:t>
-            </w:r>
-          </w:p>
-        </w:tc>
-      </w:tr>
-      <w:tr>
-        <w:trPr>
-          <w:cantSplit/>
-          <w:jc w:val="center"/>
-        </w:trPr>
-        <w:tc>
-          <w:tcPr>
-            <w:tcW w:w="2154" w:type="dxa"/>
-            <w:vAlign w:val="center"/>
-          </w:tcPr>
-          <w:p>
-            <w:pPr>
-              <w:spacing w:before="40" w:after="40" w:line="276" w:lineRule="auto"/>
-              <w:ind w:firstLine="0"/>
-              <w:jc w:val="left"/>
-            </w:pPr>
-            <w:r>
-              <w:rPr>
-                <w:b/>
-                <w:sz w:val="19"/>
-              </w:rPr>
-              <w:t>Interpretation</w:t>
-            </w:r>
-          </w:p>
-        </w:tc>
-        <w:tc>
-          <w:tcPr>
-            <w:tcW w:w="4082" w:type="dxa"/>
-            <w:vAlign w:val="center"/>
-          </w:tcPr>
-          <w:p>
-            <w:pPr>
-              <w:spacing w:before="40" w:after="40" w:line="276" w:lineRule="auto"/>
-              <w:ind w:firstLine="0"/>
-              <w:jc w:val="left"/>
-            </w:pPr>
-            <w:r>
-              <w:rPr>
-                <w:sz w:val="19"/>
-              </w:rPr>
-              <w:t>Đạt chủ động định hướng tiếp thị sai sự thật để tạo niềm tin và thúc đẩy giao dịch.</w:t>
-            </w:r>
-          </w:p>
-        </w:tc>
-        <w:tc>
-          <w:tcPr>
-            <w:tcW w:w="2721" w:type="dxa"/>
-            <w:vAlign w:val="center"/>
-          </w:tcPr>
-          <w:p>
-            <w:pPr>
-              <w:spacing w:before="40" w:after="40" w:line="276" w:lineRule="auto"/>
-              <w:ind w:firstLine="0"/>
-              <w:jc w:val="left"/>
-            </w:pPr>
-            <w:r>
-              <w:rPr>
-                <w:sz w:val="19"/>
-              </w:rPr>
-              <w:t>Suy luận logic, phù hợp với diễn biến khách quan</w:t>
-            </w:r>
-          </w:p>
-        </w:tc>
-      </w:tr>
-      <w:tr>
-        <w:trPr>
-          <w:cantSplit/>
-          <w:jc w:val="center"/>
-        </w:trPr>
-        <w:tc>
-          <w:tcPr>
-            <w:tcW w:w="2154" w:type="dxa"/>
-            <w:vAlign w:val="center"/>
-          </w:tcPr>
-          <w:p>
-            <w:pPr>
-              <w:spacing w:before="40" w:after="40" w:line="276" w:lineRule="auto"/>
-              <w:ind w:firstLine="0"/>
-              <w:jc w:val="left"/>
-            </w:pPr>
-            <w:r>
-              <w:rPr>
-                <w:b/>
-                <w:sz w:val="19"/>
-              </w:rPr>
-              <w:t>Legal Reasoning</w:t>
-            </w:r>
-          </w:p>
-        </w:tc>
-        <w:tc>
-          <w:tcPr>
-            <w:tcW w:w="4082" w:type="dxa"/>
-            <w:vAlign w:val="center"/>
-          </w:tcPr>
-          <w:p>
-            <w:pPr>
-              <w:spacing w:before="40" w:after="40" w:line="276" w:lineRule="auto"/>
-              <w:ind w:firstLine="0"/>
-              <w:jc w:val="left"/>
-            </w:pPr>
-            <w:r>
-              <w:rPr>
-                <w:sz w:val="19"/>
-              </w:rPr>
-              <w:t>Nhận thức rõ tính chất sai lệch và mong muốn bán hàng tạo cơ sở phân tích hướng lỗi cố ý trực tiếp.</w:t>
-            </w:r>
-          </w:p>
-        </w:tc>
-        <w:tc>
-          <w:tcPr>
-            <w:tcW w:w="2721" w:type="dxa"/>
-            <w:vAlign w:val="center"/>
-          </w:tcPr>
-          <w:p>
-            <w:pPr>
-              <w:spacing w:before="40" w:after="40" w:line="276" w:lineRule="auto"/>
-              <w:ind w:firstLine="0"/>
-              <w:jc w:val="left"/>
-            </w:pPr>
-            <w:r>
-              <w:rPr>
-                <w:sz w:val="19"/>
-              </w:rPr>
-              <w:t>Suy luận học thuật có căn cứ lý luận</w:t>
-            </w:r>
-          </w:p>
-        </w:tc>
-      </w:tr>
-      <w:tr>
-        <w:trPr>
-          <w:cantSplit/>
-          <w:jc w:val="center"/>
-        </w:trPr>
-        <w:tc>
-          <w:tcPr>
-            <w:tcW w:w="2154" w:type="dxa"/>
-            <w:vAlign w:val="center"/>
-          </w:tcPr>
-          <w:p>
-            <w:pPr>
-              <w:spacing w:before="40" w:after="40" w:line="276" w:lineRule="auto"/>
-              <w:ind w:firstLine="0"/>
-              <w:jc w:val="left"/>
-            </w:pPr>
-            <w:r>
-              <w:rPr>
-                <w:b/>
-                <w:sz w:val="19"/>
-              </w:rPr>
-              <w:t>Scope Limitation</w:t>
-            </w:r>
-          </w:p>
-        </w:tc>
-        <w:tc>
-          <w:tcPr>
-            <w:tcW w:w="4082" w:type="dxa"/>
-            <w:vAlign w:val="center"/>
-          </w:tcPr>
-          <w:p>
-            <w:pPr>
-              <w:spacing w:before="40" w:after="40" w:line="276" w:lineRule="auto"/>
-              <w:ind w:firstLine="0"/>
-              <w:jc w:val="left"/>
-            </w:pPr>
-            <w:r>
-              <w:rPr>
-                <w:sz w:val="19"/>
-              </w:rPr>
-              <w:t>Không tự ý áp đặt lỗi cố ý trực tiếp đồng loạt cho toàn bộ nhân sự hỗ trợ.</w:t>
-            </w:r>
-          </w:p>
-        </w:tc>
-        <w:tc>
-          <w:tcPr>
-            <w:tcW w:w="2721" w:type="dxa"/>
-            <w:vAlign w:val="center"/>
-          </w:tcPr>
-          <w:p>
-            <w:pPr>
-              <w:spacing w:before="40" w:after="40" w:line="276" w:lineRule="auto"/>
-              <w:ind w:firstLine="0"/>
-              <w:jc w:val="left"/>
-            </w:pPr>
-            <w:r>
-              <w:rPr>
-                <w:sz w:val="19"/>
-              </w:rPr>
-              <w:t>Tuân thủ nguyên tắc khách quan</w:t>
-            </w:r>
-          </w:p>
-        </w:tc>
-      </w:tr>
-    </w:tbl>
-    <w:p>
-      <w:pPr>
-        <w:pStyle w:val="u3"/>
-      </w:pPr>
-      <w:r>
-        <w:rPr>
-          <w:rFonts w:ascii="Times New Roman" w:eastAsia="Times New Roman" w:hAnsi="Times New Roman"/>
-          <w:b w:val="0"/>
-        </w:rPr>
-        <w:t>3.4.3. Nhận xét tiểu mục 3.4</w:t>
-      </w:r>
-    </w:p>
-    <w:p>
-      <w:pPr>
-        <w:spacing w:after="80"/>
-      </w:pPr>
-      <w:r>
-        <w:t>Dưới góc độ lý luận, các dữ kiện công khai tạo cơ sở phân tích hướng lỗi cố ý trực tiếp và động cơ vụ lợi của người tổ chức điều hành. Việc không áp đặt đồng loạt trạng thái tâm lý cho các nhân sự hỗ trợ thể hiện sự chuẩn mực và thận trọng trong phương pháp luận nghiên cứu pháp lý.</w:t>
-      </w:r>
-    </w:p>
-    <w:p>
-      <w:pPr>
-        <w:pStyle w:val="u2"/>
-      </w:pPr>
-      <w:bookmarkStart w:id="23" w:name="_Toc237715709"/>
-      <w:r>
-        <w:rPr>
-          <w:rFonts w:ascii="Times New Roman" w:eastAsia="Times New Roman" w:hAnsi="Times New Roman"/>
-          <w:b w:val="0"/>
-        </w:rPr>
-        <w:t>3.5. Bảng tổng hợp bốn yếu tố cấu thành vi phạm pháp luật</w:t>
-      </w:r>
-      <w:bookmarkEnd w:id="23"/>
-    </w:p>
-    <w:p>
-      <w:pPr>
-        <w:keepNext/>
-        <w:spacing w:before="200" w:after="60"/>
-        <w:ind w:firstLine="0"/>
-      </w:pPr>
-      <w:r>
-        <w:rPr>
-          <w:b/>
-          <w:sz w:val="22"/>
-        </w:rPr>
-        <w:t>Bảng 7. Tổng hợp bốn yếu tố cấu thành vi phạm pháp luật trong vụ việc</w:t>
+        <w:t>Bảng 5. Tổng hợp bốn yếu tố cấu thành vi phạm pháp luật trong vụ việc</w:t>
       </w:r>
     </w:p>
     <w:tbl>
@@ -7569,7 +6332,7 @@
                 <w:b/>
                 <w:sz w:val="19"/>
               </w:rPr>
-              <w:t>Kết luận đánh giá</w:t>
+              <w:t>Đánh giá tổng hợp</w:t>
             </w:r>
           </w:p>
         </w:tc>
@@ -7614,7 +6377,7 @@
               <w:rPr>
                 <w:sz w:val="19"/>
               </w:rPr>
-              <w:t>Sản phẩm giá mua 23k bán 199k; video người nổi tiếng bị cắt ghép; 5.429 đơn hàng thành công.</w:t>
+              <w:t>Sản phẩm mua giá 23k bán 199k; video người nổi tiếng bị cắt ghép; phát sinh 5.429 đơn hàng.</w:t>
             </w:r>
           </w:p>
         </w:tc>
@@ -7633,7 +6396,7 @@
               <w:rPr>
                 <w:sz w:val="19"/>
               </w:rPr>
-              <w:t>Các quan hệ xã hội được xem xét gồm trật tự quản lý nhà nước về quảng cáo, thương mại; quyền được thông tin trung thực của NTD; quyền nhân thân về hình ảnh.</w:t>
+              <w:t>Xâm hại trật tự quản lý quảng cáo, thương mại; quyền được thông tin trung thực của người tiêu dùng; quyền hình ảnh.</w:t>
             </w:r>
           </w:p>
         </w:tc>
@@ -7653,7 +6416,7 @@
                 <w:b/>
                 <w:sz w:val="19"/>
               </w:rPr>
-              <w:t>Khách thể chịu tác động đa chiều</w:t>
+              <w:t>Tác động đa chiều</w:t>
             </w:r>
             <w:r>
               <w:rPr>
@@ -7685,6 +6448,7 @@
                 <w:b/>
                 <w:sz w:val="19"/>
               </w:rPr>
+              <w:lastRenderedPageBreak/>
               <w:t>2. Mặt khách quan</w:t>
             </w:r>
           </w:p>
@@ -7704,7 +6468,7 @@
               <w:rPr>
                 <w:sz w:val="19"/>
               </w:rPr>
-              <w:t>Hành vi quảng cáo sai sự thật, sử dụng video cắt ghép; phát sinh 5.429 đơn hàng với tổng giá trị tiền hàng hơn 2,67 tỷ đồng theo nguồn công khai.</w:t>
+              <w:t>Hành vi quảng cáo sai sự thật, dùng video cắt ghép; thực hiện 5.429 đơn hàng với tổng giá trị tiền hàng hơn 2,67 tỷ đồng.</w:t>
             </w:r>
           </w:p>
         </w:tc>
@@ -7723,7 +6487,7 @@
               <w:rPr>
                 <w:sz w:val="19"/>
               </w:rPr>
-              <w:t>Chuỗi hành vi hành động trái pháp luật; thông tin sai lệch có khả năng tác động đến nhận thức người mua trong chuỗi giao dịch.</w:t>
+              <w:t>Chuỗi hành vi hành động trái pháp luật; thông tin sai lệch có khả năng tác động đến nhận thức người mua trong giao dịch.</w:t>
             </w:r>
           </w:p>
         </w:tc>
@@ -7743,13 +6507,13 @@
                 <w:b/>
                 <w:sz w:val="19"/>
               </w:rPr>
-              <w:t>Hành vi trái pháp luật qua nhiều khâu</w:t>
+              <w:t>Hành vi diễn ra qua nhiều khâu</w:t>
             </w:r>
             <w:r>
               <w:rPr>
                 <w:sz w:val="19"/>
               </w:rPr>
-              <w:t>, quy mô giao dịch lớn trên môi trường mạng xã hội.</w:t>
+              <w:t>, quy mô giao dịch lớn trên mạng xã hội.</w:t>
             </w:r>
           </w:p>
         </w:tc>
@@ -7794,7 +6558,7 @@
               <w:rPr>
                 <w:sz w:val="19"/>
               </w:rPr>
-              <w:t>Khởi tố Nguyễn Tiến Đạt cùng 20 bị can; Đạt sinh 1997; có các nhóm nhân sự marketing, bán hàng, vận đơn.</w:t>
+              <w:t>Khởi tố Nguyễn Tiến Đạt cùng 20 bị can; Đạt sinh năm 1997; có các nhóm làm marketing, bán hàng, vận đơn.</w:t>
             </w:r>
           </w:p>
         </w:tc>
@@ -7813,7 +6577,7 @@
               <w:rPr>
                 <w:sz w:val="19"/>
               </w:rPr>
-              <w:t>Đạt đã thành niên; các chủ thể khác chưa đủ dữ liệu công khai để đánh giá chi tiết; có sự phân công công việc rõ rệt.</w:t>
+              <w:t>Đạt đã thành niên; các cá nhân khác chưa đủ dữ liệu công khai để đánh giá chi tiết; có sự phân công công việc cụ thể.</w:t>
             </w:r>
           </w:p>
         </w:tc>
@@ -7839,7 +6603,7 @@
               <w:rPr>
                 <w:sz w:val="19"/>
               </w:rPr>
-              <w:t>, có sự phân hóa vai trò tổ chức và hỗ trợ.</w:t>
+              <w:t>, có sự phân hóa vai trò điều hành và hỗ trợ.</w:t>
             </w:r>
           </w:p>
         </w:tc>
@@ -7884,7 +6648,7 @@
               <w:rPr>
                 <w:sz w:val="19"/>
               </w:rPr>
-              <w:t>Dữ kiện chỉ đạo nội dung phóng đại, cắt ghép tư liệu người có uy tín để tạo niềm tin và bán hàng giá 199k.</w:t>
+              <w:t>Chỉ đạo đưa nội dung phóng đại, cắt ghép tư liệu người có uy tín để tạo niềm tin và bán hàng giá 199k.</w:t>
             </w:r>
           </w:p>
         </w:tc>
@@ -7903,7 +6667,7 @@
               <w:rPr>
                 <w:sz w:val="19"/>
               </w:rPr>
-              <w:t>Có cơ sở phân tích hướng lỗi cố ý trực tiếp và động cơ vụ lợi ở Đạt; nhân sự hỗ trợ cần thêm chứng cứ cụ thể.</w:t>
+              <w:t>Có cơ sở phân tích hướng lỗi cố ý trực tiếp và động cơ vụ lợi ở Đạt; nhân sự hỗ trợ cần phân hóa theo nhận thức thực tế.</w:t>
             </w:r>
           </w:p>
         </w:tc>
@@ -7923,13 +6687,13 @@
                 <w:b/>
                 <w:sz w:val="19"/>
               </w:rPr>
-              <w:t>Cơ sở phân tích hướng lỗi cố ý trực tiếp ở người tổ chức</w:t>
+              <w:t>Cơ sở phân tích lỗi cố ý trực tiếp ở người tổ chức</w:t>
             </w:r>
             <w:r>
               <w:rPr>
                 <w:sz w:val="19"/>
               </w:rPr>
-              <w:t>, động cơ vụ lợi gắn với hoạt động tiếp thị.</w:t>
+              <w:t>, động cơ vụ lợi gắn với tiếp thị bán hàng.</w:t>
             </w:r>
           </w:p>
         </w:tc>
@@ -7939,7 +6703,7 @@
       <w:pPr>
         <w:pStyle w:val="u1"/>
       </w:pPr>
-      <w:bookmarkStart w:id="24" w:name="_Toc237715710"/>
+      <w:bookmarkStart w:id="24" w:name="_Toc237716100"/>
       <w:r>
         <w:rPr>
           <w:rFonts w:ascii="Times New Roman" w:eastAsia="Times New Roman" w:hAnsi="Times New Roman"/>
@@ -7954,13 +6718,13 @@
       <w:pPr>
         <w:pStyle w:val="u2"/>
       </w:pPr>
-      <w:bookmarkStart w:id="25" w:name="_Toc237715711"/>
+      <w:bookmarkStart w:id="25" w:name="_Toc237716101"/>
       <w:r>
         <w:rPr>
           <w:rFonts w:ascii="Times New Roman" w:eastAsia="Times New Roman" w:hAnsi="Times New Roman"/>
           <w:b w:val="0"/>
         </w:rPr>
-        <w:t>4.1. Ý nghĩa phòng ngừa từ vụ việc</w:t>
+        <w:t>4.1. Một số nhận xét từ vụ việc</w:t>
       </w:r>
       <w:bookmarkEnd w:id="25"/>
     </w:p>
@@ -7969,7 +6733,7 @@
         <w:spacing w:after="80"/>
       </w:pPr>
       <w:r>
-        <w:t>Vụ việc đường dây quảng cáo gian dối sản phẩm Đông y bị triệt phá tại Phú Thọ mang lại nhiều giá trị thực tiễn trong công tác phòng ngừa vi phạm pháp luật trên không gian mạng:</w:t>
+        <w:t>Vụ việc triệt phá đường dây quảng cáo sai sự thật tại Phú Thọ cho thấy một số vấn đề thực tiễn đáng chú ý:</w:t>
       </w:r>
     </w:p>
     <w:p>
@@ -7982,10 +6746,10 @@
         <w:rPr>
           <w:b/>
         </w:rPr>
-        <w:t>Nhận diện rủi ro của tiếp thị số:</w:t>
-      </w:r>
-      <w:r>
-        <w:t xml:space="preserve"> Cảnh báo về các phương thức gian dối tinh vi như cắt ghép hình ảnh người có uy tín và tận dụng khả năng lan truyền nhanh của mạng xã hội để phát tán thông tin sai lệch.</w:t>
+        <w:t>Thủ đoạn tiếp thị trực tuyến tinh vi:</w:t>
+      </w:r>
+      <w:r>
+        <w:t xml:space="preserve"> Việc sử dụng hình ảnh, video cắt ghép người có uy tín kết hợp với mạng xã hội tạo ra khả năng lan truyền nhanh, khiến người tiêu dùng dễ tin tưởng và đặt mua sản phẩm.</w:t>
       </w:r>
     </w:p>
     <w:p>
@@ -7998,28 +6762,36 @@
         <w:rPr>
           <w:b/>
         </w:rPr>
-        <w:t>Yêu cầu phân hóa trách nhiệm cá nhân:</w:t>
-      </w:r>
-      <w:r>
-        <w:t xml:space="preserve"> Nhấn mạnh tầm quan trọng của việc cá thể hóa hành vi, nhận thức và mức độ tham gia của từng nhân sự trong các mô hình kinh doanh trực tuyến.</w:t>
+        <w:t>Sự cần thiết phân hóa trách nhiệm:</w:t>
+      </w:r>
+      <w:r>
+        <w:t xml:space="preserve"> Trong một mô hình bán hàng có nhiều người tham gia, việc cá thể hóa hành vi và nhận thức của từng vị trí công việc là rất quan trọng để xác định đúng trách nhiệm pháp lý.</w:t>
       </w:r>
     </w:p>
     <w:p>
       <w:pPr>
         <w:pStyle w:val="u2"/>
       </w:pPr>
-      <w:bookmarkStart w:id="26" w:name="_Toc237715712"/>
+      <w:bookmarkStart w:id="26" w:name="_Toc237716102"/>
       <w:r>
         <w:rPr>
           <w:rFonts w:ascii="Times New Roman" w:eastAsia="Times New Roman" w:hAnsi="Times New Roman"/>
           <w:b w:val="0"/>
         </w:rPr>
-        <w:t>4.2. Bài học đối với hoạt động kinh doanh trực tuyến và người tiêu dùng</w:t>
+        <w:t>4.2. Bài học rút ra</w:t>
       </w:r>
       <w:bookmarkEnd w:id="26"/>
     </w:p>
     <w:p>
       <w:pPr>
+        <w:spacing w:after="80"/>
+      </w:pPr>
+      <w:r>
+        <w:t>Từ vụ việc trên, có thể rút ra một số bài học thực tiễn:</w:t>
+      </w:r>
+    </w:p>
+    <w:p>
+      <w:pPr>
         <w:pStyle w:val="Duudong"/>
         <w:spacing w:after="60"/>
         <w:ind w:left="709" w:firstLine="0"/>
@@ -8028,27 +6800,10 @@
         <w:rPr>
           <w:b/>
         </w:rPr>
-        <w:t>Đối với cá nhân, tổ chức kinh doanh trực tuyến:</w:t>
-      </w:r>
-    </w:p>
-    <w:p>
-      <w:pPr>
-        <w:pStyle w:val="Duudong"/>
-        <w:spacing w:after="60"/>
-        <w:ind w:left="709" w:firstLine="0"/>
-      </w:pPr>
-      <w:r>
-        <w:t>Hoạt động quảng cáo phải tuân thủ đúng quy định của Luật Quảng cáo và các văn bản liên quan; tuyệt đối không đưa thông tin phóng đại, sai sự thật về công dụng, chất lượng hàng hóa.</w:t>
-      </w:r>
-    </w:p>
-    <w:p>
-      <w:pPr>
-        <w:pStyle w:val="Duudong"/>
-        <w:spacing w:after="60"/>
-        <w:ind w:left="709" w:firstLine="0"/>
-      </w:pPr>
-      <w:r>
-        <w:t>Việc sử dụng hình ảnh cá nhân trong hoạt động quảng cáo phải tuân thủ các điều kiện về sự đồng ý và các trường hợp ngoại lệ theo quy định pháp luật.</w:t>
+        <w:t>Đối với người kinh doanh trực tuyến:</w:t>
+      </w:r>
+      <w:r>
+        <w:t xml:space="preserve"> Phải tuân thủ đúng quy định của Luật Quảng cáo; không được phóng đại hoặc đưa thông tin sai sự thật về công dụng sản phẩm; tuân thủ điều kiện về sự đồng ý khi sử dụng hình ảnh cá nhân.</w:t>
       </w:r>
     </w:p>
     <w:p>
@@ -8063,6 +6818,9 @@
         </w:rPr>
         <w:t>Đối với người tiêu dùng:</w:t>
       </w:r>
+      <w:r>
+        <w:t xml:space="preserve"> Cần nâng cao kỹ năng kiểm chứng thông tin, cảnh giác trước các nội dung quảng cáo có cam kết tuyệt đối trên mạng xã hội; tìm kiếm tư vấn y khoa chính quy từ cơ sở y tế khi có vấn đề về sức khỏe, không tự ý sử dụng sản phẩm chỉ dựa vào quảng cáo chưa kiểm chứng.</w:t>
+      </w:r>
     </w:p>
     <w:p>
       <w:pPr>
@@ -8071,98 +6829,20 @@
         <w:ind w:left="709" w:firstLine="0"/>
       </w:pPr>
       <w:r>
-        <w:t>Cần nâng cao kỹ năng kiểm chứng thông tin, cảnh giác trước các nội dung tiếp thị có cam kết tuyệt đối trên mạng xã hội.</w:t>
-      </w:r>
-    </w:p>
-    <w:p>
-      <w:pPr>
-        <w:pStyle w:val="Duudong"/>
-        <w:spacing w:after="60"/>
-        <w:ind w:left="709" w:firstLine="0"/>
-      </w:pPr>
-      <w:r>
-        <w:t>Chủ động tìm kiếm tư vấn y khoa chính quy từ các cơ sở y tế có thẩm quyền khi gặp vấn đề về sức khỏe, không tự ý sử dụng sản phẩm chỉ dựa trên thông tin quảng cáo chưa được kiểm chứng.</w:t>
-      </w:r>
-    </w:p>
-    <w:p>
-      <w:pPr>
-        <w:pStyle w:val="u2"/>
-      </w:pPr>
-      <w:bookmarkStart w:id="27" w:name="_Toc237715713"/>
-      <w:r>
-        <w:rPr>
-          <w:rFonts w:ascii="Times New Roman" w:eastAsia="Times New Roman" w:hAnsi="Times New Roman"/>
-          <w:b w:val="0"/>
-        </w:rPr>
-        <w:t>4.3. Bài học về nhận thức pháp luật và đạo đức số cho sinh viên CNTT</w:t>
-      </w:r>
-      <w:bookmarkEnd w:id="27"/>
-    </w:p>
-    <w:p>
-      <w:pPr>
-        <w:spacing w:after="80"/>
-      </w:pPr>
-      <w:r>
-        <w:t>Vụ việc mang lại bài học sâu sắc cho sinh viên Trường Đại học Công nghệ Thông tin (UIT):</w:t>
-      </w:r>
-    </w:p>
-    <w:p>
-      <w:pPr>
-        <w:pStyle w:val="Duudong"/>
-        <w:spacing w:after="60"/>
-        <w:ind w:left="709" w:firstLine="0"/>
-      </w:pPr>
-      <w:r>
         <w:rPr>
           <w:b/>
         </w:rPr>
-        <w:t>Trách nhiệm pháp lý trong công việc kỹ thuật số:</w:t>
-      </w:r>
-      <w:r>
-        <w:t xml:space="preserve"> Khi tham gia các công việc làm thêm như chạy quảng cáo, chỉnh sửa video, quản trị trang mạng </w:t>
-      </w:r>
-      <w:r>
-        <w:lastRenderedPageBreak/>
-        <w:t>xã hội, sinh viên cần có nhận thức rõ ràng về tính hợp pháp của nội dung mình tạo ra; tuyệt đối từ chối tham gia các hoạt động cắt ghép hình ảnh giả mạo hoặc truyền bá thông tin lừa dối.</w:t>
+        <w:t>Đối với sinh viên ngành Công nghệ thông tin (UIT):</w:t>
+      </w:r>
+      <w:r>
+        <w:t xml:space="preserve"> Khi tham gia các công việc làm thêm liên quan đến tiếp thị số, chỉnh sửa video hay quản trị mạng xã hội, cần nhận thức rõ trách nhiệm pháp lý của mình; kiên quyết từ chối tham gia các hoạt động cắt ghép hình ảnh giả mạo để lừa dối người dùng và luôn sử dụng năng lực công nghệ một cách có trách nhiệm.</w:t>
       </w:r>
     </w:p>
     <w:p>
       <w:pPr>
-        <w:pStyle w:val="Duudong"/>
-        <w:spacing w:after="60"/>
-        <w:ind w:left="709" w:firstLine="0"/>
-      </w:pPr>
-      <w:r>
-        <w:rPr>
-          <w:b/>
-        </w:rPr>
-        <w:t>Nhận thức về trách nhiệm liên đới:</w:t>
-      </w:r>
-      <w:r>
-        <w:t xml:space="preserve"> Việc hỗ trợ kỹ thuật hoặc tham gia vào quy trình phát tán thông tin gian dối có thể bị xem xét trách nhiệm pháp lý tùy theo mức độ nhận thức và hành vi cụ thể.</w:t>
-      </w:r>
-    </w:p>
-    <w:p>
-      <w:pPr>
-        <w:pStyle w:val="Duudong"/>
-        <w:spacing w:after="60"/>
-        <w:ind w:left="709" w:firstLine="0"/>
-      </w:pPr>
-      <w:r>
-        <w:rPr>
-          <w:b/>
-        </w:rPr>
-        <w:t>Giữ vững đạo đức nghề nghiệp trong môi trường số:</w:t>
-      </w:r>
-      <w:r>
-        <w:t xml:space="preserve"> Năng lực công nghệ phải được sử dụng để xây dựng các giải pháp hữu ích, phục vụ cộng đồng, không tiếp tay cho các hành vi gian dối, trục lợi bất chính.</w:t>
-      </w:r>
-    </w:p>
-    <w:p>
-      <w:pPr>
         <w:pStyle w:val="u1"/>
       </w:pPr>
-      <w:bookmarkStart w:id="28" w:name="_Toc237715714"/>
+      <w:bookmarkStart w:id="27" w:name="_Toc237716103"/>
       <w:r>
         <w:rPr>
           <w:rFonts w:ascii="Times New Roman" w:eastAsia="Times New Roman" w:hAnsi="Times New Roman"/>
@@ -8171,14 +6851,14 @@
         <w:lastRenderedPageBreak/>
         <w:t>KẾT LUẬN</w:t>
       </w:r>
-      <w:bookmarkEnd w:id="28"/>
+      <w:bookmarkEnd w:id="27"/>
     </w:p>
     <w:p>
       <w:pPr>
         <w:spacing w:after="80"/>
       </w:pPr>
       <w:r>
-        <w:t>Vận dụng lý luận cấu thành vi phạm pháp luật là phương pháp luận nền tảng của môn học Pháp luật đại cương, giúp phân tích và làm sáng tỏ bản chất pháp lý của các hành vi thực tế trong đời sống xã hội. Qua việc xem xét vụ việc Cơ quan Cảnh sát điều tra Công an tỉnh Phú Thọ khởi tố 21 bị can liên quan đến sản phẩm "Xương khớp bà Sáu", bài tiểu luận đã tổng hợp bốn yếu tố cấu thành dưới góc độ học thuật:</w:t>
+        <w:t>Qua các dữ kiện công khai của vụ việc, bốn yếu tố cấu thành vi phạm pháp luật có thể được xem xét như sau:</w:t>
       </w:r>
     </w:p>
     <w:p>
@@ -8196,7 +6876,7 @@
         <w:t>Khách thể:</w:t>
       </w:r>
       <w:r>
-        <w:t xml:space="preserve"> Hành vi bị xem xét tác động tiêu cực đến trật tự quản lý nhà nước về quảng cáo, thương mại, quyền được cung cấp thông tin trung thực của người tiêu dùng và quyền nhân thân về hình ảnh của cá nhân theo quy định pháp luật.</w:t>
+        <w:t xml:space="preserve"> Tác động đến trật tự quản lý nhà nước về quảng cáo, thương mại, quyền được thông tin trung thực của người tiêu dùng và quyền nhân thân về hình ảnh theo luật định.</w:t>
       </w:r>
     </w:p>
     <w:p>
@@ -8214,7 +6894,7 @@
         <w:t>Mặt khách quan:</w:t>
       </w:r>
       <w:r>
-        <w:t xml:space="preserve"> Thể hiện qua chuỗi hành động sản xuất nội dung quảng cáo sai sự thật, khai thác hình ảnh cắt ghép và phát sinh 5.429 đơn hàng thành công với tổng giá trị tiền hàng hơn 2,67 tỷ đồng theo nguồn công khai; tạo cơ sở phân tích mối liên hệ nhân quả giữa hoạt động tiếp thị và kết quả giao dịch.</w:t>
+        <w:t xml:space="preserve"> Thể hiện qua hành vi quảng cáo sai sự thật, sử dụng hình ảnh cắt ghép và phát sinh 5.429 đơn hàng thành công với tổng giá trị tiền hàng hơn 2,67 tỷ đồng theo nguồn công khai; tạo cơ sở xem xét mối liên hệ nhân quả giữa việc tiếp thị và kết quả giao dịch.</w:t>
       </w:r>
     </w:p>
     <w:p>
@@ -8232,7 +6912,7 @@
         <w:t>Chủ thể:</w:t>
       </w:r>
       <w:r>
-        <w:t xml:space="preserve"> Lý luận môn học yêu cầu chủ thể phải thỏa mãn điều kiện độ tuổi và khả năng nhận thức; dữ liệu công khai cho phép xác định Nguyễn Tiến Đạt đã thành niên, trong khi việc đánh giá toàn diện năng lực trách nhiệm pháp lý của các cá nhân khác cần căn cứ vào kết luận chính thức của cơ quan tố tụng.</w:t>
+        <w:t xml:space="preserve"> Dữ liệu xác định người tổ chức (Nguyễn Tiến Đạt) đã đủ tuổi thành niên; việc đánh giá năng lực của các cá nhân khác căn cứ vào kết luận của cơ quan tiến hành tố tụng.</w:t>
       </w:r>
     </w:p>
     <w:p>
@@ -8250,7 +6930,7 @@
         <w:t>Mặt chủ quan:</w:t>
       </w:r>
       <w:r>
-        <w:t xml:space="preserve"> Dữ kiện thực tế tạo cơ sở phân tích theo hướng lỗi cố ý trực tiếp và động cơ vụ lợi kinh tế đối với người tổ chức điều hành; đối với các nhân sự hỗ trợ, trạng thái tâm lý cần được phân hóa dựa trên mức độ nhận thức cụ thể trong quá trình giải quyết vụ án.</w:t>
+        <w:t xml:space="preserve"> Có cơ sở phân tích hướng lỗi cố ý trực tiếp và động cơ vụ lợi đối với người tổ chức; đối với các nhân sự hỗ trợ, trách nhiệm cần được phân hóa theo nhận thức thực tế của từng người.</w:t>
       </w:r>
     </w:p>
     <w:p>
@@ -8258,25 +6938,14 @@
         <w:spacing w:after="80"/>
       </w:pPr>
       <w:r>
-        <w:t>Tiểu luận không chỉ giúp sinh viên UIT rèn luyện tư duy pháp lý khoa học mà còn nhấn mạnh ý nghĩa của việc thượng tôn pháp luật và giữ gìn đạo đức nghề nghiệp trong kỷ nguyên công nghệ số.</w:t>
+        <w:t>Việc vận dụng lý luận cấu thành vi phạm pháp luật để phân tích vụ việc thực tế giúp sinh viên UIT củng cố kiến thức môn học, hiểu rõ ranh giới pháp lý trong môi trường số và nâng cao ý thức trách nhiệm nghề nghiệp khi làm việc trong lĩnh vực công nghệ thông tin.</w:t>
       </w:r>
     </w:p>
     <w:p>
       <w:pPr>
-        <w:spacing w:after="80"/>
-      </w:pPr>
-      <w:r>
-        <w:rPr>
-          <w:i/>
-        </w:rPr>
-        <w:t>(Toàn bộ nội dung phân tích trong bài tiểu luận được xây dựng dựa trên các dữ liệu công khai ban đầu do cơ quan điều tra công bố trên Báo Điện tử Chính phủ, bảo đảm tính khách quan học thuật và tôn trọng tuyệt đối nguyên tắc suy đoán vô tội trong tố tụng).</w:t>
-      </w:r>
-    </w:p>
-    <w:p>
-      <w:pPr>
         <w:pStyle w:val="u1"/>
       </w:pPr>
-      <w:bookmarkStart w:id="29" w:name="_Toc237715715"/>
+      <w:bookmarkStart w:id="28" w:name="_Toc237716104"/>
       <w:r>
         <w:rPr>
           <w:rFonts w:ascii="Times New Roman" w:eastAsia="Times New Roman" w:hAnsi="Times New Roman"/>
@@ -8285,13 +6954,13 @@
         <w:lastRenderedPageBreak/>
         <w:t>TÀI LIỆU THAM KHẢO</w:t>
       </w:r>
-      <w:bookmarkEnd w:id="29"/>
+      <w:bookmarkEnd w:id="28"/>
     </w:p>
     <w:p>
       <w:pPr>
         <w:pStyle w:val="u2"/>
       </w:pPr>
-      <w:bookmarkStart w:id="30" w:name="_Toc237715716"/>
+      <w:bookmarkStart w:id="29" w:name="_Toc237716105"/>
       <w:r>
         <w:rPr>
           <w:rFonts w:ascii="Times New Roman" w:eastAsia="Times New Roman" w:hAnsi="Times New Roman"/>
@@ -8299,7 +6968,7 @@
         </w:rPr>
         <w:t>A. Văn bản quy phạm pháp luật</w:t>
       </w:r>
-      <w:bookmarkEnd w:id="30"/>
+      <w:bookmarkEnd w:id="29"/>
     </w:p>
     <w:p>
       <w:pPr>
@@ -8413,7 +7082,7 @@
       <w:pPr>
         <w:pStyle w:val="u2"/>
       </w:pPr>
-      <w:bookmarkStart w:id="31" w:name="_Toc237715717"/>
+      <w:bookmarkStart w:id="30" w:name="_Toc237716106"/>
       <w:r>
         <w:rPr>
           <w:rFonts w:ascii="Times New Roman" w:eastAsia="Times New Roman" w:hAnsi="Times New Roman"/>
@@ -8421,7 +7090,7 @@
         </w:rPr>
         <w:t>B. Giáo trình và tài liệu học thuật</w:t>
       </w:r>
-      <w:bookmarkEnd w:id="31"/>
+      <w:bookmarkEnd w:id="30"/>
     </w:p>
     <w:p>
       <w:pPr>
@@ -8454,7 +7123,7 @@
       <w:pPr>
         <w:pStyle w:val="u2"/>
       </w:pPr>
-      <w:bookmarkStart w:id="32" w:name="_Toc237715718"/>
+      <w:bookmarkStart w:id="31" w:name="_Toc237716107"/>
       <w:r>
         <w:rPr>
           <w:rFonts w:ascii="Times New Roman" w:eastAsia="Times New Roman" w:hAnsi="Times New Roman"/>
@@ -8462,7 +7131,7 @@
         </w:rPr>
         <w:t>C. Nguồn dữ liệu báo chí chính thức về vụ việc</w:t>
       </w:r>
-      <w:bookmarkEnd w:id="32"/>
+      <w:bookmarkEnd w:id="31"/>
     </w:p>
     <w:p>
       <w:pPr>
@@ -8762,31 +7431,31 @@
       </w:rPr>
     </w:lvl>
   </w:abstractNum>
-  <w:num w:numId="1" w16cid:durableId="1209680748">
+  <w:num w:numId="1" w16cid:durableId="154224832">
     <w:abstractNumId w:val="8"/>
   </w:num>
-  <w:num w:numId="2" w16cid:durableId="2087992525">
+  <w:num w:numId="2" w16cid:durableId="512914922">
     <w:abstractNumId w:val="6"/>
   </w:num>
-  <w:num w:numId="3" w16cid:durableId="1605763596">
+  <w:num w:numId="3" w16cid:durableId="2045863233">
     <w:abstractNumId w:val="5"/>
   </w:num>
-  <w:num w:numId="4" w16cid:durableId="601232035">
+  <w:num w:numId="4" w16cid:durableId="1143230610">
     <w:abstractNumId w:val="4"/>
   </w:num>
-  <w:num w:numId="5" w16cid:durableId="1758401975">
+  <w:num w:numId="5" w16cid:durableId="1895585435">
     <w:abstractNumId w:val="7"/>
   </w:num>
-  <w:num w:numId="6" w16cid:durableId="321661003">
+  <w:num w:numId="6" w16cid:durableId="1691834595">
     <w:abstractNumId w:val="3"/>
   </w:num>
-  <w:num w:numId="7" w16cid:durableId="1525947566">
+  <w:num w:numId="7" w16cid:durableId="509608809">
     <w:abstractNumId w:val="2"/>
   </w:num>
-  <w:num w:numId="8" w16cid:durableId="1976181189">
+  <w:num w:numId="8" w16cid:durableId="222375582">
     <w:abstractNumId w:val="1"/>
   </w:num>
-  <w:num w:numId="9" w16cid:durableId="1405878705">
+  <w:num w:numId="9" w16cid:durableId="1698774809">
     <w:abstractNumId w:val="0"/>
   </w:num>
 </w:numbering>
@@ -20189,7 +18858,7 @@
     <w:autoRedefine/>
     <w:uiPriority w:val="39"/>
     <w:unhideWhenUsed/>
-    <w:rsid w:val="003345AE"/>
+    <w:rsid w:val="0047509B"/>
     <w:pPr>
       <w:spacing w:after="100"/>
     </w:pPr>
@@ -20201,7 +18870,7 @@
     <w:autoRedefine/>
     <w:uiPriority w:val="39"/>
     <w:unhideWhenUsed/>
-    <w:rsid w:val="003345AE"/>
+    <w:rsid w:val="0047509B"/>
     <w:pPr>
       <w:spacing w:after="100"/>
       <w:ind w:left="260"/>
@@ -20212,7 +18881,7 @@
     <w:basedOn w:val="Phngmcinhcuaoanvn"/>
     <w:uiPriority w:val="99"/>
     <w:unhideWhenUsed/>
-    <w:rsid w:val="003345AE"/>
+    <w:rsid w:val="0047509B"/>
     <w:rPr>
       <w:color w:val="0000FF" w:themeColor="hyperlink"/>
       <w:u w:val="single"/>

</xml_diff>

<commit_message>
docs: rebuild final report after human edit
</commit_message>
<xml_diff>
--- a/report/BaoCao_TieuLuan_PLDC_UIT_FINAL.docx
+++ b/report/BaoCao_TieuLuan_PLDC_UIT_FINAL.docx
@@ -807,7 +807,7 @@
       <w:r>
         <w:fldChar w:fldCharType="separate"/>
       </w:r>
-      <w:hyperlink w:anchor="_Toc237716076" w:history="1">
+      <w:hyperlink w:anchor="_Toc237716336" w:history="1">
         <w:r>
           <w:rPr>
             <w:rStyle w:val="Siuktni"/>
@@ -834,7 +834,7 @@
             <w:noProof/>
             <w:webHidden/>
           </w:rPr>
-          <w:instrText xml:space="preserve"> PAGEREF _Toc237716076 \h </w:instrText>
+          <w:instrText xml:space="preserve"> PAGEREF _Toc237716336 \h </w:instrText>
         </w:r>
         <w:r>
           <w:rPr>
@@ -875,7 +875,7 @@
           <w:noProof/>
         </w:rPr>
       </w:pPr>
-      <w:hyperlink w:anchor="_Toc237716077" w:history="1">
+      <w:hyperlink w:anchor="_Toc237716337" w:history="1">
         <w:r>
           <w:rPr>
             <w:rStyle w:val="Siuktni"/>
@@ -902,7 +902,7 @@
             <w:noProof/>
             <w:webHidden/>
           </w:rPr>
-          <w:instrText xml:space="preserve"> PAGEREF _Toc237716077 \h </w:instrText>
+          <w:instrText xml:space="preserve"> PAGEREF _Toc237716337 \h </w:instrText>
         </w:r>
         <w:r>
           <w:rPr>
@@ -943,13 +943,13 @@
           <w:noProof/>
         </w:rPr>
       </w:pPr>
-      <w:hyperlink w:anchor="_Toc237716078" w:history="1">
+      <w:hyperlink w:anchor="_Toc237716338" w:history="1">
         <w:r>
           <w:rPr>
             <w:rStyle w:val="Siuktni"/>
             <w:noProof/>
           </w:rPr>
-          <w:t>2. Mục tiêu nghiên cứu</w:t>
+          <w:t>2. Mục tiêu của báo cáo</w:t>
         </w:r>
         <w:r>
           <w:rPr>
@@ -970,7 +970,7 @@
             <w:noProof/>
             <w:webHidden/>
           </w:rPr>
-          <w:instrText xml:space="preserve"> PAGEREF _Toc237716078 \h </w:instrText>
+          <w:instrText xml:space="preserve"> PAGEREF _Toc237716338 \h </w:instrText>
         </w:r>
         <w:r>
           <w:rPr>
@@ -1011,7 +1011,7 @@
           <w:noProof/>
         </w:rPr>
       </w:pPr>
-      <w:hyperlink w:anchor="_Toc237716079" w:history="1">
+      <w:hyperlink w:anchor="_Toc237716339" w:history="1">
         <w:r>
           <w:rPr>
             <w:rStyle w:val="Siuktni"/>
@@ -1038,7 +1038,7 @@
             <w:noProof/>
             <w:webHidden/>
           </w:rPr>
-          <w:instrText xml:space="preserve"> PAGEREF _Toc237716079 \h </w:instrText>
+          <w:instrText xml:space="preserve"> PAGEREF _Toc237716339 \h </w:instrText>
         </w:r>
         <w:r>
           <w:rPr>
@@ -1079,7 +1079,7 @@
           <w:noProof/>
         </w:rPr>
       </w:pPr>
-      <w:hyperlink w:anchor="_Toc237716080" w:history="1">
+      <w:hyperlink w:anchor="_Toc237716340" w:history="1">
         <w:r>
           <w:rPr>
             <w:rStyle w:val="Siuktni"/>
@@ -1106,7 +1106,7 @@
             <w:noProof/>
             <w:webHidden/>
           </w:rPr>
-          <w:instrText xml:space="preserve"> PAGEREF _Toc237716080 \h </w:instrText>
+          <w:instrText xml:space="preserve"> PAGEREF _Toc237716340 \h </w:instrText>
         </w:r>
         <w:r>
           <w:rPr>
@@ -1147,7 +1147,7 @@
           <w:noProof/>
         </w:rPr>
       </w:pPr>
-      <w:hyperlink w:anchor="_Toc237716081" w:history="1">
+      <w:hyperlink w:anchor="_Toc237716341" w:history="1">
         <w:r>
           <w:rPr>
             <w:rStyle w:val="Siuktni"/>
@@ -1174,7 +1174,7 @@
             <w:noProof/>
             <w:webHidden/>
           </w:rPr>
-          <w:instrText xml:space="preserve"> PAGEREF _Toc237716081 \h </w:instrText>
+          <w:instrText xml:space="preserve"> PAGEREF _Toc237716341 \h </w:instrText>
         </w:r>
         <w:r>
           <w:rPr>
@@ -1215,7 +1215,7 @@
           <w:noProof/>
         </w:rPr>
       </w:pPr>
-      <w:hyperlink w:anchor="_Toc237716082" w:history="1">
+      <w:hyperlink w:anchor="_Toc237716342" w:history="1">
         <w:r>
           <w:rPr>
             <w:rStyle w:val="Siuktni"/>
@@ -1242,7 +1242,7 @@
             <w:noProof/>
             <w:webHidden/>
           </w:rPr>
-          <w:instrText xml:space="preserve"> PAGEREF _Toc237716082 \h </w:instrText>
+          <w:instrText xml:space="preserve"> PAGEREF _Toc237716342 \h </w:instrText>
         </w:r>
         <w:r>
           <w:rPr>
@@ -1283,7 +1283,7 @@
           <w:noProof/>
         </w:rPr>
       </w:pPr>
-      <w:hyperlink w:anchor="_Toc237716083" w:history="1">
+      <w:hyperlink w:anchor="_Toc237716343" w:history="1">
         <w:r>
           <w:rPr>
             <w:rStyle w:val="Siuktni"/>
@@ -1310,7 +1310,7 @@
             <w:noProof/>
             <w:webHidden/>
           </w:rPr>
-          <w:instrText xml:space="preserve"> PAGEREF _Toc237716083 \h </w:instrText>
+          <w:instrText xml:space="preserve"> PAGEREF _Toc237716343 \h </w:instrText>
         </w:r>
         <w:r>
           <w:rPr>
@@ -1351,7 +1351,7 @@
           <w:noProof/>
         </w:rPr>
       </w:pPr>
-      <w:hyperlink w:anchor="_Toc237716084" w:history="1">
+      <w:hyperlink w:anchor="_Toc237716344" w:history="1">
         <w:r>
           <w:rPr>
             <w:rStyle w:val="Siuktni"/>
@@ -1378,7 +1378,7 @@
             <w:noProof/>
             <w:webHidden/>
           </w:rPr>
-          <w:instrText xml:space="preserve"> PAGEREF _Toc237716084 \h </w:instrText>
+          <w:instrText xml:space="preserve"> PAGEREF _Toc237716344 \h </w:instrText>
         </w:r>
         <w:r>
           <w:rPr>
@@ -1419,7 +1419,7 @@
           <w:noProof/>
         </w:rPr>
       </w:pPr>
-      <w:hyperlink w:anchor="_Toc237716085" w:history="1">
+      <w:hyperlink w:anchor="_Toc237716345" w:history="1">
         <w:r>
           <w:rPr>
             <w:rStyle w:val="Siuktni"/>
@@ -1446,7 +1446,7 @@
             <w:noProof/>
             <w:webHidden/>
           </w:rPr>
-          <w:instrText xml:space="preserve"> PAGEREF _Toc237716085 \h </w:instrText>
+          <w:instrText xml:space="preserve"> PAGEREF _Toc237716345 \h </w:instrText>
         </w:r>
         <w:r>
           <w:rPr>
@@ -1487,7 +1487,7 @@
           <w:noProof/>
         </w:rPr>
       </w:pPr>
-      <w:hyperlink w:anchor="_Toc237716086" w:history="1">
+      <w:hyperlink w:anchor="_Toc237716346" w:history="1">
         <w:r>
           <w:rPr>
             <w:rStyle w:val="Siuktni"/>
@@ -1514,7 +1514,7 @@
             <w:noProof/>
             <w:webHidden/>
           </w:rPr>
-          <w:instrText xml:space="preserve"> PAGEREF _Toc237716086 \h </w:instrText>
+          <w:instrText xml:space="preserve"> PAGEREF _Toc237716346 \h </w:instrText>
         </w:r>
         <w:r>
           <w:rPr>
@@ -1555,7 +1555,7 @@
           <w:noProof/>
         </w:rPr>
       </w:pPr>
-      <w:hyperlink w:anchor="_Toc237716087" w:history="1">
+      <w:hyperlink w:anchor="_Toc237716347" w:history="1">
         <w:r>
           <w:rPr>
             <w:rStyle w:val="Siuktni"/>
@@ -1582,7 +1582,7 @@
             <w:noProof/>
             <w:webHidden/>
           </w:rPr>
-          <w:instrText xml:space="preserve"> PAGEREF _Toc237716087 \h </w:instrText>
+          <w:instrText xml:space="preserve"> PAGEREF _Toc237716347 \h </w:instrText>
         </w:r>
         <w:r>
           <w:rPr>
@@ -1623,7 +1623,7 @@
           <w:noProof/>
         </w:rPr>
       </w:pPr>
-      <w:hyperlink w:anchor="_Toc237716088" w:history="1">
+      <w:hyperlink w:anchor="_Toc237716348" w:history="1">
         <w:r>
           <w:rPr>
             <w:rStyle w:val="Siuktni"/>
@@ -1650,7 +1650,7 @@
             <w:noProof/>
             <w:webHidden/>
           </w:rPr>
-          <w:instrText xml:space="preserve"> PAGEREF _Toc237716088 \h </w:instrText>
+          <w:instrText xml:space="preserve"> PAGEREF _Toc237716348 \h </w:instrText>
         </w:r>
         <w:r>
           <w:rPr>
@@ -1691,7 +1691,7 @@
           <w:noProof/>
         </w:rPr>
       </w:pPr>
-      <w:hyperlink w:anchor="_Toc237716089" w:history="1">
+      <w:hyperlink w:anchor="_Toc237716349" w:history="1">
         <w:r>
           <w:rPr>
             <w:rStyle w:val="Siuktni"/>
@@ -1718,7 +1718,7 @@
             <w:noProof/>
             <w:webHidden/>
           </w:rPr>
-          <w:instrText xml:space="preserve"> PAGEREF _Toc237716089 \h </w:instrText>
+          <w:instrText xml:space="preserve"> PAGEREF _Toc237716349 \h </w:instrText>
         </w:r>
         <w:r>
           <w:rPr>
@@ -1759,7 +1759,7 @@
           <w:noProof/>
         </w:rPr>
       </w:pPr>
-      <w:hyperlink w:anchor="_Toc237716090" w:history="1">
+      <w:hyperlink w:anchor="_Toc237716350" w:history="1">
         <w:r>
           <w:rPr>
             <w:rStyle w:val="Siuktni"/>
@@ -1786,7 +1786,7 @@
             <w:noProof/>
             <w:webHidden/>
           </w:rPr>
-          <w:instrText xml:space="preserve"> PAGEREF _Toc237716090 \h </w:instrText>
+          <w:instrText xml:space="preserve"> PAGEREF _Toc237716350 \h </w:instrText>
         </w:r>
         <w:r>
           <w:rPr>
@@ -1827,7 +1827,7 @@
           <w:noProof/>
         </w:rPr>
       </w:pPr>
-      <w:hyperlink w:anchor="_Toc237716091" w:history="1">
+      <w:hyperlink w:anchor="_Toc237716351" w:history="1">
         <w:r>
           <w:rPr>
             <w:rStyle w:val="Siuktni"/>
@@ -1854,7 +1854,7 @@
             <w:noProof/>
             <w:webHidden/>
           </w:rPr>
-          <w:instrText xml:space="preserve"> PAGEREF _Toc237716091 \h </w:instrText>
+          <w:instrText xml:space="preserve"> PAGEREF _Toc237716351 \h </w:instrText>
         </w:r>
         <w:r>
           <w:rPr>
@@ -1895,7 +1895,7 @@
           <w:noProof/>
         </w:rPr>
       </w:pPr>
-      <w:hyperlink w:anchor="_Toc237716092" w:history="1">
+      <w:hyperlink w:anchor="_Toc237716352" w:history="1">
         <w:r>
           <w:rPr>
             <w:rStyle w:val="Siuktni"/>
@@ -1922,7 +1922,7 @@
             <w:noProof/>
             <w:webHidden/>
           </w:rPr>
-          <w:instrText xml:space="preserve"> PAGEREF _Toc237716092 \h </w:instrText>
+          <w:instrText xml:space="preserve"> PAGEREF _Toc237716352 \h </w:instrText>
         </w:r>
         <w:r>
           <w:rPr>
@@ -1963,7 +1963,7 @@
           <w:noProof/>
         </w:rPr>
       </w:pPr>
-      <w:hyperlink w:anchor="_Toc237716093" w:history="1">
+      <w:hyperlink w:anchor="_Toc237716353" w:history="1">
         <w:r>
           <w:rPr>
             <w:rStyle w:val="Siuktni"/>
@@ -1990,7 +1990,7 @@
             <w:noProof/>
             <w:webHidden/>
           </w:rPr>
-          <w:instrText xml:space="preserve"> PAGEREF _Toc237716093 \h </w:instrText>
+          <w:instrText xml:space="preserve"> PAGEREF _Toc237716353 \h </w:instrText>
         </w:r>
         <w:r>
           <w:rPr>
@@ -2031,7 +2031,7 @@
           <w:noProof/>
         </w:rPr>
       </w:pPr>
-      <w:hyperlink w:anchor="_Toc237716094" w:history="1">
+      <w:hyperlink w:anchor="_Toc237716354" w:history="1">
         <w:r>
           <w:rPr>
             <w:rStyle w:val="Siuktni"/>
@@ -2058,7 +2058,7 @@
             <w:noProof/>
             <w:webHidden/>
           </w:rPr>
-          <w:instrText xml:space="preserve"> PAGEREF _Toc237716094 \h </w:instrText>
+          <w:instrText xml:space="preserve"> PAGEREF _Toc237716354 \h </w:instrText>
         </w:r>
         <w:r>
           <w:rPr>
@@ -2099,7 +2099,7 @@
           <w:noProof/>
         </w:rPr>
       </w:pPr>
-      <w:hyperlink w:anchor="_Toc237716095" w:history="1">
+      <w:hyperlink w:anchor="_Toc237716355" w:history="1">
         <w:r>
           <w:rPr>
             <w:rStyle w:val="Siuktni"/>
@@ -2126,7 +2126,7 @@
             <w:noProof/>
             <w:webHidden/>
           </w:rPr>
-          <w:instrText xml:space="preserve"> PAGEREF _Toc237716095 \h </w:instrText>
+          <w:instrText xml:space="preserve"> PAGEREF _Toc237716355 \h </w:instrText>
         </w:r>
         <w:r>
           <w:rPr>
@@ -2167,7 +2167,7 @@
           <w:noProof/>
         </w:rPr>
       </w:pPr>
-      <w:hyperlink w:anchor="_Toc237716096" w:history="1">
+      <w:hyperlink w:anchor="_Toc237716356" w:history="1">
         <w:r>
           <w:rPr>
             <w:rStyle w:val="Siuktni"/>
@@ -2194,7 +2194,7 @@
             <w:noProof/>
             <w:webHidden/>
           </w:rPr>
-          <w:instrText xml:space="preserve"> PAGEREF _Toc237716096 \h </w:instrText>
+          <w:instrText xml:space="preserve"> PAGEREF _Toc237716356 \h </w:instrText>
         </w:r>
         <w:r>
           <w:rPr>
@@ -2235,7 +2235,7 @@
           <w:noProof/>
         </w:rPr>
       </w:pPr>
-      <w:hyperlink w:anchor="_Toc237716097" w:history="1">
+      <w:hyperlink w:anchor="_Toc237716357" w:history="1">
         <w:r>
           <w:rPr>
             <w:rStyle w:val="Siuktni"/>
@@ -2262,7 +2262,7 @@
             <w:noProof/>
             <w:webHidden/>
           </w:rPr>
-          <w:instrText xml:space="preserve"> PAGEREF _Toc237716097 \h </w:instrText>
+          <w:instrText xml:space="preserve"> PAGEREF _Toc237716357 \h </w:instrText>
         </w:r>
         <w:r>
           <w:rPr>
@@ -2303,7 +2303,7 @@
           <w:noProof/>
         </w:rPr>
       </w:pPr>
-      <w:hyperlink w:anchor="_Toc237716098" w:history="1">
+      <w:hyperlink w:anchor="_Toc237716358" w:history="1">
         <w:r>
           <w:rPr>
             <w:rStyle w:val="Siuktni"/>
@@ -2330,7 +2330,7 @@
             <w:noProof/>
             <w:webHidden/>
           </w:rPr>
-          <w:instrText xml:space="preserve"> PAGEREF _Toc237716098 \h </w:instrText>
+          <w:instrText xml:space="preserve"> PAGEREF _Toc237716358 \h </w:instrText>
         </w:r>
         <w:r>
           <w:rPr>
@@ -2371,7 +2371,7 @@
           <w:noProof/>
         </w:rPr>
       </w:pPr>
-      <w:hyperlink w:anchor="_Toc237716099" w:history="1">
+      <w:hyperlink w:anchor="_Toc237716359" w:history="1">
         <w:r>
           <w:rPr>
             <w:rStyle w:val="Siuktni"/>
@@ -2398,7 +2398,7 @@
             <w:noProof/>
             <w:webHidden/>
           </w:rPr>
-          <w:instrText xml:space="preserve"> PAGEREF _Toc237716099 \h </w:instrText>
+          <w:instrText xml:space="preserve"> PAGEREF _Toc237716359 \h </w:instrText>
         </w:r>
         <w:r>
           <w:rPr>
@@ -2439,7 +2439,7 @@
           <w:noProof/>
         </w:rPr>
       </w:pPr>
-      <w:hyperlink w:anchor="_Toc237716100" w:history="1">
+      <w:hyperlink w:anchor="_Toc237716360" w:history="1">
         <w:r>
           <w:rPr>
             <w:rStyle w:val="Siuktni"/>
@@ -2466,7 +2466,7 @@
             <w:noProof/>
             <w:webHidden/>
           </w:rPr>
-          <w:instrText xml:space="preserve"> PAGEREF _Toc237716100 \h </w:instrText>
+          <w:instrText xml:space="preserve"> PAGEREF _Toc237716360 \h </w:instrText>
         </w:r>
         <w:r>
           <w:rPr>
@@ -2507,7 +2507,7 @@
           <w:noProof/>
         </w:rPr>
       </w:pPr>
-      <w:hyperlink w:anchor="_Toc237716101" w:history="1">
+      <w:hyperlink w:anchor="_Toc237716361" w:history="1">
         <w:r>
           <w:rPr>
             <w:rStyle w:val="Siuktni"/>
@@ -2534,7 +2534,7 @@
             <w:noProof/>
             <w:webHidden/>
           </w:rPr>
-          <w:instrText xml:space="preserve"> PAGEREF _Toc237716101 \h </w:instrText>
+          <w:instrText xml:space="preserve"> PAGEREF _Toc237716361 \h </w:instrText>
         </w:r>
         <w:r>
           <w:rPr>
@@ -2575,7 +2575,7 @@
           <w:noProof/>
         </w:rPr>
       </w:pPr>
-      <w:hyperlink w:anchor="_Toc237716102" w:history="1">
+      <w:hyperlink w:anchor="_Toc237716362" w:history="1">
         <w:r>
           <w:rPr>
             <w:rStyle w:val="Siuktni"/>
@@ -2602,7 +2602,7 @@
             <w:noProof/>
             <w:webHidden/>
           </w:rPr>
-          <w:instrText xml:space="preserve"> PAGEREF _Toc237716102 \h </w:instrText>
+          <w:instrText xml:space="preserve"> PAGEREF _Toc237716362 \h </w:instrText>
         </w:r>
         <w:r>
           <w:rPr>
@@ -2643,7 +2643,7 @@
           <w:noProof/>
         </w:rPr>
       </w:pPr>
-      <w:hyperlink w:anchor="_Toc237716103" w:history="1">
+      <w:hyperlink w:anchor="_Toc237716363" w:history="1">
         <w:r>
           <w:rPr>
             <w:rStyle w:val="Siuktni"/>
@@ -2670,7 +2670,7 @@
             <w:noProof/>
             <w:webHidden/>
           </w:rPr>
-          <w:instrText xml:space="preserve"> PAGEREF _Toc237716103 \h </w:instrText>
+          <w:instrText xml:space="preserve"> PAGEREF _Toc237716363 \h </w:instrText>
         </w:r>
         <w:r>
           <w:rPr>
@@ -2711,7 +2711,7 @@
           <w:noProof/>
         </w:rPr>
       </w:pPr>
-      <w:hyperlink w:anchor="_Toc237716104" w:history="1">
+      <w:hyperlink w:anchor="_Toc237716364" w:history="1">
         <w:r>
           <w:rPr>
             <w:rStyle w:val="Siuktni"/>
@@ -2738,7 +2738,7 @@
             <w:noProof/>
             <w:webHidden/>
           </w:rPr>
-          <w:instrText xml:space="preserve"> PAGEREF _Toc237716104 \h </w:instrText>
+          <w:instrText xml:space="preserve"> PAGEREF _Toc237716364 \h </w:instrText>
         </w:r>
         <w:r>
           <w:rPr>
@@ -2779,7 +2779,7 @@
           <w:noProof/>
         </w:rPr>
       </w:pPr>
-      <w:hyperlink w:anchor="_Toc237716105" w:history="1">
+      <w:hyperlink w:anchor="_Toc237716365" w:history="1">
         <w:r>
           <w:rPr>
             <w:rStyle w:val="Siuktni"/>
@@ -2806,7 +2806,7 @@
             <w:noProof/>
             <w:webHidden/>
           </w:rPr>
-          <w:instrText xml:space="preserve"> PAGEREF _Toc237716105 \h </w:instrText>
+          <w:instrText xml:space="preserve"> PAGEREF _Toc237716365 \h </w:instrText>
         </w:r>
         <w:r>
           <w:rPr>
@@ -2847,7 +2847,7 @@
           <w:noProof/>
         </w:rPr>
       </w:pPr>
-      <w:hyperlink w:anchor="_Toc237716106" w:history="1">
+      <w:hyperlink w:anchor="_Toc237716366" w:history="1">
         <w:r>
           <w:rPr>
             <w:rStyle w:val="Siuktni"/>
@@ -2874,7 +2874,7 @@
             <w:noProof/>
             <w:webHidden/>
           </w:rPr>
-          <w:instrText xml:space="preserve"> PAGEREF _Toc237716106 \h </w:instrText>
+          <w:instrText xml:space="preserve"> PAGEREF _Toc237716366 \h </w:instrText>
         </w:r>
         <w:r>
           <w:rPr>
@@ -2915,7 +2915,7 @@
           <w:noProof/>
         </w:rPr>
       </w:pPr>
-      <w:hyperlink w:anchor="_Toc237716107" w:history="1">
+      <w:hyperlink w:anchor="_Toc237716367" w:history="1">
         <w:r>
           <w:rPr>
             <w:rStyle w:val="Siuktni"/>
@@ -2942,7 +2942,7 @@
             <w:noProof/>
             <w:webHidden/>
           </w:rPr>
-          <w:instrText xml:space="preserve"> PAGEREF _Toc237716107 \h </w:instrText>
+          <w:instrText xml:space="preserve"> PAGEREF _Toc237716367 \h </w:instrText>
         </w:r>
         <w:r>
           <w:rPr>
@@ -2991,7 +2991,7 @@
       <w:pPr>
         <w:pStyle w:val="u1"/>
       </w:pPr>
-      <w:bookmarkStart w:id="0" w:name="_Toc237716076"/>
+      <w:bookmarkStart w:id="0" w:name="_Toc237716336"/>
       <w:r>
         <w:rPr>
           <w:rFonts w:ascii="Times New Roman" w:eastAsia="Times New Roman" w:hAnsi="Times New Roman"/>
@@ -3006,7 +3006,7 @@
       <w:pPr>
         <w:pStyle w:val="u2"/>
       </w:pPr>
-      <w:bookmarkStart w:id="1" w:name="_Toc237716077"/>
+      <w:bookmarkStart w:id="1" w:name="_Toc237716337"/>
       <w:r>
         <w:rPr>
           <w:rFonts w:ascii="Times New Roman" w:eastAsia="Times New Roman" w:hAnsi="Times New Roman"/>
@@ -3021,23 +3021,23 @@
         <w:spacing w:after="80"/>
       </w:pPr>
       <w:r>
-        <w:t>Mạng xã hội hiện là kênh tiếp thị và bán hàng phổ biến nhưng cũng phát sinh nhiều hành vi quảng cáo sai sự thật. Tình trạng cắt ghép hình ảnh người có uy tín để thổi phồng công dụng sản phẩm Đông y gây nhầm lẫn cho người mua và ảnh hưởng quyền lợi người tiêu dùng. Vụ việc Công an tỉnh Phú Thọ khởi tố 21 bị can liên quan đến việc quảng cáo sản phẩm Đông y “Xương khớp bà Sáu” trên mạng xã hội (tháng 8/2026) là tình huống thực tế điển hình để vận dụng mô hình bốn yếu tố cấu thành vi phạm pháp luật trong môn Ph</w:t>
-      </w:r>
-      <w:r>
-        <w:t>áp luật đại cương, đồng thời nâng cao ý thức tuân thủ pháp luật và đạo đức nghề nghiệp trong môi trường số cho sinh viên UIT.</w:t>
+        <w:t>Mạng xã hội hiện là kênh tiếp thị và bán hàng phổ biến nhưng cũng phát sinh nhiều hành vi quảng cáo sai sự thật. Tình trạng cắt ghép hình ảnh người có uy tín để thổi phồng công dụng sản phẩm Đông y gây nhầm lẫn cho người mua và ảnh hưởng xấu đến quyền lợi người tiêu dùng. Vụ việc Công an tỉnh Phú Thọ khởi tố 21 bị can liên quan đến hoạt động quảng cáo sản phẩm Đông y “Xương khớp bà Sáu” trên mạng xã hội (tháng 8/2026) là một tình huống thực tế điển hình để nhóm vận dụng lý luận về bốn yếu tố cấu thành vi ph</w:t>
+      </w:r>
+      <w:r>
+        <w:t>ạm pháp luật đã được học trong môn Pháp luật đại cương.</w:t>
       </w:r>
     </w:p>
     <w:p>
       <w:pPr>
         <w:pStyle w:val="u2"/>
       </w:pPr>
-      <w:bookmarkStart w:id="2" w:name="_Toc237716078"/>
+      <w:bookmarkStart w:id="2" w:name="_Toc237716338"/>
       <w:r>
         <w:rPr>
           <w:rFonts w:ascii="Times New Roman" w:eastAsia="Times New Roman" w:hAnsi="Times New Roman"/>
           <w:b w:val="0"/>
         </w:rPr>
-        <w:t>2. Mục tiêu nghiên cứu</w:t>
+        <w:t>2. Mục tiêu của báo cáo</w:t>
       </w:r>
       <w:bookmarkEnd w:id="2"/>
     </w:p>
@@ -3048,7 +3048,7 @@
         <w:ind w:left="709" w:firstLine="0"/>
       </w:pPr>
       <w:r>
-        <w:t>Hệ thống hóa lý thuyết cấu thành vi phạm pháp luật theo học phần Pháp luật đại cương tại UIT.</w:t>
+        <w:t>Hệ thống hóa các nội dung lý thuyết cơ bản về bốn yếu tố cấu thành vi phạm pháp luật theo học phần Pháp luật đại cương tại UIT.</w:t>
       </w:r>
     </w:p>
     <w:p>
@@ -3058,24 +3058,14 @@
         <w:ind w:left="709" w:firstLine="0"/>
       </w:pPr>
       <w:r>
-        <w:t>Phân tích bản chất pháp lý của vụ việc qua bốn yếu tố cấu thành từ nguồn tin chính thức của Báo Điện tử Chính phủ [6].</w:t>
+        <w:t>Vận dụng mô hình bốn yếu tố để phân tích bản chất pháp lý của vụ việc quảng cáo sản phẩm Đông y tại Phú Thọ từ nguồn tin chính thức do Báo Điện tử Chính phủ công bố [6].</w:t>
       </w:r>
     </w:p>
     <w:p>
       <w:pPr>
-        <w:pStyle w:val="Duudong"/>
-        <w:spacing w:after="60"/>
-        <w:ind w:left="709" w:firstLine="0"/>
-      </w:pPr>
-      <w:r>
-        <w:t>Rút ra bài học thực tiễn về pháp luật và đạo đức nghề nghiệp cho người kinh doanh trực tuyến, người tiêu dùng và sinh viên công nghệ thông tin.</w:t>
-      </w:r>
-    </w:p>
-    <w:p>
-      <w:pPr>
         <w:pStyle w:val="u2"/>
       </w:pPr>
-      <w:bookmarkStart w:id="3" w:name="_Toc237716079"/>
+      <w:bookmarkStart w:id="3" w:name="_Toc237716339"/>
       <w:r>
         <w:rPr>
           <w:rFonts w:ascii="Times New Roman" w:eastAsia="Times New Roman" w:hAnsi="Times New Roman"/>
@@ -3129,7 +3119,7 @@
       <w:pPr>
         <w:pStyle w:val="u1"/>
       </w:pPr>
-      <w:bookmarkStart w:id="4" w:name="_Toc237716080"/>
+      <w:bookmarkStart w:id="4" w:name="_Toc237716340"/>
       <w:r>
         <w:rPr>
           <w:rFonts w:ascii="Times New Roman" w:eastAsia="Times New Roman" w:hAnsi="Times New Roman"/>
@@ -3144,7 +3134,7 @@
       <w:pPr>
         <w:pStyle w:val="u2"/>
       </w:pPr>
-      <w:bookmarkStart w:id="5" w:name="_Toc237716081"/>
+      <w:bookmarkStart w:id="5" w:name="_Toc237716341"/>
       <w:r>
         <w:rPr>
           <w:rFonts w:ascii="Times New Roman" w:eastAsia="Times New Roman" w:hAnsi="Times New Roman"/>
@@ -3183,7 +3173,7 @@
       <w:pPr>
         <w:pStyle w:val="u2"/>
       </w:pPr>
-      <w:bookmarkStart w:id="6" w:name="_Toc237716082"/>
+      <w:bookmarkStart w:id="6" w:name="_Toc237716342"/>
       <w:r>
         <w:rPr>
           <w:rFonts w:ascii="Times New Roman" w:eastAsia="Times New Roman" w:hAnsi="Times New Roman"/>
@@ -3295,7 +3285,7 @@
       <w:pPr>
         <w:pStyle w:val="u2"/>
       </w:pPr>
-      <w:bookmarkStart w:id="7" w:name="_Toc237716083"/>
+      <w:bookmarkStart w:id="7" w:name="_Toc237716343"/>
       <w:r>
         <w:rPr>
           <w:rFonts w:ascii="Times New Roman" w:eastAsia="Times New Roman" w:hAnsi="Times New Roman"/>
@@ -3537,7 +3527,7 @@
       <w:pPr>
         <w:pStyle w:val="u2"/>
       </w:pPr>
-      <w:bookmarkStart w:id="8" w:name="_Toc237716084"/>
+      <w:bookmarkStart w:id="8" w:name="_Toc237716344"/>
       <w:r>
         <w:rPr>
           <w:rFonts w:ascii="Times New Roman" w:eastAsia="Times New Roman" w:hAnsi="Times New Roman"/>
@@ -3615,7 +3605,7 @@
       <w:pPr>
         <w:pStyle w:val="u2"/>
       </w:pPr>
-      <w:bookmarkStart w:id="9" w:name="_Toc237716085"/>
+      <w:bookmarkStart w:id="9" w:name="_Toc237716345"/>
       <w:r>
         <w:rPr>
           <w:rFonts w:ascii="Times New Roman" w:eastAsia="Times New Roman" w:hAnsi="Times New Roman"/>
@@ -3710,7 +3700,7 @@
       <w:pPr>
         <w:pStyle w:val="u2"/>
       </w:pPr>
-      <w:bookmarkStart w:id="10" w:name="_Toc237716086"/>
+      <w:bookmarkStart w:id="10" w:name="_Toc237716346"/>
       <w:r>
         <w:rPr>
           <w:rFonts w:ascii="Times New Roman" w:eastAsia="Times New Roman" w:hAnsi="Times New Roman"/>
@@ -3772,7 +3762,7 @@
       <w:pPr>
         <w:pStyle w:val="u2"/>
       </w:pPr>
-      <w:bookmarkStart w:id="11" w:name="_Toc237716087"/>
+      <w:bookmarkStart w:id="11" w:name="_Toc237716347"/>
       <w:r>
         <w:rPr>
           <w:rFonts w:ascii="Times New Roman" w:eastAsia="Times New Roman" w:hAnsi="Times New Roman"/>
@@ -3860,7 +3850,7 @@
       <w:pPr>
         <w:pStyle w:val="u1"/>
       </w:pPr>
-      <w:bookmarkStart w:id="12" w:name="_Toc237716088"/>
+      <w:bookmarkStart w:id="12" w:name="_Toc237716348"/>
       <w:r>
         <w:rPr>
           <w:rFonts w:ascii="Times New Roman" w:eastAsia="Times New Roman" w:hAnsi="Times New Roman"/>
@@ -3875,7 +3865,7 @@
       <w:pPr>
         <w:pStyle w:val="u2"/>
       </w:pPr>
-      <w:bookmarkStart w:id="13" w:name="_Toc237716089"/>
+      <w:bookmarkStart w:id="13" w:name="_Toc237716349"/>
       <w:r>
         <w:rPr>
           <w:rFonts w:ascii="Times New Roman" w:eastAsia="Times New Roman" w:hAnsi="Times New Roman"/>
@@ -3923,7 +3913,7 @@
       <w:pPr>
         <w:pStyle w:val="u2"/>
       </w:pPr>
-      <w:bookmarkStart w:id="14" w:name="_Toc237716090"/>
+      <w:bookmarkStart w:id="14" w:name="_Toc237716350"/>
       <w:r>
         <w:rPr>
           <w:rFonts w:ascii="Times New Roman" w:eastAsia="Times New Roman" w:hAnsi="Times New Roman"/>
@@ -4035,7 +4025,7 @@
       <w:pPr>
         <w:pStyle w:val="u2"/>
       </w:pPr>
-      <w:bookmarkStart w:id="15" w:name="_Toc237716091"/>
+      <w:bookmarkStart w:id="15" w:name="_Toc237716351"/>
       <w:r>
         <w:rPr>
           <w:rFonts w:ascii="Times New Roman" w:eastAsia="Times New Roman" w:hAnsi="Times New Roman"/>
@@ -4106,7 +4096,7 @@
       <w:pPr>
         <w:pStyle w:val="u2"/>
       </w:pPr>
-      <w:bookmarkStart w:id="16" w:name="_Toc237716092"/>
+      <w:bookmarkStart w:id="16" w:name="_Toc237716352"/>
       <w:r>
         <w:rPr>
           <w:rFonts w:ascii="Times New Roman" w:eastAsia="Times New Roman" w:hAnsi="Times New Roman"/>
@@ -4186,7 +4176,7 @@
       <w:pPr>
         <w:pStyle w:val="u2"/>
       </w:pPr>
-      <w:bookmarkStart w:id="17" w:name="_Toc237716093"/>
+      <w:bookmarkStart w:id="17" w:name="_Toc237716353"/>
       <w:r>
         <w:rPr>
           <w:rFonts w:ascii="Times New Roman" w:eastAsia="Times New Roman" w:hAnsi="Times New Roman"/>
@@ -5349,7 +5339,7 @@
       <w:pPr>
         <w:pStyle w:val="u1"/>
       </w:pPr>
-      <w:bookmarkStart w:id="18" w:name="_Toc237716094"/>
+      <w:bookmarkStart w:id="18" w:name="_Toc237716354"/>
       <w:r>
         <w:rPr>
           <w:rFonts w:ascii="Times New Roman" w:eastAsia="Times New Roman" w:hAnsi="Times New Roman"/>
@@ -5372,7 +5362,7 @@
       <w:pPr>
         <w:pStyle w:val="u2"/>
       </w:pPr>
-      <w:bookmarkStart w:id="19" w:name="_Toc237716095"/>
+      <w:bookmarkStart w:id="19" w:name="_Toc237716355"/>
       <w:r>
         <w:rPr>
           <w:rFonts w:ascii="Times New Roman" w:eastAsia="Times New Roman" w:hAnsi="Times New Roman"/>
@@ -5481,8 +5471,472 @@
           <w:b w:val="0"/>
         </w:rPr>
         <w:lastRenderedPageBreak/>
-        <w:t>3.1.2. Phân biệt các bình diện trong yếu tố Khách thể</w:t>
-      </w:r>
+        <w:t>3.1.2. Phân biệt khách thể, đối tượng tác động và người bị ảnh hưởng</w:t>
+      </w:r>
+    </w:p>
+    <w:p>
+      <w:pPr>
+        <w:spacing w:after="80"/>
+      </w:pPr>
+      <w:r>
+        <w:t>Trong vụ việc này, khách thể là các quan hệ xã hội được pháp luật bảo vệ gồm trật tự quản lý quảng cáo, quyền được thông tin trung thực của người tiêu dùng và quyền hình ảnh cá nhân. Đối tượng tác động trực tiếp là bài viết, video quảng cáo cắt ghép, sản phẩm Đông y và dòng tiền từ các đơn hàng. Những người chịu ảnh hưởng trực tiếp gồm người mua hàng qua 5.429 đơn hàng và các cá nhân bị khai thác hình ảnh trong tư liệu tiếp thị.</w:t>
+      </w:r>
+    </w:p>
+    <w:p>
+      <w:pPr>
+        <w:pStyle w:val="u2"/>
+      </w:pPr>
+      <w:bookmarkStart w:id="20" w:name="_Toc237716356"/>
+      <w:r>
+        <w:rPr>
+          <w:rFonts w:ascii="Times New Roman" w:eastAsia="Times New Roman" w:hAnsi="Times New Roman"/>
+          <w:b w:val="0"/>
+        </w:rPr>
+        <w:t>3.2. Phân tích yếu tố Mặt khách quan của vi phạm pháp luật</w:t>
+      </w:r>
+      <w:bookmarkEnd w:id="20"/>
+    </w:p>
+    <w:p>
+      <w:pPr>
+        <w:pStyle w:val="u3"/>
+      </w:pPr>
+      <w:r>
+        <w:rPr>
+          <w:rFonts w:ascii="Times New Roman" w:eastAsia="Times New Roman" w:hAnsi="Times New Roman"/>
+          <w:b w:val="0"/>
+        </w:rPr>
+        <w:t>3.2.1. Hành vi trái pháp luật</w:t>
+      </w:r>
+    </w:p>
+    <w:p>
+      <w:pPr>
+        <w:spacing w:after="80"/>
+      </w:pPr>
+      <w:r>
+        <w:t>Mặt khách quan thể hiện qua chuỗi hành vi hành động cụ thể trên thực tế:</w:t>
+      </w:r>
+    </w:p>
+    <w:p>
+      <w:pPr>
+        <w:pStyle w:val="Duudong"/>
+        <w:spacing w:after="60"/>
+        <w:ind w:left="709" w:firstLine="0"/>
+      </w:pPr>
+      <w:r>
+        <w:rPr>
+          <w:b/>
+        </w:rPr>
+        <w:t>Quảng cáo sai sự thật:</w:t>
+      </w:r>
+      <w:r>
+        <w:t xml:space="preserve"> Đưa ra thông tin phóng đại, không đúng về công dụng của sản phẩm Đông y nhằm tạo niềm tin cho người mua, vi phạm khoản 9 Điều 8 Luật Quảng cáo [3].</w:t>
+      </w:r>
+    </w:p>
+    <w:p>
+      <w:pPr>
+        <w:pStyle w:val="Duudong"/>
+        <w:spacing w:after="60"/>
+        <w:ind w:left="709" w:firstLine="0"/>
+      </w:pPr>
+      <w:r>
+        <w:rPr>
+          <w:b/>
+        </w:rPr>
+        <w:t>Sử dụng tư liệu cắt ghép người nổi tiếng:</w:t>
+      </w:r>
+      <w:r>
+        <w:t xml:space="preserve"> Lồng ghép hình ảnh, video người có uy tín đã qua chỉnh sửa vào nội dung bán hàng [6], vi phạm khoản 8 Điều 8 Luật Quảng cáo [3] và Điều 32 Bộ luật Dân sự 2015 [2] nếu không có sự đồng ý hợp lệ.</w:t>
+      </w:r>
+    </w:p>
+    <w:p>
+      <w:pPr>
+        <w:pStyle w:val="Duudong"/>
+        <w:spacing w:after="60"/>
+        <w:ind w:left="709" w:firstLine="0"/>
+      </w:pPr>
+      <w:r>
+        <w:rPr>
+          <w:b/>
+        </w:rPr>
+        <w:t>Bối cảnh tố tụng:</w:t>
+      </w:r>
+      <w:r>
+        <w:t xml:space="preserve"> Cơ quan điều tra đã khởi tố Đạt cùng 20 bị can về tội </w:t>
+      </w:r>
+      <w:r>
+        <w:rPr>
+          <w:i/>
+        </w:rPr>
+        <w:t>“Lừa dối khách hàng”</w:t>
+      </w:r>
+      <w:r>
+        <w:t xml:space="preserve"> theo khoản 2 Điều 198 Bộ luật Hình sự [1], [6], phản ánh tính chất trái pháp luật của chuỗi hành vi.</w:t>
+      </w:r>
+    </w:p>
+    <w:p>
+      <w:pPr>
+        <w:pStyle w:val="u3"/>
+      </w:pPr>
+      <w:r>
+        <w:rPr>
+          <w:rFonts w:ascii="Times New Roman" w:eastAsia="Times New Roman" w:hAnsi="Times New Roman"/>
+          <w:b w:val="0"/>
+        </w:rPr>
+        <w:t>3.2.2. Quy mô giao dịch và hậu quả ghi nhận</w:t>
+      </w:r>
+    </w:p>
+    <w:p>
+      <w:pPr>
+        <w:spacing w:after="80"/>
+      </w:pPr>
+      <w:r>
+        <w:t xml:space="preserve">Nguồn tin chính thức ghi nhận nhóm đã thực hiện thành công </w:t>
+      </w:r>
+      <w:r>
+        <w:rPr>
+          <w:b/>
+        </w:rPr>
+        <w:t>5.429 đơn hàng</w:t>
+      </w:r>
+      <w:r>
+        <w:t xml:space="preserve"> với </w:t>
+      </w:r>
+      <w:r>
+        <w:rPr>
+          <w:b/>
+        </w:rPr>
+        <w:t>tổng giá trị tiền hàng hơn 2,67 tỷ đồng</w:t>
+      </w:r>
+      <w:r>
+        <w:t xml:space="preserve"> [6]. Đây là quy mô giao dịch phát sinh trên thực tế. Cần phân biệt tổng giá trị tiền hàng với thiệt hại thực tế của người mua hay lợi nhuận thuần túy của người bán, bởi việc xác định chính xác thiệt hại phụ thuộc vào kết luận tài chính của cơ quan tố tụng.</w:t>
+      </w:r>
+    </w:p>
+    <w:p>
+      <w:pPr>
+        <w:pStyle w:val="u3"/>
+      </w:pPr>
+      <w:r>
+        <w:rPr>
+          <w:rFonts w:ascii="Times New Roman" w:eastAsia="Times New Roman" w:hAnsi="Times New Roman"/>
+          <w:b w:val="0"/>
+        </w:rPr>
+        <w:t>3.2.3. Mối liên hệ nhân quả</w:t>
+      </w:r>
+    </w:p>
+    <w:p>
+      <w:pPr>
+        <w:spacing w:after="80"/>
+      </w:pPr>
+      <w:r>
+        <w:t xml:space="preserve">Nội dung quảng cáo phóng đại và hình ảnh cắt ghép có khả năng tác động đến nhận thức, thúc đẩy người xem tin tưởng và đặt mua sản phẩm. Mối liên hệ giữa hoạt động tiếp thị sai sự thật và 5.429 đơn hàng phát sinh là cơ sở để xem xét quan hệ </w:t>
+      </w:r>
+      <w:r>
+        <w:lastRenderedPageBreak/>
+        <w:t>nhân quả trong môn học. Tuy nhiên, thông tin công khai chưa thể hiện lý do mua hàng cụ thể của từng cá nhân trong 5.429 đơn hàng, nên nhóm không nhận định rằng toàn bộ đơn hàng đều phát sinh duy nhất từ việc quảng cáo gian dối.</w:t>
+      </w:r>
+    </w:p>
+    <w:p>
+      <w:pPr>
+        <w:pStyle w:val="u2"/>
+      </w:pPr>
+      <w:bookmarkStart w:id="21" w:name="_Toc237716357"/>
+      <w:r>
+        <w:rPr>
+          <w:rFonts w:ascii="Times New Roman" w:eastAsia="Times New Roman" w:hAnsi="Times New Roman"/>
+          <w:b w:val="0"/>
+        </w:rPr>
+        <w:t>3.3. Phân tích yếu tố Chủ thể của vi phạm pháp luật</w:t>
+      </w:r>
+      <w:bookmarkEnd w:id="21"/>
+    </w:p>
+    <w:p>
+      <w:pPr>
+        <w:pStyle w:val="u3"/>
+      </w:pPr>
+      <w:r>
+        <w:rPr>
+          <w:rFonts w:ascii="Times New Roman" w:eastAsia="Times New Roman" w:hAnsi="Times New Roman"/>
+          <w:b w:val="0"/>
+        </w:rPr>
+        <w:t>3.3.1. Đánh giá năng lực trách nhiệm pháp lý</w:t>
+      </w:r>
+    </w:p>
+    <w:p>
+      <w:pPr>
+        <w:spacing w:after="80"/>
+      </w:pPr>
+      <w:r>
+        <w:t>Chủ thể của vi phạm pháp luật phải thỏa mãn điều kiện về độ tuổi và khả năng nhận thức, điều khiển hành vi [5]:</w:t>
+      </w:r>
+    </w:p>
+    <w:p>
+      <w:pPr>
+        <w:pStyle w:val="Duudong"/>
+        <w:spacing w:after="60"/>
+        <w:ind w:left="709" w:firstLine="0"/>
+      </w:pPr>
+      <w:r>
+        <w:rPr>
+          <w:b/>
+        </w:rPr>
+        <w:t>Về độ tuổi:</w:t>
+      </w:r>
+      <w:r>
+        <w:t xml:space="preserve"> Bị can Nguyễn Tiến Đạt sinh năm 1997, đã đủ tuổi thành niên tại thời điểm diễn ra vụ việc (năm 2026). Đối với 20 bị can còn lại, tài liệu công khai chưa nêu năm sinh cụ thể; quyết định khởi tố phản ánh việc thẩm tra ban đầu của cơ quan điều tra, nhưng chưa đủ dữ liệu công khai để đánh giá độ tuổi chính xác của từng người.</w:t>
+      </w:r>
+    </w:p>
+    <w:p>
+      <w:pPr>
+        <w:pStyle w:val="Duudong"/>
+        <w:spacing w:after="60"/>
+        <w:ind w:left="709" w:firstLine="0"/>
+      </w:pPr>
+      <w:r>
+        <w:rPr>
+          <w:b/>
+        </w:rPr>
+        <w:t>Về khả năng nhận thức:</w:t>
+      </w:r>
+      <w:r>
+        <w:t xml:space="preserve"> Nguồn tin ghi nhận các cá nhân tham gia vào các khâu công việc cụ thể. Việc thẩm định chính xác tình trạng tâm thần và khả năng nhận thức của từng bị can thuộc thẩm quyền của cơ quan tiến hành tố tụng.</w:t>
+      </w:r>
+    </w:p>
+    <w:p>
+      <w:pPr>
+        <w:pStyle w:val="u3"/>
+      </w:pPr>
+      <w:r>
+        <w:rPr>
+          <w:rFonts w:ascii="Times New Roman" w:eastAsia="Times New Roman" w:hAnsi="Times New Roman"/>
+          <w:b w:val="0"/>
+        </w:rPr>
+        <w:t>3.3.2. Phân hóa vai trò của các nhóm cá nhân</w:t>
+      </w:r>
+    </w:p>
+    <w:p>
+      <w:pPr>
+        <w:spacing w:after="80"/>
+      </w:pPr>
+      <w:r>
+        <w:t>Dữ liệu công khai cho thấy có sự phân công công việc giữa các cá nhân:</w:t>
+      </w:r>
+    </w:p>
+    <w:p>
+      <w:pPr>
+        <w:spacing w:after="60"/>
+        <w:ind w:left="709" w:firstLine="0"/>
+      </w:pPr>
+      <w:r>
+        <w:t xml:space="preserve">1. </w:t>
+      </w:r>
+      <w:r>
+        <w:rPr>
+          <w:b/>
+        </w:rPr>
+        <w:t>Nguyễn Tiến Đạt (Người tổ chức điều hành):</w:t>
+      </w:r>
+      <w:r>
+        <w:t xml:space="preserve"> Thỏa thuận giá mua sản phẩm, chỉ đạo sản xuất nội dung quảng cáo và điều hành hoạt động bán hàng [6].</w:t>
+      </w:r>
+    </w:p>
+    <w:p>
+      <w:pPr>
+        <w:spacing w:after="60"/>
+        <w:ind w:left="709" w:firstLine="0"/>
+      </w:pPr>
+      <w:r>
+        <w:t xml:space="preserve">2. </w:t>
+      </w:r>
+      <w:r>
+        <w:rPr>
+          <w:b/>
+        </w:rPr>
+        <w:t>Phùng Thị Nguyệt Ánh (Người liên quan nguồn hàng):</w:t>
+      </w:r>
+      <w:r>
+        <w:t xml:space="preserve"> Giám đốc doanh nghiệp cung ứng sản phẩm; mức độ liên đới đang được cơ quan công an tiếp tục làm rõ [6].</w:t>
+      </w:r>
+    </w:p>
+    <w:p>
+      <w:pPr>
+        <w:spacing w:after="60"/>
+        <w:ind w:left="709" w:firstLine="0"/>
+      </w:pPr>
+      <w:r>
+        <w:t xml:space="preserve">3. </w:t>
+      </w:r>
+      <w:r>
+        <w:rPr>
+          <w:b/>
+        </w:rPr>
+        <w:t>Nhóm nhân sự hỗ trợ:</w:t>
+      </w:r>
+      <w:r>
+        <w:t xml:space="preserve"> Thực hiện các công việc kỹ thuật marketing, tư vấn bán hàng, vận đơn và đóng gói [6]. Mức độ nhận thức và trách nhiệm của từng cá nhân sẽ được cơ quan tố tụng cá thể hóa theo chứng cứ cụ thể.</w:t>
+      </w:r>
+    </w:p>
+    <w:p>
+      <w:pPr>
+        <w:pStyle w:val="u2"/>
+      </w:pPr>
+      <w:bookmarkStart w:id="22" w:name="_Toc237716358"/>
+      <w:r>
+        <w:rPr>
+          <w:rFonts w:ascii="Times New Roman" w:eastAsia="Times New Roman" w:hAnsi="Times New Roman"/>
+          <w:b w:val="0"/>
+        </w:rPr>
+        <w:lastRenderedPageBreak/>
+        <w:t>3.4. Phân tích yếu tố Mặt chủ quan của vi phạm pháp luật</w:t>
+      </w:r>
+      <w:bookmarkEnd w:id="22"/>
+    </w:p>
+    <w:p>
+      <w:pPr>
+        <w:pStyle w:val="u3"/>
+      </w:pPr>
+      <w:r>
+        <w:rPr>
+          <w:rFonts w:ascii="Times New Roman" w:eastAsia="Times New Roman" w:hAnsi="Times New Roman"/>
+          <w:b w:val="0"/>
+        </w:rPr>
+        <w:t>3.4.1. Phân tích đối với người tổ chức (Nguyễn Tiến Đạt)</w:t>
+      </w:r>
+    </w:p>
+    <w:p>
+      <w:pPr>
+        <w:pStyle w:val="Duudong"/>
+        <w:spacing w:after="60"/>
+        <w:ind w:left="709" w:firstLine="0"/>
+      </w:pPr>
+      <w:r>
+        <w:rPr>
+          <w:b/>
+        </w:rPr>
+        <w:t>Về yếu tố Lỗi:</w:t>
+      </w:r>
+      <w:r>
+        <w:t xml:space="preserve"> Việc chỉ đạo tạo lập nội dung cắt ghép hình ảnh và phóng đại công dụng sản phẩm để tạo niềm tin cho người mua tạo cơ sở để phân tích theo hướng </w:t>
+      </w:r>
+      <w:r>
+        <w:rPr>
+          <w:b/>
+        </w:rPr>
+        <w:t>Lỗi cố ý trực tiếp</w:t>
+      </w:r>
+      <w:r>
+        <w:t>:</w:t>
+      </w:r>
+    </w:p>
+    <w:p>
+      <w:pPr>
+        <w:pStyle w:val="Duudong"/>
+        <w:spacing w:after="60"/>
+        <w:ind w:left="709" w:firstLine="0"/>
+      </w:pPr>
+      <w:r>
+        <w:rPr>
+          <w:i/>
+        </w:rPr>
+        <w:t>Về lý trí:</w:t>
+      </w:r>
+      <w:r>
+        <w:t xml:space="preserve"> Nhận thức rõ giá mua 23.000 đồng và nội dung quảng cáo cắt ghép là không đúng sự thật; thấy trước việc quảng cáo này sẽ khiến khách hàng tin tưởng đặt mua.</w:t>
+      </w:r>
+    </w:p>
+    <w:p>
+      <w:pPr>
+        <w:pStyle w:val="Duudong"/>
+        <w:spacing w:after="60"/>
+        <w:ind w:left="709" w:firstLine="0"/>
+      </w:pPr>
+      <w:r>
+        <w:rPr>
+          <w:i/>
+        </w:rPr>
+        <w:t>Về ý chí:</w:t>
+      </w:r>
+      <w:r>
+        <w:t xml:space="preserve"> Mong muốn bán được nhiều sản phẩm với mức giá 199.000 đồng/sản phẩm để thu tiền.</w:t>
+      </w:r>
+    </w:p>
+    <w:p>
+      <w:pPr>
+        <w:pStyle w:val="Duudong"/>
+        <w:spacing w:after="60"/>
+        <w:ind w:left="709" w:firstLine="0"/>
+      </w:pPr>
+      <w:r>
+        <w:rPr>
+          <w:b/>
+        </w:rPr>
+        <w:t>Về Động cơ và Mục đích:</w:t>
+      </w:r>
+    </w:p>
+    <w:p>
+      <w:pPr>
+        <w:pStyle w:val="Duudong"/>
+        <w:spacing w:after="60"/>
+        <w:ind w:left="709" w:firstLine="0"/>
+      </w:pPr>
+      <w:r>
+        <w:rPr>
+          <w:i/>
+        </w:rPr>
+        <w:t>Động cơ:</w:t>
+      </w:r>
+      <w:r>
+        <w:t xml:space="preserve"> Chênh lệch giữa giá mua và giá bán cùng quy mô tiếp thị tạo cơ sở phân tích theo hướng có động cơ vụ lợi kinh tế.</w:t>
+      </w:r>
+    </w:p>
+    <w:p>
+      <w:pPr>
+        <w:pStyle w:val="Duudong"/>
+        <w:spacing w:after="60"/>
+        <w:ind w:left="709" w:firstLine="0"/>
+      </w:pPr>
+      <w:r>
+        <w:rPr>
+          <w:i/>
+        </w:rPr>
+        <w:t>Mục đích:</w:t>
+      </w:r>
+      <w:r>
+        <w:t xml:space="preserve"> Tạo niềm tin để người tiếp cận đặt mua sản phẩm và phát sinh giao dịch bán hàng [6].</w:t>
+      </w:r>
+    </w:p>
+    <w:p>
+      <w:pPr>
+        <w:pStyle w:val="u3"/>
+      </w:pPr>
+      <w:r>
+        <w:rPr>
+          <w:rFonts w:ascii="Times New Roman" w:eastAsia="Times New Roman" w:hAnsi="Times New Roman"/>
+          <w:b w:val="0"/>
+        </w:rPr>
+        <w:t>3.4.2. Giới hạn đánh giá đối với nhân sự hỗ trợ</w:t>
+      </w:r>
+    </w:p>
+    <w:p>
+      <w:pPr>
+        <w:spacing w:after="80"/>
+      </w:pPr>
+      <w:r>
+        <w:t>Đối với các nhân viên tham gia marketing, tư vấn, đóng gói và vận chuyển, tài liệu ban đầu chưa thể hiện chi tiết ý thức chủ quan của từng người. Trong quá trình điều tra, cơ quan chức năng sẽ làm rõ mức độ nhận thức của từng nhân viên để xác định vai trò, mức độ tham gia và trách nhiệm pháp lý tương ứng.</w:t>
+      </w:r>
+    </w:p>
+    <w:p>
+      <w:pPr>
+        <w:pStyle w:val="u2"/>
+      </w:pPr>
+      <w:bookmarkStart w:id="23" w:name="_Toc237716359"/>
+      <w:r>
+        <w:rPr>
+          <w:rFonts w:ascii="Times New Roman" w:eastAsia="Times New Roman" w:hAnsi="Times New Roman"/>
+          <w:b w:val="0"/>
+        </w:rPr>
+        <w:t>3.5. Tổng hợp bốn yếu tố cấu thành vi phạm pháp luật</w:t>
+      </w:r>
+      <w:bookmarkEnd w:id="23"/>
     </w:p>
     <w:p>
       <w:pPr>
@@ -5495,7 +5949,7 @@
           <w:b/>
           <w:sz w:val="22"/>
         </w:rPr>
-        <w:t>Bảng 4. Phân biệt khách thể, đối tượng tác động và người bị ảnh hưởng</w:t>
+        <w:t>Bảng 4. Tổng hợp bốn yếu tố cấu thành vi phạm pháp luật trong vụ việc</w:t>
       </w:r>
     </w:p>
     <w:tbl>
@@ -5532,7 +5986,7 @@
                 <w:b/>
                 <w:sz w:val="19"/>
               </w:rPr>
-              <w:t>Bình diện</w:t>
+              <w:t>Yếu tố</w:t>
             </w:r>
           </w:p>
         </w:tc>
@@ -5552,7 +6006,7 @@
                 <w:b/>
                 <w:sz w:val="19"/>
               </w:rPr>
-              <w:t>Nội dung trong vụ việc</w:t>
+              <w:t>Dữ kiện chính [6]</w:t>
             </w:r>
           </w:p>
         </w:tc>
@@ -5572,7 +6026,7 @@
                 <w:b/>
                 <w:sz w:val="19"/>
               </w:rPr>
-              <w:t>Lưu ý phạm vi dữ liệu</w:t>
+              <w:t>Nhận định pháp lý</w:t>
             </w:r>
           </w:p>
         </w:tc>
@@ -5617,7 +6071,7 @@
               <w:rPr>
                 <w:sz w:val="19"/>
               </w:rPr>
-              <w:t>Trật tự quản lý quảng cáo, thương mại; quyền được thông tin trung thực của người tiêu dùng; quyền hình ảnh</w:t>
+              <w:t>Sản phẩm mua giá 23.000 đồng bán 199.000 đồng; video người nổi tiếng bị cắt ghép; 5.429 đơn hàng thành công.</w:t>
             </w:r>
           </w:p>
         </w:tc>
@@ -5636,7 +6090,7 @@
               <w:rPr>
                 <w:sz w:val="19"/>
               </w:rPr>
-              <w:t>Đánh giá theo quy định pháp luật hiện hành</w:t>
+              <w:t>Xâm hại trật tự quản lý quảng cáo, thương mại; quyền được thông tin trung thực của người tiêu dùng; quyền hình ảnh cá nhân.</w:t>
             </w:r>
           </w:p>
         </w:tc>
@@ -5662,7 +6116,7 @@
                 <w:b/>
                 <w:sz w:val="19"/>
               </w:rPr>
-              <w:t>Đối tượng tác động</w:t>
+              <w:t>Mặt khách quan</w:t>
             </w:r>
           </w:p>
         </w:tc>
@@ -5681,7 +6135,7 @@
               <w:rPr>
                 <w:sz w:val="19"/>
               </w:rPr>
-              <w:t>Bài viết, video cắt ghép; sản phẩm Đông y “Xương khớp bà Sáu”; tiền thanh toán từ 5.429 đơn hàng</w:t>
+              <w:t>Quảng cáo sai sự thật, dùng video cắt ghép; thực hiện 5.429 đơn hàng với tổng giá trị tiền hàng hơn 2,67 tỷ đồng.</w:t>
             </w:r>
           </w:p>
         </w:tc>
@@ -5700,7 +6154,7 @@
               <w:rPr>
                 <w:sz w:val="19"/>
               </w:rPr>
-              <w:t>Là thực thể vật chất hoặc dữ liệu cụ thể bị tác động</w:t>
+              <w:t>Hành vi trái pháp luật diễn ra qua nhiều khâu; thông tin sai lệch có khả năng tác động đến quyết định mua hàng của người tiếp cận.</w:t>
             </w:r>
           </w:p>
         </w:tc>
@@ -5726,7 +6180,8 @@
                 <w:b/>
                 <w:sz w:val="19"/>
               </w:rPr>
-              <w:t>Người bị ảnh hưởng</w:t>
+              <w:lastRenderedPageBreak/>
+              <w:t>Chủ thể</w:t>
             </w:r>
           </w:p>
         </w:tc>
@@ -5745,7 +6200,7 @@
               <w:rPr>
                 <w:sz w:val="19"/>
               </w:rPr>
-              <w:t>Người mua qua 5.429 đơn hàng; người nổi tiếng bị sử dụng hình ảnh cắt ghép</w:t>
+              <w:t>Khởi tố Nguyễn Tiến Đạt cùng 20 bị can; Đạt sinh năm 1997; có các nhóm làm marketing, bán hàng, vận đơn.</w:t>
             </w:r>
           </w:p>
         </w:tc>
@@ -5764,575 +6219,7 @@
               <w:rPr>
                 <w:sz w:val="19"/>
               </w:rPr>
-              <w:t>Không suy đoán số lượng khách hàng riêng biệt hay thỏa thuận hình ảnh cụ thể</w:t>
-            </w:r>
-          </w:p>
-        </w:tc>
-      </w:tr>
-    </w:tbl>
-    <w:p>
-      <w:pPr>
-        <w:pStyle w:val="u2"/>
-      </w:pPr>
-      <w:bookmarkStart w:id="20" w:name="_Toc237716096"/>
-      <w:r>
-        <w:rPr>
-          <w:rFonts w:ascii="Times New Roman" w:eastAsia="Times New Roman" w:hAnsi="Times New Roman"/>
-          <w:b w:val="0"/>
-        </w:rPr>
-        <w:t>3.2. Phân tích yếu tố Mặt khách quan của vi phạm pháp luật</w:t>
-      </w:r>
-      <w:bookmarkEnd w:id="20"/>
-    </w:p>
-    <w:p>
-      <w:pPr>
-        <w:pStyle w:val="u3"/>
-      </w:pPr>
-      <w:r>
-        <w:rPr>
-          <w:rFonts w:ascii="Times New Roman" w:eastAsia="Times New Roman" w:hAnsi="Times New Roman"/>
-          <w:b w:val="0"/>
-        </w:rPr>
-        <w:t>3.2.1. Hành vi trái pháp luật</w:t>
-      </w:r>
-    </w:p>
-    <w:p>
-      <w:pPr>
-        <w:spacing w:after="80"/>
-      </w:pPr>
-      <w:r>
-        <w:t>Mặt khách quan thể hiện qua chuỗi hành vi hành động cụ thể trên thực tế:</w:t>
-      </w:r>
-    </w:p>
-    <w:p>
-      <w:pPr>
-        <w:pStyle w:val="Duudong"/>
-        <w:spacing w:after="60"/>
-        <w:ind w:left="709" w:firstLine="0"/>
-      </w:pPr>
-      <w:r>
-        <w:rPr>
-          <w:b/>
-        </w:rPr>
-        <w:t>Quảng cáo sai sự thật:</w:t>
-      </w:r>
-      <w:r>
-        <w:t xml:space="preserve"> Đưa ra thông tin phóng đại, không đúng về công dụng của sản phẩm Đông y nhằm tạo niềm tin cho người mua, vi phạm khoản 9 Điều 8 Luật Quảng cáo [3].</w:t>
-      </w:r>
-    </w:p>
-    <w:p>
-      <w:pPr>
-        <w:pStyle w:val="Duudong"/>
-        <w:spacing w:after="60"/>
-        <w:ind w:left="709" w:firstLine="0"/>
-      </w:pPr>
-      <w:r>
-        <w:rPr>
-          <w:b/>
-        </w:rPr>
-        <w:t>Sử dụng tư liệu cắt ghép người nổi tiếng:</w:t>
-      </w:r>
-      <w:r>
-        <w:t xml:space="preserve"> Lồng ghép hình ảnh, video người có uy tín đã qua chỉnh sửa vào nội dung bán hàng [6], vi phạm khoản 8 Điều 8 Luật Quảng cáo [3] và Điều 32 Bộ luật Dân sự 2015 [2] nếu không có sự đồng ý hợp lệ.</w:t>
-      </w:r>
-    </w:p>
-    <w:p>
-      <w:pPr>
-        <w:pStyle w:val="Duudong"/>
-        <w:spacing w:after="60"/>
-        <w:ind w:left="709" w:firstLine="0"/>
-      </w:pPr>
-      <w:r>
-        <w:rPr>
-          <w:b/>
-        </w:rPr>
-        <w:t>Bối cảnh tố tụng:</w:t>
-      </w:r>
-      <w:r>
-        <w:t xml:space="preserve"> Cơ quan điều tra đã khởi tố Đạt cùng 20 bị can về tội </w:t>
-      </w:r>
-      <w:r>
-        <w:rPr>
-          <w:i/>
-        </w:rPr>
-        <w:t>“Lừa dối khách hàng”</w:t>
-      </w:r>
-      <w:r>
-        <w:t xml:space="preserve"> theo khoản 2 Điều 198 Bộ luật Hình sự [1], [6], phản ánh tính chất trái pháp luật của chuỗi hành vi.</w:t>
-      </w:r>
-    </w:p>
-    <w:p>
-      <w:pPr>
-        <w:pStyle w:val="u3"/>
-      </w:pPr>
-      <w:r>
-        <w:rPr>
-          <w:rFonts w:ascii="Times New Roman" w:eastAsia="Times New Roman" w:hAnsi="Times New Roman"/>
-          <w:b w:val="0"/>
-        </w:rPr>
-        <w:t>3.2.2. Quy mô giao dịch và hậu quả ghi nhận</w:t>
-      </w:r>
-    </w:p>
-    <w:p>
-      <w:pPr>
-        <w:spacing w:after="80"/>
-      </w:pPr>
-      <w:r>
-        <w:t xml:space="preserve">Nguồn tin chính thức ghi nhận nhóm đã thực hiện thành công </w:t>
-      </w:r>
-      <w:r>
-        <w:rPr>
-          <w:b/>
-        </w:rPr>
-        <w:t>5.429 đơn hàng</w:t>
-      </w:r>
-      <w:r>
-        <w:t xml:space="preserve"> với </w:t>
-      </w:r>
-      <w:r>
-        <w:rPr>
-          <w:b/>
-        </w:rPr>
-        <w:t>tổng giá trị tiền hàng hơn 2,67 tỷ đồng</w:t>
-      </w:r>
-      <w:r>
-        <w:t xml:space="preserve"> [6]. Đây là quy mô giao dịch phát sinh trên thực tế. Cần phân biệt tổng giá trị tiền hàng với thiệt hại thực tế của người mua hay lợi nhuận thuần túy của người bán, bởi việc xác định chính xác thiệt hại phụ thuộc vào kết luận tài chính của cơ quan tố tụng.</w:t>
-      </w:r>
-    </w:p>
-    <w:p>
-      <w:pPr>
-        <w:pStyle w:val="u3"/>
-      </w:pPr>
-      <w:r>
-        <w:rPr>
-          <w:rFonts w:ascii="Times New Roman" w:eastAsia="Times New Roman" w:hAnsi="Times New Roman"/>
-          <w:b w:val="0"/>
-        </w:rPr>
-        <w:lastRenderedPageBreak/>
-        <w:t>3.2.3. Mối liên hệ nhân quả</w:t>
-      </w:r>
-    </w:p>
-    <w:p>
-      <w:pPr>
-        <w:spacing w:after="80"/>
-      </w:pPr>
-      <w:r>
-        <w:t>Nội dung quảng cáo phóng đại và hình ảnh cắt ghép có khả năng tác động đến nhận thức, thúc đẩy người xem tin tưởng và đặt mua sản phẩm. Mối liên hệ giữa hoạt động tiếp thị sai sự thật và 5.429 đơn hàng phát sinh là cơ sở để xem xét quan hệ nhân quả trong môn học. Tuy nhiên, thông tin công khai chưa thể hiện lý do mua hàng cụ thể của từng cá nhân trong 5.429 đơn hàng, nên nhóm không nhận định rằng toàn bộ đơn hàng đều phát sinh duy nhất từ việc quảng cáo gian dối.</w:t>
-      </w:r>
-    </w:p>
-    <w:p>
-      <w:pPr>
-        <w:pStyle w:val="u2"/>
-      </w:pPr>
-      <w:bookmarkStart w:id="21" w:name="_Toc237716097"/>
-      <w:r>
-        <w:rPr>
-          <w:rFonts w:ascii="Times New Roman" w:eastAsia="Times New Roman" w:hAnsi="Times New Roman"/>
-          <w:b w:val="0"/>
-        </w:rPr>
-        <w:t>3.3. Phân tích yếu tố Chủ thể của vi phạm pháp luật</w:t>
-      </w:r>
-      <w:bookmarkEnd w:id="21"/>
-    </w:p>
-    <w:p>
-      <w:pPr>
-        <w:pStyle w:val="u3"/>
-      </w:pPr>
-      <w:r>
-        <w:rPr>
-          <w:rFonts w:ascii="Times New Roman" w:eastAsia="Times New Roman" w:hAnsi="Times New Roman"/>
-          <w:b w:val="0"/>
-        </w:rPr>
-        <w:t>3.3.1. Đánh giá năng lực trách nhiệm pháp lý</w:t>
-      </w:r>
-    </w:p>
-    <w:p>
-      <w:pPr>
-        <w:spacing w:after="80"/>
-      </w:pPr>
-      <w:r>
-        <w:t>Chủ thể của vi phạm pháp luật phải thỏa mãn điều kiện về độ tuổi và khả năng nhận thức, điều khiển hành vi [5]:</w:t>
-      </w:r>
-    </w:p>
-    <w:p>
-      <w:pPr>
-        <w:pStyle w:val="Duudong"/>
-        <w:spacing w:after="60"/>
-        <w:ind w:left="709" w:firstLine="0"/>
-      </w:pPr>
-      <w:r>
-        <w:rPr>
-          <w:b/>
-        </w:rPr>
-        <w:t>Về độ tuổi:</w:t>
-      </w:r>
-      <w:r>
-        <w:t xml:space="preserve"> Bị can Nguyễn Tiến Đạt sinh năm 1997, đã đủ tuổi thành niên tại thời điểm diễn ra vụ việc (năm 2026). Đối với 20 bị can còn lại, tài liệu công khai chưa nêu năm sinh cụ thể; quyết định khởi tố phản ánh việc thẩm tra ban đầu của cơ quan điều tra, nhưng chưa đủ dữ liệu công khai để đánh giá độ tuổi chính xác của từng người.</w:t>
-      </w:r>
-    </w:p>
-    <w:p>
-      <w:pPr>
-        <w:pStyle w:val="Duudong"/>
-        <w:spacing w:after="60"/>
-        <w:ind w:left="709" w:firstLine="0"/>
-      </w:pPr>
-      <w:r>
-        <w:rPr>
-          <w:b/>
-        </w:rPr>
-        <w:t>Về khả năng nhận thức:</w:t>
-      </w:r>
-      <w:r>
-        <w:t xml:space="preserve"> Nguồn tin ghi nhận các cá nhân tham gia vào các khâu công việc cụ thể. Việc thẩm định chính xác tình trạng tâm thần và khả năng nhận thức của từng bị can thuộc thẩm quyền của cơ quan tiến hành tố tụng.</w:t>
-      </w:r>
-    </w:p>
-    <w:p>
-      <w:pPr>
-        <w:pStyle w:val="u3"/>
-      </w:pPr>
-      <w:r>
-        <w:rPr>
-          <w:rFonts w:ascii="Times New Roman" w:eastAsia="Times New Roman" w:hAnsi="Times New Roman"/>
-          <w:b w:val="0"/>
-        </w:rPr>
-        <w:t>3.3.2. Phân hóa vai trò của các nhóm cá nhân</w:t>
-      </w:r>
-    </w:p>
-    <w:p>
-      <w:pPr>
-        <w:spacing w:after="80"/>
-      </w:pPr>
-      <w:r>
-        <w:t>Dữ liệu công khai cho thấy có sự phân công công việc giữa các cá nhân:</w:t>
-      </w:r>
-    </w:p>
-    <w:p>
-      <w:pPr>
-        <w:spacing w:after="60"/>
-        <w:ind w:left="709" w:firstLine="0"/>
-      </w:pPr>
-      <w:r>
-        <w:t xml:space="preserve">1. </w:t>
-      </w:r>
-      <w:r>
-        <w:rPr>
-          <w:b/>
-        </w:rPr>
-        <w:t>Nguyễn Tiến Đạt (Người tổ chức điều hành):</w:t>
-      </w:r>
-      <w:r>
-        <w:t xml:space="preserve"> Thỏa thuận giá mua sản phẩm, chỉ đạo sản xuất nội dung quảng cáo và điều hành hoạt động bán hàng [6].</w:t>
-      </w:r>
-    </w:p>
-    <w:p>
-      <w:pPr>
-        <w:spacing w:after="60"/>
-        <w:ind w:left="709" w:firstLine="0"/>
-      </w:pPr>
-      <w:r>
-        <w:t xml:space="preserve">2. </w:t>
-      </w:r>
-      <w:r>
-        <w:rPr>
-          <w:b/>
-        </w:rPr>
-        <w:t>Phùng Thị Nguyệt Ánh (Người liên quan nguồn hàng):</w:t>
-      </w:r>
-      <w:r>
-        <w:t xml:space="preserve"> Giám đốc doanh nghiệp cung ứng sản phẩm; mức độ liên đới đang được cơ quan công an tiếp tục làm rõ [6].</w:t>
-      </w:r>
-    </w:p>
-    <w:p>
-      <w:pPr>
-        <w:spacing w:after="60"/>
-        <w:ind w:left="709" w:firstLine="0"/>
-      </w:pPr>
-      <w:r>
-        <w:lastRenderedPageBreak/>
-        <w:t xml:space="preserve">3. </w:t>
-      </w:r>
-      <w:r>
-        <w:rPr>
-          <w:b/>
-        </w:rPr>
-        <w:t>Nhóm nhân sự hỗ trợ:</w:t>
-      </w:r>
-      <w:r>
-        <w:t xml:space="preserve"> Thực hiện các công việc kỹ thuật marketing, tư vấn bán hàng, vận đơn và đóng gói [6]. Mức độ nhận thức và trách nhiệm của từng cá nhân sẽ được cơ quan tố tụng cá thể hóa theo chứng cứ cụ thể.</w:t>
-      </w:r>
-    </w:p>
-    <w:p>
-      <w:pPr>
-        <w:pStyle w:val="u2"/>
-      </w:pPr>
-      <w:bookmarkStart w:id="22" w:name="_Toc237716098"/>
-      <w:r>
-        <w:rPr>
-          <w:rFonts w:ascii="Times New Roman" w:eastAsia="Times New Roman" w:hAnsi="Times New Roman"/>
-          <w:b w:val="0"/>
-        </w:rPr>
-        <w:t>3.4. Phân tích yếu tố Mặt chủ quan của vi phạm pháp luật</w:t>
-      </w:r>
-      <w:bookmarkEnd w:id="22"/>
-    </w:p>
-    <w:p>
-      <w:pPr>
-        <w:pStyle w:val="u3"/>
-      </w:pPr>
-      <w:r>
-        <w:rPr>
-          <w:rFonts w:ascii="Times New Roman" w:eastAsia="Times New Roman" w:hAnsi="Times New Roman"/>
-          <w:b w:val="0"/>
-        </w:rPr>
-        <w:t>3.4.1. Phân tích đối với người tổ chức (Nguyễn Tiến Đạt)</w:t>
-      </w:r>
-    </w:p>
-    <w:p>
-      <w:pPr>
-        <w:pStyle w:val="Duudong"/>
-        <w:spacing w:after="60"/>
-        <w:ind w:left="709" w:firstLine="0"/>
-      </w:pPr>
-      <w:r>
-        <w:rPr>
-          <w:b/>
-        </w:rPr>
-        <w:t>Về yếu tố Lỗi:</w:t>
-      </w:r>
-      <w:r>
-        <w:t xml:space="preserve"> Việc chỉ đạo tạo lập nội dung cắt ghép hình ảnh và phóng đại công dụng sản phẩm để tạo niềm tin cho người mua tạo cơ sở để phân tích theo hướng </w:t>
-      </w:r>
-      <w:r>
-        <w:rPr>
-          <w:b/>
-        </w:rPr>
-        <w:t>Lỗi cố ý trực tiếp</w:t>
-      </w:r>
-      <w:r>
-        <w:t>:</w:t>
-      </w:r>
-    </w:p>
-    <w:p>
-      <w:pPr>
-        <w:pStyle w:val="Duudong"/>
-        <w:spacing w:after="60"/>
-        <w:ind w:left="709" w:firstLine="0"/>
-      </w:pPr>
-      <w:r>
-        <w:rPr>
-          <w:i/>
-        </w:rPr>
-        <w:t>Về lý trí:</w:t>
-      </w:r>
-      <w:r>
-        <w:t xml:space="preserve"> Nhận thức rõ giá mua 23.000 đồng và nội dung quảng cáo cắt ghép là không đúng sự thật; thấy trước việc quảng cáo này sẽ khiến khách hàng tin tưởng đặt mua.</w:t>
-      </w:r>
-    </w:p>
-    <w:p>
-      <w:pPr>
-        <w:pStyle w:val="Duudong"/>
-        <w:spacing w:after="60"/>
-        <w:ind w:left="709" w:firstLine="0"/>
-      </w:pPr>
-      <w:r>
-        <w:rPr>
-          <w:i/>
-        </w:rPr>
-        <w:t>Về ý chí:</w:t>
-      </w:r>
-      <w:r>
-        <w:t xml:space="preserve"> Mong muốn bán được nhiều sản phẩm với mức giá 199.000 đồng/sản phẩm để thu tiền.</w:t>
-      </w:r>
-    </w:p>
-    <w:p>
-      <w:pPr>
-        <w:pStyle w:val="Duudong"/>
-        <w:spacing w:after="60"/>
-        <w:ind w:left="709" w:firstLine="0"/>
-      </w:pPr>
-      <w:r>
-        <w:rPr>
-          <w:b/>
-        </w:rPr>
-        <w:t>Về Động cơ và Mục đích:</w:t>
-      </w:r>
-    </w:p>
-    <w:p>
-      <w:pPr>
-        <w:pStyle w:val="Duudong"/>
-        <w:spacing w:after="60"/>
-        <w:ind w:left="709" w:firstLine="0"/>
-      </w:pPr>
-      <w:r>
-        <w:rPr>
-          <w:i/>
-        </w:rPr>
-        <w:t>Động cơ:</w:t>
-      </w:r>
-      <w:r>
-        <w:t xml:space="preserve"> Chênh lệch giữa giá mua và giá bán cùng quy mô tiếp thị tạo cơ sở phân tích theo hướng có động cơ vụ lợi kinh tế.</w:t>
-      </w:r>
-    </w:p>
-    <w:p>
-      <w:pPr>
-        <w:pStyle w:val="Duudong"/>
-        <w:spacing w:after="60"/>
-        <w:ind w:left="709" w:firstLine="0"/>
-      </w:pPr>
-      <w:r>
-        <w:rPr>
-          <w:i/>
-        </w:rPr>
-        <w:t>Mục đích:</w:t>
-      </w:r>
-      <w:r>
-        <w:t xml:space="preserve"> Tạo niềm tin để người tiếp cận đặt mua sản phẩm và phát sinh giao dịch bán hàng [6].</w:t>
-      </w:r>
-    </w:p>
-    <w:p>
-      <w:pPr>
-        <w:pStyle w:val="u3"/>
-      </w:pPr>
-      <w:r>
-        <w:rPr>
-          <w:rFonts w:ascii="Times New Roman" w:eastAsia="Times New Roman" w:hAnsi="Times New Roman"/>
-          <w:b w:val="0"/>
-        </w:rPr>
-        <w:t>3.4.2. Giới hạn đánh giá đối với nhân sự hỗ trợ</w:t>
-      </w:r>
-    </w:p>
-    <w:p>
-      <w:pPr>
-        <w:spacing w:after="80"/>
-      </w:pPr>
-      <w:r>
-        <w:t>Đối với các nhân viên tham gia marketing, tư vấn, đóng gói và vận chuyển, tài liệu ban đầu chưa thể hiện chi tiết ý thức chủ quan của từng người. Trong quá trình điều tra, cơ quan chức năng sẽ làm rõ mức độ nhận thức của từng nhân viên để xác định vai trò, mức độ tham gia và trách nhiệm pháp lý tương ứng.</w:t>
-      </w:r>
-    </w:p>
-    <w:p>
-      <w:pPr>
-        <w:pStyle w:val="u2"/>
-      </w:pPr>
-      <w:bookmarkStart w:id="23" w:name="_Toc237716099"/>
-      <w:r>
-        <w:rPr>
-          <w:rFonts w:ascii="Times New Roman" w:eastAsia="Times New Roman" w:hAnsi="Times New Roman"/>
-          <w:b w:val="0"/>
-        </w:rPr>
-        <w:t>3.5. Tổng hợp bốn yếu tố cấu thành vi phạm pháp luật</w:t>
-      </w:r>
-      <w:bookmarkEnd w:id="23"/>
-    </w:p>
-    <w:p>
-      <w:pPr>
-        <w:keepNext/>
-        <w:spacing w:before="200" w:after="60"/>
-        <w:ind w:firstLine="0"/>
-      </w:pPr>
-      <w:r>
-        <w:rPr>
-          <w:b/>
-          <w:sz w:val="22"/>
-        </w:rPr>
-        <w:t>Bảng 5. Tổng hợp bốn yếu tố cấu thành vi phạm pháp luật trong vụ việc</w:t>
-      </w:r>
-    </w:p>
-    <w:tbl>
-      <w:tblPr>
-        <w:tblStyle w:val="LiBang"/>
-        <w:tblW w:w="0" w:type="auto"/>
-        <w:jc w:val="center"/>
-        <w:tblLook w:val="04A0" w:firstRow="1" w:lastRow="0" w:firstColumn="1" w:lastColumn="0" w:noHBand="0" w:noVBand="1"/>
-      </w:tblPr>
-      <w:tblGrid>
-        <w:gridCol w:w="1814"/>
-        <w:gridCol w:w="2608"/>
-        <w:gridCol w:w="2268"/>
-        <w:gridCol w:w="2268"/>
-      </w:tblGrid>
-      <w:tr>
-        <w:trPr>
-          <w:cantSplit/>
-          <w:tblHeader/>
-          <w:jc w:val="center"/>
-        </w:trPr>
-        <w:tc>
-          <w:tcPr>
-            <w:tcW w:w="1814" w:type="dxa"/>
-            <w:vAlign w:val="center"/>
-          </w:tcPr>
-          <w:p>
-            <w:pPr>
-              <w:spacing w:before="40" w:after="40" w:line="276" w:lineRule="auto"/>
-              <w:ind w:firstLine="0"/>
-              <w:jc w:val="center"/>
-            </w:pPr>
-            <w:r>
-              <w:rPr>
-                <w:b/>
-                <w:sz w:val="19"/>
-              </w:rPr>
-              <w:t>Yếu tố cấu thành</w:t>
-            </w:r>
-          </w:p>
-        </w:tc>
-        <w:tc>
-          <w:tcPr>
-            <w:tcW w:w="2608" w:type="dxa"/>
-            <w:vAlign w:val="center"/>
-          </w:tcPr>
-          <w:p>
-            <w:pPr>
-              <w:spacing w:before="40" w:after="40" w:line="276" w:lineRule="auto"/>
-              <w:ind w:firstLine="0"/>
-              <w:jc w:val="center"/>
-            </w:pPr>
-            <w:r>
-              <w:rPr>
-                <w:b/>
-                <w:sz w:val="19"/>
-              </w:rPr>
-              <w:t>Dữ kiện thực tế chính [6]</w:t>
-            </w:r>
-          </w:p>
-        </w:tc>
-        <w:tc>
-          <w:tcPr>
-            <w:tcW w:w="2268" w:type="dxa"/>
-            <w:vAlign w:val="center"/>
-          </w:tcPr>
-          <w:p>
-            <w:pPr>
-              <w:spacing w:before="40" w:after="40" w:line="276" w:lineRule="auto"/>
-              <w:ind w:firstLine="0"/>
-              <w:jc w:val="center"/>
-            </w:pPr>
-            <w:r>
-              <w:rPr>
-                <w:b/>
-                <w:sz w:val="19"/>
-              </w:rPr>
-              <w:t>Phân tích lý luận pháp lý</w:t>
-            </w:r>
-          </w:p>
-        </w:tc>
-        <w:tc>
-          <w:tcPr>
-            <w:tcW w:w="2268" w:type="dxa"/>
-            <w:vAlign w:val="center"/>
-          </w:tcPr>
-          <w:p>
-            <w:pPr>
-              <w:spacing w:before="40" w:after="40" w:line="276" w:lineRule="auto"/>
-              <w:ind w:firstLine="0"/>
-              <w:jc w:val="center"/>
-            </w:pPr>
-            <w:r>
-              <w:rPr>
-                <w:b/>
-                <w:sz w:val="19"/>
-              </w:rPr>
-              <w:t>Đánh giá tổng hợp</w:t>
+              <w:t>Đạt đã đủ tuổi thành niên; các cá nhân khác chờ kết luận của cơ quan tố tụng; có sự phân hóa vai trò điều hành và hỗ trợ.</w:t>
             </w:r>
           </w:p>
         </w:tc>
@@ -6344,7 +6231,7 @@
         </w:trPr>
         <w:tc>
           <w:tcPr>
-            <w:tcW w:w="1814" w:type="dxa"/>
+            <w:tcW w:w="2154" w:type="dxa"/>
             <w:vAlign w:val="center"/>
           </w:tcPr>
           <w:p>
@@ -6358,13 +6245,13 @@
                 <w:b/>
                 <w:sz w:val="19"/>
               </w:rPr>
-              <w:t>1. Khách thể</w:t>
+              <w:t>Mặt chủ quan</w:t>
             </w:r>
           </w:p>
         </w:tc>
         <w:tc>
           <w:tcPr>
-            <w:tcW w:w="2608" w:type="dxa"/>
+            <w:tcW w:w="4082" w:type="dxa"/>
             <w:vAlign w:val="center"/>
           </w:tcPr>
           <w:p>
@@ -6377,13 +6264,13 @@
               <w:rPr>
                 <w:sz w:val="19"/>
               </w:rPr>
-              <w:t>Sản phẩm mua giá 23k bán 199k; video người nổi tiếng bị cắt ghép; phát sinh 5.429 đơn hàng.</w:t>
+              <w:t>Chỉ đạo đưa nội dung phóng đại, cắt ghép tư liệu người có uy tín để tạo niềm tin và bán hàng giá 199.000 đồng.</w:t>
             </w:r>
           </w:p>
         </w:tc>
         <w:tc>
           <w:tcPr>
-            <w:tcW w:w="2268" w:type="dxa"/>
+            <w:tcW w:w="2721" w:type="dxa"/>
             <w:vAlign w:val="center"/>
           </w:tcPr>
           <w:p>
@@ -6396,304 +6283,7 @@
               <w:rPr>
                 <w:sz w:val="19"/>
               </w:rPr>
-              <w:t>Xâm hại trật tự quản lý quảng cáo, thương mại; quyền được thông tin trung thực của người tiêu dùng; quyền hình ảnh.</w:t>
-            </w:r>
-          </w:p>
-        </w:tc>
-        <w:tc>
-          <w:tcPr>
-            <w:tcW w:w="2268" w:type="dxa"/>
-            <w:vAlign w:val="center"/>
-          </w:tcPr>
-          <w:p>
-            <w:pPr>
-              <w:spacing w:before="40" w:after="40" w:line="276" w:lineRule="auto"/>
-              <w:ind w:firstLine="0"/>
-              <w:jc w:val="left"/>
-            </w:pPr>
-            <w:r>
-              <w:rPr>
-                <w:b/>
-                <w:sz w:val="19"/>
-              </w:rPr>
-              <w:t>Tác động đa chiều</w:t>
-            </w:r>
-            <w:r>
-              <w:rPr>
-                <w:sz w:val="19"/>
-              </w:rPr>
-              <w:t>, ảnh hưởng trật tự thị trường và quyền lợi người tiêu dùng.</w:t>
-            </w:r>
-          </w:p>
-        </w:tc>
-      </w:tr>
-      <w:tr>
-        <w:trPr>
-          <w:cantSplit/>
-          <w:jc w:val="center"/>
-        </w:trPr>
-        <w:tc>
-          <w:tcPr>
-            <w:tcW w:w="1814" w:type="dxa"/>
-            <w:vAlign w:val="center"/>
-          </w:tcPr>
-          <w:p>
-            <w:pPr>
-              <w:spacing w:before="40" w:after="40" w:line="276" w:lineRule="auto"/>
-              <w:ind w:firstLine="0"/>
-              <w:jc w:val="left"/>
-            </w:pPr>
-            <w:r>
-              <w:rPr>
-                <w:b/>
-                <w:sz w:val="19"/>
-              </w:rPr>
-              <w:lastRenderedPageBreak/>
-              <w:t>2. Mặt khách quan</w:t>
-            </w:r>
-          </w:p>
-        </w:tc>
-        <w:tc>
-          <w:tcPr>
-            <w:tcW w:w="2608" w:type="dxa"/>
-            <w:vAlign w:val="center"/>
-          </w:tcPr>
-          <w:p>
-            <w:pPr>
-              <w:spacing w:before="40" w:after="40" w:line="276" w:lineRule="auto"/>
-              <w:ind w:firstLine="0"/>
-              <w:jc w:val="left"/>
-            </w:pPr>
-            <w:r>
-              <w:rPr>
-                <w:sz w:val="19"/>
-              </w:rPr>
-              <w:t>Hành vi quảng cáo sai sự thật, dùng video cắt ghép; thực hiện 5.429 đơn hàng với tổng giá trị tiền hàng hơn 2,67 tỷ đồng.</w:t>
-            </w:r>
-          </w:p>
-        </w:tc>
-        <w:tc>
-          <w:tcPr>
-            <w:tcW w:w="2268" w:type="dxa"/>
-            <w:vAlign w:val="center"/>
-          </w:tcPr>
-          <w:p>
-            <w:pPr>
-              <w:spacing w:before="40" w:after="40" w:line="276" w:lineRule="auto"/>
-              <w:ind w:firstLine="0"/>
-              <w:jc w:val="left"/>
-            </w:pPr>
-            <w:r>
-              <w:rPr>
-                <w:sz w:val="19"/>
-              </w:rPr>
-              <w:t>Chuỗi hành vi hành động trái pháp luật; thông tin sai lệch có khả năng tác động đến nhận thức người mua trong giao dịch.</w:t>
-            </w:r>
-          </w:p>
-        </w:tc>
-        <w:tc>
-          <w:tcPr>
-            <w:tcW w:w="2268" w:type="dxa"/>
-            <w:vAlign w:val="center"/>
-          </w:tcPr>
-          <w:p>
-            <w:pPr>
-              <w:spacing w:before="40" w:after="40" w:line="276" w:lineRule="auto"/>
-              <w:ind w:firstLine="0"/>
-              <w:jc w:val="left"/>
-            </w:pPr>
-            <w:r>
-              <w:rPr>
-                <w:b/>
-                <w:sz w:val="19"/>
-              </w:rPr>
-              <w:t>Hành vi diễn ra qua nhiều khâu</w:t>
-            </w:r>
-            <w:r>
-              <w:rPr>
-                <w:sz w:val="19"/>
-              </w:rPr>
-              <w:t>, quy mô giao dịch lớn trên mạng xã hội.</w:t>
-            </w:r>
-          </w:p>
-        </w:tc>
-      </w:tr>
-      <w:tr>
-        <w:trPr>
-          <w:cantSplit/>
-          <w:jc w:val="center"/>
-        </w:trPr>
-        <w:tc>
-          <w:tcPr>
-            <w:tcW w:w="1814" w:type="dxa"/>
-            <w:vAlign w:val="center"/>
-          </w:tcPr>
-          <w:p>
-            <w:pPr>
-              <w:spacing w:before="40" w:after="40" w:line="276" w:lineRule="auto"/>
-              <w:ind w:firstLine="0"/>
-              <w:jc w:val="left"/>
-            </w:pPr>
-            <w:r>
-              <w:rPr>
-                <w:b/>
-                <w:sz w:val="19"/>
-              </w:rPr>
-              <w:t>3. Chủ thể</w:t>
-            </w:r>
-          </w:p>
-        </w:tc>
-        <w:tc>
-          <w:tcPr>
-            <w:tcW w:w="2608" w:type="dxa"/>
-            <w:vAlign w:val="center"/>
-          </w:tcPr>
-          <w:p>
-            <w:pPr>
-              <w:spacing w:before="40" w:after="40" w:line="276" w:lineRule="auto"/>
-              <w:ind w:firstLine="0"/>
-              <w:jc w:val="left"/>
-            </w:pPr>
-            <w:r>
-              <w:rPr>
-                <w:sz w:val="19"/>
-              </w:rPr>
-              <w:t>Khởi tố Nguyễn Tiến Đạt cùng 20 bị can; Đạt sinh năm 1997; có các nhóm làm marketing, bán hàng, vận đơn.</w:t>
-            </w:r>
-          </w:p>
-        </w:tc>
-        <w:tc>
-          <w:tcPr>
-            <w:tcW w:w="2268" w:type="dxa"/>
-            <w:vAlign w:val="center"/>
-          </w:tcPr>
-          <w:p>
-            <w:pPr>
-              <w:spacing w:before="40" w:after="40" w:line="276" w:lineRule="auto"/>
-              <w:ind w:firstLine="0"/>
-              <w:jc w:val="left"/>
-            </w:pPr>
-            <w:r>
-              <w:rPr>
-                <w:sz w:val="19"/>
-              </w:rPr>
-              <w:t>Đạt đã thành niên; các cá nhân khác chưa đủ dữ liệu công khai để đánh giá chi tiết; có sự phân công công việc cụ thể.</w:t>
-            </w:r>
-          </w:p>
-        </w:tc>
-        <w:tc>
-          <w:tcPr>
-            <w:tcW w:w="2268" w:type="dxa"/>
-            <w:vAlign w:val="center"/>
-          </w:tcPr>
-          <w:p>
-            <w:pPr>
-              <w:spacing w:before="40" w:after="40" w:line="276" w:lineRule="auto"/>
-              <w:ind w:firstLine="0"/>
-              <w:jc w:val="left"/>
-            </w:pPr>
-            <w:r>
-              <w:rPr>
-                <w:b/>
-                <w:sz w:val="19"/>
-              </w:rPr>
-              <w:t>Xác định được độ tuổi của người tổ chức</w:t>
-            </w:r>
-            <w:r>
-              <w:rPr>
-                <w:sz w:val="19"/>
-              </w:rPr>
-              <w:t>, có sự phân hóa vai trò điều hành và hỗ trợ.</w:t>
-            </w:r>
-          </w:p>
-        </w:tc>
-      </w:tr>
-      <w:tr>
-        <w:trPr>
-          <w:cantSplit/>
-          <w:jc w:val="center"/>
-        </w:trPr>
-        <w:tc>
-          <w:tcPr>
-            <w:tcW w:w="1814" w:type="dxa"/>
-            <w:vAlign w:val="center"/>
-          </w:tcPr>
-          <w:p>
-            <w:pPr>
-              <w:spacing w:before="40" w:after="40" w:line="276" w:lineRule="auto"/>
-              <w:ind w:firstLine="0"/>
-              <w:jc w:val="left"/>
-            </w:pPr>
-            <w:r>
-              <w:rPr>
-                <w:b/>
-                <w:sz w:val="19"/>
-              </w:rPr>
-              <w:t>4. Mặt chủ quan</w:t>
-            </w:r>
-          </w:p>
-        </w:tc>
-        <w:tc>
-          <w:tcPr>
-            <w:tcW w:w="2608" w:type="dxa"/>
-            <w:vAlign w:val="center"/>
-          </w:tcPr>
-          <w:p>
-            <w:pPr>
-              <w:spacing w:before="40" w:after="40" w:line="276" w:lineRule="auto"/>
-              <w:ind w:firstLine="0"/>
-              <w:jc w:val="left"/>
-            </w:pPr>
-            <w:r>
-              <w:rPr>
-                <w:sz w:val="19"/>
-              </w:rPr>
-              <w:t>Chỉ đạo đưa nội dung phóng đại, cắt ghép tư liệu người có uy tín để tạo niềm tin và bán hàng giá 199k.</w:t>
-            </w:r>
-          </w:p>
-        </w:tc>
-        <w:tc>
-          <w:tcPr>
-            <w:tcW w:w="2268" w:type="dxa"/>
-            <w:vAlign w:val="center"/>
-          </w:tcPr>
-          <w:p>
-            <w:pPr>
-              <w:spacing w:before="40" w:after="40" w:line="276" w:lineRule="auto"/>
-              <w:ind w:firstLine="0"/>
-              <w:jc w:val="left"/>
-            </w:pPr>
-            <w:r>
-              <w:rPr>
-                <w:sz w:val="19"/>
-              </w:rPr>
-              <w:t>Có cơ sở phân tích hướng lỗi cố ý trực tiếp và động cơ vụ lợi ở Đạt; nhân sự hỗ trợ cần phân hóa theo nhận thức thực tế.</w:t>
-            </w:r>
-          </w:p>
-        </w:tc>
-        <w:tc>
-          <w:tcPr>
-            <w:tcW w:w="2268" w:type="dxa"/>
-            <w:vAlign w:val="center"/>
-          </w:tcPr>
-          <w:p>
-            <w:pPr>
-              <w:spacing w:before="40" w:after="40" w:line="276" w:lineRule="auto"/>
-              <w:ind w:firstLine="0"/>
-              <w:jc w:val="left"/>
-            </w:pPr>
-            <w:r>
-              <w:rPr>
-                <w:b/>
-                <w:sz w:val="19"/>
-              </w:rPr>
-              <w:t>Cơ sở phân tích lỗi cố ý trực tiếp ở người tổ chức</w:t>
-            </w:r>
-            <w:r>
-              <w:rPr>
-                <w:sz w:val="19"/>
-              </w:rPr>
-              <w:t>, động cơ vụ lợi gắn với tiếp thị bán hàng.</w:t>
+              <w:t>Có cơ sở phân tích hướng lỗi cố ý trực tiếp và động cơ vụ lợi kinh tế ở Đạt; nhân sự hỗ trợ cần phân hóa theo nhận thức thực tế.</w:t>
             </w:r>
           </w:p>
         </w:tc>
@@ -6703,7 +6293,7 @@
       <w:pPr>
         <w:pStyle w:val="u1"/>
       </w:pPr>
-      <w:bookmarkStart w:id="24" w:name="_Toc237716100"/>
+      <w:bookmarkStart w:id="24" w:name="_Toc237716360"/>
       <w:r>
         <w:rPr>
           <w:rFonts w:ascii="Times New Roman" w:eastAsia="Times New Roman" w:hAnsi="Times New Roman"/>
@@ -6718,7 +6308,7 @@
       <w:pPr>
         <w:pStyle w:val="u2"/>
       </w:pPr>
-      <w:bookmarkStart w:id="25" w:name="_Toc237716101"/>
+      <w:bookmarkStart w:id="25" w:name="_Toc237716361"/>
       <w:r>
         <w:rPr>
           <w:rFonts w:ascii="Times New Roman" w:eastAsia="Times New Roman" w:hAnsi="Times New Roman"/>
@@ -6733,46 +6323,22 @@
         <w:spacing w:after="80"/>
       </w:pPr>
       <w:r>
-        <w:t>Vụ việc triệt phá đường dây quảng cáo sai sự thật tại Phú Thọ cho thấy một số vấn đề thực tiễn đáng chú ý:</w:t>
+        <w:t>Vụ việc tại Phú Thọ phản ánh thực trạng lợi dụng mạng xã hội để tiếp thị gian dối thông qua việc cắt ghép hình ảnh người có uy tín nhằm tạo niềm tin cho người mua. Việc quảng cáo sai lệch kết hợp với khả năng lan truyền nhanh của không gian mạng khiến nhiều người tiêu dùng dễ dàng đưa ra quyết định mua hàng đối với các sản phẩm chưa rõ nguồn gốc và chất lượng.</w:t>
       </w:r>
     </w:p>
     <w:p>
       <w:pPr>
-        <w:pStyle w:val="Duudong"/>
-        <w:spacing w:after="60"/>
-        <w:ind w:left="709" w:firstLine="0"/>
-      </w:pPr>
-      <w:r>
-        <w:rPr>
-          <w:b/>
-        </w:rPr>
-        <w:t>Thủ đoạn tiếp thị trực tuyến tinh vi:</w:t>
-      </w:r>
-      <w:r>
-        <w:t xml:space="preserve"> Việc sử dụng hình ảnh, video cắt ghép người có uy tín kết hợp với mạng xã hội tạo ra khả năng lan truyền nhanh, khiến người tiêu dùng dễ tin tưởng và đặt mua sản phẩm.</w:t>
+        <w:spacing w:after="80"/>
+      </w:pPr>
+      <w:r>
+        <w:t>Đồng thời, mô hình hoạt động phân chia nhiều khâu (marketing, tư vấn, vận đơn, giao nhận) đặt ra yêu cầu phải xem xét kỹ mức độ tham gia và nhận thức thực tế của từng cá nhân để xác định đúng trách nhiệm pháp lý.</w:t>
       </w:r>
     </w:p>
     <w:p>
       <w:pPr>
-        <w:pStyle w:val="Duudong"/>
-        <w:spacing w:after="60"/>
-        <w:ind w:left="709" w:firstLine="0"/>
-      </w:pPr>
-      <w:r>
-        <w:rPr>
-          <w:b/>
-        </w:rPr>
-        <w:t>Sự cần thiết phân hóa trách nhiệm:</w:t>
-      </w:r>
-      <w:r>
-        <w:t xml:space="preserve"> Trong một mô hình bán hàng có nhiều người tham gia, việc cá thể hóa hành vi và nhận thức của từng vị trí công việc là rất quan trọng để xác định đúng trách nhiệm pháp lý.</w:t>
-      </w:r>
-    </w:p>
-    <w:p>
-      <w:pPr>
         <w:pStyle w:val="u2"/>
       </w:pPr>
-      <w:bookmarkStart w:id="26" w:name="_Toc237716102"/>
+      <w:bookmarkStart w:id="26" w:name="_Toc237716362"/>
       <w:r>
         <w:rPr>
           <w:rFonts w:ascii="Times New Roman" w:eastAsia="Times New Roman" w:hAnsi="Times New Roman"/>
@@ -6787,62 +6353,22 @@
         <w:spacing w:after="80"/>
       </w:pPr>
       <w:r>
-        <w:t>Từ vụ việc trên, có thể rút ra một số bài học thực tiễn:</w:t>
+        <w:t>Từ vụ việc này, bài học quan trọng đối với hoạt động kinh doanh trực tuyến là phải tuân thủ đúng các quy định về quảng cáo, tuyệt đối không đưa thông tin sai sự thật về công dụng sản phẩm và phải có sự đồng ý hợp pháp khi sử dụng hình ảnh cá nhân. Đối với người tiêu dùng, việc chủ động kiểm chứng thông tin và tìm kiếm tư vấn y tế chính quy khi có vấn đề về sức khỏe là điều cần thiết để bảo vệ quyền lợi và an toàn của bản thân.</w:t>
       </w:r>
     </w:p>
     <w:p>
       <w:pPr>
-        <w:pStyle w:val="Duudong"/>
-        <w:spacing w:after="60"/>
-        <w:ind w:left="709" w:firstLine="0"/>
-      </w:pPr>
-      <w:r>
-        <w:rPr>
-          <w:b/>
-        </w:rPr>
-        <w:t>Đối với người kinh doanh trực tuyến:</w:t>
-      </w:r>
-      <w:r>
-        <w:t xml:space="preserve"> Phải tuân thủ đúng quy định của Luật Quảng cáo; không được phóng đại hoặc đưa thông tin sai sự thật về công dụng sản phẩm; tuân thủ điều kiện về sự đồng ý khi sử dụng hình ảnh cá nhân.</w:t>
+        <w:spacing w:after="80"/>
+      </w:pPr>
+      <w:r>
+        <w:t>Đối với sinh viên ngành Công nghệ thông tin tại UIT, vụ việc nhắc nhở rằng khi tham gia các công việc liên quan đến tiếp thị số, dựng video hay quản trị trang mạng xã hội, sinh viên cần có nhận thức rõ ràng về tính hợp pháp của công việc. Năng lực kỹ thuật số phải được sử dụng đúng đắn, kiên quyết từ chối tham gia các hoạt động cắt ghép hình ảnh giả mạo hoặc hỗ trợ phát tán thông tin lừa dối.</w:t>
       </w:r>
     </w:p>
     <w:p>
       <w:pPr>
-        <w:pStyle w:val="Duudong"/>
-        <w:spacing w:after="60"/>
-        <w:ind w:left="709" w:firstLine="0"/>
-      </w:pPr>
-      <w:r>
-        <w:rPr>
-          <w:b/>
-        </w:rPr>
-        <w:t>Đối với người tiêu dùng:</w:t>
-      </w:r>
-      <w:r>
-        <w:t xml:space="preserve"> Cần nâng cao kỹ năng kiểm chứng thông tin, cảnh giác trước các nội dung quảng cáo có cam kết tuyệt đối trên mạng xã hội; tìm kiếm tư vấn y khoa chính quy từ cơ sở y tế khi có vấn đề về sức khỏe, không tự ý sử dụng sản phẩm chỉ dựa vào quảng cáo chưa kiểm chứng.</w:t>
-      </w:r>
-    </w:p>
-    <w:p>
-      <w:pPr>
-        <w:pStyle w:val="Duudong"/>
-        <w:spacing w:after="60"/>
-        <w:ind w:left="709" w:firstLine="0"/>
-      </w:pPr>
-      <w:r>
-        <w:rPr>
-          <w:b/>
-        </w:rPr>
-        <w:t>Đối với sinh viên ngành Công nghệ thông tin (UIT):</w:t>
-      </w:r>
-      <w:r>
-        <w:t xml:space="preserve"> Khi tham gia các công việc làm thêm liên quan đến tiếp thị số, chỉnh sửa video hay quản trị mạng xã hội, cần nhận thức rõ trách nhiệm pháp lý của mình; kiên quyết từ chối tham gia các hoạt động cắt ghép hình ảnh giả mạo để lừa dối người dùng và luôn sử dụng năng lực công nghệ một cách có trách nhiệm.</w:t>
-      </w:r>
-    </w:p>
-    <w:p>
-      <w:pPr>
         <w:pStyle w:val="u1"/>
       </w:pPr>
-      <w:bookmarkStart w:id="27" w:name="_Toc237716103"/>
+      <w:bookmarkStart w:id="27" w:name="_Toc237716363"/>
       <w:r>
         <w:rPr>
           <w:rFonts w:ascii="Times New Roman" w:eastAsia="Times New Roman" w:hAnsi="Times New Roman"/>
@@ -6858,94 +6384,25 @@
         <w:spacing w:after="80"/>
       </w:pPr>
       <w:r>
-        <w:t>Qua các dữ kiện công khai của vụ việc, bốn yếu tố cấu thành vi phạm pháp luật có thể được xem xét như sau:</w:t>
+        <w:t>Qua phân tích vụ việc tại Phú Thọ, bốn yếu tố cấu thành vi phạm pháp luật được thể hiện rõ qua các dữ kiện thực tế: hành vi quảng cáo sai sự thật và khai thác hình ảnh cắt ghép xâm hại đến trật tự quản lý quảng cáo, quyền lợi của người tiêu dùng và quyền hình ảnh cá nhân; chuỗi hành vi được thực hiện qua nhiều khâu với 5.429 đơn hàng phát sinh; người tổ chức (Nguyễn Tiến Đạt) đã đủ tuổi thành niên; và dữ kiện tiếp thị phóng đại để bán hàng giá cao tạo cơ sở phân tích hướng lỗi cố ý trực tiếp gắn với động cơ</w:t>
+      </w:r>
+      <w:r>
+        <w:t xml:space="preserve"> kinh tế.</w:t>
       </w:r>
     </w:p>
     <w:p>
       <w:pPr>
-        <w:spacing w:after="60"/>
-        <w:ind w:left="709" w:firstLine="0"/>
-      </w:pPr>
-      <w:r>
-        <w:t xml:space="preserve">1. </w:t>
-      </w:r>
-      <w:r>
-        <w:rPr>
-          <w:b/>
-        </w:rPr>
-        <w:t>Khách thể:</w:t>
-      </w:r>
-      <w:r>
-        <w:t xml:space="preserve"> Tác động đến trật tự quản lý nhà nước về quảng cáo, thương mại, quyền được thông tin trung thực của người tiêu dùng và quyền nhân thân về hình ảnh theo luật định.</w:t>
+        <w:spacing w:after="80"/>
+      </w:pPr>
+      <w:r>
+        <w:t>Do vụ án vẫn đang trong giai đoạn điều tra mở rộng, các nhận định trong báo cáo chỉ dừng lại ở phạm vi nghiên cứu học thuật dựa trên dữ liệu công khai hiện có. Việc vận dụng lý luận môn Pháp luật đại cương vào tình huống thực tế đã giúp nhóm hiểu rõ phương pháp đánh giá một vi phạm pháp luật và nhận thức sâu sắc hơn về trách nhiệm pháp lý khi làm việc trong môi trường công nghệ.</w:t>
       </w:r>
     </w:p>
     <w:p>
       <w:pPr>
-        <w:spacing w:after="60"/>
-        <w:ind w:left="709" w:firstLine="0"/>
-      </w:pPr>
-      <w:r>
-        <w:t xml:space="preserve">2. </w:t>
-      </w:r>
-      <w:r>
-        <w:rPr>
-          <w:b/>
-        </w:rPr>
-        <w:t>Mặt khách quan:</w:t>
-      </w:r>
-      <w:r>
-        <w:t xml:space="preserve"> Thể hiện qua hành vi quảng cáo sai sự thật, sử dụng hình ảnh cắt ghép và phát sinh 5.429 đơn hàng thành công với tổng giá trị tiền hàng hơn 2,67 tỷ đồng theo nguồn công khai; tạo cơ sở xem xét mối liên hệ nhân quả giữa việc tiếp thị và kết quả giao dịch.</w:t>
-      </w:r>
-    </w:p>
-    <w:p>
-      <w:pPr>
-        <w:spacing w:after="60"/>
-        <w:ind w:left="709" w:firstLine="0"/>
-      </w:pPr>
-      <w:r>
-        <w:t xml:space="preserve">3. </w:t>
-      </w:r>
-      <w:r>
-        <w:rPr>
-          <w:b/>
-        </w:rPr>
-        <w:t>Chủ thể:</w:t>
-      </w:r>
-      <w:r>
-        <w:t xml:space="preserve"> Dữ liệu xác định người tổ chức (Nguyễn Tiến Đạt) đã đủ tuổi thành niên; việc đánh giá năng lực của các cá nhân khác căn cứ vào kết luận của cơ quan tiến hành tố tụng.</w:t>
-      </w:r>
-    </w:p>
-    <w:p>
-      <w:pPr>
-        <w:spacing w:after="60"/>
-        <w:ind w:left="709" w:firstLine="0"/>
-      </w:pPr>
-      <w:r>
-        <w:t xml:space="preserve">4. </w:t>
-      </w:r>
-      <w:r>
-        <w:rPr>
-          <w:b/>
-        </w:rPr>
-        <w:t>Mặt chủ quan:</w:t>
-      </w:r>
-      <w:r>
-        <w:t xml:space="preserve"> Có cơ sở phân tích hướng lỗi cố ý trực tiếp và động cơ vụ lợi đối với người tổ chức; đối với các nhân sự hỗ trợ, trách nhiệm cần được phân hóa theo nhận thức thực tế của từng người.</w:t>
-      </w:r>
-    </w:p>
-    <w:p>
-      <w:pPr>
-        <w:spacing w:after="80"/>
-      </w:pPr>
-      <w:r>
-        <w:t>Việc vận dụng lý luận cấu thành vi phạm pháp luật để phân tích vụ việc thực tế giúp sinh viên UIT củng cố kiến thức môn học, hiểu rõ ranh giới pháp lý trong môi trường số và nâng cao ý thức trách nhiệm nghề nghiệp khi làm việc trong lĩnh vực công nghệ thông tin.</w:t>
-      </w:r>
-    </w:p>
-    <w:p>
-      <w:pPr>
         <w:pStyle w:val="u1"/>
       </w:pPr>
-      <w:bookmarkStart w:id="28" w:name="_Toc237716104"/>
+      <w:bookmarkStart w:id="28" w:name="_Toc237716364"/>
       <w:r>
         <w:rPr>
           <w:rFonts w:ascii="Times New Roman" w:eastAsia="Times New Roman" w:hAnsi="Times New Roman"/>
@@ -6960,7 +6417,7 @@
       <w:pPr>
         <w:pStyle w:val="u2"/>
       </w:pPr>
-      <w:bookmarkStart w:id="29" w:name="_Toc237716105"/>
+      <w:bookmarkStart w:id="29" w:name="_Toc237716365"/>
       <w:r>
         <w:rPr>
           <w:rFonts w:ascii="Times New Roman" w:eastAsia="Times New Roman" w:hAnsi="Times New Roman"/>
@@ -7082,7 +6539,7 @@
       <w:pPr>
         <w:pStyle w:val="u2"/>
       </w:pPr>
-      <w:bookmarkStart w:id="30" w:name="_Toc237716106"/>
+      <w:bookmarkStart w:id="30" w:name="_Toc237716366"/>
       <w:r>
         <w:rPr>
           <w:rFonts w:ascii="Times New Roman" w:eastAsia="Times New Roman" w:hAnsi="Times New Roman"/>
@@ -7123,7 +6580,7 @@
       <w:pPr>
         <w:pStyle w:val="u2"/>
       </w:pPr>
-      <w:bookmarkStart w:id="31" w:name="_Toc237716107"/>
+      <w:bookmarkStart w:id="31" w:name="_Toc237716367"/>
       <w:r>
         <w:rPr>
           <w:rFonts w:ascii="Times New Roman" w:eastAsia="Times New Roman" w:hAnsi="Times New Roman"/>
@@ -7431,31 +6888,31 @@
       </w:rPr>
     </w:lvl>
   </w:abstractNum>
-  <w:num w:numId="1" w16cid:durableId="154224832">
+  <w:num w:numId="1" w16cid:durableId="1045644592">
     <w:abstractNumId w:val="8"/>
   </w:num>
-  <w:num w:numId="2" w16cid:durableId="512914922">
+  <w:num w:numId="2" w16cid:durableId="1816678567">
     <w:abstractNumId w:val="6"/>
   </w:num>
-  <w:num w:numId="3" w16cid:durableId="2045863233">
+  <w:num w:numId="3" w16cid:durableId="1539276756">
     <w:abstractNumId w:val="5"/>
   </w:num>
-  <w:num w:numId="4" w16cid:durableId="1143230610">
+  <w:num w:numId="4" w16cid:durableId="388845351">
     <w:abstractNumId w:val="4"/>
   </w:num>
-  <w:num w:numId="5" w16cid:durableId="1895585435">
+  <w:num w:numId="5" w16cid:durableId="14041290">
     <w:abstractNumId w:val="7"/>
   </w:num>
-  <w:num w:numId="6" w16cid:durableId="1691834595">
+  <w:num w:numId="6" w16cid:durableId="332420335">
     <w:abstractNumId w:val="3"/>
   </w:num>
-  <w:num w:numId="7" w16cid:durableId="509608809">
+  <w:num w:numId="7" w16cid:durableId="761099647">
     <w:abstractNumId w:val="2"/>
   </w:num>
-  <w:num w:numId="8" w16cid:durableId="222375582">
+  <w:num w:numId="8" w16cid:durableId="1791627760">
     <w:abstractNumId w:val="1"/>
   </w:num>
-  <w:num w:numId="9" w16cid:durableId="1698774809">
+  <w:num w:numId="9" w16cid:durableId="2003242604">
     <w:abstractNumId w:val="0"/>
   </w:num>
 </w:numbering>
@@ -18858,7 +18315,7 @@
     <w:autoRedefine/>
     <w:uiPriority w:val="39"/>
     <w:unhideWhenUsed/>
-    <w:rsid w:val="0047509B"/>
+    <w:rsid w:val="00762552"/>
     <w:pPr>
       <w:spacing w:after="100"/>
     </w:pPr>
@@ -18870,7 +18327,7 @@
     <w:autoRedefine/>
     <w:uiPriority w:val="39"/>
     <w:unhideWhenUsed/>
-    <w:rsid w:val="0047509B"/>
+    <w:rsid w:val="00762552"/>
     <w:pPr>
       <w:spacing w:after="100"/>
       <w:ind w:left="260"/>
@@ -18881,7 +18338,7 @@
     <w:basedOn w:val="Phngmcinhcuaoanvn"/>
     <w:uiPriority w:val="99"/>
     <w:unhideWhenUsed/>
-    <w:rsid w:val="0047509B"/>
+    <w:rsid w:val="00762552"/>
     <w:rPr>
       <w:color w:val="0000FF" w:themeColor="hyperlink"/>
       <w:u w:val="single"/>

</xml_diff>

<commit_message>
docs: rebuild locked PLDC report package
</commit_message>
<xml_diff>
--- a/report/BaoCao_TieuLuan_PLDC_UIT_FINAL.docx
+++ b/report/BaoCao_TieuLuan_PLDC_UIT_FINAL.docx
@@ -4,7 +4,7 @@
   <w:body>
     <w:p>
       <w:pPr>
-        <w:spacing w:after="60"/>
+        <w:spacing w:after="800"/>
         <w:ind w:firstLine="0"/>
         <w:jc w:val="center"/>
       </w:pPr>
@@ -22,19 +22,6 @@
         </w:rPr>
         <w:br/>
         <w:t>TRƯỜNG ĐẠI HỌC CÔNG NGHỆ THÔNG TIN</w:t>
-      </w:r>
-    </w:p>
-    <w:p>
-      <w:pPr>
-        <w:spacing w:after="720"/>
-        <w:ind w:firstLine="0"/>
-        <w:jc w:val="center"/>
-      </w:pPr>
-      <w:r>
-        <w:rPr>
-          <w:b/>
-        </w:rPr>
-        <w:t>KHOA / BỘ MÔN LÝ LUẬN CHÍNH TRỊ</w:t>
       </w:r>
     </w:p>
     <w:p>
@@ -807,7 +794,7 @@
       <w:r>
         <w:fldChar w:fldCharType="separate"/>
       </w:r>
-      <w:hyperlink w:anchor="_Toc237716336" w:history="1">
+      <w:hyperlink w:anchor="_Toc237716638" w:history="1">
         <w:r>
           <w:rPr>
             <w:rStyle w:val="Siuktni"/>
@@ -834,7 +821,7 @@
             <w:noProof/>
             <w:webHidden/>
           </w:rPr>
-          <w:instrText xml:space="preserve"> PAGEREF _Toc237716336 \h </w:instrText>
+          <w:instrText xml:space="preserve"> PAGEREF _Toc237716638 \h </w:instrText>
         </w:r>
         <w:r>
           <w:rPr>
@@ -875,7 +862,7 @@
           <w:noProof/>
         </w:rPr>
       </w:pPr>
-      <w:hyperlink w:anchor="_Toc237716337" w:history="1">
+      <w:hyperlink w:anchor="_Toc237716639" w:history="1">
         <w:r>
           <w:rPr>
             <w:rStyle w:val="Siuktni"/>
@@ -902,7 +889,7 @@
             <w:noProof/>
             <w:webHidden/>
           </w:rPr>
-          <w:instrText xml:space="preserve"> PAGEREF _Toc237716337 \h </w:instrText>
+          <w:instrText xml:space="preserve"> PAGEREF _Toc237716639 \h </w:instrText>
         </w:r>
         <w:r>
           <w:rPr>
@@ -943,7 +930,7 @@
           <w:noProof/>
         </w:rPr>
       </w:pPr>
-      <w:hyperlink w:anchor="_Toc237716338" w:history="1">
+      <w:hyperlink w:anchor="_Toc237716640" w:history="1">
         <w:r>
           <w:rPr>
             <w:rStyle w:val="Siuktni"/>
@@ -970,7 +957,7 @@
             <w:noProof/>
             <w:webHidden/>
           </w:rPr>
-          <w:instrText xml:space="preserve"> PAGEREF _Toc237716338 \h </w:instrText>
+          <w:instrText xml:space="preserve"> PAGEREF _Toc237716640 \h </w:instrText>
         </w:r>
         <w:r>
           <w:rPr>
@@ -1011,7 +998,7 @@
           <w:noProof/>
         </w:rPr>
       </w:pPr>
-      <w:hyperlink w:anchor="_Toc237716339" w:history="1">
+      <w:hyperlink w:anchor="_Toc237716641" w:history="1">
         <w:r>
           <w:rPr>
             <w:rStyle w:val="Siuktni"/>
@@ -1038,7 +1025,7 @@
             <w:noProof/>
             <w:webHidden/>
           </w:rPr>
-          <w:instrText xml:space="preserve"> PAGEREF _Toc237716339 \h </w:instrText>
+          <w:instrText xml:space="preserve"> PAGEREF _Toc237716641 \h </w:instrText>
         </w:r>
         <w:r>
           <w:rPr>
@@ -1079,7 +1066,7 @@
           <w:noProof/>
         </w:rPr>
       </w:pPr>
-      <w:hyperlink w:anchor="_Toc237716340" w:history="1">
+      <w:hyperlink w:anchor="_Toc237716642" w:history="1">
         <w:r>
           <w:rPr>
             <w:rStyle w:val="Siuktni"/>
@@ -1106,7 +1093,7 @@
             <w:noProof/>
             <w:webHidden/>
           </w:rPr>
-          <w:instrText xml:space="preserve"> PAGEREF _Toc237716340 \h </w:instrText>
+          <w:instrText xml:space="preserve"> PAGEREF _Toc237716642 \h </w:instrText>
         </w:r>
         <w:r>
           <w:rPr>
@@ -1147,7 +1134,7 @@
           <w:noProof/>
         </w:rPr>
       </w:pPr>
-      <w:hyperlink w:anchor="_Toc237716341" w:history="1">
+      <w:hyperlink w:anchor="_Toc237716643" w:history="1">
         <w:r>
           <w:rPr>
             <w:rStyle w:val="Siuktni"/>
@@ -1174,7 +1161,7 @@
             <w:noProof/>
             <w:webHidden/>
           </w:rPr>
-          <w:instrText xml:space="preserve"> PAGEREF _Toc237716341 \h </w:instrText>
+          <w:instrText xml:space="preserve"> PAGEREF _Toc237716643 \h </w:instrText>
         </w:r>
         <w:r>
           <w:rPr>
@@ -1215,7 +1202,7 @@
           <w:noProof/>
         </w:rPr>
       </w:pPr>
-      <w:hyperlink w:anchor="_Toc237716342" w:history="1">
+      <w:hyperlink w:anchor="_Toc237716644" w:history="1">
         <w:r>
           <w:rPr>
             <w:rStyle w:val="Siuktni"/>
@@ -1242,7 +1229,7 @@
             <w:noProof/>
             <w:webHidden/>
           </w:rPr>
-          <w:instrText xml:space="preserve"> PAGEREF _Toc237716342 \h </w:instrText>
+          <w:instrText xml:space="preserve"> PAGEREF _Toc237716644 \h </w:instrText>
         </w:r>
         <w:r>
           <w:rPr>
@@ -1283,7 +1270,7 @@
           <w:noProof/>
         </w:rPr>
       </w:pPr>
-      <w:hyperlink w:anchor="_Toc237716343" w:history="1">
+      <w:hyperlink w:anchor="_Toc237716645" w:history="1">
         <w:r>
           <w:rPr>
             <w:rStyle w:val="Siuktni"/>
@@ -1310,7 +1297,7 @@
             <w:noProof/>
             <w:webHidden/>
           </w:rPr>
-          <w:instrText xml:space="preserve"> PAGEREF _Toc237716343 \h </w:instrText>
+          <w:instrText xml:space="preserve"> PAGEREF _Toc237716645 \h </w:instrText>
         </w:r>
         <w:r>
           <w:rPr>
@@ -1351,7 +1338,7 @@
           <w:noProof/>
         </w:rPr>
       </w:pPr>
-      <w:hyperlink w:anchor="_Toc237716344" w:history="1">
+      <w:hyperlink w:anchor="_Toc237716646" w:history="1">
         <w:r>
           <w:rPr>
             <w:rStyle w:val="Siuktni"/>
@@ -1378,7 +1365,7 @@
             <w:noProof/>
             <w:webHidden/>
           </w:rPr>
-          <w:instrText xml:space="preserve"> PAGEREF _Toc237716344 \h </w:instrText>
+          <w:instrText xml:space="preserve"> PAGEREF _Toc237716646 \h </w:instrText>
         </w:r>
         <w:r>
           <w:rPr>
@@ -1419,7 +1406,7 @@
           <w:noProof/>
         </w:rPr>
       </w:pPr>
-      <w:hyperlink w:anchor="_Toc237716345" w:history="1">
+      <w:hyperlink w:anchor="_Toc237716647" w:history="1">
         <w:r>
           <w:rPr>
             <w:rStyle w:val="Siuktni"/>
@@ -1446,7 +1433,7 @@
             <w:noProof/>
             <w:webHidden/>
           </w:rPr>
-          <w:instrText xml:space="preserve"> PAGEREF _Toc237716345 \h </w:instrText>
+          <w:instrText xml:space="preserve"> PAGEREF _Toc237716647 \h </w:instrText>
         </w:r>
         <w:r>
           <w:rPr>
@@ -1487,7 +1474,7 @@
           <w:noProof/>
         </w:rPr>
       </w:pPr>
-      <w:hyperlink w:anchor="_Toc237716346" w:history="1">
+      <w:hyperlink w:anchor="_Toc237716648" w:history="1">
         <w:r>
           <w:rPr>
             <w:rStyle w:val="Siuktni"/>
@@ -1514,7 +1501,7 @@
             <w:noProof/>
             <w:webHidden/>
           </w:rPr>
-          <w:instrText xml:space="preserve"> PAGEREF _Toc237716346 \h </w:instrText>
+          <w:instrText xml:space="preserve"> PAGEREF _Toc237716648 \h </w:instrText>
         </w:r>
         <w:r>
           <w:rPr>
@@ -1555,7 +1542,7 @@
           <w:noProof/>
         </w:rPr>
       </w:pPr>
-      <w:hyperlink w:anchor="_Toc237716347" w:history="1">
+      <w:hyperlink w:anchor="_Toc237716649" w:history="1">
         <w:r>
           <w:rPr>
             <w:rStyle w:val="Siuktni"/>
@@ -1582,7 +1569,7 @@
             <w:noProof/>
             <w:webHidden/>
           </w:rPr>
-          <w:instrText xml:space="preserve"> PAGEREF _Toc237716347 \h </w:instrText>
+          <w:instrText xml:space="preserve"> PAGEREF _Toc237716649 \h </w:instrText>
         </w:r>
         <w:r>
           <w:rPr>
@@ -1623,7 +1610,7 @@
           <w:noProof/>
         </w:rPr>
       </w:pPr>
-      <w:hyperlink w:anchor="_Toc237716348" w:history="1">
+      <w:hyperlink w:anchor="_Toc237716650" w:history="1">
         <w:r>
           <w:rPr>
             <w:rStyle w:val="Siuktni"/>
@@ -1650,7 +1637,7 @@
             <w:noProof/>
             <w:webHidden/>
           </w:rPr>
-          <w:instrText xml:space="preserve"> PAGEREF _Toc237716348 \h </w:instrText>
+          <w:instrText xml:space="preserve"> PAGEREF _Toc237716650 \h </w:instrText>
         </w:r>
         <w:r>
           <w:rPr>
@@ -1691,7 +1678,7 @@
           <w:noProof/>
         </w:rPr>
       </w:pPr>
-      <w:hyperlink w:anchor="_Toc237716349" w:history="1">
+      <w:hyperlink w:anchor="_Toc237716651" w:history="1">
         <w:r>
           <w:rPr>
             <w:rStyle w:val="Siuktni"/>
@@ -1718,7 +1705,7 @@
             <w:noProof/>
             <w:webHidden/>
           </w:rPr>
-          <w:instrText xml:space="preserve"> PAGEREF _Toc237716349 \h </w:instrText>
+          <w:instrText xml:space="preserve"> PAGEREF _Toc237716651 \h </w:instrText>
         </w:r>
         <w:r>
           <w:rPr>
@@ -1759,7 +1746,7 @@
           <w:noProof/>
         </w:rPr>
       </w:pPr>
-      <w:hyperlink w:anchor="_Toc237716350" w:history="1">
+      <w:hyperlink w:anchor="_Toc237716652" w:history="1">
         <w:r>
           <w:rPr>
             <w:rStyle w:val="Siuktni"/>
@@ -1786,7 +1773,7 @@
             <w:noProof/>
             <w:webHidden/>
           </w:rPr>
-          <w:instrText xml:space="preserve"> PAGEREF _Toc237716350 \h </w:instrText>
+          <w:instrText xml:space="preserve"> PAGEREF _Toc237716652 \h </w:instrText>
         </w:r>
         <w:r>
           <w:rPr>
@@ -1827,7 +1814,7 @@
           <w:noProof/>
         </w:rPr>
       </w:pPr>
-      <w:hyperlink w:anchor="_Toc237716351" w:history="1">
+      <w:hyperlink w:anchor="_Toc237716653" w:history="1">
         <w:r>
           <w:rPr>
             <w:rStyle w:val="Siuktni"/>
@@ -1854,7 +1841,7 @@
             <w:noProof/>
             <w:webHidden/>
           </w:rPr>
-          <w:instrText xml:space="preserve"> PAGEREF _Toc237716351 \h </w:instrText>
+          <w:instrText xml:space="preserve"> PAGEREF _Toc237716653 \h </w:instrText>
         </w:r>
         <w:r>
           <w:rPr>
@@ -1895,7 +1882,7 @@
           <w:noProof/>
         </w:rPr>
       </w:pPr>
-      <w:hyperlink w:anchor="_Toc237716352" w:history="1">
+      <w:hyperlink w:anchor="_Toc237716654" w:history="1">
         <w:r>
           <w:rPr>
             <w:rStyle w:val="Siuktni"/>
@@ -1922,7 +1909,7 @@
             <w:noProof/>
             <w:webHidden/>
           </w:rPr>
-          <w:instrText xml:space="preserve"> PAGEREF _Toc237716352 \h </w:instrText>
+          <w:instrText xml:space="preserve"> PAGEREF _Toc237716654 \h </w:instrText>
         </w:r>
         <w:r>
           <w:rPr>
@@ -1963,7 +1950,7 @@
           <w:noProof/>
         </w:rPr>
       </w:pPr>
-      <w:hyperlink w:anchor="_Toc237716353" w:history="1">
+      <w:hyperlink w:anchor="_Toc237716655" w:history="1">
         <w:r>
           <w:rPr>
             <w:rStyle w:val="Siuktni"/>
@@ -1990,7 +1977,7 @@
             <w:noProof/>
             <w:webHidden/>
           </w:rPr>
-          <w:instrText xml:space="preserve"> PAGEREF _Toc237716353 \h </w:instrText>
+          <w:instrText xml:space="preserve"> PAGEREF _Toc237716655 \h </w:instrText>
         </w:r>
         <w:r>
           <w:rPr>
@@ -2031,7 +2018,7 @@
           <w:noProof/>
         </w:rPr>
       </w:pPr>
-      <w:hyperlink w:anchor="_Toc237716354" w:history="1">
+      <w:hyperlink w:anchor="_Toc237716656" w:history="1">
         <w:r>
           <w:rPr>
             <w:rStyle w:val="Siuktni"/>
@@ -2058,7 +2045,7 @@
             <w:noProof/>
             <w:webHidden/>
           </w:rPr>
-          <w:instrText xml:space="preserve"> PAGEREF _Toc237716354 \h </w:instrText>
+          <w:instrText xml:space="preserve"> PAGEREF _Toc237716656 \h </w:instrText>
         </w:r>
         <w:r>
           <w:rPr>
@@ -2099,7 +2086,7 @@
           <w:noProof/>
         </w:rPr>
       </w:pPr>
-      <w:hyperlink w:anchor="_Toc237716355" w:history="1">
+      <w:hyperlink w:anchor="_Toc237716657" w:history="1">
         <w:r>
           <w:rPr>
             <w:rStyle w:val="Siuktni"/>
@@ -2126,7 +2113,7 @@
             <w:noProof/>
             <w:webHidden/>
           </w:rPr>
-          <w:instrText xml:space="preserve"> PAGEREF _Toc237716355 \h </w:instrText>
+          <w:instrText xml:space="preserve"> PAGEREF _Toc237716657 \h </w:instrText>
         </w:r>
         <w:r>
           <w:rPr>
@@ -2167,7 +2154,7 @@
           <w:noProof/>
         </w:rPr>
       </w:pPr>
-      <w:hyperlink w:anchor="_Toc237716356" w:history="1">
+      <w:hyperlink w:anchor="_Toc237716658" w:history="1">
         <w:r>
           <w:rPr>
             <w:rStyle w:val="Siuktni"/>
@@ -2194,7 +2181,7 @@
             <w:noProof/>
             <w:webHidden/>
           </w:rPr>
-          <w:instrText xml:space="preserve"> PAGEREF _Toc237716356 \h </w:instrText>
+          <w:instrText xml:space="preserve"> PAGEREF _Toc237716658 \h </w:instrText>
         </w:r>
         <w:r>
           <w:rPr>
@@ -2235,7 +2222,7 @@
           <w:noProof/>
         </w:rPr>
       </w:pPr>
-      <w:hyperlink w:anchor="_Toc237716357" w:history="1">
+      <w:hyperlink w:anchor="_Toc237716659" w:history="1">
         <w:r>
           <w:rPr>
             <w:rStyle w:val="Siuktni"/>
@@ -2262,7 +2249,7 @@
             <w:noProof/>
             <w:webHidden/>
           </w:rPr>
-          <w:instrText xml:space="preserve"> PAGEREF _Toc237716357 \h </w:instrText>
+          <w:instrText xml:space="preserve"> PAGEREF _Toc237716659 \h </w:instrText>
         </w:r>
         <w:r>
           <w:rPr>
@@ -2303,7 +2290,7 @@
           <w:noProof/>
         </w:rPr>
       </w:pPr>
-      <w:hyperlink w:anchor="_Toc237716358" w:history="1">
+      <w:hyperlink w:anchor="_Toc237716660" w:history="1">
         <w:r>
           <w:rPr>
             <w:rStyle w:val="Siuktni"/>
@@ -2330,7 +2317,7 @@
             <w:noProof/>
             <w:webHidden/>
           </w:rPr>
-          <w:instrText xml:space="preserve"> PAGEREF _Toc237716358 \h </w:instrText>
+          <w:instrText xml:space="preserve"> PAGEREF _Toc237716660 \h </w:instrText>
         </w:r>
         <w:r>
           <w:rPr>
@@ -2371,7 +2358,7 @@
           <w:noProof/>
         </w:rPr>
       </w:pPr>
-      <w:hyperlink w:anchor="_Toc237716359" w:history="1">
+      <w:hyperlink w:anchor="_Toc237716661" w:history="1">
         <w:r>
           <w:rPr>
             <w:rStyle w:val="Siuktni"/>
@@ -2398,7 +2385,7 @@
             <w:noProof/>
             <w:webHidden/>
           </w:rPr>
-          <w:instrText xml:space="preserve"> PAGEREF _Toc237716359 \h </w:instrText>
+          <w:instrText xml:space="preserve"> PAGEREF _Toc237716661 \h </w:instrText>
         </w:r>
         <w:r>
           <w:rPr>
@@ -2439,7 +2426,7 @@
           <w:noProof/>
         </w:rPr>
       </w:pPr>
-      <w:hyperlink w:anchor="_Toc237716360" w:history="1">
+      <w:hyperlink w:anchor="_Toc237716662" w:history="1">
         <w:r>
           <w:rPr>
             <w:rStyle w:val="Siuktni"/>
@@ -2466,7 +2453,7 @@
             <w:noProof/>
             <w:webHidden/>
           </w:rPr>
-          <w:instrText xml:space="preserve"> PAGEREF _Toc237716360 \h </w:instrText>
+          <w:instrText xml:space="preserve"> PAGEREF _Toc237716662 \h </w:instrText>
         </w:r>
         <w:r>
           <w:rPr>
@@ -2507,7 +2494,7 @@
           <w:noProof/>
         </w:rPr>
       </w:pPr>
-      <w:hyperlink w:anchor="_Toc237716361" w:history="1">
+      <w:hyperlink w:anchor="_Toc237716663" w:history="1">
         <w:r>
           <w:rPr>
             <w:rStyle w:val="Siuktni"/>
@@ -2534,7 +2521,7 @@
             <w:noProof/>
             <w:webHidden/>
           </w:rPr>
-          <w:instrText xml:space="preserve"> PAGEREF _Toc237716361 \h </w:instrText>
+          <w:instrText xml:space="preserve"> PAGEREF _Toc237716663 \h </w:instrText>
         </w:r>
         <w:r>
           <w:rPr>
@@ -2575,7 +2562,7 @@
           <w:noProof/>
         </w:rPr>
       </w:pPr>
-      <w:hyperlink w:anchor="_Toc237716362" w:history="1">
+      <w:hyperlink w:anchor="_Toc237716664" w:history="1">
         <w:r>
           <w:rPr>
             <w:rStyle w:val="Siuktni"/>
@@ -2602,7 +2589,7 @@
             <w:noProof/>
             <w:webHidden/>
           </w:rPr>
-          <w:instrText xml:space="preserve"> PAGEREF _Toc237716362 \h </w:instrText>
+          <w:instrText xml:space="preserve"> PAGEREF _Toc237716664 \h </w:instrText>
         </w:r>
         <w:r>
           <w:rPr>
@@ -2643,7 +2630,7 @@
           <w:noProof/>
         </w:rPr>
       </w:pPr>
-      <w:hyperlink w:anchor="_Toc237716363" w:history="1">
+      <w:hyperlink w:anchor="_Toc237716665" w:history="1">
         <w:r>
           <w:rPr>
             <w:rStyle w:val="Siuktni"/>
@@ -2670,7 +2657,7 @@
             <w:noProof/>
             <w:webHidden/>
           </w:rPr>
-          <w:instrText xml:space="preserve"> PAGEREF _Toc237716363 \h </w:instrText>
+          <w:instrText xml:space="preserve"> PAGEREF _Toc237716665 \h </w:instrText>
         </w:r>
         <w:r>
           <w:rPr>
@@ -2711,7 +2698,7 @@
           <w:noProof/>
         </w:rPr>
       </w:pPr>
-      <w:hyperlink w:anchor="_Toc237716364" w:history="1">
+      <w:hyperlink w:anchor="_Toc237716666" w:history="1">
         <w:r>
           <w:rPr>
             <w:rStyle w:val="Siuktni"/>
@@ -2738,7 +2725,7 @@
             <w:noProof/>
             <w:webHidden/>
           </w:rPr>
-          <w:instrText xml:space="preserve"> PAGEREF _Toc237716364 \h </w:instrText>
+          <w:instrText xml:space="preserve"> PAGEREF _Toc237716666 \h </w:instrText>
         </w:r>
         <w:r>
           <w:rPr>
@@ -2779,7 +2766,7 @@
           <w:noProof/>
         </w:rPr>
       </w:pPr>
-      <w:hyperlink w:anchor="_Toc237716365" w:history="1">
+      <w:hyperlink w:anchor="_Toc237716667" w:history="1">
         <w:r>
           <w:rPr>
             <w:rStyle w:val="Siuktni"/>
@@ -2806,7 +2793,7 @@
             <w:noProof/>
             <w:webHidden/>
           </w:rPr>
-          <w:instrText xml:space="preserve"> PAGEREF _Toc237716365 \h </w:instrText>
+          <w:instrText xml:space="preserve"> PAGEREF _Toc237716667 \h </w:instrText>
         </w:r>
         <w:r>
           <w:rPr>
@@ -2847,7 +2834,7 @@
           <w:noProof/>
         </w:rPr>
       </w:pPr>
-      <w:hyperlink w:anchor="_Toc237716366" w:history="1">
+      <w:hyperlink w:anchor="_Toc237716668" w:history="1">
         <w:r>
           <w:rPr>
             <w:rStyle w:val="Siuktni"/>
@@ -2874,7 +2861,7 @@
             <w:noProof/>
             <w:webHidden/>
           </w:rPr>
-          <w:instrText xml:space="preserve"> PAGEREF _Toc237716366 \h </w:instrText>
+          <w:instrText xml:space="preserve"> PAGEREF _Toc237716668 \h </w:instrText>
         </w:r>
         <w:r>
           <w:rPr>
@@ -2915,7 +2902,7 @@
           <w:noProof/>
         </w:rPr>
       </w:pPr>
-      <w:hyperlink w:anchor="_Toc237716367" w:history="1">
+      <w:hyperlink w:anchor="_Toc237716669" w:history="1">
         <w:r>
           <w:rPr>
             <w:rStyle w:val="Siuktni"/>
@@ -2942,7 +2929,7 @@
             <w:noProof/>
             <w:webHidden/>
           </w:rPr>
-          <w:instrText xml:space="preserve"> PAGEREF _Toc237716367 \h </w:instrText>
+          <w:instrText xml:space="preserve"> PAGEREF _Toc237716669 \h </w:instrText>
         </w:r>
         <w:r>
           <w:rPr>
@@ -2991,7 +2978,7 @@
       <w:pPr>
         <w:pStyle w:val="u1"/>
       </w:pPr>
-      <w:bookmarkStart w:id="0" w:name="_Toc237716336"/>
+      <w:bookmarkStart w:id="0" w:name="_Toc237716638"/>
       <w:r>
         <w:rPr>
           <w:rFonts w:ascii="Times New Roman" w:eastAsia="Times New Roman" w:hAnsi="Times New Roman"/>
@@ -3006,7 +2993,7 @@
       <w:pPr>
         <w:pStyle w:val="u2"/>
       </w:pPr>
-      <w:bookmarkStart w:id="1" w:name="_Toc237716337"/>
+      <w:bookmarkStart w:id="1" w:name="_Toc237716639"/>
       <w:r>
         <w:rPr>
           <w:rFonts w:ascii="Times New Roman" w:eastAsia="Times New Roman" w:hAnsi="Times New Roman"/>
@@ -3031,7 +3018,7 @@
       <w:pPr>
         <w:pStyle w:val="u2"/>
       </w:pPr>
-      <w:bookmarkStart w:id="2" w:name="_Toc237716338"/>
+      <w:bookmarkStart w:id="2" w:name="_Toc237716640"/>
       <w:r>
         <w:rPr>
           <w:rFonts w:ascii="Times New Roman" w:eastAsia="Times New Roman" w:hAnsi="Times New Roman"/>
@@ -3065,7 +3052,7 @@
       <w:pPr>
         <w:pStyle w:val="u2"/>
       </w:pPr>
-      <w:bookmarkStart w:id="3" w:name="_Toc237716339"/>
+      <w:bookmarkStart w:id="3" w:name="_Toc237716641"/>
       <w:r>
         <w:rPr>
           <w:rFonts w:ascii="Times New Roman" w:eastAsia="Times New Roman" w:hAnsi="Times New Roman"/>
@@ -3119,7 +3106,7 @@
       <w:pPr>
         <w:pStyle w:val="u1"/>
       </w:pPr>
-      <w:bookmarkStart w:id="4" w:name="_Toc237716340"/>
+      <w:bookmarkStart w:id="4" w:name="_Toc237716642"/>
       <w:r>
         <w:rPr>
           <w:rFonts w:ascii="Times New Roman" w:eastAsia="Times New Roman" w:hAnsi="Times New Roman"/>
@@ -3134,7 +3121,7 @@
       <w:pPr>
         <w:pStyle w:val="u2"/>
       </w:pPr>
-      <w:bookmarkStart w:id="5" w:name="_Toc237716341"/>
+      <w:bookmarkStart w:id="5" w:name="_Toc237716643"/>
       <w:r>
         <w:rPr>
           <w:rFonts w:ascii="Times New Roman" w:eastAsia="Times New Roman" w:hAnsi="Times New Roman"/>
@@ -3173,7 +3160,7 @@
       <w:pPr>
         <w:pStyle w:val="u2"/>
       </w:pPr>
-      <w:bookmarkStart w:id="6" w:name="_Toc237716342"/>
+      <w:bookmarkStart w:id="6" w:name="_Toc237716644"/>
       <w:r>
         <w:rPr>
           <w:rFonts w:ascii="Times New Roman" w:eastAsia="Times New Roman" w:hAnsi="Times New Roman"/>
@@ -3285,7 +3272,7 @@
       <w:pPr>
         <w:pStyle w:val="u2"/>
       </w:pPr>
-      <w:bookmarkStart w:id="7" w:name="_Toc237716343"/>
+      <w:bookmarkStart w:id="7" w:name="_Toc237716645"/>
       <w:r>
         <w:rPr>
           <w:rFonts w:ascii="Times New Roman" w:eastAsia="Times New Roman" w:hAnsi="Times New Roman"/>
@@ -3527,7 +3514,7 @@
       <w:pPr>
         <w:pStyle w:val="u2"/>
       </w:pPr>
-      <w:bookmarkStart w:id="8" w:name="_Toc237716344"/>
+      <w:bookmarkStart w:id="8" w:name="_Toc237716646"/>
       <w:r>
         <w:rPr>
           <w:rFonts w:ascii="Times New Roman" w:eastAsia="Times New Roman" w:hAnsi="Times New Roman"/>
@@ -3605,7 +3592,7 @@
       <w:pPr>
         <w:pStyle w:val="u2"/>
       </w:pPr>
-      <w:bookmarkStart w:id="9" w:name="_Toc237716345"/>
+      <w:bookmarkStart w:id="9" w:name="_Toc237716647"/>
       <w:r>
         <w:rPr>
           <w:rFonts w:ascii="Times New Roman" w:eastAsia="Times New Roman" w:hAnsi="Times New Roman"/>
@@ -3700,7 +3687,7 @@
       <w:pPr>
         <w:pStyle w:val="u2"/>
       </w:pPr>
-      <w:bookmarkStart w:id="10" w:name="_Toc237716346"/>
+      <w:bookmarkStart w:id="10" w:name="_Toc237716648"/>
       <w:r>
         <w:rPr>
           <w:rFonts w:ascii="Times New Roman" w:eastAsia="Times New Roman" w:hAnsi="Times New Roman"/>
@@ -3762,7 +3749,7 @@
       <w:pPr>
         <w:pStyle w:val="u2"/>
       </w:pPr>
-      <w:bookmarkStart w:id="11" w:name="_Toc237716347"/>
+      <w:bookmarkStart w:id="11" w:name="_Toc237716649"/>
       <w:r>
         <w:rPr>
           <w:rFonts w:ascii="Times New Roman" w:eastAsia="Times New Roman" w:hAnsi="Times New Roman"/>
@@ -3850,7 +3837,7 @@
       <w:pPr>
         <w:pStyle w:val="u1"/>
       </w:pPr>
-      <w:bookmarkStart w:id="12" w:name="_Toc237716348"/>
+      <w:bookmarkStart w:id="12" w:name="_Toc237716650"/>
       <w:r>
         <w:rPr>
           <w:rFonts w:ascii="Times New Roman" w:eastAsia="Times New Roman" w:hAnsi="Times New Roman"/>
@@ -3865,7 +3852,7 @@
       <w:pPr>
         <w:pStyle w:val="u2"/>
       </w:pPr>
-      <w:bookmarkStart w:id="13" w:name="_Toc237716349"/>
+      <w:bookmarkStart w:id="13" w:name="_Toc237716651"/>
       <w:r>
         <w:rPr>
           <w:rFonts w:ascii="Times New Roman" w:eastAsia="Times New Roman" w:hAnsi="Times New Roman"/>
@@ -3913,7 +3900,7 @@
       <w:pPr>
         <w:pStyle w:val="u2"/>
       </w:pPr>
-      <w:bookmarkStart w:id="14" w:name="_Toc237716350"/>
+      <w:bookmarkStart w:id="14" w:name="_Toc237716652"/>
       <w:r>
         <w:rPr>
           <w:rFonts w:ascii="Times New Roman" w:eastAsia="Times New Roman" w:hAnsi="Times New Roman"/>
@@ -4025,7 +4012,7 @@
       <w:pPr>
         <w:pStyle w:val="u2"/>
       </w:pPr>
-      <w:bookmarkStart w:id="15" w:name="_Toc237716351"/>
+      <w:bookmarkStart w:id="15" w:name="_Toc237716653"/>
       <w:r>
         <w:rPr>
           <w:rFonts w:ascii="Times New Roman" w:eastAsia="Times New Roman" w:hAnsi="Times New Roman"/>
@@ -4096,7 +4083,7 @@
       <w:pPr>
         <w:pStyle w:val="u2"/>
       </w:pPr>
-      <w:bookmarkStart w:id="16" w:name="_Toc237716352"/>
+      <w:bookmarkStart w:id="16" w:name="_Toc237716654"/>
       <w:r>
         <w:rPr>
           <w:rFonts w:ascii="Times New Roman" w:eastAsia="Times New Roman" w:hAnsi="Times New Roman"/>
@@ -4176,7 +4163,7 @@
       <w:pPr>
         <w:pStyle w:val="u2"/>
       </w:pPr>
-      <w:bookmarkStart w:id="17" w:name="_Toc237716353"/>
+      <w:bookmarkStart w:id="17" w:name="_Toc237716655"/>
       <w:r>
         <w:rPr>
           <w:rFonts w:ascii="Times New Roman" w:eastAsia="Times New Roman" w:hAnsi="Times New Roman"/>
@@ -5339,7 +5326,7 @@
       <w:pPr>
         <w:pStyle w:val="u1"/>
       </w:pPr>
-      <w:bookmarkStart w:id="18" w:name="_Toc237716354"/>
+      <w:bookmarkStart w:id="18" w:name="_Toc237716656"/>
       <w:r>
         <w:rPr>
           <w:rFonts w:ascii="Times New Roman" w:eastAsia="Times New Roman" w:hAnsi="Times New Roman"/>
@@ -5362,7 +5349,7 @@
       <w:pPr>
         <w:pStyle w:val="u2"/>
       </w:pPr>
-      <w:bookmarkStart w:id="19" w:name="_Toc237716355"/>
+      <w:bookmarkStart w:id="19" w:name="_Toc237716657"/>
       <w:r>
         <w:rPr>
           <w:rFonts w:ascii="Times New Roman" w:eastAsia="Times New Roman" w:hAnsi="Times New Roman"/>
@@ -5479,14 +5466,14 @@
         <w:spacing w:after="80"/>
       </w:pPr>
       <w:r>
-        <w:t>Trong vụ việc này, khách thể là các quan hệ xã hội được pháp luật bảo vệ gồm trật tự quản lý quảng cáo, quyền được thông tin trung thực của người tiêu dùng và quyền hình ảnh cá nhân. Đối tượng tác động trực tiếp là bài viết, video quảng cáo cắt ghép, sản phẩm Đông y và dòng tiền từ các đơn hàng. Những người chịu ảnh hưởng trực tiếp gồm người mua hàng qua 5.429 đơn hàng và các cá nhân bị khai thác hình ảnh trong tư liệu tiếp thị.</w:t>
+        <w:t>Trong vụ việc này, khách thể là các quan hệ xã hội được pháp luật bảo vệ gồm trật tự quản lý quảng cáo, quyền được thông tin trung thực của người tiêu dùng và quyền hình ảnh cá nhân. Đối tượng tác động trực tiếp là bài viết, video quảng cáo cắt ghép, sản phẩm Đông y và dòng tiền từ các đơn hàng. Những người chịu ảnh hưởng gồm người mua hàng qua 5.429 đơn hàng (con số 5.429 là số đơn hàng thành công, không đồng nghĩa với 5.429 người mua riêng biệt) và các cá nhân bị khai thác hình ảnh trong tư liệu tiếp thị.</w:t>
       </w:r>
     </w:p>
     <w:p>
       <w:pPr>
         <w:pStyle w:val="u2"/>
       </w:pPr>
-      <w:bookmarkStart w:id="20" w:name="_Toc237716356"/>
+      <w:bookmarkStart w:id="20" w:name="_Toc237716658"/>
       <w:r>
         <w:rPr>
           <w:rFonts w:ascii="Times New Roman" w:eastAsia="Times New Roman" w:hAnsi="Times New Roman"/>
@@ -5628,18 +5615,18 @@
         <w:spacing w:after="80"/>
       </w:pPr>
       <w:r>
-        <w:t xml:space="preserve">Nội dung quảng cáo phóng đại và hình ảnh cắt ghép có khả năng tác động đến nhận thức, thúc đẩy người xem tin tưởng và đặt mua sản phẩm. Mối liên hệ giữa hoạt động tiếp thị sai sự thật và 5.429 đơn hàng phát sinh là cơ sở để xem xét quan hệ </w:t>
+        <w:t xml:space="preserve">Nội dung quảng cáo phóng đại và hình ảnh cắt ghép có khả năng tác động đến nhận thức, thúc đẩy người xem tin tưởng và đặt mua sản phẩm. Mối liên hệ giữa hoạt </w:t>
       </w:r>
       <w:r>
         <w:lastRenderedPageBreak/>
-        <w:t>nhân quả trong môn học. Tuy nhiên, thông tin công khai chưa thể hiện lý do mua hàng cụ thể của từng cá nhân trong 5.429 đơn hàng, nên nhóm không nhận định rằng toàn bộ đơn hàng đều phát sinh duy nhất từ việc quảng cáo gian dối.</w:t>
+        <w:t>động tiếp thị sai sự thật và 5.429 đơn hàng phát sinh là cơ sở để xem xét quan hệ nhân quả trong môn học. Tuy nhiên, thông tin công khai chưa thể hiện lý do mua hàng cụ thể của từng cá nhân trong 5.429 đơn hàng, nên nhóm không nhận định rằng toàn bộ đơn hàng đều phát sinh duy nhất từ việc quảng cáo gian dối.</w:t>
       </w:r>
     </w:p>
     <w:p>
       <w:pPr>
         <w:pStyle w:val="u2"/>
       </w:pPr>
-      <w:bookmarkStart w:id="21" w:name="_Toc237716357"/>
+      <w:bookmarkStart w:id="21" w:name="_Toc237716659"/>
       <w:r>
         <w:rPr>
           <w:rFonts w:ascii="Times New Roman" w:eastAsia="Times New Roman" w:hAnsi="Times New Roman"/>
@@ -5779,7 +5766,7 @@
       <w:pPr>
         <w:pStyle w:val="u2"/>
       </w:pPr>
-      <w:bookmarkStart w:id="22" w:name="_Toc237716358"/>
+      <w:bookmarkStart w:id="22" w:name="_Toc237716660"/>
       <w:r>
         <w:rPr>
           <w:rFonts w:ascii="Times New Roman" w:eastAsia="Times New Roman" w:hAnsi="Times New Roman"/>
@@ -5928,7 +5915,7 @@
       <w:pPr>
         <w:pStyle w:val="u2"/>
       </w:pPr>
-      <w:bookmarkStart w:id="23" w:name="_Toc237716359"/>
+      <w:bookmarkStart w:id="23" w:name="_Toc237716661"/>
       <w:r>
         <w:rPr>
           <w:rFonts w:ascii="Times New Roman" w:eastAsia="Times New Roman" w:hAnsi="Times New Roman"/>
@@ -6090,7 +6077,7 @@
               <w:rPr>
                 <w:sz w:val="19"/>
               </w:rPr>
-              <w:t>Xâm hại trật tự quản lý quảng cáo, thương mại; quyền được thông tin trung thực của người tiêu dùng; quyền hình ảnh cá nhân.</w:t>
+              <w:t>Tác động đến trật tự quản lý quảng cáo và quyền được cung cấp thông tin trung thực của người tiêu dùng; việc sử dụng hình ảnh cắt ghép còn có thể đặt ra vấn đề về quyền hình ảnh nếu không đáp ứng các điều kiện pháp luật.</w:t>
             </w:r>
           </w:p>
         </w:tc>
@@ -6116,6 +6103,7 @@
                 <w:b/>
                 <w:sz w:val="19"/>
               </w:rPr>
+              <w:lastRenderedPageBreak/>
               <w:t>Mặt khách quan</w:t>
             </w:r>
           </w:p>
@@ -6180,7 +6168,6 @@
                 <w:b/>
                 <w:sz w:val="19"/>
               </w:rPr>
-              <w:lastRenderedPageBreak/>
               <w:t>Chủ thể</w:t>
             </w:r>
           </w:p>
@@ -6293,7 +6280,7 @@
       <w:pPr>
         <w:pStyle w:val="u1"/>
       </w:pPr>
-      <w:bookmarkStart w:id="24" w:name="_Toc237716360"/>
+      <w:bookmarkStart w:id="24" w:name="_Toc237716662"/>
       <w:r>
         <w:rPr>
           <w:rFonts w:ascii="Times New Roman" w:eastAsia="Times New Roman" w:hAnsi="Times New Roman"/>
@@ -6308,7 +6295,7 @@
       <w:pPr>
         <w:pStyle w:val="u2"/>
       </w:pPr>
-      <w:bookmarkStart w:id="25" w:name="_Toc237716361"/>
+      <w:bookmarkStart w:id="25" w:name="_Toc237716663"/>
       <w:r>
         <w:rPr>
           <w:rFonts w:ascii="Times New Roman" w:eastAsia="Times New Roman" w:hAnsi="Times New Roman"/>
@@ -6323,7 +6310,7 @@
         <w:spacing w:after="80"/>
       </w:pPr>
       <w:r>
-        <w:t>Vụ việc tại Phú Thọ phản ánh thực trạng lợi dụng mạng xã hội để tiếp thị gian dối thông qua việc cắt ghép hình ảnh người có uy tín nhằm tạo niềm tin cho người mua. Việc quảng cáo sai lệch kết hợp với khả năng lan truyền nhanh của không gian mạng khiến nhiều người tiêu dùng dễ dàng đưa ra quyết định mua hàng đối với các sản phẩm chưa rõ nguồn gốc và chất lượng.</w:t>
+        <w:t>Vụ việc tại Phú Thọ phản ánh thực trạng lợi dụng mạng xã hội để tiếp thị gian dối thông qua việc cắt ghép hình ảnh người có uy tín nhằm tạo niềm tin cho người mua. Việc quảng cáo sai lệch kết hợp với khả năng lan truyền nhanh của không gian mạng khiến nhiều người tiêu dùng dễ dàng đưa ra quyết định mua hàng đối với sản phẩm được quảng cáo bằng thông tin phóng đại hoặc chưa được kiểm chứng đầy đủ về chất lượng.</w:t>
       </w:r>
     </w:p>
     <w:p>
@@ -6338,7 +6325,7 @@
       <w:pPr>
         <w:pStyle w:val="u2"/>
       </w:pPr>
-      <w:bookmarkStart w:id="26" w:name="_Toc237716362"/>
+      <w:bookmarkStart w:id="26" w:name="_Toc237716664"/>
       <w:r>
         <w:rPr>
           <w:rFonts w:ascii="Times New Roman" w:eastAsia="Times New Roman" w:hAnsi="Times New Roman"/>
@@ -6353,7 +6340,7 @@
         <w:spacing w:after="80"/>
       </w:pPr>
       <w:r>
-        <w:t>Từ vụ việc này, bài học quan trọng đối với hoạt động kinh doanh trực tuyến là phải tuân thủ đúng các quy định về quảng cáo, tuyệt đối không đưa thông tin sai sự thật về công dụng sản phẩm và phải có sự đồng ý hợp pháp khi sử dụng hình ảnh cá nhân. Đối với người tiêu dùng, việc chủ động kiểm chứng thông tin và tìm kiếm tư vấn y tế chính quy khi có vấn đề về sức khỏe là điều cần thiết để bảo vệ quyền lợi và an toàn của bản thân.</w:t>
+        <w:t>Từ vụ việc này, bài học quan trọng đối với hoạt động kinh doanh trực tuyến là phải tuân thủ đúng các quy định về quảng cáo, tuyệt đối không đưa thông tin sai sự thật về công dụng sản phẩm; việc sử dụng hình ảnh cá nhân phải tuân thủ quy định về sự đồng ý và các trường hợp ngoại lệ do pháp luật quy định. Đối với người tiêu dùng, việc chủ động kiểm chứng thông tin và tìm kiếm tư vấn y tế chính quy khi có vấn đề về sức khỏe là điều cần thiết để bảo vệ quyền lợi và an toàn của bản thân.</w:t>
       </w:r>
     </w:p>
     <w:p>
@@ -6368,7 +6355,7 @@
       <w:pPr>
         <w:pStyle w:val="u1"/>
       </w:pPr>
-      <w:bookmarkStart w:id="27" w:name="_Toc237716363"/>
+      <w:bookmarkStart w:id="27" w:name="_Toc237716665"/>
       <w:r>
         <w:rPr>
           <w:rFonts w:ascii="Times New Roman" w:eastAsia="Times New Roman" w:hAnsi="Times New Roman"/>
@@ -6384,10 +6371,10 @@
         <w:spacing w:after="80"/>
       </w:pPr>
       <w:r>
-        <w:t>Qua phân tích vụ việc tại Phú Thọ, bốn yếu tố cấu thành vi phạm pháp luật được thể hiện rõ qua các dữ kiện thực tế: hành vi quảng cáo sai sự thật và khai thác hình ảnh cắt ghép xâm hại đến trật tự quản lý quảng cáo, quyền lợi của người tiêu dùng và quyền hình ảnh cá nhân; chuỗi hành vi được thực hiện qua nhiều khâu với 5.429 đơn hàng phát sinh; người tổ chức (Nguyễn Tiến Đạt) đã đủ tuổi thành niên; và dữ kiện tiếp thị phóng đại để bán hàng giá cao tạo cơ sở phân tích hướng lỗi cố ý trực tiếp gắn với động cơ</w:t>
-      </w:r>
-      <w:r>
-        <w:t xml:space="preserve"> kinh tế.</w:t>
+        <w:t xml:space="preserve">Qua các dữ kiện công khai, vụ việc có thể được phân tích theo bốn yếu tố cấu thành vi phạm pháp luật: hành vi quảng cáo sai sự thật và khai thác hình ảnh cắt ghép tác động đến trật tự quản lý quảng cáo, quyền lợi của người tiêu dùng và quyền hình ảnh cá nhân theo quy định pháp luật; chuỗi hành vi được thực hiện qua nhiều khâu với 5.429 đơn hàng phát sinh; người tổ chức (Nguyễn Tiến Đạt) đã đủ tuổi thành niên; và dữ kiện tiếp thị phóng đại để bán hàng giá cao tạo cơ sở phân tích hướng lỗi cố ý trực tiếp gắn </w:t>
+      </w:r>
+      <w:r>
+        <w:t>với động cơ kinh tế.</w:t>
       </w:r>
     </w:p>
     <w:p>
@@ -6402,7 +6389,7 @@
       <w:pPr>
         <w:pStyle w:val="u1"/>
       </w:pPr>
-      <w:bookmarkStart w:id="28" w:name="_Toc237716364"/>
+      <w:bookmarkStart w:id="28" w:name="_Toc237716666"/>
       <w:r>
         <w:rPr>
           <w:rFonts w:ascii="Times New Roman" w:eastAsia="Times New Roman" w:hAnsi="Times New Roman"/>
@@ -6417,7 +6404,7 @@
       <w:pPr>
         <w:pStyle w:val="u2"/>
       </w:pPr>
-      <w:bookmarkStart w:id="29" w:name="_Toc237716365"/>
+      <w:bookmarkStart w:id="29" w:name="_Toc237716667"/>
       <w:r>
         <w:rPr>
           <w:rFonts w:ascii="Times New Roman" w:eastAsia="Times New Roman" w:hAnsi="Times New Roman"/>
@@ -6539,7 +6526,7 @@
       <w:pPr>
         <w:pStyle w:val="u2"/>
       </w:pPr>
-      <w:bookmarkStart w:id="30" w:name="_Toc237716366"/>
+      <w:bookmarkStart w:id="30" w:name="_Toc237716668"/>
       <w:r>
         <w:rPr>
           <w:rFonts w:ascii="Times New Roman" w:eastAsia="Times New Roman" w:hAnsi="Times New Roman"/>
@@ -6580,7 +6567,7 @@
       <w:pPr>
         <w:pStyle w:val="u2"/>
       </w:pPr>
-      <w:bookmarkStart w:id="31" w:name="_Toc237716367"/>
+      <w:bookmarkStart w:id="31" w:name="_Toc237716669"/>
       <w:r>
         <w:rPr>
           <w:rFonts w:ascii="Times New Roman" w:eastAsia="Times New Roman" w:hAnsi="Times New Roman"/>
@@ -6888,31 +6875,31 @@
       </w:rPr>
     </w:lvl>
   </w:abstractNum>
-  <w:num w:numId="1" w16cid:durableId="1045644592">
+  <w:num w:numId="1" w16cid:durableId="180439529">
     <w:abstractNumId w:val="8"/>
   </w:num>
-  <w:num w:numId="2" w16cid:durableId="1816678567">
+  <w:num w:numId="2" w16cid:durableId="1227640382">
     <w:abstractNumId w:val="6"/>
   </w:num>
-  <w:num w:numId="3" w16cid:durableId="1539276756">
+  <w:num w:numId="3" w16cid:durableId="2134714268">
     <w:abstractNumId w:val="5"/>
   </w:num>
-  <w:num w:numId="4" w16cid:durableId="388845351">
+  <w:num w:numId="4" w16cid:durableId="710232531">
     <w:abstractNumId w:val="4"/>
   </w:num>
-  <w:num w:numId="5" w16cid:durableId="14041290">
+  <w:num w:numId="5" w16cid:durableId="1703435660">
     <w:abstractNumId w:val="7"/>
   </w:num>
-  <w:num w:numId="6" w16cid:durableId="332420335">
+  <w:num w:numId="6" w16cid:durableId="1589775519">
     <w:abstractNumId w:val="3"/>
   </w:num>
-  <w:num w:numId="7" w16cid:durableId="761099647">
+  <w:num w:numId="7" w16cid:durableId="1540899876">
     <w:abstractNumId w:val="2"/>
   </w:num>
-  <w:num w:numId="8" w16cid:durableId="1791627760">
+  <w:num w:numId="8" w16cid:durableId="698163911">
     <w:abstractNumId w:val="1"/>
   </w:num>
-  <w:num w:numId="9" w16cid:durableId="2003242604">
+  <w:num w:numId="9" w16cid:durableId="1305770355">
     <w:abstractNumId w:val="0"/>
   </w:num>
 </w:numbering>
@@ -18315,7 +18302,7 @@
     <w:autoRedefine/>
     <w:uiPriority w:val="39"/>
     <w:unhideWhenUsed/>
-    <w:rsid w:val="00762552"/>
+    <w:rsid w:val="004E02D8"/>
     <w:pPr>
       <w:spacing w:after="100"/>
     </w:pPr>
@@ -18327,7 +18314,7 @@
     <w:autoRedefine/>
     <w:uiPriority w:val="39"/>
     <w:unhideWhenUsed/>
-    <w:rsid w:val="00762552"/>
+    <w:rsid w:val="004E02D8"/>
     <w:pPr>
       <w:spacing w:after="100"/>
       <w:ind w:left="260"/>
@@ -18338,7 +18325,7 @@
     <w:basedOn w:val="Phngmcinhcuaoanvn"/>
     <w:uiPriority w:val="99"/>
     <w:unhideWhenUsed/>
-    <w:rsid w:val="00762552"/>
+    <w:rsid w:val="004E02D8"/>
     <w:rPr>
       <w:color w:val="0000FF" w:themeColor="hyperlink"/>
       <w:u w:val="single"/>

</xml_diff>

<commit_message>
fix: resolve final verified report issue
</commit_message>
<xml_diff>
--- a/report/BaoCao_TieuLuan_PLDC_UIT_FINAL.docx
+++ b/report/BaoCao_TieuLuan_PLDC_UIT_FINAL.docx
@@ -794,7 +794,7 @@
       <w:r>
         <w:fldChar w:fldCharType="separate"/>
       </w:r>
-      <w:hyperlink w:anchor="_Toc237716638" w:history="1">
+      <w:hyperlink w:anchor="_Toc237717142" w:history="1">
         <w:r>
           <w:rPr>
             <w:rStyle w:val="Siuktni"/>
@@ -821,7 +821,7 @@
             <w:noProof/>
             <w:webHidden/>
           </w:rPr>
-          <w:instrText xml:space="preserve"> PAGEREF _Toc237716638 \h </w:instrText>
+          <w:instrText xml:space="preserve"> PAGEREF _Toc237717142 \h </w:instrText>
         </w:r>
         <w:r>
           <w:rPr>
@@ -862,7 +862,7 @@
           <w:noProof/>
         </w:rPr>
       </w:pPr>
-      <w:hyperlink w:anchor="_Toc237716639" w:history="1">
+      <w:hyperlink w:anchor="_Toc237717143" w:history="1">
         <w:r>
           <w:rPr>
             <w:rStyle w:val="Siuktni"/>
@@ -889,7 +889,7 @@
             <w:noProof/>
             <w:webHidden/>
           </w:rPr>
-          <w:instrText xml:space="preserve"> PAGEREF _Toc237716639 \h </w:instrText>
+          <w:instrText xml:space="preserve"> PAGEREF _Toc237717143 \h </w:instrText>
         </w:r>
         <w:r>
           <w:rPr>
@@ -930,7 +930,7 @@
           <w:noProof/>
         </w:rPr>
       </w:pPr>
-      <w:hyperlink w:anchor="_Toc237716640" w:history="1">
+      <w:hyperlink w:anchor="_Toc237717144" w:history="1">
         <w:r>
           <w:rPr>
             <w:rStyle w:val="Siuktni"/>
@@ -957,7 +957,7 @@
             <w:noProof/>
             <w:webHidden/>
           </w:rPr>
-          <w:instrText xml:space="preserve"> PAGEREF _Toc237716640 \h </w:instrText>
+          <w:instrText xml:space="preserve"> PAGEREF _Toc237717144 \h </w:instrText>
         </w:r>
         <w:r>
           <w:rPr>
@@ -998,7 +998,7 @@
           <w:noProof/>
         </w:rPr>
       </w:pPr>
-      <w:hyperlink w:anchor="_Toc237716641" w:history="1">
+      <w:hyperlink w:anchor="_Toc237717145" w:history="1">
         <w:r>
           <w:rPr>
             <w:rStyle w:val="Siuktni"/>
@@ -1025,7 +1025,7 @@
             <w:noProof/>
             <w:webHidden/>
           </w:rPr>
-          <w:instrText xml:space="preserve"> PAGEREF _Toc237716641 \h </w:instrText>
+          <w:instrText xml:space="preserve"> PAGEREF _Toc237717145 \h </w:instrText>
         </w:r>
         <w:r>
           <w:rPr>
@@ -1066,7 +1066,7 @@
           <w:noProof/>
         </w:rPr>
       </w:pPr>
-      <w:hyperlink w:anchor="_Toc237716642" w:history="1">
+      <w:hyperlink w:anchor="_Toc237717146" w:history="1">
         <w:r>
           <w:rPr>
             <w:rStyle w:val="Siuktni"/>
@@ -1093,7 +1093,7 @@
             <w:noProof/>
             <w:webHidden/>
           </w:rPr>
-          <w:instrText xml:space="preserve"> PAGEREF _Toc237716642 \h </w:instrText>
+          <w:instrText xml:space="preserve"> PAGEREF _Toc237717146 \h </w:instrText>
         </w:r>
         <w:r>
           <w:rPr>
@@ -1134,7 +1134,7 @@
           <w:noProof/>
         </w:rPr>
       </w:pPr>
-      <w:hyperlink w:anchor="_Toc237716643" w:history="1">
+      <w:hyperlink w:anchor="_Toc237717147" w:history="1">
         <w:r>
           <w:rPr>
             <w:rStyle w:val="Siuktni"/>
@@ -1161,7 +1161,7 @@
             <w:noProof/>
             <w:webHidden/>
           </w:rPr>
-          <w:instrText xml:space="preserve"> PAGEREF _Toc237716643 \h </w:instrText>
+          <w:instrText xml:space="preserve"> PAGEREF _Toc237717147 \h </w:instrText>
         </w:r>
         <w:r>
           <w:rPr>
@@ -1202,7 +1202,7 @@
           <w:noProof/>
         </w:rPr>
       </w:pPr>
-      <w:hyperlink w:anchor="_Toc237716644" w:history="1">
+      <w:hyperlink w:anchor="_Toc237717148" w:history="1">
         <w:r>
           <w:rPr>
             <w:rStyle w:val="Siuktni"/>
@@ -1229,7 +1229,7 @@
             <w:noProof/>
             <w:webHidden/>
           </w:rPr>
-          <w:instrText xml:space="preserve"> PAGEREF _Toc237716644 \h </w:instrText>
+          <w:instrText xml:space="preserve"> PAGEREF _Toc237717148 \h </w:instrText>
         </w:r>
         <w:r>
           <w:rPr>
@@ -1270,7 +1270,7 @@
           <w:noProof/>
         </w:rPr>
       </w:pPr>
-      <w:hyperlink w:anchor="_Toc237716645" w:history="1">
+      <w:hyperlink w:anchor="_Toc237717149" w:history="1">
         <w:r>
           <w:rPr>
             <w:rStyle w:val="Siuktni"/>
@@ -1297,7 +1297,7 @@
             <w:noProof/>
             <w:webHidden/>
           </w:rPr>
-          <w:instrText xml:space="preserve"> PAGEREF _Toc237716645 \h </w:instrText>
+          <w:instrText xml:space="preserve"> PAGEREF _Toc237717149 \h </w:instrText>
         </w:r>
         <w:r>
           <w:rPr>
@@ -1338,7 +1338,7 @@
           <w:noProof/>
         </w:rPr>
       </w:pPr>
-      <w:hyperlink w:anchor="_Toc237716646" w:history="1">
+      <w:hyperlink w:anchor="_Toc237717150" w:history="1">
         <w:r>
           <w:rPr>
             <w:rStyle w:val="Siuktni"/>
@@ -1365,7 +1365,7 @@
             <w:noProof/>
             <w:webHidden/>
           </w:rPr>
-          <w:instrText xml:space="preserve"> PAGEREF _Toc237716646 \h </w:instrText>
+          <w:instrText xml:space="preserve"> PAGEREF _Toc237717150 \h </w:instrText>
         </w:r>
         <w:r>
           <w:rPr>
@@ -1406,7 +1406,7 @@
           <w:noProof/>
         </w:rPr>
       </w:pPr>
-      <w:hyperlink w:anchor="_Toc237716647" w:history="1">
+      <w:hyperlink w:anchor="_Toc237717151" w:history="1">
         <w:r>
           <w:rPr>
             <w:rStyle w:val="Siuktni"/>
@@ -1433,7 +1433,7 @@
             <w:noProof/>
             <w:webHidden/>
           </w:rPr>
-          <w:instrText xml:space="preserve"> PAGEREF _Toc237716647 \h </w:instrText>
+          <w:instrText xml:space="preserve"> PAGEREF _Toc237717151 \h </w:instrText>
         </w:r>
         <w:r>
           <w:rPr>
@@ -1474,7 +1474,7 @@
           <w:noProof/>
         </w:rPr>
       </w:pPr>
-      <w:hyperlink w:anchor="_Toc237716648" w:history="1">
+      <w:hyperlink w:anchor="_Toc237717152" w:history="1">
         <w:r>
           <w:rPr>
             <w:rStyle w:val="Siuktni"/>
@@ -1501,7 +1501,7 @@
             <w:noProof/>
             <w:webHidden/>
           </w:rPr>
-          <w:instrText xml:space="preserve"> PAGEREF _Toc237716648 \h </w:instrText>
+          <w:instrText xml:space="preserve"> PAGEREF _Toc237717152 \h </w:instrText>
         </w:r>
         <w:r>
           <w:rPr>
@@ -1542,7 +1542,7 @@
           <w:noProof/>
         </w:rPr>
       </w:pPr>
-      <w:hyperlink w:anchor="_Toc237716649" w:history="1">
+      <w:hyperlink w:anchor="_Toc237717153" w:history="1">
         <w:r>
           <w:rPr>
             <w:rStyle w:val="Siuktni"/>
@@ -1569,7 +1569,7 @@
             <w:noProof/>
             <w:webHidden/>
           </w:rPr>
-          <w:instrText xml:space="preserve"> PAGEREF _Toc237716649 \h </w:instrText>
+          <w:instrText xml:space="preserve"> PAGEREF _Toc237717153 \h </w:instrText>
         </w:r>
         <w:r>
           <w:rPr>
@@ -1610,7 +1610,7 @@
           <w:noProof/>
         </w:rPr>
       </w:pPr>
-      <w:hyperlink w:anchor="_Toc237716650" w:history="1">
+      <w:hyperlink w:anchor="_Toc237717154" w:history="1">
         <w:r>
           <w:rPr>
             <w:rStyle w:val="Siuktni"/>
@@ -1637,7 +1637,7 @@
             <w:noProof/>
             <w:webHidden/>
           </w:rPr>
-          <w:instrText xml:space="preserve"> PAGEREF _Toc237716650 \h </w:instrText>
+          <w:instrText xml:space="preserve"> PAGEREF _Toc237717154 \h </w:instrText>
         </w:r>
         <w:r>
           <w:rPr>
@@ -1678,7 +1678,7 @@
           <w:noProof/>
         </w:rPr>
       </w:pPr>
-      <w:hyperlink w:anchor="_Toc237716651" w:history="1">
+      <w:hyperlink w:anchor="_Toc237717155" w:history="1">
         <w:r>
           <w:rPr>
             <w:rStyle w:val="Siuktni"/>
@@ -1705,7 +1705,7 @@
             <w:noProof/>
             <w:webHidden/>
           </w:rPr>
-          <w:instrText xml:space="preserve"> PAGEREF _Toc237716651 \h </w:instrText>
+          <w:instrText xml:space="preserve"> PAGEREF _Toc237717155 \h </w:instrText>
         </w:r>
         <w:r>
           <w:rPr>
@@ -1746,7 +1746,7 @@
           <w:noProof/>
         </w:rPr>
       </w:pPr>
-      <w:hyperlink w:anchor="_Toc237716652" w:history="1">
+      <w:hyperlink w:anchor="_Toc237717156" w:history="1">
         <w:r>
           <w:rPr>
             <w:rStyle w:val="Siuktni"/>
@@ -1773,7 +1773,7 @@
             <w:noProof/>
             <w:webHidden/>
           </w:rPr>
-          <w:instrText xml:space="preserve"> PAGEREF _Toc237716652 \h </w:instrText>
+          <w:instrText xml:space="preserve"> PAGEREF _Toc237717156 \h </w:instrText>
         </w:r>
         <w:r>
           <w:rPr>
@@ -1814,7 +1814,7 @@
           <w:noProof/>
         </w:rPr>
       </w:pPr>
-      <w:hyperlink w:anchor="_Toc237716653" w:history="1">
+      <w:hyperlink w:anchor="_Toc237717157" w:history="1">
         <w:r>
           <w:rPr>
             <w:rStyle w:val="Siuktni"/>
@@ -1841,7 +1841,7 @@
             <w:noProof/>
             <w:webHidden/>
           </w:rPr>
-          <w:instrText xml:space="preserve"> PAGEREF _Toc237716653 \h </w:instrText>
+          <w:instrText xml:space="preserve"> PAGEREF _Toc237717157 \h </w:instrText>
         </w:r>
         <w:r>
           <w:rPr>
@@ -1882,7 +1882,7 @@
           <w:noProof/>
         </w:rPr>
       </w:pPr>
-      <w:hyperlink w:anchor="_Toc237716654" w:history="1">
+      <w:hyperlink w:anchor="_Toc237717158" w:history="1">
         <w:r>
           <w:rPr>
             <w:rStyle w:val="Siuktni"/>
@@ -1909,7 +1909,7 @@
             <w:noProof/>
             <w:webHidden/>
           </w:rPr>
-          <w:instrText xml:space="preserve"> PAGEREF _Toc237716654 \h </w:instrText>
+          <w:instrText xml:space="preserve"> PAGEREF _Toc237717158 \h </w:instrText>
         </w:r>
         <w:r>
           <w:rPr>
@@ -1950,7 +1950,7 @@
           <w:noProof/>
         </w:rPr>
       </w:pPr>
-      <w:hyperlink w:anchor="_Toc237716655" w:history="1">
+      <w:hyperlink w:anchor="_Toc237717159" w:history="1">
         <w:r>
           <w:rPr>
             <w:rStyle w:val="Siuktni"/>
@@ -1977,7 +1977,7 @@
             <w:noProof/>
             <w:webHidden/>
           </w:rPr>
-          <w:instrText xml:space="preserve"> PAGEREF _Toc237716655 \h </w:instrText>
+          <w:instrText xml:space="preserve"> PAGEREF _Toc237717159 \h </w:instrText>
         </w:r>
         <w:r>
           <w:rPr>
@@ -2018,7 +2018,7 @@
           <w:noProof/>
         </w:rPr>
       </w:pPr>
-      <w:hyperlink w:anchor="_Toc237716656" w:history="1">
+      <w:hyperlink w:anchor="_Toc237717160" w:history="1">
         <w:r>
           <w:rPr>
             <w:rStyle w:val="Siuktni"/>
@@ -2045,7 +2045,7 @@
             <w:noProof/>
             <w:webHidden/>
           </w:rPr>
-          <w:instrText xml:space="preserve"> PAGEREF _Toc237716656 \h </w:instrText>
+          <w:instrText xml:space="preserve"> PAGEREF _Toc237717160 \h </w:instrText>
         </w:r>
         <w:r>
           <w:rPr>
@@ -2086,7 +2086,7 @@
           <w:noProof/>
         </w:rPr>
       </w:pPr>
-      <w:hyperlink w:anchor="_Toc237716657" w:history="1">
+      <w:hyperlink w:anchor="_Toc237717161" w:history="1">
         <w:r>
           <w:rPr>
             <w:rStyle w:val="Siuktni"/>
@@ -2113,7 +2113,7 @@
             <w:noProof/>
             <w:webHidden/>
           </w:rPr>
-          <w:instrText xml:space="preserve"> PAGEREF _Toc237716657 \h </w:instrText>
+          <w:instrText xml:space="preserve"> PAGEREF _Toc237717161 \h </w:instrText>
         </w:r>
         <w:r>
           <w:rPr>
@@ -2154,7 +2154,7 @@
           <w:noProof/>
         </w:rPr>
       </w:pPr>
-      <w:hyperlink w:anchor="_Toc237716658" w:history="1">
+      <w:hyperlink w:anchor="_Toc237717162" w:history="1">
         <w:r>
           <w:rPr>
             <w:rStyle w:val="Siuktni"/>
@@ -2181,7 +2181,7 @@
             <w:noProof/>
             <w:webHidden/>
           </w:rPr>
-          <w:instrText xml:space="preserve"> PAGEREF _Toc237716658 \h </w:instrText>
+          <w:instrText xml:space="preserve"> PAGEREF _Toc237717162 \h </w:instrText>
         </w:r>
         <w:r>
           <w:rPr>
@@ -2222,7 +2222,7 @@
           <w:noProof/>
         </w:rPr>
       </w:pPr>
-      <w:hyperlink w:anchor="_Toc237716659" w:history="1">
+      <w:hyperlink w:anchor="_Toc237717163" w:history="1">
         <w:r>
           <w:rPr>
             <w:rStyle w:val="Siuktni"/>
@@ -2249,7 +2249,7 @@
             <w:noProof/>
             <w:webHidden/>
           </w:rPr>
-          <w:instrText xml:space="preserve"> PAGEREF _Toc237716659 \h </w:instrText>
+          <w:instrText xml:space="preserve"> PAGEREF _Toc237717163 \h </w:instrText>
         </w:r>
         <w:r>
           <w:rPr>
@@ -2290,7 +2290,7 @@
           <w:noProof/>
         </w:rPr>
       </w:pPr>
-      <w:hyperlink w:anchor="_Toc237716660" w:history="1">
+      <w:hyperlink w:anchor="_Toc237717164" w:history="1">
         <w:r>
           <w:rPr>
             <w:rStyle w:val="Siuktni"/>
@@ -2317,7 +2317,7 @@
             <w:noProof/>
             <w:webHidden/>
           </w:rPr>
-          <w:instrText xml:space="preserve"> PAGEREF _Toc237716660 \h </w:instrText>
+          <w:instrText xml:space="preserve"> PAGEREF _Toc237717164 \h </w:instrText>
         </w:r>
         <w:r>
           <w:rPr>
@@ -2358,7 +2358,7 @@
           <w:noProof/>
         </w:rPr>
       </w:pPr>
-      <w:hyperlink w:anchor="_Toc237716661" w:history="1">
+      <w:hyperlink w:anchor="_Toc237717165" w:history="1">
         <w:r>
           <w:rPr>
             <w:rStyle w:val="Siuktni"/>
@@ -2385,7 +2385,7 @@
             <w:noProof/>
             <w:webHidden/>
           </w:rPr>
-          <w:instrText xml:space="preserve"> PAGEREF _Toc237716661 \h </w:instrText>
+          <w:instrText xml:space="preserve"> PAGEREF _Toc237717165 \h </w:instrText>
         </w:r>
         <w:r>
           <w:rPr>
@@ -2426,7 +2426,7 @@
           <w:noProof/>
         </w:rPr>
       </w:pPr>
-      <w:hyperlink w:anchor="_Toc237716662" w:history="1">
+      <w:hyperlink w:anchor="_Toc237717166" w:history="1">
         <w:r>
           <w:rPr>
             <w:rStyle w:val="Siuktni"/>
@@ -2453,7 +2453,7 @@
             <w:noProof/>
             <w:webHidden/>
           </w:rPr>
-          <w:instrText xml:space="preserve"> PAGEREF _Toc237716662 \h </w:instrText>
+          <w:instrText xml:space="preserve"> PAGEREF _Toc237717166 \h </w:instrText>
         </w:r>
         <w:r>
           <w:rPr>
@@ -2494,7 +2494,7 @@
           <w:noProof/>
         </w:rPr>
       </w:pPr>
-      <w:hyperlink w:anchor="_Toc237716663" w:history="1">
+      <w:hyperlink w:anchor="_Toc237717167" w:history="1">
         <w:r>
           <w:rPr>
             <w:rStyle w:val="Siuktni"/>
@@ -2521,7 +2521,7 @@
             <w:noProof/>
             <w:webHidden/>
           </w:rPr>
-          <w:instrText xml:space="preserve"> PAGEREF _Toc237716663 \h </w:instrText>
+          <w:instrText xml:space="preserve"> PAGEREF _Toc237717167 \h </w:instrText>
         </w:r>
         <w:r>
           <w:rPr>
@@ -2562,7 +2562,7 @@
           <w:noProof/>
         </w:rPr>
       </w:pPr>
-      <w:hyperlink w:anchor="_Toc237716664" w:history="1">
+      <w:hyperlink w:anchor="_Toc237717168" w:history="1">
         <w:r>
           <w:rPr>
             <w:rStyle w:val="Siuktni"/>
@@ -2589,7 +2589,7 @@
             <w:noProof/>
             <w:webHidden/>
           </w:rPr>
-          <w:instrText xml:space="preserve"> PAGEREF _Toc237716664 \h </w:instrText>
+          <w:instrText xml:space="preserve"> PAGEREF _Toc237717168 \h </w:instrText>
         </w:r>
         <w:r>
           <w:rPr>
@@ -2630,7 +2630,7 @@
           <w:noProof/>
         </w:rPr>
       </w:pPr>
-      <w:hyperlink w:anchor="_Toc237716665" w:history="1">
+      <w:hyperlink w:anchor="_Toc237717169" w:history="1">
         <w:r>
           <w:rPr>
             <w:rStyle w:val="Siuktni"/>
@@ -2657,7 +2657,7 @@
             <w:noProof/>
             <w:webHidden/>
           </w:rPr>
-          <w:instrText xml:space="preserve"> PAGEREF _Toc237716665 \h </w:instrText>
+          <w:instrText xml:space="preserve"> PAGEREF _Toc237717169 \h </w:instrText>
         </w:r>
         <w:r>
           <w:rPr>
@@ -2698,7 +2698,7 @@
           <w:noProof/>
         </w:rPr>
       </w:pPr>
-      <w:hyperlink w:anchor="_Toc237716666" w:history="1">
+      <w:hyperlink w:anchor="_Toc237717170" w:history="1">
         <w:r>
           <w:rPr>
             <w:rStyle w:val="Siuktni"/>
@@ -2725,7 +2725,7 @@
             <w:noProof/>
             <w:webHidden/>
           </w:rPr>
-          <w:instrText xml:space="preserve"> PAGEREF _Toc237716666 \h </w:instrText>
+          <w:instrText xml:space="preserve"> PAGEREF _Toc237717170 \h </w:instrText>
         </w:r>
         <w:r>
           <w:rPr>
@@ -2766,7 +2766,7 @@
           <w:noProof/>
         </w:rPr>
       </w:pPr>
-      <w:hyperlink w:anchor="_Toc237716667" w:history="1">
+      <w:hyperlink w:anchor="_Toc237717171" w:history="1">
         <w:r>
           <w:rPr>
             <w:rStyle w:val="Siuktni"/>
@@ -2793,7 +2793,7 @@
             <w:noProof/>
             <w:webHidden/>
           </w:rPr>
-          <w:instrText xml:space="preserve"> PAGEREF _Toc237716667 \h </w:instrText>
+          <w:instrText xml:space="preserve"> PAGEREF _Toc237717171 \h </w:instrText>
         </w:r>
         <w:r>
           <w:rPr>
@@ -2834,7 +2834,7 @@
           <w:noProof/>
         </w:rPr>
       </w:pPr>
-      <w:hyperlink w:anchor="_Toc237716668" w:history="1">
+      <w:hyperlink w:anchor="_Toc237717172" w:history="1">
         <w:r>
           <w:rPr>
             <w:rStyle w:val="Siuktni"/>
@@ -2861,7 +2861,7 @@
             <w:noProof/>
             <w:webHidden/>
           </w:rPr>
-          <w:instrText xml:space="preserve"> PAGEREF _Toc237716668 \h </w:instrText>
+          <w:instrText xml:space="preserve"> PAGEREF _Toc237717172 \h </w:instrText>
         </w:r>
         <w:r>
           <w:rPr>
@@ -2902,7 +2902,7 @@
           <w:noProof/>
         </w:rPr>
       </w:pPr>
-      <w:hyperlink w:anchor="_Toc237716669" w:history="1">
+      <w:hyperlink w:anchor="_Toc237717173" w:history="1">
         <w:r>
           <w:rPr>
             <w:rStyle w:val="Siuktni"/>
@@ -2929,7 +2929,7 @@
             <w:noProof/>
             <w:webHidden/>
           </w:rPr>
-          <w:instrText xml:space="preserve"> PAGEREF _Toc237716669 \h </w:instrText>
+          <w:instrText xml:space="preserve"> PAGEREF _Toc237717173 \h </w:instrText>
         </w:r>
         <w:r>
           <w:rPr>
@@ -2978,7 +2978,7 @@
       <w:pPr>
         <w:pStyle w:val="u1"/>
       </w:pPr>
-      <w:bookmarkStart w:id="0" w:name="_Toc237716638"/>
+      <w:bookmarkStart w:id="0" w:name="_Toc237717142"/>
       <w:r>
         <w:rPr>
           <w:rFonts w:ascii="Times New Roman" w:eastAsia="Times New Roman" w:hAnsi="Times New Roman"/>
@@ -2993,7 +2993,7 @@
       <w:pPr>
         <w:pStyle w:val="u2"/>
       </w:pPr>
-      <w:bookmarkStart w:id="1" w:name="_Toc237716639"/>
+      <w:bookmarkStart w:id="1" w:name="_Toc237717143"/>
       <w:r>
         <w:rPr>
           <w:rFonts w:ascii="Times New Roman" w:eastAsia="Times New Roman" w:hAnsi="Times New Roman"/>
@@ -3018,7 +3018,7 @@
       <w:pPr>
         <w:pStyle w:val="u2"/>
       </w:pPr>
-      <w:bookmarkStart w:id="2" w:name="_Toc237716640"/>
+      <w:bookmarkStart w:id="2" w:name="_Toc237717144"/>
       <w:r>
         <w:rPr>
           <w:rFonts w:ascii="Times New Roman" w:eastAsia="Times New Roman" w:hAnsi="Times New Roman"/>
@@ -3052,7 +3052,7 @@
       <w:pPr>
         <w:pStyle w:val="u2"/>
       </w:pPr>
-      <w:bookmarkStart w:id="3" w:name="_Toc237716641"/>
+      <w:bookmarkStart w:id="3" w:name="_Toc237717145"/>
       <w:r>
         <w:rPr>
           <w:rFonts w:ascii="Times New Roman" w:eastAsia="Times New Roman" w:hAnsi="Times New Roman"/>
@@ -3106,7 +3106,7 @@
       <w:pPr>
         <w:pStyle w:val="u1"/>
       </w:pPr>
-      <w:bookmarkStart w:id="4" w:name="_Toc237716642"/>
+      <w:bookmarkStart w:id="4" w:name="_Toc237717146"/>
       <w:r>
         <w:rPr>
           <w:rFonts w:ascii="Times New Roman" w:eastAsia="Times New Roman" w:hAnsi="Times New Roman"/>
@@ -3121,7 +3121,7 @@
       <w:pPr>
         <w:pStyle w:val="u2"/>
       </w:pPr>
-      <w:bookmarkStart w:id="5" w:name="_Toc237716643"/>
+      <w:bookmarkStart w:id="5" w:name="_Toc237717147"/>
       <w:r>
         <w:rPr>
           <w:rFonts w:ascii="Times New Roman" w:eastAsia="Times New Roman" w:hAnsi="Times New Roman"/>
@@ -3160,7 +3160,7 @@
       <w:pPr>
         <w:pStyle w:val="u2"/>
       </w:pPr>
-      <w:bookmarkStart w:id="6" w:name="_Toc237716644"/>
+      <w:bookmarkStart w:id="6" w:name="_Toc237717148"/>
       <w:r>
         <w:rPr>
           <w:rFonts w:ascii="Times New Roman" w:eastAsia="Times New Roman" w:hAnsi="Times New Roman"/>
@@ -3272,7 +3272,7 @@
       <w:pPr>
         <w:pStyle w:val="u2"/>
       </w:pPr>
-      <w:bookmarkStart w:id="7" w:name="_Toc237716645"/>
+      <w:bookmarkStart w:id="7" w:name="_Toc237717149"/>
       <w:r>
         <w:rPr>
           <w:rFonts w:ascii="Times New Roman" w:eastAsia="Times New Roman" w:hAnsi="Times New Roman"/>
@@ -3514,7 +3514,7 @@
       <w:pPr>
         <w:pStyle w:val="u2"/>
       </w:pPr>
-      <w:bookmarkStart w:id="8" w:name="_Toc237716646"/>
+      <w:bookmarkStart w:id="8" w:name="_Toc237717150"/>
       <w:r>
         <w:rPr>
           <w:rFonts w:ascii="Times New Roman" w:eastAsia="Times New Roman" w:hAnsi="Times New Roman"/>
@@ -3592,7 +3592,7 @@
       <w:pPr>
         <w:pStyle w:val="u2"/>
       </w:pPr>
-      <w:bookmarkStart w:id="9" w:name="_Toc237716647"/>
+      <w:bookmarkStart w:id="9" w:name="_Toc237717151"/>
       <w:r>
         <w:rPr>
           <w:rFonts w:ascii="Times New Roman" w:eastAsia="Times New Roman" w:hAnsi="Times New Roman"/>
@@ -3687,7 +3687,7 @@
       <w:pPr>
         <w:pStyle w:val="u2"/>
       </w:pPr>
-      <w:bookmarkStart w:id="10" w:name="_Toc237716648"/>
+      <w:bookmarkStart w:id="10" w:name="_Toc237717152"/>
       <w:r>
         <w:rPr>
           <w:rFonts w:ascii="Times New Roman" w:eastAsia="Times New Roman" w:hAnsi="Times New Roman"/>
@@ -3749,7 +3749,7 @@
       <w:pPr>
         <w:pStyle w:val="u2"/>
       </w:pPr>
-      <w:bookmarkStart w:id="11" w:name="_Toc237716649"/>
+      <w:bookmarkStart w:id="11" w:name="_Toc237717153"/>
       <w:r>
         <w:rPr>
           <w:rFonts w:ascii="Times New Roman" w:eastAsia="Times New Roman" w:hAnsi="Times New Roman"/>
@@ -3837,7 +3837,7 @@
       <w:pPr>
         <w:pStyle w:val="u1"/>
       </w:pPr>
-      <w:bookmarkStart w:id="12" w:name="_Toc237716650"/>
+      <w:bookmarkStart w:id="12" w:name="_Toc237717154"/>
       <w:r>
         <w:rPr>
           <w:rFonts w:ascii="Times New Roman" w:eastAsia="Times New Roman" w:hAnsi="Times New Roman"/>
@@ -3852,7 +3852,7 @@
       <w:pPr>
         <w:pStyle w:val="u2"/>
       </w:pPr>
-      <w:bookmarkStart w:id="13" w:name="_Toc237716651"/>
+      <w:bookmarkStart w:id="13" w:name="_Toc237717155"/>
       <w:r>
         <w:rPr>
           <w:rFonts w:ascii="Times New Roman" w:eastAsia="Times New Roman" w:hAnsi="Times New Roman"/>
@@ -3900,7 +3900,7 @@
       <w:pPr>
         <w:pStyle w:val="u2"/>
       </w:pPr>
-      <w:bookmarkStart w:id="14" w:name="_Toc237716652"/>
+      <w:bookmarkStart w:id="14" w:name="_Toc237717156"/>
       <w:r>
         <w:rPr>
           <w:rFonts w:ascii="Times New Roman" w:eastAsia="Times New Roman" w:hAnsi="Times New Roman"/>
@@ -4012,7 +4012,7 @@
       <w:pPr>
         <w:pStyle w:val="u2"/>
       </w:pPr>
-      <w:bookmarkStart w:id="15" w:name="_Toc237716653"/>
+      <w:bookmarkStart w:id="15" w:name="_Toc237717157"/>
       <w:r>
         <w:rPr>
           <w:rFonts w:ascii="Times New Roman" w:eastAsia="Times New Roman" w:hAnsi="Times New Roman"/>
@@ -4083,7 +4083,7 @@
       <w:pPr>
         <w:pStyle w:val="u2"/>
       </w:pPr>
-      <w:bookmarkStart w:id="16" w:name="_Toc237716654"/>
+      <w:bookmarkStart w:id="16" w:name="_Toc237717158"/>
       <w:r>
         <w:rPr>
           <w:rFonts w:ascii="Times New Roman" w:eastAsia="Times New Roman" w:hAnsi="Times New Roman"/>
@@ -4163,7 +4163,7 @@
       <w:pPr>
         <w:pStyle w:val="u2"/>
       </w:pPr>
-      <w:bookmarkStart w:id="17" w:name="_Toc237716655"/>
+      <w:bookmarkStart w:id="17" w:name="_Toc237717159"/>
       <w:r>
         <w:rPr>
           <w:rFonts w:ascii="Times New Roman" w:eastAsia="Times New Roman" w:hAnsi="Times New Roman"/>
@@ -5326,7 +5326,7 @@
       <w:pPr>
         <w:pStyle w:val="u1"/>
       </w:pPr>
-      <w:bookmarkStart w:id="18" w:name="_Toc237716656"/>
+      <w:bookmarkStart w:id="18" w:name="_Toc237717160"/>
       <w:r>
         <w:rPr>
           <w:rFonts w:ascii="Times New Roman" w:eastAsia="Times New Roman" w:hAnsi="Times New Roman"/>
@@ -5349,7 +5349,7 @@
       <w:pPr>
         <w:pStyle w:val="u2"/>
       </w:pPr>
-      <w:bookmarkStart w:id="19" w:name="_Toc237716657"/>
+      <w:bookmarkStart w:id="19" w:name="_Toc237717161"/>
       <w:r>
         <w:rPr>
           <w:rFonts w:ascii="Times New Roman" w:eastAsia="Times New Roman" w:hAnsi="Times New Roman"/>
@@ -5399,7 +5399,7 @@
         <w:spacing w:after="80"/>
       </w:pPr>
       <w:r>
-        <w:t xml:space="preserve">   Nhà nước ban hành các quy định nhằm bảo đảm tính trung thực và cạnh tranh lành mạnh trên thị trường. Việc đưa thông tin sai lệch về công dụng sản phẩm và sử dụng hình ảnh không đúng quy định vi phạm quy tắc quản lý tại Điều 8 và Điều 19 Luật Quảng cáo [3], làm ảnh hưởng đến trật tự kinh doanh chung.</w:t>
+        <w:t xml:space="preserve">   Nhà nước ban hành các quy định nhằm bảo đảm tính trung thực và cạnh tranh lành mạnh trên thị trường. Nếu các dữ kiện được làm rõ trong tố tụng, việc đưa thông tin sai lệch về công dụng sản phẩm và sử dụng hình ảnh không đúng quy định có thể được đối chiếu với Điều 8 và Điều 19 Luật Quảng cáo [3] để đánh giá tác động đến trật tự kinh doanh chung.</w:t>
       </w:r>
     </w:p>
     <w:p>
@@ -5422,7 +5422,7 @@
         <w:spacing w:after="80"/>
       </w:pPr>
       <w:r>
-        <w:t xml:space="preserve">   Theo Điều 10 Luật Bảo vệ quyền lợi người tiêu dùng năm 2023, pháp luật nghiêm cấm hành vi lừa dối hoặc gây nhầm lẫn cho người tiêu dùng thông qua hoạt động cung cấp thông tin, quảng cáo [4]. Người tiêu dùng có quyền được cung cấp thông tin trung thực về công dụng và giá trị sản phẩm. Việc tiếp nhận thông tin phóng đại làm ảnh hưởng trực tiếp đến quyền lựa chọn đúng đắn của người mua.</w:t>
+        <w:t xml:space="preserve">   Theo Điều 10 Luật Bảo vệ quyền lợi người tiêu dùng năm 2023, pháp luật nghiêm cấm hành vi lừa dối hoặc gây nhầm lẫn cho người tiêu dùng thông qua hoạt động cung cấp thông tin, quảng cáo [4]. Người tiêu dùng có quyền được cung cấp thông tin trung thực về công dụng và giá trị sản phẩm. Thông tin bị nêu là phóng đại có thể ảnh hưởng đến quyền lựa chọn của người mua nếu được chứng minh trong quá trình giải quyết vụ việc.</w:t>
       </w:r>
     </w:p>
     <w:p>
@@ -5445,7 +5445,160 @@
         <w:spacing w:after="80"/>
       </w:pPr>
       <w:r>
-        <w:t xml:space="preserve">   Theo Điều 32 Bộ luật Dân sự năm 2015 [2] và pháp luật về quảng cáo [3], việc sử dụng hình ảnh cá nhân trong hoạt động thương mại phải tuân thủ sự đồng ý hợp pháp hoặc các trường hợp ngoại lệ theo luật định. Dữ kiện ghi nhận nhóm đối tượng sử dụng hình ảnh, video cắt ghép người nổi tiếng để quảng cáo [6]. Nếu việc khai thác này không có sự đồng ý hoặc không thuộc trường hợp luật định thì làm phát sinh vấn đề xâm phạm quyền hình ảnh cá nhân.</w:t>
+        <w:t xml:space="preserve">   Theo Điều 32 Bộ luật Dân sự năm 2015 [2] và pháp luật về quảng cáo [3], việc sử dụng hình ảnh cá nhân trong hoạt động thương mại phải tuân thủ sự đồng ý hợp pháp hoặc các trường hợp ngoại lệ theo luật định. Dữ kiện ghi nhận nhóm đối tượng sử dụng hình ảnh, video cắt ghép người nổi tiếng để quảng cáo [6]. Nếu việc </w:t>
+      </w:r>
+      <w:r>
+        <w:lastRenderedPageBreak/>
+        <w:t>khai thác này không có sự đồng ý hoặc không thuộc trường hợp luật định thì làm phát sinh vấn đề xâm phạm quyền hình ảnh cá nhân.</w:t>
+      </w:r>
+    </w:p>
+    <w:p>
+      <w:pPr>
+        <w:pStyle w:val="u3"/>
+      </w:pPr>
+      <w:r>
+        <w:rPr>
+          <w:rFonts w:ascii="Times New Roman" w:eastAsia="Times New Roman" w:hAnsi="Times New Roman"/>
+          <w:b w:val="0"/>
+        </w:rPr>
+        <w:t>3.1.2. Phân biệt khách thể, đối tượng tác động và người bị ảnh hưởng</w:t>
+      </w:r>
+    </w:p>
+    <w:p>
+      <w:pPr>
+        <w:spacing w:after="80"/>
+      </w:pPr>
+      <w:r>
+        <w:t>Trong vụ việc này, khách thể là các quan hệ xã hội được pháp luật bảo vệ gồm trật tự quản lý quảng cáo, quyền được thông tin trung thực của người tiêu dùng và quyền hình ảnh cá nhân. Đối tượng tác động trực tiếp là bài viết, video quảng cáo cắt ghép, sản phẩm Đông y và dòng tiền từ các đơn hàng. Những người chịu ảnh hưởng gồm người mua hàng qua 5.429 đơn hàng (con số 5.429 là số đơn hàng thành công, không đồng nghĩa với 5.429 người mua riêng biệt) và các cá nhân bị khai thác hình ảnh trong tư liệu tiếp thị.</w:t>
+      </w:r>
+    </w:p>
+    <w:p>
+      <w:pPr>
+        <w:pStyle w:val="u2"/>
+      </w:pPr>
+      <w:bookmarkStart w:id="20" w:name="_Toc237717162"/>
+      <w:r>
+        <w:rPr>
+          <w:rFonts w:ascii="Times New Roman" w:eastAsia="Times New Roman" w:hAnsi="Times New Roman"/>
+          <w:b w:val="0"/>
+        </w:rPr>
+        <w:t>3.2. Phân tích yếu tố Mặt khách quan của vi phạm pháp luật</w:t>
+      </w:r>
+      <w:bookmarkEnd w:id="20"/>
+    </w:p>
+    <w:p>
+      <w:pPr>
+        <w:pStyle w:val="u3"/>
+      </w:pPr>
+      <w:r>
+        <w:rPr>
+          <w:rFonts w:ascii="Times New Roman" w:eastAsia="Times New Roman" w:hAnsi="Times New Roman"/>
+          <w:b w:val="0"/>
+        </w:rPr>
+        <w:t>3.2.1. Hành vi trái pháp luật</w:t>
+      </w:r>
+    </w:p>
+    <w:p>
+      <w:pPr>
+        <w:spacing w:after="80"/>
+      </w:pPr>
+      <w:r>
+        <w:t>Mặt khách quan thể hiện qua chuỗi hành vi hành động cụ thể trên thực tế:</w:t>
+      </w:r>
+    </w:p>
+    <w:p>
+      <w:pPr>
+        <w:pStyle w:val="Duudong"/>
+        <w:spacing w:after="60"/>
+        <w:ind w:left="709" w:firstLine="0"/>
+      </w:pPr>
+      <w:r>
+        <w:rPr>
+          <w:b/>
+        </w:rPr>
+        <w:t>Nội dung quảng cáo bị nêu là phóng đại, sai lệch:</w:t>
+      </w:r>
+      <w:r>
+        <w:t xml:space="preserve"> Theo nguồn công khai, nội dung về công dụng sản phẩm được nêu là phóng đại, sai lệch nhằm tạo niềm tin cho người mua; dữ kiện này có thể được đối chiếu với khoản 9 Điều 8 Luật Quảng cáo [3].</w:t>
+      </w:r>
+    </w:p>
+    <w:p>
+      <w:pPr>
+        <w:pStyle w:val="Duudong"/>
+        <w:spacing w:after="60"/>
+        <w:ind w:left="709" w:firstLine="0"/>
+      </w:pPr>
+      <w:r>
+        <w:rPr>
+          <w:b/>
+        </w:rPr>
+        <w:t>Tư liệu cắt ghép người nổi tiếng:</w:t>
+      </w:r>
+      <w:r>
+        <w:t xml:space="preserve"> Bài báo nêu hình ảnh, video người có uy tín đã qua chỉnh sửa được đưa vào nội dung bán hàng [6]. Vấn đề này có thể được đối chiếu với khoản 8 Điều 8 Luật Quảng cáo [3] và Điều 32 Bộ luật Dân sự 2015 [2] nếu không có sự đồng ý hợp lệ.</w:t>
+      </w:r>
+    </w:p>
+    <w:p>
+      <w:pPr>
+        <w:pStyle w:val="Duudong"/>
+        <w:spacing w:after="60"/>
+        <w:ind w:left="709" w:firstLine="0"/>
+      </w:pPr>
+      <w:r>
+        <w:rPr>
+          <w:b/>
+        </w:rPr>
+        <w:t>Bối cảnh tố tụng:</w:t>
+      </w:r>
+      <w:r>
+        <w:t xml:space="preserve"> Cơ quan điều tra đã khởi tố Đạt cùng 20 bị can về tội </w:t>
+      </w:r>
+      <w:r>
+        <w:rPr>
+          <w:i/>
+        </w:rPr>
+        <w:t>“Lừa dối khách hàng”</w:t>
+      </w:r>
+      <w:r>
+        <w:t xml:space="preserve"> theo khoản 2 Điều 198 Bộ luật Hình sự [1], [6]. Đây là dữ kiện tố tụng, không phải kết luận của báo cáo về trách nhiệm cuối cùng.</w:t>
+      </w:r>
+    </w:p>
+    <w:p>
+      <w:pPr>
+        <w:pStyle w:val="u3"/>
+      </w:pPr>
+      <w:r>
+        <w:rPr>
+          <w:rFonts w:ascii="Times New Roman" w:eastAsia="Times New Roman" w:hAnsi="Times New Roman"/>
+          <w:b w:val="0"/>
+        </w:rPr>
+        <w:t>3.2.2. Quy mô giao dịch và hậu quả ghi nhận</w:t>
+      </w:r>
+    </w:p>
+    <w:p>
+      <w:pPr>
+        <w:spacing w:after="80"/>
+      </w:pPr>
+      <w:r>
+        <w:t xml:space="preserve">Nguồn tin chính thức ghi nhận nhóm đã thực hiện thành công </w:t>
+      </w:r>
+      <w:r>
+        <w:rPr>
+          <w:b/>
+        </w:rPr>
+        <w:t>5.429 đơn hàng</w:t>
+      </w:r>
+      <w:r>
+        <w:t xml:space="preserve"> với </w:t>
+      </w:r>
+      <w:r>
+        <w:rPr>
+          <w:b/>
+        </w:rPr>
+        <w:t>tổng giá trị tiền hàng hơn 2,67 tỷ đồng</w:t>
+      </w:r>
+      <w:r>
+        <w:t xml:space="preserve"> [6]. Đây là quy mô giao dịch phát sinh trên thực tế. Cần phân biệt tổng giá trị tiền hàng với thiệt hại thực tế của người mua hay lợi nhuận thuần túy của người bán, bởi việc xác định chính xác thiệt hại phụ thuộc vào kết luận tài chính của cơ quan tố tụng.</w:t>
       </w:r>
     </w:p>
     <w:p>
@@ -5458,7 +5611,7 @@
           <w:b w:val="0"/>
         </w:rPr>
         <w:lastRenderedPageBreak/>
-        <w:t>3.1.2. Phân biệt khách thể, đối tượng tác động và người bị ảnh hưởng</w:t>
+        <w:t>3.2.3. Mối liên hệ nhân quả</w:t>
       </w:r>
     </w:p>
     <w:p>
@@ -5466,167 +5619,14 @@
         <w:spacing w:after="80"/>
       </w:pPr>
       <w:r>
-        <w:t>Trong vụ việc này, khách thể là các quan hệ xã hội được pháp luật bảo vệ gồm trật tự quản lý quảng cáo, quyền được thông tin trung thực của người tiêu dùng và quyền hình ảnh cá nhân. Đối tượng tác động trực tiếp là bài viết, video quảng cáo cắt ghép, sản phẩm Đông y và dòng tiền từ các đơn hàng. Những người chịu ảnh hưởng gồm người mua hàng qua 5.429 đơn hàng (con số 5.429 là số đơn hàng thành công, không đồng nghĩa với 5.429 người mua riêng biệt) và các cá nhân bị khai thác hình ảnh trong tư liệu tiếp thị.</w:t>
+        <w:t>Nội dung quảng cáo phóng đại và hình ảnh cắt ghép có khả năng tác động đến nhận thức, thúc đẩy người xem tin tưởng và đặt mua sản phẩm. Mối liên hệ giữa hoạt động tiếp thị sai sự thật và 5.429 đơn hàng phát sinh là cơ sở để xem xét quan hệ nhân quả trong môn học. Tuy nhiên, thông tin công khai chưa thể hiện lý do mua hàng cụ thể của từng cá nhân trong 5.429 đơn hàng, nên nhóm không nhận định rằng toàn bộ đơn hàng đều phát sinh duy nhất từ việc quảng cáo gian dối.</w:t>
       </w:r>
     </w:p>
     <w:p>
       <w:pPr>
         <w:pStyle w:val="u2"/>
       </w:pPr>
-      <w:bookmarkStart w:id="20" w:name="_Toc237716658"/>
-      <w:r>
-        <w:rPr>
-          <w:rFonts w:ascii="Times New Roman" w:eastAsia="Times New Roman" w:hAnsi="Times New Roman"/>
-          <w:b w:val="0"/>
-        </w:rPr>
-        <w:t>3.2. Phân tích yếu tố Mặt khách quan của vi phạm pháp luật</w:t>
-      </w:r>
-      <w:bookmarkEnd w:id="20"/>
-    </w:p>
-    <w:p>
-      <w:pPr>
-        <w:pStyle w:val="u3"/>
-      </w:pPr>
-      <w:r>
-        <w:rPr>
-          <w:rFonts w:ascii="Times New Roman" w:eastAsia="Times New Roman" w:hAnsi="Times New Roman"/>
-          <w:b w:val="0"/>
-        </w:rPr>
-        <w:t>3.2.1. Hành vi trái pháp luật</w:t>
-      </w:r>
-    </w:p>
-    <w:p>
-      <w:pPr>
-        <w:spacing w:after="80"/>
-      </w:pPr>
-      <w:r>
-        <w:t>Mặt khách quan thể hiện qua chuỗi hành vi hành động cụ thể trên thực tế:</w:t>
-      </w:r>
-    </w:p>
-    <w:p>
-      <w:pPr>
-        <w:pStyle w:val="Duudong"/>
-        <w:spacing w:after="60"/>
-        <w:ind w:left="709" w:firstLine="0"/>
-      </w:pPr>
-      <w:r>
-        <w:rPr>
-          <w:b/>
-        </w:rPr>
-        <w:t>Quảng cáo sai sự thật:</w:t>
-      </w:r>
-      <w:r>
-        <w:t xml:space="preserve"> Đưa ra thông tin phóng đại, không đúng về công dụng của sản phẩm Đông y nhằm tạo niềm tin cho người mua, vi phạm khoản 9 Điều 8 Luật Quảng cáo [3].</w:t>
-      </w:r>
-    </w:p>
-    <w:p>
-      <w:pPr>
-        <w:pStyle w:val="Duudong"/>
-        <w:spacing w:after="60"/>
-        <w:ind w:left="709" w:firstLine="0"/>
-      </w:pPr>
-      <w:r>
-        <w:rPr>
-          <w:b/>
-        </w:rPr>
-        <w:t>Sử dụng tư liệu cắt ghép người nổi tiếng:</w:t>
-      </w:r>
-      <w:r>
-        <w:t xml:space="preserve"> Lồng ghép hình ảnh, video người có uy tín đã qua chỉnh sửa vào nội dung bán hàng [6], vi phạm khoản 8 Điều 8 Luật Quảng cáo [3] và Điều 32 Bộ luật Dân sự 2015 [2] nếu không có sự đồng ý hợp lệ.</w:t>
-      </w:r>
-    </w:p>
-    <w:p>
-      <w:pPr>
-        <w:pStyle w:val="Duudong"/>
-        <w:spacing w:after="60"/>
-        <w:ind w:left="709" w:firstLine="0"/>
-      </w:pPr>
-      <w:r>
-        <w:rPr>
-          <w:b/>
-        </w:rPr>
-        <w:t>Bối cảnh tố tụng:</w:t>
-      </w:r>
-      <w:r>
-        <w:t xml:space="preserve"> Cơ quan điều tra đã khởi tố Đạt cùng 20 bị can về tội </w:t>
-      </w:r>
-      <w:r>
-        <w:rPr>
-          <w:i/>
-        </w:rPr>
-        <w:t>“Lừa dối khách hàng”</w:t>
-      </w:r>
-      <w:r>
-        <w:t xml:space="preserve"> theo khoản 2 Điều 198 Bộ luật Hình sự [1], [6], phản ánh tính chất trái pháp luật của chuỗi hành vi.</w:t>
-      </w:r>
-    </w:p>
-    <w:p>
-      <w:pPr>
-        <w:pStyle w:val="u3"/>
-      </w:pPr>
-      <w:r>
-        <w:rPr>
-          <w:rFonts w:ascii="Times New Roman" w:eastAsia="Times New Roman" w:hAnsi="Times New Roman"/>
-          <w:b w:val="0"/>
-        </w:rPr>
-        <w:t>3.2.2. Quy mô giao dịch và hậu quả ghi nhận</w:t>
-      </w:r>
-    </w:p>
-    <w:p>
-      <w:pPr>
-        <w:spacing w:after="80"/>
-      </w:pPr>
-      <w:r>
-        <w:t xml:space="preserve">Nguồn tin chính thức ghi nhận nhóm đã thực hiện thành công </w:t>
-      </w:r>
-      <w:r>
-        <w:rPr>
-          <w:b/>
-        </w:rPr>
-        <w:t>5.429 đơn hàng</w:t>
-      </w:r>
-      <w:r>
-        <w:t xml:space="preserve"> với </w:t>
-      </w:r>
-      <w:r>
-        <w:rPr>
-          <w:b/>
-        </w:rPr>
-        <w:t>tổng giá trị tiền hàng hơn 2,67 tỷ đồng</w:t>
-      </w:r>
-      <w:r>
-        <w:t xml:space="preserve"> [6]. Đây là quy mô giao dịch phát sinh trên thực tế. Cần phân biệt tổng giá trị tiền hàng với thiệt hại thực tế của người mua hay lợi nhuận thuần túy của người bán, bởi việc xác định chính xác thiệt hại phụ thuộc vào kết luận tài chính của cơ quan tố tụng.</w:t>
-      </w:r>
-    </w:p>
-    <w:p>
-      <w:pPr>
-        <w:pStyle w:val="u3"/>
-      </w:pPr>
-      <w:r>
-        <w:rPr>
-          <w:rFonts w:ascii="Times New Roman" w:eastAsia="Times New Roman" w:hAnsi="Times New Roman"/>
-          <w:b w:val="0"/>
-        </w:rPr>
-        <w:t>3.2.3. Mối liên hệ nhân quả</w:t>
-      </w:r>
-    </w:p>
-    <w:p>
-      <w:pPr>
-        <w:spacing w:after="80"/>
-      </w:pPr>
-      <w:r>
-        <w:t xml:space="preserve">Nội dung quảng cáo phóng đại và hình ảnh cắt ghép có khả năng tác động đến nhận thức, thúc đẩy người xem tin tưởng và đặt mua sản phẩm. Mối liên hệ giữa hoạt </w:t>
-      </w:r>
-      <w:r>
-        <w:lastRenderedPageBreak/>
-        <w:t>động tiếp thị sai sự thật và 5.429 đơn hàng phát sinh là cơ sở để xem xét quan hệ nhân quả trong môn học. Tuy nhiên, thông tin công khai chưa thể hiện lý do mua hàng cụ thể của từng cá nhân trong 5.429 đơn hàng, nên nhóm không nhận định rằng toàn bộ đơn hàng đều phát sinh duy nhất từ việc quảng cáo gian dối.</w:t>
-      </w:r>
-    </w:p>
-    <w:p>
-      <w:pPr>
-        <w:pStyle w:val="u2"/>
-      </w:pPr>
-      <w:bookmarkStart w:id="21" w:name="_Toc237716659"/>
+      <w:bookmarkStart w:id="21" w:name="_Toc237717163"/>
       <w:r>
         <w:rPr>
           <w:rFonts w:ascii="Times New Roman" w:eastAsia="Times New Roman" w:hAnsi="Times New Roman"/>
@@ -5750,6 +5750,7 @@
         <w:ind w:left="709" w:firstLine="0"/>
       </w:pPr>
       <w:r>
+        <w:lastRenderedPageBreak/>
         <w:t xml:space="preserve">3. </w:t>
       </w:r>
       <w:r>
@@ -5766,13 +5767,12 @@
       <w:pPr>
         <w:pStyle w:val="u2"/>
       </w:pPr>
-      <w:bookmarkStart w:id="22" w:name="_Toc237716660"/>
+      <w:bookmarkStart w:id="22" w:name="_Toc237717164"/>
       <w:r>
         <w:rPr>
           <w:rFonts w:ascii="Times New Roman" w:eastAsia="Times New Roman" w:hAnsi="Times New Roman"/>
           <w:b w:val="0"/>
         </w:rPr>
-        <w:lastRenderedPageBreak/>
         <w:t>3.4. Phân tích yếu tố Mặt chủ quan của vi phạm pháp luật</w:t>
       </w:r>
       <w:bookmarkEnd w:id="22"/>
@@ -5827,7 +5827,7 @@
         <w:t>Về lý trí:</w:t>
       </w:r>
       <w:r>
-        <w:t xml:space="preserve"> Nhận thức rõ giá mua 23.000 đồng và nội dung quảng cáo cắt ghép là không đúng sự thật; thấy trước việc quảng cáo này sẽ khiến khách hàng tin tưởng đặt mua.</w:t>
+        <w:t xml:space="preserve"> Từ việc chỉ đạo nội dung cắt ghép và phóng đại được bài báo nêu, có thể suy luận ở mức học thuật về nhận thức đối với tính không trung thực của cách quảng cáo; không phải kết luận về nội tâm đã được chứng minh.</w:t>
       </w:r>
     </w:p>
     <w:p>
@@ -5843,7 +5843,7 @@
         <w:t>Về ý chí:</w:t>
       </w:r>
       <w:r>
-        <w:t xml:space="preserve"> Mong muốn bán được nhiều sản phẩm với mức giá 199.000 đồng/sản phẩm để thu tiền.</w:t>
+        <w:t xml:space="preserve"> Mục đích tạo niềm tin và thúc đẩy người mua đặt hàng được bài báo nêu là cơ sở để phân tích hướng bán sản phẩm với giá 199.000 đồng/sản phẩm và thu tiền từ giao dịch.</w:t>
       </w:r>
     </w:p>
     <w:p>
@@ -5915,7 +5915,7 @@
       <w:pPr>
         <w:pStyle w:val="u2"/>
       </w:pPr>
-      <w:bookmarkStart w:id="23" w:name="_Toc237716661"/>
+      <w:bookmarkStart w:id="23" w:name="_Toc237717165"/>
       <w:r>
         <w:rPr>
           <w:rFonts w:ascii="Times New Roman" w:eastAsia="Times New Roman" w:hAnsi="Times New Roman"/>
@@ -6039,6 +6039,7 @@
                 <w:b/>
                 <w:sz w:val="19"/>
               </w:rPr>
+              <w:lastRenderedPageBreak/>
               <w:t>Khách thể</w:t>
             </w:r>
           </w:p>
@@ -6103,7 +6104,6 @@
                 <w:b/>
                 <w:sz w:val="19"/>
               </w:rPr>
-              <w:lastRenderedPageBreak/>
               <w:t>Mặt khách quan</w:t>
             </w:r>
           </w:p>
@@ -6280,7 +6280,7 @@
       <w:pPr>
         <w:pStyle w:val="u1"/>
       </w:pPr>
-      <w:bookmarkStart w:id="24" w:name="_Toc237716662"/>
+      <w:bookmarkStart w:id="24" w:name="_Toc237717166"/>
       <w:r>
         <w:rPr>
           <w:rFonts w:ascii="Times New Roman" w:eastAsia="Times New Roman" w:hAnsi="Times New Roman"/>
@@ -6295,7 +6295,7 @@
       <w:pPr>
         <w:pStyle w:val="u2"/>
       </w:pPr>
-      <w:bookmarkStart w:id="25" w:name="_Toc237716663"/>
+      <w:bookmarkStart w:id="25" w:name="_Toc237717167"/>
       <w:r>
         <w:rPr>
           <w:rFonts w:ascii="Times New Roman" w:eastAsia="Times New Roman" w:hAnsi="Times New Roman"/>
@@ -6310,7 +6310,7 @@
         <w:spacing w:after="80"/>
       </w:pPr>
       <w:r>
-        <w:t>Vụ việc tại Phú Thọ phản ánh thực trạng lợi dụng mạng xã hội để tiếp thị gian dối thông qua việc cắt ghép hình ảnh người có uy tín nhằm tạo niềm tin cho người mua. Việc quảng cáo sai lệch kết hợp với khả năng lan truyền nhanh của không gian mạng khiến nhiều người tiêu dùng dễ dàng đưa ra quyết định mua hàng đối với sản phẩm được quảng cáo bằng thông tin phóng đại hoặc chưa được kiểm chứng đầy đủ về chất lượng.</w:t>
+        <w:t>Từ dữ kiện vụ việc tại Phú Thọ có thể thấy rủi ro của việc dùng mạng xã hội để tiếp thị bằng nội dung bị nêu là phóng đại, sai lệch và hình ảnh cắt ghép người có uy tín. Khả năng lan truyền nhanh của không gian mạng có thể làm tăng nguy cơ người tiếp nhận đưa ra quyết định mua hàng trên cơ sở thông tin chưa được kiểm chứng đầy đủ.</w:t>
       </w:r>
     </w:p>
     <w:p>
@@ -6325,7 +6325,7 @@
       <w:pPr>
         <w:pStyle w:val="u2"/>
       </w:pPr>
-      <w:bookmarkStart w:id="26" w:name="_Toc237716664"/>
+      <w:bookmarkStart w:id="26" w:name="_Toc237717168"/>
       <w:r>
         <w:rPr>
           <w:rFonts w:ascii="Times New Roman" w:eastAsia="Times New Roman" w:hAnsi="Times New Roman"/>
@@ -6355,7 +6355,7 @@
       <w:pPr>
         <w:pStyle w:val="u1"/>
       </w:pPr>
-      <w:bookmarkStart w:id="27" w:name="_Toc237716665"/>
+      <w:bookmarkStart w:id="27" w:name="_Toc237717169"/>
       <w:r>
         <w:rPr>
           <w:rFonts w:ascii="Times New Roman" w:eastAsia="Times New Roman" w:hAnsi="Times New Roman"/>
@@ -6371,10 +6371,7 @@
         <w:spacing w:after="80"/>
       </w:pPr>
       <w:r>
-        <w:t xml:space="preserve">Qua các dữ kiện công khai, vụ việc có thể được phân tích theo bốn yếu tố cấu thành vi phạm pháp luật: hành vi quảng cáo sai sự thật và khai thác hình ảnh cắt ghép tác động đến trật tự quản lý quảng cáo, quyền lợi của người tiêu dùng và quyền hình ảnh cá nhân theo quy định pháp luật; chuỗi hành vi được thực hiện qua nhiều khâu với 5.429 đơn hàng phát sinh; người tổ chức (Nguyễn Tiến Đạt) đã đủ tuổi thành niên; và dữ kiện tiếp thị phóng đại để bán hàng giá cao tạo cơ sở phân tích hướng lỗi cố ý trực tiếp gắn </w:t>
-      </w:r>
-      <w:r>
-        <w:t>với động cơ kinh tế.</w:t>
+        <w:t>Qua các dữ kiện công khai, vụ việc có thể được phân tích theo bốn yếu tố cấu thành vi phạm pháp luật: dữ kiện về nội dung quảng cáo bị nêu là sai lệch và hình ảnh cắt ghép cho phép xem xét tác động đến trật tự quản lý quảng cáo, quyền lợi người tiêu dùng và quyền hình ảnh theo quy định pháp luật; chuỗi hoạt động có 5.429 đơn hàng phát sinh; Nguyễn Tiến Đạt đã đủ tuổi thành niên; và dữ kiện tiếp thị phóng đại để bán hàng giá cao tạo cơ sở phân tích hướng lỗi cố ý trực tiếp gắn với động cơ kinh tế.</w:t>
       </w:r>
     </w:p>
     <w:p>
@@ -6389,7 +6386,7 @@
       <w:pPr>
         <w:pStyle w:val="u1"/>
       </w:pPr>
-      <w:bookmarkStart w:id="28" w:name="_Toc237716666"/>
+      <w:bookmarkStart w:id="28" w:name="_Toc237717170"/>
       <w:r>
         <w:rPr>
           <w:rFonts w:ascii="Times New Roman" w:eastAsia="Times New Roman" w:hAnsi="Times New Roman"/>
@@ -6404,7 +6401,7 @@
       <w:pPr>
         <w:pStyle w:val="u2"/>
       </w:pPr>
-      <w:bookmarkStart w:id="29" w:name="_Toc237716667"/>
+      <w:bookmarkStart w:id="29" w:name="_Toc237717171"/>
       <w:r>
         <w:rPr>
           <w:rFonts w:ascii="Times New Roman" w:eastAsia="Times New Roman" w:hAnsi="Times New Roman"/>
@@ -6526,7 +6523,7 @@
       <w:pPr>
         <w:pStyle w:val="u2"/>
       </w:pPr>
-      <w:bookmarkStart w:id="30" w:name="_Toc237716668"/>
+      <w:bookmarkStart w:id="30" w:name="_Toc237717172"/>
       <w:r>
         <w:rPr>
           <w:rFonts w:ascii="Times New Roman" w:eastAsia="Times New Roman" w:hAnsi="Times New Roman"/>
@@ -6567,7 +6564,7 @@
       <w:pPr>
         <w:pStyle w:val="u2"/>
       </w:pPr>
-      <w:bookmarkStart w:id="31" w:name="_Toc237716669"/>
+      <w:bookmarkStart w:id="31" w:name="_Toc237717173"/>
       <w:r>
         <w:rPr>
           <w:rFonts w:ascii="Times New Roman" w:eastAsia="Times New Roman" w:hAnsi="Times New Roman"/>
@@ -6875,31 +6872,31 @@
       </w:rPr>
     </w:lvl>
   </w:abstractNum>
-  <w:num w:numId="1" w16cid:durableId="180439529">
+  <w:num w:numId="1" w16cid:durableId="1101026666">
     <w:abstractNumId w:val="8"/>
   </w:num>
-  <w:num w:numId="2" w16cid:durableId="1227640382">
+  <w:num w:numId="2" w16cid:durableId="1570116826">
     <w:abstractNumId w:val="6"/>
   </w:num>
-  <w:num w:numId="3" w16cid:durableId="2134714268">
+  <w:num w:numId="3" w16cid:durableId="1427657336">
     <w:abstractNumId w:val="5"/>
   </w:num>
-  <w:num w:numId="4" w16cid:durableId="710232531">
+  <w:num w:numId="4" w16cid:durableId="1934320085">
     <w:abstractNumId w:val="4"/>
   </w:num>
-  <w:num w:numId="5" w16cid:durableId="1703435660">
+  <w:num w:numId="5" w16cid:durableId="941455851">
     <w:abstractNumId w:val="7"/>
   </w:num>
-  <w:num w:numId="6" w16cid:durableId="1589775519">
+  <w:num w:numId="6" w16cid:durableId="1077246022">
     <w:abstractNumId w:val="3"/>
   </w:num>
-  <w:num w:numId="7" w16cid:durableId="1540899876">
+  <w:num w:numId="7" w16cid:durableId="702678404">
     <w:abstractNumId w:val="2"/>
   </w:num>
-  <w:num w:numId="8" w16cid:durableId="698163911">
+  <w:num w:numId="8" w16cid:durableId="258368717">
     <w:abstractNumId w:val="1"/>
   </w:num>
-  <w:num w:numId="9" w16cid:durableId="1305770355">
+  <w:num w:numId="9" w16cid:durableId="992024376">
     <w:abstractNumId w:val="0"/>
   </w:num>
 </w:numbering>
@@ -18302,7 +18299,7 @@
     <w:autoRedefine/>
     <w:uiPriority w:val="39"/>
     <w:unhideWhenUsed/>
-    <w:rsid w:val="004E02D8"/>
+    <w:rsid w:val="006560BC"/>
     <w:pPr>
       <w:spacing w:after="100"/>
     </w:pPr>
@@ -18314,7 +18311,7 @@
     <w:autoRedefine/>
     <w:uiPriority w:val="39"/>
     <w:unhideWhenUsed/>
-    <w:rsid w:val="004E02D8"/>
+    <w:rsid w:val="006560BC"/>
     <w:pPr>
       <w:spacing w:after="100"/>
       <w:ind w:left="260"/>
@@ -18325,7 +18322,7 @@
     <w:basedOn w:val="Phngmcinhcuaoanvn"/>
     <w:uiPriority w:val="99"/>
     <w:unhideWhenUsed/>
-    <w:rsid w:val="004E02D8"/>
+    <w:rsid w:val="006560BC"/>
     <w:rPr>
       <w:color w:val="0000FF" w:themeColor="hyperlink"/>
       <w:u w:val="single"/>

</xml_diff>